<commit_message>
docs: release 1.5.0 pubblicata (link verificati su Cloudflare e GitHub)
Co-Authored-By: Claude Opus 5.5 <noreply@anthropic.com>
</commit_message>
<xml_diff>
--- a/docs/PDFz_20261030.docx
+++ b/docs/PDFz_20261030.docx
@@ -16,7 +16,7 @@
           <w:noProof/>
         </w:rPr>
         <w:drawing>
-          <wp:inline distT="0" distB="0" distL="0" distR="0" wp14:anchorId="43DC44B9" wp14:editId="7445422C">
+          <wp:inline distT="0" distB="0" distL="0" distR="0" wp14:anchorId="252C2343" wp14:editId="2951750B">
             <wp:extent cx="3619500" cy="1285875"/>
             <wp:effectExtent l="0" t="0" r="0" b="0"/>
             <wp:docPr id="1" name="Immagine 1"/>
@@ -135,7 +135,7 @@
     <w:sdt>
       <w:sdtPr>
         <w:alias w:val="Indice"/>
-        <w:id w:val="-498741178"/>
+        <w:id w:val="-1868057345"/>
       </w:sdtPr>
       <w:sdtEndPr/>
       <w:sdtContent>
@@ -158,7 +158,7 @@
           <w:r>
             <w:fldChar w:fldCharType="separate"/>
           </w:r>
-          <w:hyperlink w:anchor="_Toc244254942" w:history="1">
+          <w:hyperlink w:anchor="_Toc244255595" w:history="1">
             <w:r>
               <w:rPr>
                 <w:rStyle w:val="Collegamentoipertestuale"/>
@@ -182,7 +182,7 @@
               <w:rPr>
                 <w:noProof/>
               </w:rPr>
-              <w:instrText xml:space="preserve"> PAGEREF _Toc244254942 \h </w:instrText>
+              <w:instrText xml:space="preserve"> PAGEREF _Toc244255595 \h </w:instrText>
             </w:r>
             <w:r>
               <w:rPr>
@@ -219,7 +219,7 @@
               <w:noProof/>
             </w:rPr>
           </w:pPr>
-          <w:hyperlink w:anchor="_Toc244254943" w:history="1">
+          <w:hyperlink w:anchor="_Toc244255596" w:history="1">
             <w:r>
               <w:rPr>
                 <w:rStyle w:val="Collegamentoipertestuale"/>
@@ -243,7 +243,7 @@
               <w:rPr>
                 <w:noProof/>
               </w:rPr>
-              <w:instrText xml:space="preserve"> PAGEREF _Toc244254943 \h </w:instrText>
+              <w:instrText xml:space="preserve"> PAGEREF _Toc244255596 \h </w:instrText>
             </w:r>
             <w:r>
               <w:rPr>
@@ -280,7 +280,7 @@
               <w:noProof/>
             </w:rPr>
           </w:pPr>
-          <w:hyperlink w:anchor="_Toc244254944" w:history="1">
+          <w:hyperlink w:anchor="_Toc244255597" w:history="1">
             <w:r>
               <w:rPr>
                 <w:rStyle w:val="Collegamentoipertestuale"/>
@@ -304,7 +304,7 @@
               <w:rPr>
                 <w:noProof/>
               </w:rPr>
-              <w:instrText xml:space="preserve"> PAGEREF _Toc244254944 \h </w:instrText>
+              <w:instrText xml:space="preserve"> PAGEREF _Toc244255597 \h </w:instrText>
             </w:r>
             <w:r>
               <w:rPr>
@@ -341,7 +341,7 @@
               <w:noProof/>
             </w:rPr>
           </w:pPr>
-          <w:hyperlink w:anchor="_Toc244254945" w:history="1">
+          <w:hyperlink w:anchor="_Toc244255598" w:history="1">
             <w:r>
               <w:rPr>
                 <w:rStyle w:val="Collegamentoipertestuale"/>
@@ -365,7 +365,7 @@
               <w:rPr>
                 <w:noProof/>
               </w:rPr>
-              <w:instrText xml:space="preserve"> PAGEREF _Toc244254945 \h </w:instrText>
+              <w:instrText xml:space="preserve"> PAGEREF _Toc244255598 \h </w:instrText>
             </w:r>
             <w:r>
               <w:rPr>
@@ -402,7 +402,7 @@
               <w:noProof/>
             </w:rPr>
           </w:pPr>
-          <w:hyperlink w:anchor="_Toc244254946" w:history="1">
+          <w:hyperlink w:anchor="_Toc244255599" w:history="1">
             <w:r>
               <w:rPr>
                 <w:rStyle w:val="Collegamentoipertestuale"/>
@@ -426,7 +426,7 @@
               <w:rPr>
                 <w:noProof/>
               </w:rPr>
-              <w:instrText xml:space="preserve"> PAGEREF _Toc244254946 \h </w:instrText>
+              <w:instrText xml:space="preserve"> PAGEREF _Toc244255599 \h </w:instrText>
             </w:r>
             <w:r>
               <w:rPr>
@@ -463,7 +463,7 @@
               <w:noProof/>
             </w:rPr>
           </w:pPr>
-          <w:hyperlink w:anchor="_Toc244254947" w:history="1">
+          <w:hyperlink w:anchor="_Toc244255600" w:history="1">
             <w:r>
               <w:rPr>
                 <w:rStyle w:val="Collegamentoipertestuale"/>
@@ -487,7 +487,7 @@
               <w:rPr>
                 <w:noProof/>
               </w:rPr>
-              <w:instrText xml:space="preserve"> PAGEREF _Toc244254947 \h </w:instrText>
+              <w:instrText xml:space="preserve"> PAGEREF _Toc244255600 \h </w:instrText>
             </w:r>
             <w:r>
               <w:rPr>
@@ -524,7 +524,7 @@
               <w:noProof/>
             </w:rPr>
           </w:pPr>
-          <w:hyperlink w:anchor="_Toc244254948" w:history="1">
+          <w:hyperlink w:anchor="_Toc244255601" w:history="1">
             <w:r>
               <w:rPr>
                 <w:rStyle w:val="Collegamentoipertestuale"/>
@@ -548,7 +548,7 @@
               <w:rPr>
                 <w:noProof/>
               </w:rPr>
-              <w:instrText xml:space="preserve"> PAGEREF _Toc244254948 \h </w:instrText>
+              <w:instrText xml:space="preserve"> PAGEREF _Toc244255601 \h </w:instrText>
             </w:r>
             <w:r>
               <w:rPr>
@@ -585,7 +585,7 @@
               <w:noProof/>
             </w:rPr>
           </w:pPr>
-          <w:hyperlink w:anchor="_Toc244254949" w:history="1">
+          <w:hyperlink w:anchor="_Toc244255602" w:history="1">
             <w:r>
               <w:rPr>
                 <w:rStyle w:val="Collegamentoipertestuale"/>
@@ -609,7 +609,7 @@
               <w:rPr>
                 <w:noProof/>
               </w:rPr>
-              <w:instrText xml:space="preserve"> PAGEREF _Toc244254949 \h </w:instrText>
+              <w:instrText xml:space="preserve"> PAGEREF _Toc244255602 \h </w:instrText>
             </w:r>
             <w:r>
               <w:rPr>
@@ -646,7 +646,7 @@
               <w:noProof/>
             </w:rPr>
           </w:pPr>
-          <w:hyperlink w:anchor="_Toc244254950" w:history="1">
+          <w:hyperlink w:anchor="_Toc244255603" w:history="1">
             <w:r>
               <w:rPr>
                 <w:rStyle w:val="Collegamentoipertestuale"/>
@@ -670,7 +670,7 @@
               <w:rPr>
                 <w:noProof/>
               </w:rPr>
-              <w:instrText xml:space="preserve"> PAGEREF _Toc244254950 \h </w:instrText>
+              <w:instrText xml:space="preserve"> PAGEREF _Toc244255603 \h </w:instrText>
             </w:r>
             <w:r>
               <w:rPr>
@@ -707,7 +707,7 @@
               <w:noProof/>
             </w:rPr>
           </w:pPr>
-          <w:hyperlink w:anchor="_Toc244254951" w:history="1">
+          <w:hyperlink w:anchor="_Toc244255604" w:history="1">
             <w:r>
               <w:rPr>
                 <w:rStyle w:val="Collegamentoipertestuale"/>
@@ -731,7 +731,7 @@
               <w:rPr>
                 <w:noProof/>
               </w:rPr>
-              <w:instrText xml:space="preserve"> PAGEREF _Toc244254951 \h </w:instrText>
+              <w:instrText xml:space="preserve"> PAGEREF _Toc244255604 \h </w:instrText>
             </w:r>
             <w:r>
               <w:rPr>
@@ -768,7 +768,7 @@
               <w:noProof/>
             </w:rPr>
           </w:pPr>
-          <w:hyperlink w:anchor="_Toc244254952" w:history="1">
+          <w:hyperlink w:anchor="_Toc244255605" w:history="1">
             <w:r>
               <w:rPr>
                 <w:rStyle w:val="Collegamentoipertestuale"/>
@@ -792,7 +792,7 @@
               <w:rPr>
                 <w:noProof/>
               </w:rPr>
-              <w:instrText xml:space="preserve"> PAGEREF _Toc244254952 \h </w:instrText>
+              <w:instrText xml:space="preserve"> PAGEREF _Toc244255605 \h </w:instrText>
             </w:r>
             <w:r>
               <w:rPr>
@@ -829,7 +829,7 @@
               <w:noProof/>
             </w:rPr>
           </w:pPr>
-          <w:hyperlink w:anchor="_Toc244254953" w:history="1">
+          <w:hyperlink w:anchor="_Toc244255606" w:history="1">
             <w:r>
               <w:rPr>
                 <w:rStyle w:val="Collegamentoipertestuale"/>
@@ -853,7 +853,7 @@
               <w:rPr>
                 <w:noProof/>
               </w:rPr>
-              <w:instrText xml:space="preserve"> PAGEREF _Toc244254953 \h </w:instrText>
+              <w:instrText xml:space="preserve"> PAGEREF _Toc244255606 \h </w:instrText>
             </w:r>
             <w:r>
               <w:rPr>
@@ -890,7 +890,7 @@
               <w:noProof/>
             </w:rPr>
           </w:pPr>
-          <w:hyperlink w:anchor="_Toc244254954" w:history="1">
+          <w:hyperlink w:anchor="_Toc244255607" w:history="1">
             <w:r>
               <w:rPr>
                 <w:rStyle w:val="Collegamentoipertestuale"/>
@@ -914,7 +914,7 @@
               <w:rPr>
                 <w:noProof/>
               </w:rPr>
-              <w:instrText xml:space="preserve"> PAGEREF _Toc244254954 \h </w:instrText>
+              <w:instrText xml:space="preserve"> PAGEREF _Toc244255607 \h </w:instrText>
             </w:r>
             <w:r>
               <w:rPr>
@@ -951,7 +951,7 @@
               <w:noProof/>
             </w:rPr>
           </w:pPr>
-          <w:hyperlink w:anchor="_Toc244254955" w:history="1">
+          <w:hyperlink w:anchor="_Toc244255608" w:history="1">
             <w:r>
               <w:rPr>
                 <w:rStyle w:val="Collegamentoipertestuale"/>
@@ -975,7 +975,7 @@
               <w:rPr>
                 <w:noProof/>
               </w:rPr>
-              <w:instrText xml:space="preserve"> PAGEREF _Toc244254955 \h </w:instrText>
+              <w:instrText xml:space="preserve"> PAGEREF _Toc244255608 \h </w:instrText>
             </w:r>
             <w:r>
               <w:rPr>
@@ -1012,7 +1012,7 @@
               <w:noProof/>
             </w:rPr>
           </w:pPr>
-          <w:hyperlink w:anchor="_Toc244254956" w:history="1">
+          <w:hyperlink w:anchor="_Toc244255609" w:history="1">
             <w:r>
               <w:rPr>
                 <w:rStyle w:val="Collegamentoipertestuale"/>
@@ -1036,7 +1036,7 @@
               <w:rPr>
                 <w:noProof/>
               </w:rPr>
-              <w:instrText xml:space="preserve"> PAGEREF _Toc244254956 \h </w:instrText>
+              <w:instrText xml:space="preserve"> PAGEREF _Toc244255609 \h </w:instrText>
             </w:r>
             <w:r>
               <w:rPr>
@@ -1073,7 +1073,7 @@
               <w:noProof/>
             </w:rPr>
           </w:pPr>
-          <w:hyperlink w:anchor="_Toc244254957" w:history="1">
+          <w:hyperlink w:anchor="_Toc244255610" w:history="1">
             <w:r>
               <w:rPr>
                 <w:rStyle w:val="Collegamentoipertestuale"/>
@@ -1097,7 +1097,7 @@
               <w:rPr>
                 <w:noProof/>
               </w:rPr>
-              <w:instrText xml:space="preserve"> PAGEREF _Toc244254957 \h </w:instrText>
+              <w:instrText xml:space="preserve"> PAGEREF _Toc244255610 \h </w:instrText>
             </w:r>
             <w:r>
               <w:rPr>
@@ -1134,7 +1134,7 @@
               <w:noProof/>
             </w:rPr>
           </w:pPr>
-          <w:hyperlink w:anchor="_Toc244254958" w:history="1">
+          <w:hyperlink w:anchor="_Toc244255611" w:history="1">
             <w:r>
               <w:rPr>
                 <w:rStyle w:val="Collegamentoipertestuale"/>
@@ -1158,7 +1158,7 @@
               <w:rPr>
                 <w:noProof/>
               </w:rPr>
-              <w:instrText xml:space="preserve"> PAGEREF _Toc244254958 \h </w:instrText>
+              <w:instrText xml:space="preserve"> PAGEREF _Toc244255611 \h </w:instrText>
             </w:r>
             <w:r>
               <w:rPr>
@@ -1195,7 +1195,7 @@
               <w:noProof/>
             </w:rPr>
           </w:pPr>
-          <w:hyperlink w:anchor="_Toc244254959" w:history="1">
+          <w:hyperlink w:anchor="_Toc244255612" w:history="1">
             <w:r>
               <w:rPr>
                 <w:rStyle w:val="Collegamentoipertestuale"/>
@@ -1219,7 +1219,7 @@
               <w:rPr>
                 <w:noProof/>
               </w:rPr>
-              <w:instrText xml:space="preserve"> PAGEREF _Toc244254959 \h </w:instrText>
+              <w:instrText xml:space="preserve"> PAGEREF _Toc244255612 \h </w:instrText>
             </w:r>
             <w:r>
               <w:rPr>
@@ -1256,7 +1256,7 @@
               <w:noProof/>
             </w:rPr>
           </w:pPr>
-          <w:hyperlink w:anchor="_Toc244254960" w:history="1">
+          <w:hyperlink w:anchor="_Toc244255613" w:history="1">
             <w:r>
               <w:rPr>
                 <w:rStyle w:val="Collegamentoipertestuale"/>
@@ -1280,7 +1280,7 @@
               <w:rPr>
                 <w:noProof/>
               </w:rPr>
-              <w:instrText xml:space="preserve"> PAGEREF _Toc244254960 \h </w:instrText>
+              <w:instrText xml:space="preserve"> PAGEREF _Toc244255613 \h </w:instrText>
             </w:r>
             <w:r>
               <w:rPr>
@@ -1317,7 +1317,7 @@
               <w:noProof/>
             </w:rPr>
           </w:pPr>
-          <w:hyperlink w:anchor="_Toc244254961" w:history="1">
+          <w:hyperlink w:anchor="_Toc244255614" w:history="1">
             <w:r>
               <w:rPr>
                 <w:rStyle w:val="Collegamentoipertestuale"/>
@@ -1341,7 +1341,7 @@
               <w:rPr>
                 <w:noProof/>
               </w:rPr>
-              <w:instrText xml:space="preserve"> PAGEREF _Toc244254961 \h </w:instrText>
+              <w:instrText xml:space="preserve"> PAGEREF _Toc244255614 \h </w:instrText>
             </w:r>
             <w:r>
               <w:rPr>
@@ -1378,7 +1378,7 @@
               <w:noProof/>
             </w:rPr>
           </w:pPr>
-          <w:hyperlink w:anchor="_Toc244254962" w:history="1">
+          <w:hyperlink w:anchor="_Toc244255615" w:history="1">
             <w:r>
               <w:rPr>
                 <w:rStyle w:val="Collegamentoipertestuale"/>
@@ -1402,7 +1402,7 @@
               <w:rPr>
                 <w:noProof/>
               </w:rPr>
-              <w:instrText xml:space="preserve"> PAGEREF _Toc244254962 \h </w:instrText>
+              <w:instrText xml:space="preserve"> PAGEREF _Toc244255615 \h </w:instrText>
             </w:r>
             <w:r>
               <w:rPr>
@@ -1439,7 +1439,7 @@
               <w:noProof/>
             </w:rPr>
           </w:pPr>
-          <w:hyperlink w:anchor="_Toc244254963" w:history="1">
+          <w:hyperlink w:anchor="_Toc244255616" w:history="1">
             <w:r>
               <w:rPr>
                 <w:rStyle w:val="Collegamentoipertestuale"/>
@@ -1463,7 +1463,7 @@
               <w:rPr>
                 <w:noProof/>
               </w:rPr>
-              <w:instrText xml:space="preserve"> PAGEREF _Toc244254963 \h </w:instrText>
+              <w:instrText xml:space="preserve"> PAGEREF _Toc244255616 \h </w:instrText>
             </w:r>
             <w:r>
               <w:rPr>
@@ -1500,7 +1500,7 @@
               <w:noProof/>
             </w:rPr>
           </w:pPr>
-          <w:hyperlink w:anchor="_Toc244254964" w:history="1">
+          <w:hyperlink w:anchor="_Toc244255617" w:history="1">
             <w:r>
               <w:rPr>
                 <w:rStyle w:val="Collegamentoipertestuale"/>
@@ -1524,7 +1524,7 @@
               <w:rPr>
                 <w:noProof/>
               </w:rPr>
-              <w:instrText xml:space="preserve"> PAGEREF _Toc244254964 \h </w:instrText>
+              <w:instrText xml:space="preserve"> PAGEREF _Toc244255617 \h </w:instrText>
             </w:r>
             <w:r>
               <w:rPr>
@@ -1561,7 +1561,7 @@
               <w:noProof/>
             </w:rPr>
           </w:pPr>
-          <w:hyperlink w:anchor="_Toc244254965" w:history="1">
+          <w:hyperlink w:anchor="_Toc244255618" w:history="1">
             <w:r>
               <w:rPr>
                 <w:rStyle w:val="Collegamentoipertestuale"/>
@@ -1585,7 +1585,7 @@
               <w:rPr>
                 <w:noProof/>
               </w:rPr>
-              <w:instrText xml:space="preserve"> PAGEREF _Toc244254965 \h </w:instrText>
+              <w:instrText xml:space="preserve"> PAGEREF _Toc244255618 \h </w:instrText>
             </w:r>
             <w:r>
               <w:rPr>
@@ -1622,7 +1622,7 @@
               <w:noProof/>
             </w:rPr>
           </w:pPr>
-          <w:hyperlink w:anchor="_Toc244254966" w:history="1">
+          <w:hyperlink w:anchor="_Toc244255619" w:history="1">
             <w:r>
               <w:rPr>
                 <w:rStyle w:val="Collegamentoipertestuale"/>
@@ -1646,7 +1646,7 @@
               <w:rPr>
                 <w:noProof/>
               </w:rPr>
-              <w:instrText xml:space="preserve"> PAGEREF _Toc244254966 \h </w:instrText>
+              <w:instrText xml:space="preserve"> PAGEREF _Toc244255619 \h </w:instrText>
             </w:r>
             <w:r>
               <w:rPr>
@@ -1683,7 +1683,7 @@
               <w:noProof/>
             </w:rPr>
           </w:pPr>
-          <w:hyperlink w:anchor="_Toc244254967" w:history="1">
+          <w:hyperlink w:anchor="_Toc244255620" w:history="1">
             <w:r>
               <w:rPr>
                 <w:rStyle w:val="Collegamentoipertestuale"/>
@@ -1707,7 +1707,7 @@
               <w:rPr>
                 <w:noProof/>
               </w:rPr>
-              <w:instrText xml:space="preserve"> PAGEREF _Toc244254967 \h </w:instrText>
+              <w:instrText xml:space="preserve"> PAGEREF _Toc244255620 \h </w:instrText>
             </w:r>
             <w:r>
               <w:rPr>
@@ -1744,7 +1744,7 @@
               <w:noProof/>
             </w:rPr>
           </w:pPr>
-          <w:hyperlink w:anchor="_Toc244254968" w:history="1">
+          <w:hyperlink w:anchor="_Toc244255621" w:history="1">
             <w:r>
               <w:rPr>
                 <w:rStyle w:val="Collegamentoipertestuale"/>
@@ -1768,7 +1768,7 @@
               <w:rPr>
                 <w:noProof/>
               </w:rPr>
-              <w:instrText xml:space="preserve"> PAGEREF _Toc244254968 \h </w:instrText>
+              <w:instrText xml:space="preserve"> PAGEREF _Toc244255621 \h </w:instrText>
             </w:r>
             <w:r>
               <w:rPr>
@@ -1805,7 +1805,7 @@
               <w:noProof/>
             </w:rPr>
           </w:pPr>
-          <w:hyperlink w:anchor="_Toc244254969" w:history="1">
+          <w:hyperlink w:anchor="_Toc244255622" w:history="1">
             <w:r>
               <w:rPr>
                 <w:rStyle w:val="Collegamentoipertestuale"/>
@@ -1829,7 +1829,7 @@
               <w:rPr>
                 <w:noProof/>
               </w:rPr>
-              <w:instrText xml:space="preserve"> PAGEREF _Toc244254969 \h </w:instrText>
+              <w:instrText xml:space="preserve"> PAGEREF _Toc244255622 \h </w:instrText>
             </w:r>
             <w:r>
               <w:rPr>
@@ -1866,7 +1866,7 @@
               <w:noProof/>
             </w:rPr>
           </w:pPr>
-          <w:hyperlink w:anchor="_Toc244254970" w:history="1">
+          <w:hyperlink w:anchor="_Toc244255623" w:history="1">
             <w:r>
               <w:rPr>
                 <w:rStyle w:val="Collegamentoipertestuale"/>
@@ -1890,7 +1890,7 @@
               <w:rPr>
                 <w:noProof/>
               </w:rPr>
-              <w:instrText xml:space="preserve"> PAGEREF _Toc244254970 \h </w:instrText>
+              <w:instrText xml:space="preserve"> PAGEREF _Toc244255623 \h </w:instrText>
             </w:r>
             <w:r>
               <w:rPr>
@@ -1927,7 +1927,7 @@
               <w:noProof/>
             </w:rPr>
           </w:pPr>
-          <w:hyperlink w:anchor="_Toc244254971" w:history="1">
+          <w:hyperlink w:anchor="_Toc244255624" w:history="1">
             <w:r>
               <w:rPr>
                 <w:rStyle w:val="Collegamentoipertestuale"/>
@@ -1951,7 +1951,7 @@
               <w:rPr>
                 <w:noProof/>
               </w:rPr>
-              <w:instrText xml:space="preserve"> PAGEREF _Toc244254971 \h </w:instrText>
+              <w:instrText xml:space="preserve"> PAGEREF _Toc244255624 \h </w:instrText>
             </w:r>
             <w:r>
               <w:rPr>
@@ -1988,7 +1988,7 @@
               <w:noProof/>
             </w:rPr>
           </w:pPr>
-          <w:hyperlink w:anchor="_Toc244254972" w:history="1">
+          <w:hyperlink w:anchor="_Toc244255625" w:history="1">
             <w:r>
               <w:rPr>
                 <w:rStyle w:val="Collegamentoipertestuale"/>
@@ -2012,7 +2012,7 @@
               <w:rPr>
                 <w:noProof/>
               </w:rPr>
-              <w:instrText xml:space="preserve"> PAGEREF _Toc244254972 \h </w:instrText>
+              <w:instrText xml:space="preserve"> PAGEREF _Toc244255625 \h </w:instrText>
             </w:r>
             <w:r>
               <w:rPr>
@@ -2049,7 +2049,7 @@
               <w:noProof/>
             </w:rPr>
           </w:pPr>
-          <w:hyperlink w:anchor="_Toc244254973" w:history="1">
+          <w:hyperlink w:anchor="_Toc244255626" w:history="1">
             <w:r>
               <w:rPr>
                 <w:rStyle w:val="Collegamentoipertestuale"/>
@@ -2073,7 +2073,7 @@
               <w:rPr>
                 <w:noProof/>
               </w:rPr>
-              <w:instrText xml:space="preserve"> PAGEREF _Toc244254973 \h </w:instrText>
+              <w:instrText xml:space="preserve"> PAGEREF _Toc244255626 \h </w:instrText>
             </w:r>
             <w:r>
               <w:rPr>
@@ -2110,7 +2110,7 @@
               <w:noProof/>
             </w:rPr>
           </w:pPr>
-          <w:hyperlink w:anchor="_Toc244254974" w:history="1">
+          <w:hyperlink w:anchor="_Toc244255627" w:history="1">
             <w:r>
               <w:rPr>
                 <w:rStyle w:val="Collegamentoipertestuale"/>
@@ -2134,7 +2134,7 @@
               <w:rPr>
                 <w:noProof/>
               </w:rPr>
-              <w:instrText xml:space="preserve"> PAGEREF _Toc244254974 \h </w:instrText>
+              <w:instrText xml:space="preserve"> PAGEREF _Toc244255627 \h </w:instrText>
             </w:r>
             <w:r>
               <w:rPr>
@@ -2171,7 +2171,7 @@
               <w:noProof/>
             </w:rPr>
           </w:pPr>
-          <w:hyperlink w:anchor="_Toc244254975" w:history="1">
+          <w:hyperlink w:anchor="_Toc244255628" w:history="1">
             <w:r>
               <w:rPr>
                 <w:rStyle w:val="Collegamentoipertestuale"/>
@@ -2195,7 +2195,7 @@
               <w:rPr>
                 <w:noProof/>
               </w:rPr>
-              <w:instrText xml:space="preserve"> PAGEREF _Toc244254975 \h </w:instrText>
+              <w:instrText xml:space="preserve"> PAGEREF _Toc244255628 \h </w:instrText>
             </w:r>
             <w:r>
               <w:rPr>
@@ -2232,7 +2232,7 @@
               <w:noProof/>
             </w:rPr>
           </w:pPr>
-          <w:hyperlink w:anchor="_Toc244254976" w:history="1">
+          <w:hyperlink w:anchor="_Toc244255629" w:history="1">
             <w:r>
               <w:rPr>
                 <w:rStyle w:val="Collegamentoipertestuale"/>
@@ -2256,7 +2256,7 @@
               <w:rPr>
                 <w:noProof/>
               </w:rPr>
-              <w:instrText xml:space="preserve"> PAGEREF _Toc244254976 \h </w:instrText>
+              <w:instrText xml:space="preserve"> PAGEREF _Toc244255629 \h </w:instrText>
             </w:r>
             <w:r>
               <w:rPr>
@@ -2293,7 +2293,7 @@
               <w:noProof/>
             </w:rPr>
           </w:pPr>
-          <w:hyperlink w:anchor="_Toc244254977" w:history="1">
+          <w:hyperlink w:anchor="_Toc244255630" w:history="1">
             <w:r>
               <w:rPr>
                 <w:rStyle w:val="Collegamentoipertestuale"/>
@@ -2317,7 +2317,7 @@
               <w:rPr>
                 <w:noProof/>
               </w:rPr>
-              <w:instrText xml:space="preserve"> PAGEREF _Toc244254977 \h </w:instrText>
+              <w:instrText xml:space="preserve"> PAGEREF _Toc244255630 \h </w:instrText>
             </w:r>
             <w:r>
               <w:rPr>
@@ -2354,7 +2354,7 @@
               <w:noProof/>
             </w:rPr>
           </w:pPr>
-          <w:hyperlink w:anchor="_Toc244254978" w:history="1">
+          <w:hyperlink w:anchor="_Toc244255631" w:history="1">
             <w:r>
               <w:rPr>
                 <w:rStyle w:val="Collegamentoipertestuale"/>
@@ -2378,7 +2378,7 @@
               <w:rPr>
                 <w:noProof/>
               </w:rPr>
-              <w:instrText xml:space="preserve"> PAGEREF _Toc244254978 \h </w:instrText>
+              <w:instrText xml:space="preserve"> PAGEREF _Toc244255631 \h </w:instrText>
             </w:r>
             <w:r>
               <w:rPr>
@@ -2415,7 +2415,7 @@
               <w:noProof/>
             </w:rPr>
           </w:pPr>
-          <w:hyperlink w:anchor="_Toc244254979" w:history="1">
+          <w:hyperlink w:anchor="_Toc244255632" w:history="1">
             <w:r>
               <w:rPr>
                 <w:rStyle w:val="Collegamentoipertestuale"/>
@@ -2439,7 +2439,7 @@
               <w:rPr>
                 <w:noProof/>
               </w:rPr>
-              <w:instrText xml:space="preserve"> PAGEREF _Toc244254979 \h </w:instrText>
+              <w:instrText xml:space="preserve"> PAGEREF _Toc244255632 \h </w:instrText>
             </w:r>
             <w:r>
               <w:rPr>
@@ -2476,7 +2476,7 @@
               <w:noProof/>
             </w:rPr>
           </w:pPr>
-          <w:hyperlink w:anchor="_Toc244254980" w:history="1">
+          <w:hyperlink w:anchor="_Toc244255633" w:history="1">
             <w:r>
               <w:rPr>
                 <w:rStyle w:val="Collegamentoipertestuale"/>
@@ -2500,7 +2500,7 @@
               <w:rPr>
                 <w:noProof/>
               </w:rPr>
-              <w:instrText xml:space="preserve"> PAGEREF _Toc244254980 \h </w:instrText>
+              <w:instrText xml:space="preserve"> PAGEREF _Toc244255633 \h </w:instrText>
             </w:r>
             <w:r>
               <w:rPr>
@@ -2537,7 +2537,7 @@
               <w:noProof/>
             </w:rPr>
           </w:pPr>
-          <w:hyperlink w:anchor="_Toc244254981" w:history="1">
+          <w:hyperlink w:anchor="_Toc244255634" w:history="1">
             <w:r>
               <w:rPr>
                 <w:rStyle w:val="Collegamentoipertestuale"/>
@@ -2561,7 +2561,7 @@
               <w:rPr>
                 <w:noProof/>
               </w:rPr>
-              <w:instrText xml:space="preserve"> PAGEREF _Toc244254981 \h </w:instrText>
+              <w:instrText xml:space="preserve"> PAGEREF _Toc244255634 \h </w:instrText>
             </w:r>
             <w:r>
               <w:rPr>
@@ -2598,7 +2598,7 @@
               <w:noProof/>
             </w:rPr>
           </w:pPr>
-          <w:hyperlink w:anchor="_Toc244254982" w:history="1">
+          <w:hyperlink w:anchor="_Toc244255635" w:history="1">
             <w:r>
               <w:rPr>
                 <w:rStyle w:val="Collegamentoipertestuale"/>
@@ -2622,7 +2622,7 @@
               <w:rPr>
                 <w:noProof/>
               </w:rPr>
-              <w:instrText xml:space="preserve"> PAGEREF _Toc244254982 \h </w:instrText>
+              <w:instrText xml:space="preserve"> PAGEREF _Toc244255635 \h </w:instrText>
             </w:r>
             <w:r>
               <w:rPr>
@@ -2659,7 +2659,7 @@
               <w:noProof/>
             </w:rPr>
           </w:pPr>
-          <w:hyperlink w:anchor="_Toc244254983" w:history="1">
+          <w:hyperlink w:anchor="_Toc244255636" w:history="1">
             <w:r>
               <w:rPr>
                 <w:rStyle w:val="Collegamentoipertestuale"/>
@@ -2683,7 +2683,7 @@
               <w:rPr>
                 <w:noProof/>
               </w:rPr>
-              <w:instrText xml:space="preserve"> PAGEREF _Toc244254983 \h </w:instrText>
+              <w:instrText xml:space="preserve"> PAGEREF _Toc244255636 \h </w:instrText>
             </w:r>
             <w:r>
               <w:rPr>
@@ -2720,7 +2720,7 @@
               <w:noProof/>
             </w:rPr>
           </w:pPr>
-          <w:hyperlink w:anchor="_Toc244254984" w:history="1">
+          <w:hyperlink w:anchor="_Toc244255637" w:history="1">
             <w:r>
               <w:rPr>
                 <w:rStyle w:val="Collegamentoipertestuale"/>
@@ -2744,7 +2744,7 @@
               <w:rPr>
                 <w:noProof/>
               </w:rPr>
-              <w:instrText xml:space="preserve"> PAGEREF _Toc244254984 \h </w:instrText>
+              <w:instrText xml:space="preserve"> PAGEREF _Toc244255637 \h </w:instrText>
             </w:r>
             <w:r>
               <w:rPr>
@@ -2781,7 +2781,7 @@
               <w:noProof/>
             </w:rPr>
           </w:pPr>
-          <w:hyperlink w:anchor="_Toc244254985" w:history="1">
+          <w:hyperlink w:anchor="_Toc244255638" w:history="1">
             <w:r>
               <w:rPr>
                 <w:rStyle w:val="Collegamentoipertestuale"/>
@@ -2805,7 +2805,7 @@
               <w:rPr>
                 <w:noProof/>
               </w:rPr>
-              <w:instrText xml:space="preserve"> PAGEREF _Toc244254985 \h </w:instrText>
+              <w:instrText xml:space="preserve"> PAGEREF _Toc244255638 \h </w:instrText>
             </w:r>
             <w:r>
               <w:rPr>
@@ -2842,7 +2842,7 @@
               <w:noProof/>
             </w:rPr>
           </w:pPr>
-          <w:hyperlink w:anchor="_Toc244254986" w:history="1">
+          <w:hyperlink w:anchor="_Toc244255639" w:history="1">
             <w:r>
               <w:rPr>
                 <w:rStyle w:val="Collegamentoipertestuale"/>
@@ -2866,7 +2866,7 @@
               <w:rPr>
                 <w:noProof/>
               </w:rPr>
-              <w:instrText xml:space="preserve"> PAGEREF _Toc244254986 \h </w:instrText>
+              <w:instrText xml:space="preserve"> PAGEREF _Toc244255639 \h </w:instrText>
             </w:r>
             <w:r>
               <w:rPr>
@@ -2903,7 +2903,7 @@
               <w:noProof/>
             </w:rPr>
           </w:pPr>
-          <w:hyperlink w:anchor="_Toc244254987" w:history="1">
+          <w:hyperlink w:anchor="_Toc244255640" w:history="1">
             <w:r>
               <w:rPr>
                 <w:rStyle w:val="Collegamentoipertestuale"/>
@@ -2927,7 +2927,7 @@
               <w:rPr>
                 <w:noProof/>
               </w:rPr>
-              <w:instrText xml:space="preserve"> PAGEREF _Toc244254987 \h </w:instrText>
+              <w:instrText xml:space="preserve"> PAGEREF _Toc244255640 \h </w:instrText>
             </w:r>
             <w:r>
               <w:rPr>
@@ -2964,7 +2964,7 @@
               <w:noProof/>
             </w:rPr>
           </w:pPr>
-          <w:hyperlink w:anchor="_Toc244254988" w:history="1">
+          <w:hyperlink w:anchor="_Toc244255641" w:history="1">
             <w:r>
               <w:rPr>
                 <w:rStyle w:val="Collegamentoipertestuale"/>
@@ -2988,7 +2988,7 @@
               <w:rPr>
                 <w:noProof/>
               </w:rPr>
-              <w:instrText xml:space="preserve"> PAGEREF _Toc244254988 \h </w:instrText>
+              <w:instrText xml:space="preserve"> PAGEREF _Toc244255641 \h </w:instrText>
             </w:r>
             <w:r>
               <w:rPr>
@@ -3025,7 +3025,7 @@
               <w:noProof/>
             </w:rPr>
           </w:pPr>
-          <w:hyperlink w:anchor="_Toc244254989" w:history="1">
+          <w:hyperlink w:anchor="_Toc244255642" w:history="1">
             <w:r>
               <w:rPr>
                 <w:rStyle w:val="Collegamentoipertestuale"/>
@@ -3049,7 +3049,7 @@
               <w:rPr>
                 <w:noProof/>
               </w:rPr>
-              <w:instrText xml:space="preserve"> PAGEREF _Toc244254989 \h </w:instrText>
+              <w:instrText xml:space="preserve"> PAGEREF _Toc244255642 \h </w:instrText>
             </w:r>
             <w:r>
               <w:rPr>
@@ -3086,7 +3086,7 @@
               <w:noProof/>
             </w:rPr>
           </w:pPr>
-          <w:hyperlink w:anchor="_Toc244254990" w:history="1">
+          <w:hyperlink w:anchor="_Toc244255643" w:history="1">
             <w:r>
               <w:rPr>
                 <w:rStyle w:val="Collegamentoipertestuale"/>
@@ -3110,7 +3110,7 @@
               <w:rPr>
                 <w:noProof/>
               </w:rPr>
-              <w:instrText xml:space="preserve"> PAGEREF _Toc244254990 \h </w:instrText>
+              <w:instrText xml:space="preserve"> PAGEREF _Toc244255643 \h </w:instrText>
             </w:r>
             <w:r>
               <w:rPr>
@@ -3147,7 +3147,7 @@
               <w:noProof/>
             </w:rPr>
           </w:pPr>
-          <w:hyperlink w:anchor="_Toc244254991" w:history="1">
+          <w:hyperlink w:anchor="_Toc244255644" w:history="1">
             <w:r>
               <w:rPr>
                 <w:rStyle w:val="Collegamentoipertestuale"/>
@@ -3171,7 +3171,7 @@
               <w:rPr>
                 <w:noProof/>
               </w:rPr>
-              <w:instrText xml:space="preserve"> PAGEREF _Toc244254991 \h </w:instrText>
+              <w:instrText xml:space="preserve"> PAGEREF _Toc244255644 \h </w:instrText>
             </w:r>
             <w:r>
               <w:rPr>
@@ -3208,7 +3208,7 @@
               <w:noProof/>
             </w:rPr>
           </w:pPr>
-          <w:hyperlink w:anchor="_Toc244254992" w:history="1">
+          <w:hyperlink w:anchor="_Toc244255645" w:history="1">
             <w:r>
               <w:rPr>
                 <w:rStyle w:val="Collegamentoipertestuale"/>
@@ -3232,7 +3232,7 @@
               <w:rPr>
                 <w:noProof/>
               </w:rPr>
-              <w:instrText xml:space="preserve"> PAGEREF _Toc244254992 \h </w:instrText>
+              <w:instrText xml:space="preserve"> PAGEREF _Toc244255645 \h </w:instrText>
             </w:r>
             <w:r>
               <w:rPr>
@@ -3269,7 +3269,7 @@
               <w:noProof/>
             </w:rPr>
           </w:pPr>
-          <w:hyperlink w:anchor="_Toc244254993" w:history="1">
+          <w:hyperlink w:anchor="_Toc244255646" w:history="1">
             <w:r>
               <w:rPr>
                 <w:rStyle w:val="Collegamentoipertestuale"/>
@@ -3293,7 +3293,7 @@
               <w:rPr>
                 <w:noProof/>
               </w:rPr>
-              <w:instrText xml:space="preserve"> PAGEREF _Toc244254993 \h </w:instrText>
+              <w:instrText xml:space="preserve"> PAGEREF _Toc244255646 \h </w:instrText>
             </w:r>
             <w:r>
               <w:rPr>
@@ -3330,7 +3330,7 @@
               <w:noProof/>
             </w:rPr>
           </w:pPr>
-          <w:hyperlink w:anchor="_Toc244254994" w:history="1">
+          <w:hyperlink w:anchor="_Toc244255647" w:history="1">
             <w:r>
               <w:rPr>
                 <w:rStyle w:val="Collegamentoipertestuale"/>
@@ -3354,7 +3354,7 @@
               <w:rPr>
                 <w:noProof/>
               </w:rPr>
-              <w:instrText xml:space="preserve"> PAGEREF _Toc244254994 \h </w:instrText>
+              <w:instrText xml:space="preserve"> PAGEREF _Toc244255647 \h </w:instrText>
             </w:r>
             <w:r>
               <w:rPr>
@@ -3391,7 +3391,7 @@
               <w:noProof/>
             </w:rPr>
           </w:pPr>
-          <w:hyperlink w:anchor="_Toc244254995" w:history="1">
+          <w:hyperlink w:anchor="_Toc244255648" w:history="1">
             <w:r>
               <w:rPr>
                 <w:rStyle w:val="Collegamentoipertestuale"/>
@@ -3415,7 +3415,7 @@
               <w:rPr>
                 <w:noProof/>
               </w:rPr>
-              <w:instrText xml:space="preserve"> PAGEREF _Toc244254995 \h </w:instrText>
+              <w:instrText xml:space="preserve"> PAGEREF _Toc244255648 \h </w:instrText>
             </w:r>
             <w:r>
               <w:rPr>
@@ -3452,7 +3452,7 @@
               <w:noProof/>
             </w:rPr>
           </w:pPr>
-          <w:hyperlink w:anchor="_Toc244254996" w:history="1">
+          <w:hyperlink w:anchor="_Toc244255649" w:history="1">
             <w:r>
               <w:rPr>
                 <w:rStyle w:val="Collegamentoipertestuale"/>
@@ -3476,7 +3476,7 @@
               <w:rPr>
                 <w:noProof/>
               </w:rPr>
-              <w:instrText xml:space="preserve"> PAGEREF _Toc244254996 \h </w:instrText>
+              <w:instrText xml:space="preserve"> PAGEREF _Toc244255649 \h </w:instrText>
             </w:r>
             <w:r>
               <w:rPr>
@@ -3513,7 +3513,7 @@
               <w:noProof/>
             </w:rPr>
           </w:pPr>
-          <w:hyperlink w:anchor="_Toc244254997" w:history="1">
+          <w:hyperlink w:anchor="_Toc244255650" w:history="1">
             <w:r>
               <w:rPr>
                 <w:rStyle w:val="Collegamentoipertestuale"/>
@@ -3537,7 +3537,7 @@
               <w:rPr>
                 <w:noProof/>
               </w:rPr>
-              <w:instrText xml:space="preserve"> PAGEREF _Toc244254997 \h </w:instrText>
+              <w:instrText xml:space="preserve"> PAGEREF _Toc244255650 \h </w:instrText>
             </w:r>
             <w:r>
               <w:rPr>
@@ -3574,7 +3574,7 @@
               <w:noProof/>
             </w:rPr>
           </w:pPr>
-          <w:hyperlink w:anchor="_Toc244254998" w:history="1">
+          <w:hyperlink w:anchor="_Toc244255651" w:history="1">
             <w:r>
               <w:rPr>
                 <w:rStyle w:val="Collegamentoipertestuale"/>
@@ -3598,7 +3598,7 @@
               <w:rPr>
                 <w:noProof/>
               </w:rPr>
-              <w:instrText xml:space="preserve"> PAGEREF _Toc244254998 \h </w:instrText>
+              <w:instrText xml:space="preserve"> PAGEREF _Toc244255651 \h </w:instrText>
             </w:r>
             <w:r>
               <w:rPr>
@@ -3635,7 +3635,7 @@
               <w:noProof/>
             </w:rPr>
           </w:pPr>
-          <w:hyperlink w:anchor="_Toc244254999" w:history="1">
+          <w:hyperlink w:anchor="_Toc244255652" w:history="1">
             <w:r>
               <w:rPr>
                 <w:rStyle w:val="Collegamentoipertestuale"/>
@@ -3659,7 +3659,7 @@
               <w:rPr>
                 <w:noProof/>
               </w:rPr>
-              <w:instrText xml:space="preserve"> PAGEREF _Toc244254999 \h </w:instrText>
+              <w:instrText xml:space="preserve"> PAGEREF _Toc244255652 \h </w:instrText>
             </w:r>
             <w:r>
               <w:rPr>
@@ -3696,7 +3696,7 @@
               <w:noProof/>
             </w:rPr>
           </w:pPr>
-          <w:hyperlink w:anchor="_Toc244255000" w:history="1">
+          <w:hyperlink w:anchor="_Toc244255653" w:history="1">
             <w:r>
               <w:rPr>
                 <w:rStyle w:val="Collegamentoipertestuale"/>
@@ -3720,7 +3720,7 @@
               <w:rPr>
                 <w:noProof/>
               </w:rPr>
-              <w:instrText xml:space="preserve"> PAGEREF _Toc244255000 \h </w:instrText>
+              <w:instrText xml:space="preserve"> PAGEREF _Toc244255653 \h </w:instrText>
             </w:r>
             <w:r>
               <w:rPr>
@@ -3757,7 +3757,7 @@
               <w:noProof/>
             </w:rPr>
           </w:pPr>
-          <w:hyperlink w:anchor="_Toc244255001" w:history="1">
+          <w:hyperlink w:anchor="_Toc244255654" w:history="1">
             <w:r>
               <w:rPr>
                 <w:rStyle w:val="Collegamentoipertestuale"/>
@@ -3781,7 +3781,7 @@
               <w:rPr>
                 <w:noProof/>
               </w:rPr>
-              <w:instrText xml:space="preserve"> PAGEREF _Toc244255001 \h </w:instrText>
+              <w:instrText xml:space="preserve"> PAGEREF _Toc244255654 \h </w:instrText>
             </w:r>
             <w:r>
               <w:rPr>
@@ -3824,7 +3824,7 @@
       <w:pPr>
         <w:pStyle w:val="Titolo1"/>
       </w:pPr>
-      <w:bookmarkStart w:id="0" w:name="_Toc244254942"/>
+      <w:bookmarkStart w:id="0" w:name="_Toc244255595"/>
       <w:r>
         <w:t>1. In breve</w:t>
       </w:r>
@@ -4225,7 +4225,7 @@
       <w:pPr>
         <w:pStyle w:val="Titolo1"/>
       </w:pPr>
-      <w:bookmarkStart w:id="1" w:name="_Toc244254943"/>
+      <w:bookmarkStart w:id="1" w:name="_Toc244255596"/>
       <w:r>
         <w:t>2. Nuovo marchio</w:t>
       </w:r>
@@ -4235,7 +4235,7 @@
       <w:pPr>
         <w:pStyle w:val="Titolo2"/>
       </w:pPr>
-      <w:bookmarkStart w:id="2" w:name="_Toc244254944"/>
+      <w:bookmarkStart w:id="2" w:name="_Toc244255597"/>
       <w:r>
         <w:t>2.1 Nomi e identificativi</w:t>
       </w:r>
@@ -4781,7 +4781,7 @@
       <w:pPr>
         <w:pStyle w:val="Titolo2"/>
       </w:pPr>
-      <w:bookmarkStart w:id="3" w:name="_Toc244254945"/>
+      <w:bookmarkStart w:id="3" w:name="_Toc244255598"/>
       <w:r>
         <w:t>2.2 Colori</w:t>
       </w:r>
@@ -5176,7 +5176,7 @@
       <w:pPr>
         <w:pStyle w:val="Titolo2"/>
       </w:pPr>
-      <w:bookmarkStart w:id="4" w:name="_Toc244254946"/>
+      <w:bookmarkStart w:id="4" w:name="_Toc244255599"/>
       <w:r>
         <w:t>2.3 Icona in uso: 24 «Foglio senza fondo» (serie 6, 22 ottobre)</w:t>
       </w:r>
@@ -5210,7 +5210,7 @@
           <w:noProof/>
         </w:rPr>
         <w:drawing>
-          <wp:inline distT="0" distB="0" distL="0" distR="0" wp14:anchorId="20089171" wp14:editId="03C04E7B">
+          <wp:inline distT="0" distB="0" distL="0" distR="0" wp14:anchorId="3503E736" wp14:editId="71C9CFA4">
             <wp:extent cx="3429000" cy="4000500"/>
             <wp:effectExtent l="0" t="0" r="0" b="0"/>
             <wp:docPr id="2" name="Immagine 2"/>
@@ -5269,7 +5269,7 @@
       <w:pPr>
         <w:pStyle w:val="Titolo2"/>
       </w:pPr>
-      <w:bookmarkStart w:id="5" w:name="_Toc244254947"/>
+      <w:bookmarkStart w:id="5" w:name="_Toc244255600"/>
       <w:r>
         <w:t>2.4 Serie 4: la 17 «Foglio oro», in uso fino al 21 ottobre</w:t>
       </w:r>
@@ -5303,7 +5303,7 @@
           <w:noProof/>
         </w:rPr>
         <w:drawing>
-          <wp:inline distT="0" distB="0" distL="0" distR="0" wp14:anchorId="038F8188" wp14:editId="3368DE67">
+          <wp:inline distT="0" distB="0" distL="0" distR="0" wp14:anchorId="662FBC4A" wp14:editId="50574A82">
             <wp:extent cx="5334000" cy="5895975"/>
             <wp:effectExtent l="0" t="0" r="0" b="0"/>
             <wp:docPr id="3" name="Immagine 3"/>
@@ -5716,7 +5716,7 @@
       <w:pPr>
         <w:pStyle w:val="Titolo2"/>
       </w:pPr>
-      <w:bookmarkStart w:id="6" w:name="_Toc244254948"/>
+      <w:bookmarkStart w:id="6" w:name="_Toc244255601"/>
       <w:r>
         <w:t>2.5 Serie 5: la 17 con più bianco, la 19 in uso il 21 ottobre</w:t>
       </w:r>
@@ -5750,7 +5750,7 @@
           <w:noProof/>
         </w:rPr>
         <w:drawing>
-          <wp:inline distT="0" distB="0" distL="0" distR="0" wp14:anchorId="5928DE66" wp14:editId="0FE8C5C0">
+          <wp:inline distT="0" distB="0" distL="0" distR="0" wp14:anchorId="3FD23F15" wp14:editId="7FCAEB02">
             <wp:extent cx="5715000" cy="3295650"/>
             <wp:effectExtent l="0" t="0" r="0" b="0"/>
             <wp:docPr id="4" name="Immagine 4"/>
@@ -6297,7 +6297,7 @@
       <w:pPr>
         <w:pStyle w:val="Titolo2"/>
       </w:pPr>
-      <w:bookmarkStart w:id="7" w:name="_Toc244254949"/>
+      <w:bookmarkStart w:id="7" w:name="_Toc244255602"/>
       <w:r>
         <w:t>2.6 Serie 3, non scelta (la 11 è diventata la serie 4)</w:t>
       </w:r>
@@ -6321,7 +6321,7 @@
           <w:noProof/>
         </w:rPr>
         <w:drawing>
-          <wp:inline distT="0" distB="0" distL="0" distR="0" wp14:anchorId="6FF7104B" wp14:editId="7438FA44">
+          <wp:inline distT="0" distB="0" distL="0" distR="0" wp14:anchorId="26A69886" wp14:editId="60361CA0">
             <wp:extent cx="5905500" cy="4133850"/>
             <wp:effectExtent l="0" t="0" r="0" b="0"/>
             <wp:docPr id="5" name="Immagine 5"/>
@@ -7007,7 +7007,7 @@
       <w:pPr>
         <w:pStyle w:val="Titolo2"/>
       </w:pPr>
-      <w:bookmarkStart w:id="8" w:name="_Toc244254950"/>
+      <w:bookmarkStart w:id="8" w:name="_Toc244255603"/>
       <w:r>
         <w:t>2.7 Serie 2, non scelta</w:t>
       </w:r>
@@ -7031,7 +7031,7 @@
           <w:noProof/>
         </w:rPr>
         <w:drawing>
-          <wp:inline distT="0" distB="0" distL="0" distR="0" wp14:anchorId="48E5E7A2" wp14:editId="36F3FF1A">
+          <wp:inline distT="0" distB="0" distL="0" distR="0" wp14:anchorId="16F51F10" wp14:editId="54B562BB">
             <wp:extent cx="5905500" cy="4133850"/>
             <wp:effectExtent l="0" t="0" r="0" b="0"/>
             <wp:docPr id="6" name="Immagine 6"/>
@@ -7751,7 +7751,7 @@
       <w:pPr>
         <w:pStyle w:val="Titolo2"/>
       </w:pPr>
-      <w:bookmarkStart w:id="9" w:name="_Toc244254951"/>
+      <w:bookmarkStart w:id="9" w:name="_Toc244255604"/>
       <w:r>
         <w:t>2.8 Serie 1, scartata</w:t>
       </w:r>
@@ -7775,7 +7775,7 @@
           <w:noProof/>
         </w:rPr>
         <w:drawing>
-          <wp:inline distT="0" distB="0" distL="0" distR="0" wp14:anchorId="498E6CB3" wp14:editId="77ECEA36">
+          <wp:inline distT="0" distB="0" distL="0" distR="0" wp14:anchorId="4D99896F" wp14:editId="163A3793">
             <wp:extent cx="4000500" cy="2800350"/>
             <wp:effectExtent l="0" t="0" r="0" b="0"/>
             <wp:docPr id="7" name="Immagine 7"/>
@@ -7834,7 +7834,7 @@
       <w:pPr>
         <w:pStyle w:val="Titolo2"/>
       </w:pPr>
-      <w:bookmarkStart w:id="10" w:name="_Toc244254952"/>
+      <w:bookmarkStart w:id="10" w:name="_Toc244255605"/>
       <w:r>
         <w:t>2.9 Verifica dei marchi registrati</w:t>
       </w:r>
@@ -8086,7 +8086,7 @@
       <w:pPr>
         <w:pStyle w:val="Titolo1"/>
       </w:pPr>
-      <w:bookmarkStart w:id="11" w:name="_Toc244254953"/>
+      <w:bookmarkStart w:id="11" w:name="_Toc244255606"/>
       <w:r>
         <w:t>3. Temi colore</w:t>
       </w:r>
@@ -8120,7 +8120,7 @@
           <w:noProof/>
         </w:rPr>
         <w:drawing>
-          <wp:inline distT="0" distB="0" distL="0" distR="0" wp14:anchorId="56E21BFE" wp14:editId="3B58BB36">
+          <wp:inline distT="0" distB="0" distL="0" distR="0" wp14:anchorId="5272CA7C" wp14:editId="18CEC6D9">
             <wp:extent cx="4572000" cy="3429000"/>
             <wp:effectExtent l="0" t="0" r="0" b="0"/>
             <wp:docPr id="8" name="Immagine 8"/>
@@ -8830,7 +8830,7 @@
       <w:pPr>
         <w:pStyle w:val="Titolo1"/>
       </w:pPr>
-      <w:bookmarkStart w:id="12" w:name="_Toc244254954"/>
+      <w:bookmarkStart w:id="12" w:name="_Toc244255607"/>
       <w:r>
         <w:t>4. Correzione: avvisi «come JavaScript»</w:t>
       </w:r>
@@ -8840,7 +8840,7 @@
       <w:pPr>
         <w:pStyle w:val="Titolo2"/>
       </w:pPr>
-      <w:bookmarkStart w:id="13" w:name="_Toc244254955"/>
+      <w:bookmarkStart w:id="13" w:name="_Toc244255608"/>
       <w:r>
         <w:t>4.1 Il problema</w:t>
       </w:r>
@@ -9243,7 +9243,7 @@
       <w:pPr>
         <w:pStyle w:val="Titolo2"/>
       </w:pPr>
-      <w:bookmarkStart w:id="14" w:name="_Toc244254956"/>
+      <w:bookmarkStart w:id="14" w:name="_Toc244255609"/>
       <w:r>
         <w:t>4.2 La soluzione</w:t>
       </w:r>
@@ -9376,7 +9376,7 @@
           <w:noProof/>
         </w:rPr>
         <w:drawing>
-          <wp:inline distT="0" distB="0" distL="0" distR="0" wp14:anchorId="5612DB96" wp14:editId="2C7EE295">
+          <wp:inline distT="0" distB="0" distL="0" distR="0" wp14:anchorId="4FAF3777" wp14:editId="0FEFB8C2">
             <wp:extent cx="4572000" cy="3429000"/>
             <wp:effectExtent l="0" t="0" r="0" b="0"/>
             <wp:docPr id="9" name="Immagine 9"/>
@@ -9435,7 +9435,7 @@
       <w:pPr>
         <w:pStyle w:val="Titolo2"/>
       </w:pPr>
-      <w:bookmarkStart w:id="15" w:name="_Toc244254957"/>
+      <w:bookmarkStart w:id="15" w:name="_Toc244255610"/>
       <w:r>
         <w:t>4.3 Verifiche</w:t>
       </w:r>
@@ -9482,7 +9482,7 @@
       <w:pPr>
         <w:pStyle w:val="Titolo2"/>
       </w:pPr>
-      <w:bookmarkStart w:id="16" w:name="_Toc244254958"/>
+      <w:bookmarkStart w:id="16" w:name="_Toc244255611"/>
       <w:r>
         <w:t>4.4 Android: menu Tema e notifiche (versione 1.0.1)</w:t>
       </w:r>
@@ -9817,7 +9817,7 @@
       <w:pPr>
         <w:pStyle w:val="Titolo2"/>
       </w:pPr>
-      <w:bookmarkStart w:id="17" w:name="_Toc244254959"/>
+      <w:bookmarkStart w:id="17" w:name="_Toc244255612"/>
       <w:r>
         <w:t>4.5 App più leggera: traduzione tolta</w:t>
       </w:r>
@@ -10250,7 +10250,7 @@
       <w:pPr>
         <w:pStyle w:val="Titolo2"/>
       </w:pPr>
-      <w:bookmarkStart w:id="18" w:name="_Toc244254960"/>
+      <w:bookmarkStart w:id="18" w:name="_Toc244255613"/>
       <w:r>
         <w:t>4.6 Schede in una nuova finestra</w:t>
       </w:r>
@@ -10368,7 +10368,7 @@
           <w:noProof/>
         </w:rPr>
         <w:drawing>
-          <wp:inline distT="0" distB="0" distL="0" distR="0" wp14:anchorId="1AC746D9" wp14:editId="69F5A8B4">
+          <wp:inline distT="0" distB="0" distL="0" distR="0" wp14:anchorId="7A8FACDC" wp14:editId="74E77193">
             <wp:extent cx="5715000" cy="857250"/>
             <wp:effectExtent l="0" t="0" r="0" b="0"/>
             <wp:docPr id="10" name="Immagine 10"/>
@@ -10657,7 +10657,7 @@
       <w:pPr>
         <w:pStyle w:val="Titolo2"/>
       </w:pPr>
-      <w:bookmarkStart w:id="19" w:name="_Toc244254961"/>
+      <w:bookmarkStart w:id="19" w:name="_Toc244255614"/>
       <w:r>
         <w:t>4.7 Riunire le finestre</w:t>
       </w:r>
@@ -10759,7 +10759,7 @@
       <w:pPr>
         <w:pStyle w:val="Titolo2"/>
       </w:pPr>
-      <w:bookmarkStart w:id="20" w:name="_Toc244254962"/>
+      <w:bookmarkStart w:id="20" w:name="_Toc244255615"/>
       <w:r>
         <w:t>4.8 Correzioni di «Modifica testo»</w:t>
       </w:r>
@@ -11024,7 +11024,7 @@
           <w:noProof/>
         </w:rPr>
         <w:drawing>
-          <wp:inline distT="0" distB="0" distL="0" distR="0" wp14:anchorId="1055F23C" wp14:editId="4C3AB067">
+          <wp:inline distT="0" distB="0" distL="0" distR="0" wp14:anchorId="6DFD05C4" wp14:editId="1ED329AA">
             <wp:extent cx="3286125" cy="2286000"/>
             <wp:effectExtent l="0" t="0" r="0" b="0"/>
             <wp:docPr id="11" name="Immagine 11"/>
@@ -11089,7 +11089,7 @@
           <w:noProof/>
         </w:rPr>
         <w:drawing>
-          <wp:inline distT="0" distB="0" distL="0" distR="0" wp14:anchorId="028E39A3" wp14:editId="2545CA01">
+          <wp:inline distT="0" distB="0" distL="0" distR="0" wp14:anchorId="25F2232B" wp14:editId="553BFC3D">
             <wp:extent cx="3286125" cy="2286000"/>
             <wp:effectExtent l="0" t="0" r="0" b="0"/>
             <wp:docPr id="12" name="Immagine 12"/>
@@ -11156,7 +11156,7 @@
       <w:pPr>
         <w:pStyle w:val="Titolo2"/>
       </w:pPr>
-      <w:bookmarkStart w:id="21" w:name="_Toc244254963"/>
+      <w:bookmarkStart w:id="21" w:name="_Toc244255616"/>
       <w:r>
         <w:t>4.9 Web app per iPhone</w:t>
       </w:r>
@@ -11595,7 +11595,7 @@
       <w:pPr>
         <w:pStyle w:val="Titolo2"/>
       </w:pPr>
-      <w:bookmarkStart w:id="22" w:name="_Toc244254964"/>
+      <w:bookmarkStart w:id="22" w:name="_Toc244255617"/>
       <w:r>
         <w:t>4.10 Aggiornamenti su Cloudflare (repository privato)</w:t>
       </w:r>
@@ -12109,7 +12109,7 @@
       <w:pPr>
         <w:pStyle w:val="Titolo2"/>
       </w:pPr>
-      <w:bookmarkStart w:id="23" w:name="_Toc244254965"/>
+      <w:bookmarkStart w:id="23" w:name="_Toc244255618"/>
       <w:r>
         <w:t>4.11 Eliminare firme, timbri e testi già applicati (versione 1.4.0)</w:t>
       </w:r>
@@ -12440,7 +12440,7 @@
           <w:noProof/>
         </w:rPr>
         <w:drawing>
-          <wp:inline distT="0" distB="0" distL="0" distR="0" wp14:anchorId="01634D27" wp14:editId="599391E8">
+          <wp:inline distT="0" distB="0" distL="0" distR="0" wp14:anchorId="7948A545" wp14:editId="72F94498">
             <wp:extent cx="2095500" cy="4533900"/>
             <wp:effectExtent l="0" t="0" r="0" b="0"/>
             <wp:docPr id="13" name="Immagine 13"/>
@@ -12537,7 +12537,7 @@
       <w:pPr>
         <w:pStyle w:val="Titolo2"/>
       </w:pPr>
-      <w:bookmarkStart w:id="24" w:name="_Toc244254966"/>
+      <w:bookmarkStart w:id="24" w:name="_Toc244255619"/>
       <w:r>
         <w:t>4.12 Telefono: pannello più grande e caselle di testo comode (versione 1.4.0)</w:t>
       </w:r>
@@ -12605,7 +12605,7 @@
           <w:noProof/>
         </w:rPr>
         <w:drawing>
-          <wp:inline distT="0" distB="0" distL="0" distR="0" wp14:anchorId="0D5148BA" wp14:editId="025FC58A">
+          <wp:inline distT="0" distB="0" distL="0" distR="0" wp14:anchorId="5FC97739" wp14:editId="4EEFB739">
             <wp:extent cx="2095500" cy="4533900"/>
             <wp:effectExtent l="0" t="0" r="0" b="0"/>
             <wp:docPr id="14" name="Immagine 14"/>
@@ -12670,7 +12670,7 @@
           <w:noProof/>
         </w:rPr>
         <w:drawing>
-          <wp:inline distT="0" distB="0" distL="0" distR="0" wp14:anchorId="2F29FAED" wp14:editId="788C2DFD">
+          <wp:inline distT="0" distB="0" distL="0" distR="0" wp14:anchorId="5D54E6AA" wp14:editId="1D21E33F">
             <wp:extent cx="2095500" cy="4533900"/>
             <wp:effectExtent l="0" t="0" r="0" b="0"/>
             <wp:docPr id="15" name="Immagine 15"/>
@@ -12729,7 +12729,7 @@
       <w:pPr>
         <w:pStyle w:val="Titolo2"/>
       </w:pPr>
-      <w:bookmarkStart w:id="25" w:name="_Toc244254967"/>
+      <w:bookmarkStart w:id="25" w:name="_Toc244255620"/>
       <w:r>
         <w:t>4.13 Spostare firme, timbri e testi già applicati (versione 1.5.0)</w:t>
       </w:r>
@@ -12781,7 +12781,7 @@
           <w:noProof/>
         </w:rPr>
         <w:drawing>
-          <wp:inline distT="0" distB="0" distL="0" distR="0" wp14:anchorId="34CD363A" wp14:editId="3FA61787">
+          <wp:inline distT="0" distB="0" distL="0" distR="0" wp14:anchorId="3817B969" wp14:editId="0130BC9A">
             <wp:extent cx="4953000" cy="3095625"/>
             <wp:effectExtent l="0" t="0" r="0" b="0"/>
             <wp:docPr id="16" name="Immagine 16"/>
@@ -12840,7 +12840,7 @@
       <w:pPr>
         <w:pStyle w:val="Titolo2"/>
       </w:pPr>
-      <w:bookmarkStart w:id="26" w:name="_Toc244254968"/>
+      <w:bookmarkStart w:id="26" w:name="_Toc244255621"/>
       <w:r>
         <w:t>4.14 Modi di lettura e presentazione (versione 1.5.0)</w:t>
       </w:r>
@@ -12977,7 +12977,7 @@
           <w:noProof/>
         </w:rPr>
         <w:drawing>
-          <wp:inline distT="0" distB="0" distL="0" distR="0" wp14:anchorId="61E16251" wp14:editId="1E85BA2F">
+          <wp:inline distT="0" distB="0" distL="0" distR="0" wp14:anchorId="45C0100D" wp14:editId="74348DB9">
             <wp:extent cx="4953000" cy="3095625"/>
             <wp:effectExtent l="0" t="0" r="0" b="0"/>
             <wp:docPr id="17" name="Immagine 17"/>
@@ -13042,7 +13042,7 @@
           <w:noProof/>
         </w:rPr>
         <w:drawing>
-          <wp:inline distT="0" distB="0" distL="0" distR="0" wp14:anchorId="0B44611D" wp14:editId="594E4650">
+          <wp:inline distT="0" distB="0" distL="0" distR="0" wp14:anchorId="1F2DF70F" wp14:editId="416BAFE0">
             <wp:extent cx="1905000" cy="4124325"/>
             <wp:effectExtent l="0" t="0" r="0" b="0"/>
             <wp:docPr id="18" name="Immagine 18"/>
@@ -13101,7 +13101,7 @@
       <w:pPr>
         <w:pStyle w:val="Titolo2"/>
       </w:pPr>
-      <w:bookmarkStart w:id="27" w:name="_Toc244254969"/>
+      <w:bookmarkStart w:id="27" w:name="_Toc244255622"/>
       <w:r>
         <w:t>4.15 Correzione: immagini sulle pagine ruotate (versione 1.5.0)</w:t>
       </w:r>
@@ -13129,7 +13129,7 @@
       <w:pPr>
         <w:pStyle w:val="Titolo1"/>
       </w:pPr>
-      <w:bookmarkStart w:id="28" w:name="_Toc244254970"/>
+      <w:bookmarkStart w:id="28" w:name="_Toc244255623"/>
       <w:r>
         <w:t>5. Decisioni</w:t>
       </w:r>
@@ -13147,7 +13147,7 @@
       <w:pPr>
         <w:pStyle w:val="Titolo2"/>
       </w:pPr>
-      <w:bookmarkStart w:id="29" w:name="_Toc244254971"/>
+      <w:bookmarkStart w:id="29" w:name="_Toc244255624"/>
       <w:r>
         <w:t>5.1 Canale degli aggiornamenti</w:t>
       </w:r>
@@ -13654,7 +13654,7 @@
       <w:pPr>
         <w:pStyle w:val="Titolo2"/>
       </w:pPr>
-      <w:bookmarkStart w:id="30" w:name="_Toc244254972"/>
+      <w:bookmarkStart w:id="30" w:name="_Toc244255625"/>
       <w:r>
         <w:t>5.2 Storia del repository</w:t>
       </w:r>
@@ -14161,7 +14161,7 @@
       <w:pPr>
         <w:pStyle w:val="Titolo2"/>
       </w:pPr>
-      <w:bookmarkStart w:id="31" w:name="_Toc244254973"/>
+      <w:bookmarkStart w:id="31" w:name="_Toc244255626"/>
       <w:r>
         <w:t>5.3 Identificativi del prodotto</w:t>
       </w:r>
@@ -14661,7 +14661,7 @@
       <w:pPr>
         <w:pStyle w:val="Titolo2"/>
       </w:pPr>
-      <w:bookmarkStart w:id="32" w:name="_Toc244254974"/>
+      <w:bookmarkStart w:id="32" w:name="_Toc244255627"/>
       <w:r>
         <w:t>5.4 Avvisi e domande</w:t>
       </w:r>
@@ -15168,7 +15168,7 @@
       <w:pPr>
         <w:pStyle w:val="Titolo2"/>
       </w:pPr>
-      <w:bookmarkStart w:id="33" w:name="_Toc244254975"/>
+      <w:bookmarkStart w:id="33" w:name="_Toc244255628"/>
       <w:r>
         <w:t>5.5 Traduzione offline</w:t>
       </w:r>
@@ -15675,7 +15675,7 @@
       <w:pPr>
         <w:pStyle w:val="Titolo2"/>
       </w:pPr>
-      <w:bookmarkStart w:id="34" w:name="_Toc244254976"/>
+      <w:bookmarkStart w:id="34" w:name="_Toc244255629"/>
       <w:r>
         <w:t>5.6 Passaggio della scheda alla nuova finestra</w:t>
       </w:r>
@@ -16197,7 +16197,7 @@
       <w:pPr>
         <w:pStyle w:val="Titolo2"/>
       </w:pPr>
-      <w:bookmarkStart w:id="35" w:name="_Toc244254977"/>
+      <w:bookmarkStart w:id="35" w:name="_Toc244255630"/>
       <w:r>
         <w:t>5.7 Come si cancella la riga in «Modifica testo»</w:t>
       </w:r>
@@ -16704,7 +16704,7 @@
       <w:pPr>
         <w:pStyle w:val="Titolo2"/>
       </w:pPr>
-      <w:bookmarkStart w:id="36" w:name="_Toc244254978"/>
+      <w:bookmarkStart w:id="36" w:name="_Toc244255631"/>
       <w:r>
         <w:t>5.9 Lettura a libro e presentazione</w:t>
       </w:r>
@@ -17211,7 +17211,7 @@
       <w:pPr>
         <w:pStyle w:val="Titolo2"/>
       </w:pPr>
-      <w:bookmarkStart w:id="37" w:name="_Toc244254979"/>
+      <w:bookmarkStart w:id="37" w:name="_Toc244255632"/>
       <w:r>
         <w:t>5.8 Come si ritrovano firme e timbri applicati</w:t>
       </w:r>
@@ -17748,7 +17748,7 @@
       <w:pPr>
         <w:pStyle w:val="Titolo1"/>
       </w:pPr>
-      <w:bookmarkStart w:id="38" w:name="_Toc244254980"/>
+      <w:bookmarkStart w:id="38" w:name="_Toc244255633"/>
       <w:r>
         <w:t>6. Come si lavora</w:t>
       </w:r>
@@ -17758,7 +17758,7 @@
       <w:pPr>
         <w:pStyle w:val="Titolo2"/>
       </w:pPr>
-      <w:bookmarkStart w:id="39" w:name="_Toc244254981"/>
+      <w:bookmarkStart w:id="39" w:name="_Toc244255634"/>
       <w:r>
         <w:t>6.1 Comandi</w:t>
       </w:r>
@@ -17828,7 +17828,7 @@
       <w:pPr>
         <w:pStyle w:val="Titolo2"/>
       </w:pPr>
-      <w:bookmarkStart w:id="40" w:name="_Toc244254982"/>
+      <w:bookmarkStart w:id="40" w:name="_Toc244255635"/>
       <w:r>
         <w:t>6.2 Pubblicare una versione</w:t>
       </w:r>
@@ -17956,7 +17956,7 @@
       <w:pPr>
         <w:pStyle w:val="Titolo2"/>
       </w:pPr>
-      <w:bookmarkStart w:id="41" w:name="_Toc244254983"/>
+      <w:bookmarkStart w:id="41" w:name="_Toc244255636"/>
       <w:r>
         <w:t>6.3 Release 1.0.0 (pubblicata il 16 ottobre 2026)</w:t>
       </w:r>
@@ -18683,7 +18683,7 @@
       <w:pPr>
         <w:pStyle w:val="Titolo2"/>
       </w:pPr>
-      <w:bookmarkStart w:id="42" w:name="_Toc244254984"/>
+      <w:bookmarkStart w:id="42" w:name="_Toc244255637"/>
       <w:r>
         <w:t>6.4 Release 1.0.1</w:t>
       </w:r>
@@ -18980,7 +18980,7 @@
       <w:pPr>
         <w:pStyle w:val="Titolo2"/>
       </w:pPr>
-      <w:bookmarkStart w:id="43" w:name="_Toc244254985"/>
+      <w:bookmarkStart w:id="43" w:name="_Toc244255638"/>
       <w:r>
         <w:t>6.5 Release 1.0.2 e repository pubblico</w:t>
       </w:r>
@@ -19402,7 +19402,7 @@
       <w:pPr>
         <w:pStyle w:val="Titolo2"/>
       </w:pPr>
-      <w:bookmarkStart w:id="44" w:name="_Toc244254986"/>
+      <w:bookmarkStart w:id="44" w:name="_Toc244255639"/>
       <w:r>
         <w:t>6.6 Nuova versione: link diretto per ogni sistema</w:t>
       </w:r>
@@ -19819,7 +19819,7 @@
           <w:noProof/>
         </w:rPr>
         <w:drawing>
-          <wp:inline distT="0" distB="0" distL="0" distR="0" wp14:anchorId="2AEC4E6B" wp14:editId="4689332A">
+          <wp:inline distT="0" distB="0" distL="0" distR="0" wp14:anchorId="5B46EB68" wp14:editId="4AC1D61D">
             <wp:extent cx="4572000" cy="4429125"/>
             <wp:effectExtent l="0" t="0" r="0" b="0"/>
             <wp:docPr id="19" name="Immagine 19"/>
@@ -19894,7 +19894,7 @@
       <w:pPr>
         <w:pStyle w:val="Titolo2"/>
       </w:pPr>
-      <w:bookmarkStart w:id="45" w:name="_Toc244254987"/>
+      <w:bookmarkStart w:id="45" w:name="_Toc244255640"/>
       <w:r>
         <w:t>6.7 Release 1.1.0</w:t>
       </w:r>
@@ -20458,7 +20458,7 @@
       <w:pPr>
         <w:pStyle w:val="Titolo2"/>
       </w:pPr>
-      <w:bookmarkStart w:id="46" w:name="_Toc244254988"/>
+      <w:bookmarkStart w:id="46" w:name="_Toc244255641"/>
       <w:r>
         <w:t>6.8 Versione 1.2.0</w:t>
       </w:r>
@@ -21007,7 +21007,7 @@
       <w:pPr>
         <w:pStyle w:val="Titolo2"/>
       </w:pPr>
-      <w:bookmarkStart w:id="47" w:name="_Toc244254989"/>
+      <w:bookmarkStart w:id="47" w:name="_Toc244255642"/>
       <w:r>
         <w:t>6.9 Versione 1.2.1</w:t>
       </w:r>
@@ -21025,7 +21025,7 @@
       <w:pPr>
         <w:pStyle w:val="Titolo2"/>
       </w:pPr>
-      <w:bookmarkStart w:id="48" w:name="_Toc244254990"/>
+      <w:bookmarkStart w:id="48" w:name="_Toc244255643"/>
       <w:r>
         <w:t>6.10 Versione 1.3.0</w:t>
       </w:r>
@@ -21057,7 +21057,7 @@
       <w:pPr>
         <w:pStyle w:val="Titolo2"/>
       </w:pPr>
-      <w:bookmarkStart w:id="49" w:name="_Toc244254991"/>
+      <w:bookmarkStart w:id="49" w:name="_Toc244255644"/>
       <w:r>
         <w:t>6.11 Versione 1.3.1 (ponte verso Cloudflare)</w:t>
       </w:r>
@@ -21075,7 +21075,7 @@
       <w:pPr>
         <w:pStyle w:val="Titolo2"/>
       </w:pPr>
-      <w:bookmarkStart w:id="50" w:name="_Toc244254992"/>
+      <w:bookmarkStart w:id="50" w:name="_Toc244255645"/>
       <w:r>
         <w:t>6.12 Versione 1.4.0</w:t>
       </w:r>
@@ -21093,7 +21093,7 @@
       <w:pPr>
         <w:pStyle w:val="Titolo2"/>
       </w:pPr>
-      <w:bookmarkStart w:id="51" w:name="_Toc244254993"/>
+      <w:bookmarkStart w:id="51" w:name="_Toc244255646"/>
       <w:r>
         <w:t>6.13 Versione 1.5.0</w:t>
       </w:r>
@@ -21104,14 +21104,14 @@
         <w:spacing w:after="120"/>
       </w:pPr>
       <w:r>
-        <w:t>Preparata il 30 ottobre 2026 (installer Windows 101.5.0, Android 1001005000): oggetti applicati spostabili, Vista (due pagine, libro), presentazione con Ctrl+L, immagini diritte sulle pagine ruotate. Gli aggiornamenti arrivano dal sito https://pdfz.pages.dev/.</w:t>
+        <w:t>Pubblicata il 30 ottobre 2026 (release in 7 minuti, sito Cloudflare aggiornato da solo subito dopo; installer Windows 101.5.0, Android 1001005000): oggetti applicati spostabili, Vista (due pagine, libro), presentazione con Ctrl+L, immagini diritte sulle pagine ruotate. Gli aggiornamenti arrivano dal sito https://pdfz.pages.dev/.</w:t>
       </w:r>
     </w:p>
     <w:p>
       <w:pPr>
         <w:pStyle w:val="Titolo2"/>
       </w:pPr>
-      <w:bookmarkStart w:id="52" w:name="_Toc244254994"/>
+      <w:bookmarkStart w:id="52" w:name="_Toc244255647"/>
       <w:r>
         <w:t>6.14 Ruoli</w:t>
       </w:r>
@@ -21384,7 +21384,7 @@
       <w:pPr>
         <w:pStyle w:val="Titolo1"/>
       </w:pPr>
-      <w:bookmarkStart w:id="53" w:name="_Toc244254995"/>
+      <w:bookmarkStart w:id="53" w:name="_Toc244255648"/>
       <w:r>
         <w:t>7. Sicurezza</w:t>
       </w:r>
@@ -21683,7 +21683,7 @@
       <w:pPr>
         <w:pStyle w:val="Titolo1"/>
       </w:pPr>
-      <w:bookmarkStart w:id="54" w:name="_Toc244254996"/>
+      <w:bookmarkStart w:id="54" w:name="_Toc244255649"/>
       <w:r>
         <w:t>8. Punti aperti</w:t>
       </w:r>
@@ -21972,7 +21972,7 @@
       <w:pPr>
         <w:pStyle w:val="Titolo1"/>
       </w:pPr>
-      <w:bookmarkStart w:id="55" w:name="_Toc244254997"/>
+      <w:bookmarkStart w:id="55" w:name="_Toc244255650"/>
       <w:r>
         <w:t>9. Pensato per i prossimi 10 anni</w:t>
       </w:r>
@@ -22166,7 +22166,7 @@
       <w:pPr>
         <w:pStyle w:val="Titolo1"/>
       </w:pPr>
-      <w:bookmarkStart w:id="56" w:name="_Toc244254998"/>
+      <w:bookmarkStart w:id="56" w:name="_Toc244255651"/>
       <w:r>
         <w:t>10. Facilità d'uso: analisi e proposte (30 ottobre 2026)</w:t>
       </w:r>
@@ -22254,7 +22254,7 @@
       <w:pPr>
         <w:pStyle w:val="Titolo2"/>
       </w:pPr>
-      <w:bookmarkStart w:id="57" w:name="_Toc244254999"/>
+      <w:bookmarkStart w:id="57" w:name="_Toc244255652"/>
       <w:r>
         <w:t>10.1 Opinione</w:t>
       </w:r>
@@ -22782,7 +22782,7 @@
       <w:pPr>
         <w:pStyle w:val="Titolo2"/>
       </w:pPr>
-      <w:bookmarkStart w:id="58" w:name="_Toc244255000"/>
+      <w:bookmarkStart w:id="58" w:name="_Toc244255653"/>
       <w:r>
         <w:t>10.2 Punti da migliorare</w:t>
       </w:r>
@@ -22931,7 +22931,7 @@
           <w:noProof/>
         </w:rPr>
         <w:drawing>
-          <wp:inline distT="0" distB="0" distL="0" distR="0" wp14:anchorId="187CB95D" wp14:editId="03DFD5DE">
+          <wp:inline distT="0" distB="0" distL="0" distR="0" wp14:anchorId="093FEE81" wp14:editId="74AD87C7">
             <wp:extent cx="1905000" cy="4124325"/>
             <wp:effectExtent l="0" t="0" r="0" b="0"/>
             <wp:docPr id="20" name="Immagine 20"/>
@@ -22996,7 +22996,7 @@
           <w:noProof/>
         </w:rPr>
         <w:drawing>
-          <wp:inline distT="0" distB="0" distL="0" distR="0" wp14:anchorId="3D1C5827" wp14:editId="036E93FB">
+          <wp:inline distT="0" distB="0" distL="0" distR="0" wp14:anchorId="403ED0FC" wp14:editId="44E41868">
             <wp:extent cx="1905000" cy="4124325"/>
             <wp:effectExtent l="0" t="0" r="0" b="0"/>
             <wp:docPr id="21" name="Immagine 21"/>
@@ -23061,7 +23061,7 @@
           <w:noProof/>
         </w:rPr>
         <w:drawing>
-          <wp:inline distT="0" distB="0" distL="0" distR="0" wp14:anchorId="442FC66C" wp14:editId="77DBE696">
+          <wp:inline distT="0" distB="0" distL="0" distR="0" wp14:anchorId="7D8924D8" wp14:editId="11577539">
             <wp:extent cx="4953000" cy="3095625"/>
             <wp:effectExtent l="0" t="0" r="0" b="0"/>
             <wp:docPr id="22" name="Immagine 22"/>
@@ -23120,7 +23120,7 @@
       <w:pPr>
         <w:pStyle w:val="Titolo2"/>
       </w:pPr>
-      <w:bookmarkStart w:id="59" w:name="_Toc244255001"/>
+      <w:bookmarkStart w:id="59" w:name="_Toc244255654"/>
       <w:r>
         <w:t>10.3 Cinque proposte</w:t>
       </w:r>
@@ -23950,150 +23950,64 @@
 <file path=word/numbering.xml><?xml version="1.0" encoding="utf-8"?>
 <w:numbering xmlns:wpc="http://schemas.microsoft.com/office/word/2010/wordprocessingCanvas" xmlns:cx="http://schemas.microsoft.com/office/drawing/2014/chartex" xmlns:cx1="http://schemas.microsoft.com/office/drawing/2015/9/8/chartex" xmlns:cx2="http://schemas.microsoft.com/office/drawing/2015/10/21/chartex" xmlns:cx3="http://schemas.microsoft.com/office/drawing/2016/5/9/chartex" xmlns:cx4="http://schemas.microsoft.com/office/drawing/2016/5/10/chartex" xmlns:cx5="http://schemas.microsoft.com/office/drawing/2016/5/11/chartex" xmlns:cx6="http://schemas.microsoft.com/office/drawing/2016/5/12/chartex" xmlns:cx7="http://schemas.microsoft.com/office/drawing/2016/5/13/chartex" xmlns:cx8="http://schemas.microsoft.com/office/drawing/2016/5/14/chartex" xmlns:mc="http://schemas.openxmlformats.org/markup-compatibility/2006" xmlns:aink="http://schemas.microsoft.com/office/drawing/2016/ink" xmlns:am3d="http://schemas.microsoft.com/office/drawing/2017/model3d" xmlns:o="urn:schemas-microsoft-com:office:office" xmlns:oel="http://schemas.microsoft.com/office/2019/extlst" xmlns:r="http://schemas.openxmlformats.org/officeDocument/2006/relationships" xmlns:m="http://schemas.openxmlformats.org/officeDocument/2006/math" xmlns:v="urn:schemas-microsoft-com:vml" xmlns:wp14="http://schemas.microsoft.com/office/word/2010/wordprocessingDrawing" xmlns:wp="http://schemas.openxmlformats.org/drawingml/2006/wordprocessingDrawing" xmlns:w10="urn:schemas-microsoft-com:office:word" xmlns:w="http://schemas.openxmlformats.org/wordprocessingml/2006/main" xmlns:w14="http://schemas.microsoft.com/office/word/2010/wordml" xmlns:w15="http://schemas.microsoft.com/office/word/2012/wordml" xmlns:w16cex="http://schemas.microsoft.com/office/word/2018/wordml/cex" xmlns:w16cid="http://schemas.microsoft.com/office/word/2016/wordml/cid" xmlns:w16="http://schemas.microsoft.com/office/word/2018/wordml" xmlns:w16du="http://schemas.microsoft.com/office/word/2023/wordml/word16du" xmlns:w16sdtdh="http://schemas.microsoft.com/office/word/2020/wordml/sdtdatahash" xmlns:w16sdtfl="http://schemas.microsoft.com/office/word/2024/wordml/sdtformatlock" xmlns:w16se="http://schemas.microsoft.com/office/word/2015/wordml/symex" xmlns:wpg="http://schemas.microsoft.com/office/word/2010/wordprocessingGroup" xmlns:wpi="http://schemas.microsoft.com/office/word/2010/wordprocessingInk" xmlns:wne="http://schemas.microsoft.com/office/word/2006/wordml" xmlns:wps="http://schemas.microsoft.com/office/word/2010/wordprocessingShape" mc:Ignorable="w14 w15 w16se w16cid w16 w16cex w16sdtdh w16sdtfl w16du wp14">
   <w:abstractNum w:abstractNumId="0" w15:restartNumberingAfterBreak="0">
-    <w:nsid w:val="18A35778"/>
+    <w:nsid w:val="1340230C"/>
     <w:multiLevelType w:val="hybridMultilevel"/>
-    <w:tmpl w:val="B868F358"/>
-    <w:lvl w:ilvl="0" w:tplc="1EB6855C">
+    <w:tmpl w:val="6B806676"/>
+    <w:lvl w:ilvl="0" w:tplc="369A1DC4">
       <w:start w:val="1"/>
-      <w:numFmt w:val="decimal"/>
-      <w:lvlText w:val="%1."/>
+      <w:numFmt w:val="bullet"/>
+      <w:lvlText w:val="•"/>
       <w:lvlJc w:val="left"/>
       <w:pPr>
-        <w:ind w:left="540" w:hanging="300"/>
+        <w:ind w:left="540" w:hanging="270"/>
       </w:pPr>
     </w:lvl>
-    <w:lvl w:ilvl="1" w:tplc="80165008">
+    <w:lvl w:ilvl="1" w:tplc="71C4CBD8">
       <w:numFmt w:val="decimal"/>
       <w:lvlText w:val=""/>
       <w:lvlJc w:val="left"/>
     </w:lvl>
-    <w:lvl w:ilvl="2" w:tplc="A8F65560">
+    <w:lvl w:ilvl="2" w:tplc="B31CB036">
       <w:numFmt w:val="decimal"/>
       <w:lvlText w:val=""/>
       <w:lvlJc w:val="left"/>
     </w:lvl>
-    <w:lvl w:ilvl="3" w:tplc="A252B06C">
+    <w:lvl w:ilvl="3" w:tplc="909675A0">
       <w:numFmt w:val="decimal"/>
       <w:lvlText w:val=""/>
       <w:lvlJc w:val="left"/>
     </w:lvl>
-    <w:lvl w:ilvl="4" w:tplc="8EFAB18A">
+    <w:lvl w:ilvl="4" w:tplc="0F0A2FD8">
       <w:numFmt w:val="decimal"/>
       <w:lvlText w:val=""/>
       <w:lvlJc w:val="left"/>
     </w:lvl>
-    <w:lvl w:ilvl="5" w:tplc="AC6E9F1E">
+    <w:lvl w:ilvl="5" w:tplc="C096C860">
       <w:numFmt w:val="decimal"/>
       <w:lvlText w:val=""/>
       <w:lvlJc w:val="left"/>
     </w:lvl>
-    <w:lvl w:ilvl="6" w:tplc="E91C5566">
+    <w:lvl w:ilvl="6" w:tplc="AA8A15D6">
       <w:numFmt w:val="decimal"/>
       <w:lvlText w:val=""/>
       <w:lvlJc w:val="left"/>
     </w:lvl>
-    <w:lvl w:ilvl="7" w:tplc="7F3CA58C">
+    <w:lvl w:ilvl="7" w:tplc="153AD684">
       <w:numFmt w:val="decimal"/>
       <w:lvlText w:val=""/>
       <w:lvlJc w:val="left"/>
     </w:lvl>
-    <w:lvl w:ilvl="8" w:tplc="61F46010">
+    <w:lvl w:ilvl="8" w:tplc="23503790">
       <w:numFmt w:val="decimal"/>
       <w:lvlText w:val=""/>
       <w:lvlJc w:val="left"/>
     </w:lvl>
   </w:abstractNum>
   <w:abstractNum w:abstractNumId="1" w15:restartNumberingAfterBreak="0">
-    <w:nsid w:val="587E2FF7"/>
+    <w:nsid w:val="266F3C0F"/>
     <w:multiLevelType w:val="hybridMultilevel"/>
-    <w:tmpl w:val="1B7834A8"/>
-    <w:lvl w:ilvl="0" w:tplc="684A59CE" w:tentative="1">
-      <w:start w:val="1"/>
-      <w:numFmt w:val="bullet"/>
-      <w:lvlText w:val="●"/>
-      <w:lvlJc w:val="left"/>
-      <w:pPr>
-        <w:ind w:left="720" w:hanging="360"/>
-      </w:pPr>
-    </w:lvl>
-    <w:lvl w:ilvl="1" w:tplc="9EE8D3B8" w:tentative="1">
-      <w:start w:val="1"/>
-      <w:numFmt w:val="bullet"/>
-      <w:lvlText w:val="○"/>
-      <w:lvlJc w:val="left"/>
-      <w:pPr>
-        <w:ind w:left="1440" w:hanging="360"/>
-      </w:pPr>
-    </w:lvl>
-    <w:lvl w:ilvl="2" w:tplc="D15EB9EE" w:tentative="1">
-      <w:start w:val="1"/>
-      <w:numFmt w:val="bullet"/>
-      <w:lvlText w:val="■"/>
-      <w:lvlJc w:val="left"/>
-      <w:pPr>
-        <w:ind w:left="2160" w:hanging="360"/>
-      </w:pPr>
-    </w:lvl>
-    <w:lvl w:ilvl="3" w:tplc="536E3736" w:tentative="1">
-      <w:start w:val="1"/>
-      <w:numFmt w:val="bullet"/>
-      <w:lvlText w:val="●"/>
-      <w:lvlJc w:val="left"/>
-      <w:pPr>
-        <w:ind w:left="2880" w:hanging="360"/>
-      </w:pPr>
-    </w:lvl>
-    <w:lvl w:ilvl="4" w:tplc="62A6E4F2" w:tentative="1">
-      <w:start w:val="1"/>
-      <w:numFmt w:val="bullet"/>
-      <w:lvlText w:val="○"/>
-      <w:lvlJc w:val="left"/>
-      <w:pPr>
-        <w:ind w:left="3600" w:hanging="360"/>
-      </w:pPr>
-    </w:lvl>
-    <w:lvl w:ilvl="5" w:tplc="C8F2675C" w:tentative="1">
-      <w:start w:val="1"/>
-      <w:numFmt w:val="bullet"/>
-      <w:lvlText w:val="■"/>
-      <w:lvlJc w:val="left"/>
-      <w:pPr>
-        <w:ind w:left="4320" w:hanging="360"/>
-      </w:pPr>
-    </w:lvl>
-    <w:lvl w:ilvl="6" w:tplc="B888B65A" w:tentative="1">
-      <w:start w:val="1"/>
-      <w:numFmt w:val="bullet"/>
-      <w:lvlText w:val="●"/>
-      <w:lvlJc w:val="left"/>
-      <w:pPr>
-        <w:ind w:left="5040" w:hanging="360"/>
-      </w:pPr>
-    </w:lvl>
-    <w:lvl w:ilvl="7" w:tplc="4A142F12" w:tentative="1">
-      <w:start w:val="1"/>
-      <w:numFmt w:val="bullet"/>
-      <w:lvlText w:val="●"/>
-      <w:lvlJc w:val="left"/>
-      <w:pPr>
-        <w:ind w:left="5760" w:hanging="360"/>
-      </w:pPr>
-    </w:lvl>
-    <w:lvl w:ilvl="8" w:tplc="5048399C" w:tentative="1">
-      <w:start w:val="1"/>
-      <w:numFmt w:val="bullet"/>
-      <w:lvlText w:val="●"/>
-      <w:lvlJc w:val="left"/>
-      <w:pPr>
-        <w:ind w:left="6480" w:hanging="360"/>
-      </w:pPr>
-    </w:lvl>
-  </w:abstractNum>
-  <w:abstractNum w:abstractNumId="2" w15:restartNumberingAfterBreak="0">
-    <w:nsid w:val="641F5094"/>
-    <w:multiLevelType w:val="hybridMultilevel"/>
-    <w:tmpl w:val="21121B5C"/>
-    <w:lvl w:ilvl="0" w:tplc="02DC0DBE">
+    <w:tmpl w:val="7A429D2E"/>
+    <w:lvl w:ilvl="0" w:tplc="75B29E78">
       <w:start w:val="1"/>
       <w:numFmt w:val="decimal"/>
       <w:lvlText w:val="%1."/>
@@ -24102,121 +24016,207 @@
         <w:ind w:left="540" w:hanging="300"/>
       </w:pPr>
     </w:lvl>
-    <w:lvl w:ilvl="1" w:tplc="B0BE1BB2">
+    <w:lvl w:ilvl="1" w:tplc="EECA49B0">
       <w:numFmt w:val="decimal"/>
       <w:lvlText w:val=""/>
       <w:lvlJc w:val="left"/>
     </w:lvl>
-    <w:lvl w:ilvl="2" w:tplc="06763B3C">
+    <w:lvl w:ilvl="2" w:tplc="66704A82">
       <w:numFmt w:val="decimal"/>
       <w:lvlText w:val=""/>
       <w:lvlJc w:val="left"/>
     </w:lvl>
-    <w:lvl w:ilvl="3" w:tplc="E18E94B4">
+    <w:lvl w:ilvl="3" w:tplc="EB0E19B2">
       <w:numFmt w:val="decimal"/>
       <w:lvlText w:val=""/>
       <w:lvlJc w:val="left"/>
     </w:lvl>
-    <w:lvl w:ilvl="4" w:tplc="6BF4FAEE">
+    <w:lvl w:ilvl="4" w:tplc="0A689F82">
       <w:numFmt w:val="decimal"/>
       <w:lvlText w:val=""/>
       <w:lvlJc w:val="left"/>
     </w:lvl>
-    <w:lvl w:ilvl="5" w:tplc="2B5EFFC0">
+    <w:lvl w:ilvl="5" w:tplc="D5E09D2C">
       <w:numFmt w:val="decimal"/>
       <w:lvlText w:val=""/>
       <w:lvlJc w:val="left"/>
     </w:lvl>
-    <w:lvl w:ilvl="6" w:tplc="2BBAE8FE">
+    <w:lvl w:ilvl="6" w:tplc="20C0A67C">
       <w:numFmt w:val="decimal"/>
       <w:lvlText w:val=""/>
       <w:lvlJc w:val="left"/>
     </w:lvl>
-    <w:lvl w:ilvl="7" w:tplc="E79CFDA6">
+    <w:lvl w:ilvl="7" w:tplc="89701AA6">
       <w:numFmt w:val="decimal"/>
       <w:lvlText w:val=""/>
       <w:lvlJc w:val="left"/>
     </w:lvl>
-    <w:lvl w:ilvl="8" w:tplc="5658DF92">
+    <w:lvl w:ilvl="8" w:tplc="9612DEA8">
+      <w:numFmt w:val="decimal"/>
+      <w:lvlText w:val=""/>
+      <w:lvlJc w:val="left"/>
+    </w:lvl>
+  </w:abstractNum>
+  <w:abstractNum w:abstractNumId="2" w15:restartNumberingAfterBreak="0">
+    <w:nsid w:val="3731047D"/>
+    <w:multiLevelType w:val="hybridMultilevel"/>
+    <w:tmpl w:val="B8BE06CA"/>
+    <w:lvl w:ilvl="0" w:tplc="DD721746">
+      <w:start w:val="1"/>
+      <w:numFmt w:val="decimal"/>
+      <w:lvlText w:val="%1."/>
+      <w:lvlJc w:val="left"/>
+      <w:pPr>
+        <w:ind w:left="540" w:hanging="300"/>
+      </w:pPr>
+    </w:lvl>
+    <w:lvl w:ilvl="1" w:tplc="312CB5F4">
+      <w:numFmt w:val="decimal"/>
+      <w:lvlText w:val=""/>
+      <w:lvlJc w:val="left"/>
+    </w:lvl>
+    <w:lvl w:ilvl="2" w:tplc="D040A312">
+      <w:numFmt w:val="decimal"/>
+      <w:lvlText w:val=""/>
+      <w:lvlJc w:val="left"/>
+    </w:lvl>
+    <w:lvl w:ilvl="3" w:tplc="5F76A308">
+      <w:numFmt w:val="decimal"/>
+      <w:lvlText w:val=""/>
+      <w:lvlJc w:val="left"/>
+    </w:lvl>
+    <w:lvl w:ilvl="4" w:tplc="F692D640">
+      <w:numFmt w:val="decimal"/>
+      <w:lvlText w:val=""/>
+      <w:lvlJc w:val="left"/>
+    </w:lvl>
+    <w:lvl w:ilvl="5" w:tplc="09F2E6C4">
+      <w:numFmt w:val="decimal"/>
+      <w:lvlText w:val=""/>
+      <w:lvlJc w:val="left"/>
+    </w:lvl>
+    <w:lvl w:ilvl="6" w:tplc="A502D9EC">
+      <w:numFmt w:val="decimal"/>
+      <w:lvlText w:val=""/>
+      <w:lvlJc w:val="left"/>
+    </w:lvl>
+    <w:lvl w:ilvl="7" w:tplc="D96828F4">
+      <w:numFmt w:val="decimal"/>
+      <w:lvlText w:val=""/>
+      <w:lvlJc w:val="left"/>
+    </w:lvl>
+    <w:lvl w:ilvl="8" w:tplc="6698519A">
       <w:numFmt w:val="decimal"/>
       <w:lvlText w:val=""/>
       <w:lvlJc w:val="left"/>
     </w:lvl>
   </w:abstractNum>
   <w:abstractNum w:abstractNumId="3" w15:restartNumberingAfterBreak="0">
-    <w:nsid w:val="6E8712EB"/>
+    <w:nsid w:val="715469D0"/>
     <w:multiLevelType w:val="hybridMultilevel"/>
-    <w:tmpl w:val="FAC2A934"/>
-    <w:lvl w:ilvl="0" w:tplc="D3D64E74">
+    <w:tmpl w:val="6DDE76EA"/>
+    <w:lvl w:ilvl="0" w:tplc="87E038B2" w:tentative="1">
       <w:start w:val="1"/>
       <w:numFmt w:val="bullet"/>
-      <w:lvlText w:val="•"/>
+      <w:lvlText w:val="●"/>
       <w:lvlJc w:val="left"/>
       <w:pPr>
-        <w:ind w:left="540" w:hanging="270"/>
+        <w:ind w:left="720" w:hanging="360"/>
       </w:pPr>
     </w:lvl>
-    <w:lvl w:ilvl="1" w:tplc="387EB012">
-      <w:numFmt w:val="decimal"/>
-      <w:lvlText w:val=""/>
+    <w:lvl w:ilvl="1" w:tplc="803CF732" w:tentative="1">
+      <w:start w:val="1"/>
+      <w:numFmt w:val="bullet"/>
+      <w:lvlText w:val="○"/>
       <w:lvlJc w:val="left"/>
+      <w:pPr>
+        <w:ind w:left="1440" w:hanging="360"/>
+      </w:pPr>
     </w:lvl>
-    <w:lvl w:ilvl="2" w:tplc="29E6C502">
-      <w:numFmt w:val="decimal"/>
-      <w:lvlText w:val=""/>
+    <w:lvl w:ilvl="2" w:tplc="02D6072E" w:tentative="1">
+      <w:start w:val="1"/>
+      <w:numFmt w:val="bullet"/>
+      <w:lvlText w:val="■"/>
       <w:lvlJc w:val="left"/>
+      <w:pPr>
+        <w:ind w:left="2160" w:hanging="360"/>
+      </w:pPr>
     </w:lvl>
-    <w:lvl w:ilvl="3" w:tplc="59162E8C">
-      <w:numFmt w:val="decimal"/>
-      <w:lvlText w:val=""/>
+    <w:lvl w:ilvl="3" w:tplc="BC465FA2" w:tentative="1">
+      <w:start w:val="1"/>
+      <w:numFmt w:val="bullet"/>
+      <w:lvlText w:val="●"/>
       <w:lvlJc w:val="left"/>
+      <w:pPr>
+        <w:ind w:left="2880" w:hanging="360"/>
+      </w:pPr>
     </w:lvl>
-    <w:lvl w:ilvl="4" w:tplc="2F9CFB3C">
-      <w:numFmt w:val="decimal"/>
-      <w:lvlText w:val=""/>
+    <w:lvl w:ilvl="4" w:tplc="43CC45A8" w:tentative="1">
+      <w:start w:val="1"/>
+      <w:numFmt w:val="bullet"/>
+      <w:lvlText w:val="○"/>
       <w:lvlJc w:val="left"/>
+      <w:pPr>
+        <w:ind w:left="3600" w:hanging="360"/>
+      </w:pPr>
     </w:lvl>
-    <w:lvl w:ilvl="5" w:tplc="E922547E">
-      <w:numFmt w:val="decimal"/>
-      <w:lvlText w:val=""/>
+    <w:lvl w:ilvl="5" w:tplc="B3C64D64" w:tentative="1">
+      <w:start w:val="1"/>
+      <w:numFmt w:val="bullet"/>
+      <w:lvlText w:val="■"/>
       <w:lvlJc w:val="left"/>
+      <w:pPr>
+        <w:ind w:left="4320" w:hanging="360"/>
+      </w:pPr>
     </w:lvl>
-    <w:lvl w:ilvl="6" w:tplc="F274E816">
-      <w:numFmt w:val="decimal"/>
-      <w:lvlText w:val=""/>
+    <w:lvl w:ilvl="6" w:tplc="66AE88BA" w:tentative="1">
+      <w:start w:val="1"/>
+      <w:numFmt w:val="bullet"/>
+      <w:lvlText w:val="●"/>
       <w:lvlJc w:val="left"/>
+      <w:pPr>
+        <w:ind w:left="5040" w:hanging="360"/>
+      </w:pPr>
     </w:lvl>
-    <w:lvl w:ilvl="7" w:tplc="4432C1B8">
-      <w:numFmt w:val="decimal"/>
-      <w:lvlText w:val=""/>
+    <w:lvl w:ilvl="7" w:tplc="B1AA3826" w:tentative="1">
+      <w:start w:val="1"/>
+      <w:numFmt w:val="bullet"/>
+      <w:lvlText w:val="●"/>
       <w:lvlJc w:val="left"/>
+      <w:pPr>
+        <w:ind w:left="5760" w:hanging="360"/>
+      </w:pPr>
     </w:lvl>
-    <w:lvl w:ilvl="8" w:tplc="5A8C4A06">
-      <w:numFmt w:val="decimal"/>
-      <w:lvlText w:val=""/>
+    <w:lvl w:ilvl="8" w:tplc="722C7D68" w:tentative="1">
+      <w:start w:val="1"/>
+      <w:numFmt w:val="bullet"/>
+      <w:lvlText w:val="●"/>
       <w:lvlJc w:val="left"/>
+      <w:pPr>
+        <w:ind w:left="6480" w:hanging="360"/>
+      </w:pPr>
     </w:lvl>
   </w:abstractNum>
-  <w:num w:numId="1" w16cid:durableId="1980918587">
-    <w:abstractNumId w:val="1"/>
-    <w:lvlOverride w:ilvl="0">
-      <w:startOverride w:val="1"/>
-    </w:lvlOverride>
-  </w:num>
-  <w:num w:numId="2" w16cid:durableId="1663701994">
+  <w:num w:numId="1" w16cid:durableId="544872048">
     <w:abstractNumId w:val="3"/>
     <w:lvlOverride w:ilvl="0">
       <w:startOverride w:val="1"/>
     </w:lvlOverride>
   </w:num>
-  <w:num w:numId="3" w16cid:durableId="1826387100">
+  <w:num w:numId="2" w16cid:durableId="1787626226">
+    <w:abstractNumId w:val="0"/>
+    <w:lvlOverride w:ilvl="0">
+      <w:startOverride w:val="1"/>
+    </w:lvlOverride>
+  </w:num>
+  <w:num w:numId="3" w16cid:durableId="410783050">
     <w:abstractNumId w:val="2"/>
     <w:lvlOverride w:ilvl="0">
       <w:startOverride w:val="1"/>
     </w:lvlOverride>
   </w:num>
-  <w:num w:numId="4" w16cid:durableId="1895773756">
-    <w:abstractNumId w:val="0"/>
+  <w:num w:numId="4" w16cid:durableId="1885217340">
+    <w:abstractNumId w:val="1"/>
     <w:lvlOverride w:ilvl="0">
       <w:startOverride w:val="1"/>
     </w:lvlOverride>
@@ -24857,7 +24857,7 @@
     <w:autoRedefine/>
     <w:uiPriority w:val="39"/>
     <w:unhideWhenUsed/>
-    <w:rsid w:val="00286A49"/>
+    <w:rsid w:val="00DD5D13"/>
     <w:pPr>
       <w:spacing w:after="100"/>
     </w:pPr>
@@ -24869,7 +24869,7 @@
     <w:autoRedefine/>
     <w:uiPriority w:val="39"/>
     <w:unhideWhenUsed/>
-    <w:rsid w:val="00286A49"/>
+    <w:rsid w:val="00DD5D13"/>
     <w:pPr>
       <w:spacing w:after="100"/>
       <w:ind w:left="210"/>

</xml_diff>

<commit_message>
docs: release 1.6.0 pubblicata (link verificati su Cloudflare e GitHub)
Co-Authored-By: Claude Opus 5.5 <noreply@anthropic.com>
</commit_message>
<xml_diff>
--- a/docs/PDFz_20261030.docx
+++ b/docs/PDFz_20261030.docx
@@ -16,7 +16,7 @@
           <w:noProof/>
         </w:rPr>
         <w:drawing>
-          <wp:inline distT="0" distB="0" distL="0" distR="0" wp14:anchorId="48133E48" wp14:editId="25492799">
+          <wp:inline distT="0" distB="0" distL="0" distR="0" wp14:anchorId="689416B3" wp14:editId="1437BE6D">
             <wp:extent cx="3619500" cy="1285875"/>
             <wp:effectExtent l="0" t="0" r="0" b="0"/>
             <wp:docPr id="1" name="Immagine 1"/>
@@ -135,7 +135,7 @@
     <w:sdt>
       <w:sdtPr>
         <w:alias w:val="Indice"/>
-        <w:id w:val="1688098824"/>
+        <w:id w:val="-436367873"/>
       </w:sdtPr>
       <w:sdtEndPr/>
       <w:sdtContent>
@@ -158,7 +158,7 @@
           <w:r>
             <w:fldChar w:fldCharType="separate"/>
           </w:r>
-          <w:hyperlink w:anchor="_Toc244258856" w:history="1">
+          <w:hyperlink w:anchor="_Toc244259545" w:history="1">
             <w:r>
               <w:rPr>
                 <w:rStyle w:val="Collegamentoipertestuale"/>
@@ -182,7 +182,7 @@
               <w:rPr>
                 <w:noProof/>
               </w:rPr>
-              <w:instrText xml:space="preserve"> PAGEREF _Toc244258856 \h </w:instrText>
+              <w:instrText xml:space="preserve"> PAGEREF _Toc244259545 \h </w:instrText>
             </w:r>
             <w:r>
               <w:rPr>
@@ -219,7 +219,7 @@
               <w:noProof/>
             </w:rPr>
           </w:pPr>
-          <w:hyperlink w:anchor="_Toc244258857" w:history="1">
+          <w:hyperlink w:anchor="_Toc244259546" w:history="1">
             <w:r>
               <w:rPr>
                 <w:rStyle w:val="Collegamentoipertestuale"/>
@@ -243,7 +243,7 @@
               <w:rPr>
                 <w:noProof/>
               </w:rPr>
-              <w:instrText xml:space="preserve"> PAGEREF _Toc244258857 \h </w:instrText>
+              <w:instrText xml:space="preserve"> PAGEREF _Toc244259546 \h </w:instrText>
             </w:r>
             <w:r>
               <w:rPr>
@@ -280,7 +280,7 @@
               <w:noProof/>
             </w:rPr>
           </w:pPr>
-          <w:hyperlink w:anchor="_Toc244258858" w:history="1">
+          <w:hyperlink w:anchor="_Toc244259547" w:history="1">
             <w:r>
               <w:rPr>
                 <w:rStyle w:val="Collegamentoipertestuale"/>
@@ -304,7 +304,7 @@
               <w:rPr>
                 <w:noProof/>
               </w:rPr>
-              <w:instrText xml:space="preserve"> PAGEREF _Toc244258858 \h </w:instrText>
+              <w:instrText xml:space="preserve"> PAGEREF _Toc244259547 \h </w:instrText>
             </w:r>
             <w:r>
               <w:rPr>
@@ -341,7 +341,7 @@
               <w:noProof/>
             </w:rPr>
           </w:pPr>
-          <w:hyperlink w:anchor="_Toc244258859" w:history="1">
+          <w:hyperlink w:anchor="_Toc244259548" w:history="1">
             <w:r>
               <w:rPr>
                 <w:rStyle w:val="Collegamentoipertestuale"/>
@@ -365,7 +365,7 @@
               <w:rPr>
                 <w:noProof/>
               </w:rPr>
-              <w:instrText xml:space="preserve"> PAGEREF _Toc244258859 \h </w:instrText>
+              <w:instrText xml:space="preserve"> PAGEREF _Toc244259548 \h </w:instrText>
             </w:r>
             <w:r>
               <w:rPr>
@@ -402,7 +402,7 @@
               <w:noProof/>
             </w:rPr>
           </w:pPr>
-          <w:hyperlink w:anchor="_Toc244258860" w:history="1">
+          <w:hyperlink w:anchor="_Toc244259549" w:history="1">
             <w:r>
               <w:rPr>
                 <w:rStyle w:val="Collegamentoipertestuale"/>
@@ -426,7 +426,7 @@
               <w:rPr>
                 <w:noProof/>
               </w:rPr>
-              <w:instrText xml:space="preserve"> PAGEREF _Toc244258860 \h </w:instrText>
+              <w:instrText xml:space="preserve"> PAGEREF _Toc244259549 \h </w:instrText>
             </w:r>
             <w:r>
               <w:rPr>
@@ -463,7 +463,7 @@
               <w:noProof/>
             </w:rPr>
           </w:pPr>
-          <w:hyperlink w:anchor="_Toc244258861" w:history="1">
+          <w:hyperlink w:anchor="_Toc244259550" w:history="1">
             <w:r>
               <w:rPr>
                 <w:rStyle w:val="Collegamentoipertestuale"/>
@@ -487,7 +487,7 @@
               <w:rPr>
                 <w:noProof/>
               </w:rPr>
-              <w:instrText xml:space="preserve"> PAGEREF _Toc244258861 \h </w:instrText>
+              <w:instrText xml:space="preserve"> PAGEREF _Toc244259550 \h </w:instrText>
             </w:r>
             <w:r>
               <w:rPr>
@@ -524,7 +524,7 @@
               <w:noProof/>
             </w:rPr>
           </w:pPr>
-          <w:hyperlink w:anchor="_Toc244258862" w:history="1">
+          <w:hyperlink w:anchor="_Toc244259551" w:history="1">
             <w:r>
               <w:rPr>
                 <w:rStyle w:val="Collegamentoipertestuale"/>
@@ -548,7 +548,7 @@
               <w:rPr>
                 <w:noProof/>
               </w:rPr>
-              <w:instrText xml:space="preserve"> PAGEREF _Toc244258862 \h </w:instrText>
+              <w:instrText xml:space="preserve"> PAGEREF _Toc244259551 \h </w:instrText>
             </w:r>
             <w:r>
               <w:rPr>
@@ -585,7 +585,7 @@
               <w:noProof/>
             </w:rPr>
           </w:pPr>
-          <w:hyperlink w:anchor="_Toc244258863" w:history="1">
+          <w:hyperlink w:anchor="_Toc244259552" w:history="1">
             <w:r>
               <w:rPr>
                 <w:rStyle w:val="Collegamentoipertestuale"/>
@@ -609,7 +609,7 @@
               <w:rPr>
                 <w:noProof/>
               </w:rPr>
-              <w:instrText xml:space="preserve"> PAGEREF _Toc244258863 \h </w:instrText>
+              <w:instrText xml:space="preserve"> PAGEREF _Toc244259552 \h </w:instrText>
             </w:r>
             <w:r>
               <w:rPr>
@@ -646,7 +646,7 @@
               <w:noProof/>
             </w:rPr>
           </w:pPr>
-          <w:hyperlink w:anchor="_Toc244258864" w:history="1">
+          <w:hyperlink w:anchor="_Toc244259553" w:history="1">
             <w:r>
               <w:rPr>
                 <w:rStyle w:val="Collegamentoipertestuale"/>
@@ -670,7 +670,7 @@
               <w:rPr>
                 <w:noProof/>
               </w:rPr>
-              <w:instrText xml:space="preserve"> PAGEREF _Toc244258864 \h </w:instrText>
+              <w:instrText xml:space="preserve"> PAGEREF _Toc244259553 \h </w:instrText>
             </w:r>
             <w:r>
               <w:rPr>
@@ -707,7 +707,7 @@
               <w:noProof/>
             </w:rPr>
           </w:pPr>
-          <w:hyperlink w:anchor="_Toc244258865" w:history="1">
+          <w:hyperlink w:anchor="_Toc244259554" w:history="1">
             <w:r>
               <w:rPr>
                 <w:rStyle w:val="Collegamentoipertestuale"/>
@@ -731,7 +731,7 @@
               <w:rPr>
                 <w:noProof/>
               </w:rPr>
-              <w:instrText xml:space="preserve"> PAGEREF _Toc244258865 \h </w:instrText>
+              <w:instrText xml:space="preserve"> PAGEREF _Toc244259554 \h </w:instrText>
             </w:r>
             <w:r>
               <w:rPr>
@@ -768,7 +768,7 @@
               <w:noProof/>
             </w:rPr>
           </w:pPr>
-          <w:hyperlink w:anchor="_Toc244258866" w:history="1">
+          <w:hyperlink w:anchor="_Toc244259555" w:history="1">
             <w:r>
               <w:rPr>
                 <w:rStyle w:val="Collegamentoipertestuale"/>
@@ -792,7 +792,7 @@
               <w:rPr>
                 <w:noProof/>
               </w:rPr>
-              <w:instrText xml:space="preserve"> PAGEREF _Toc244258866 \h </w:instrText>
+              <w:instrText xml:space="preserve"> PAGEREF _Toc244259555 \h </w:instrText>
             </w:r>
             <w:r>
               <w:rPr>
@@ -829,7 +829,7 @@
               <w:noProof/>
             </w:rPr>
           </w:pPr>
-          <w:hyperlink w:anchor="_Toc244258867" w:history="1">
+          <w:hyperlink w:anchor="_Toc244259556" w:history="1">
             <w:r>
               <w:rPr>
                 <w:rStyle w:val="Collegamentoipertestuale"/>
@@ -853,7 +853,7 @@
               <w:rPr>
                 <w:noProof/>
               </w:rPr>
-              <w:instrText xml:space="preserve"> PAGEREF _Toc244258867 \h </w:instrText>
+              <w:instrText xml:space="preserve"> PAGEREF _Toc244259556 \h </w:instrText>
             </w:r>
             <w:r>
               <w:rPr>
@@ -890,7 +890,7 @@
               <w:noProof/>
             </w:rPr>
           </w:pPr>
-          <w:hyperlink w:anchor="_Toc244258868" w:history="1">
+          <w:hyperlink w:anchor="_Toc244259557" w:history="1">
             <w:r>
               <w:rPr>
                 <w:rStyle w:val="Collegamentoipertestuale"/>
@@ -914,7 +914,7 @@
               <w:rPr>
                 <w:noProof/>
               </w:rPr>
-              <w:instrText xml:space="preserve"> PAGEREF _Toc244258868 \h </w:instrText>
+              <w:instrText xml:space="preserve"> PAGEREF _Toc244259557 \h </w:instrText>
             </w:r>
             <w:r>
               <w:rPr>
@@ -951,7 +951,7 @@
               <w:noProof/>
             </w:rPr>
           </w:pPr>
-          <w:hyperlink w:anchor="_Toc244258869" w:history="1">
+          <w:hyperlink w:anchor="_Toc244259558" w:history="1">
             <w:r>
               <w:rPr>
                 <w:rStyle w:val="Collegamentoipertestuale"/>
@@ -975,7 +975,7 @@
               <w:rPr>
                 <w:noProof/>
               </w:rPr>
-              <w:instrText xml:space="preserve"> PAGEREF _Toc244258869 \h </w:instrText>
+              <w:instrText xml:space="preserve"> PAGEREF _Toc244259558 \h </w:instrText>
             </w:r>
             <w:r>
               <w:rPr>
@@ -1012,7 +1012,7 @@
               <w:noProof/>
             </w:rPr>
           </w:pPr>
-          <w:hyperlink w:anchor="_Toc244258870" w:history="1">
+          <w:hyperlink w:anchor="_Toc244259559" w:history="1">
             <w:r>
               <w:rPr>
                 <w:rStyle w:val="Collegamentoipertestuale"/>
@@ -1036,7 +1036,7 @@
               <w:rPr>
                 <w:noProof/>
               </w:rPr>
-              <w:instrText xml:space="preserve"> PAGEREF _Toc244258870 \h </w:instrText>
+              <w:instrText xml:space="preserve"> PAGEREF _Toc244259559 \h </w:instrText>
             </w:r>
             <w:r>
               <w:rPr>
@@ -1073,7 +1073,7 @@
               <w:noProof/>
             </w:rPr>
           </w:pPr>
-          <w:hyperlink w:anchor="_Toc244258871" w:history="1">
+          <w:hyperlink w:anchor="_Toc244259560" w:history="1">
             <w:r>
               <w:rPr>
                 <w:rStyle w:val="Collegamentoipertestuale"/>
@@ -1097,7 +1097,7 @@
               <w:rPr>
                 <w:noProof/>
               </w:rPr>
-              <w:instrText xml:space="preserve"> PAGEREF _Toc244258871 \h </w:instrText>
+              <w:instrText xml:space="preserve"> PAGEREF _Toc244259560 \h </w:instrText>
             </w:r>
             <w:r>
               <w:rPr>
@@ -1134,7 +1134,7 @@
               <w:noProof/>
             </w:rPr>
           </w:pPr>
-          <w:hyperlink w:anchor="_Toc244258872" w:history="1">
+          <w:hyperlink w:anchor="_Toc244259561" w:history="1">
             <w:r>
               <w:rPr>
                 <w:rStyle w:val="Collegamentoipertestuale"/>
@@ -1158,7 +1158,7 @@
               <w:rPr>
                 <w:noProof/>
               </w:rPr>
-              <w:instrText xml:space="preserve"> PAGEREF _Toc244258872 \h </w:instrText>
+              <w:instrText xml:space="preserve"> PAGEREF _Toc244259561 \h </w:instrText>
             </w:r>
             <w:r>
               <w:rPr>
@@ -1195,7 +1195,7 @@
               <w:noProof/>
             </w:rPr>
           </w:pPr>
-          <w:hyperlink w:anchor="_Toc244258873" w:history="1">
+          <w:hyperlink w:anchor="_Toc244259562" w:history="1">
             <w:r>
               <w:rPr>
                 <w:rStyle w:val="Collegamentoipertestuale"/>
@@ -1219,7 +1219,7 @@
               <w:rPr>
                 <w:noProof/>
               </w:rPr>
-              <w:instrText xml:space="preserve"> PAGEREF _Toc244258873 \h </w:instrText>
+              <w:instrText xml:space="preserve"> PAGEREF _Toc244259562 \h </w:instrText>
             </w:r>
             <w:r>
               <w:rPr>
@@ -1256,7 +1256,7 @@
               <w:noProof/>
             </w:rPr>
           </w:pPr>
-          <w:hyperlink w:anchor="_Toc244258874" w:history="1">
+          <w:hyperlink w:anchor="_Toc244259563" w:history="1">
             <w:r>
               <w:rPr>
                 <w:rStyle w:val="Collegamentoipertestuale"/>
@@ -1280,7 +1280,7 @@
               <w:rPr>
                 <w:noProof/>
               </w:rPr>
-              <w:instrText xml:space="preserve"> PAGEREF _Toc244258874 \h </w:instrText>
+              <w:instrText xml:space="preserve"> PAGEREF _Toc244259563 \h </w:instrText>
             </w:r>
             <w:r>
               <w:rPr>
@@ -1317,7 +1317,7 @@
               <w:noProof/>
             </w:rPr>
           </w:pPr>
-          <w:hyperlink w:anchor="_Toc244258875" w:history="1">
+          <w:hyperlink w:anchor="_Toc244259564" w:history="1">
             <w:r>
               <w:rPr>
                 <w:rStyle w:val="Collegamentoipertestuale"/>
@@ -1341,7 +1341,7 @@
               <w:rPr>
                 <w:noProof/>
               </w:rPr>
-              <w:instrText xml:space="preserve"> PAGEREF _Toc244258875 \h </w:instrText>
+              <w:instrText xml:space="preserve"> PAGEREF _Toc244259564 \h </w:instrText>
             </w:r>
             <w:r>
               <w:rPr>
@@ -1378,7 +1378,7 @@
               <w:noProof/>
             </w:rPr>
           </w:pPr>
-          <w:hyperlink w:anchor="_Toc244258876" w:history="1">
+          <w:hyperlink w:anchor="_Toc244259565" w:history="1">
             <w:r>
               <w:rPr>
                 <w:rStyle w:val="Collegamentoipertestuale"/>
@@ -1402,7 +1402,7 @@
               <w:rPr>
                 <w:noProof/>
               </w:rPr>
-              <w:instrText xml:space="preserve"> PAGEREF _Toc244258876 \h </w:instrText>
+              <w:instrText xml:space="preserve"> PAGEREF _Toc244259565 \h </w:instrText>
             </w:r>
             <w:r>
               <w:rPr>
@@ -1439,7 +1439,7 @@
               <w:noProof/>
             </w:rPr>
           </w:pPr>
-          <w:hyperlink w:anchor="_Toc244258877" w:history="1">
+          <w:hyperlink w:anchor="_Toc244259566" w:history="1">
             <w:r>
               <w:rPr>
                 <w:rStyle w:val="Collegamentoipertestuale"/>
@@ -1463,7 +1463,7 @@
               <w:rPr>
                 <w:noProof/>
               </w:rPr>
-              <w:instrText xml:space="preserve"> PAGEREF _Toc244258877 \h </w:instrText>
+              <w:instrText xml:space="preserve"> PAGEREF _Toc244259566 \h </w:instrText>
             </w:r>
             <w:r>
               <w:rPr>
@@ -1500,7 +1500,7 @@
               <w:noProof/>
             </w:rPr>
           </w:pPr>
-          <w:hyperlink w:anchor="_Toc244258878" w:history="1">
+          <w:hyperlink w:anchor="_Toc244259567" w:history="1">
             <w:r>
               <w:rPr>
                 <w:rStyle w:val="Collegamentoipertestuale"/>
@@ -1524,7 +1524,7 @@
               <w:rPr>
                 <w:noProof/>
               </w:rPr>
-              <w:instrText xml:space="preserve"> PAGEREF _Toc244258878 \h </w:instrText>
+              <w:instrText xml:space="preserve"> PAGEREF _Toc244259567 \h </w:instrText>
             </w:r>
             <w:r>
               <w:rPr>
@@ -1561,7 +1561,7 @@
               <w:noProof/>
             </w:rPr>
           </w:pPr>
-          <w:hyperlink w:anchor="_Toc244258879" w:history="1">
+          <w:hyperlink w:anchor="_Toc244259568" w:history="1">
             <w:r>
               <w:rPr>
                 <w:rStyle w:val="Collegamentoipertestuale"/>
@@ -1585,7 +1585,7 @@
               <w:rPr>
                 <w:noProof/>
               </w:rPr>
-              <w:instrText xml:space="preserve"> PAGEREF _Toc244258879 \h </w:instrText>
+              <w:instrText xml:space="preserve"> PAGEREF _Toc244259568 \h </w:instrText>
             </w:r>
             <w:r>
               <w:rPr>
@@ -1622,7 +1622,7 @@
               <w:noProof/>
             </w:rPr>
           </w:pPr>
-          <w:hyperlink w:anchor="_Toc244258880" w:history="1">
+          <w:hyperlink w:anchor="_Toc244259569" w:history="1">
             <w:r>
               <w:rPr>
                 <w:rStyle w:val="Collegamentoipertestuale"/>
@@ -1646,7 +1646,7 @@
               <w:rPr>
                 <w:noProof/>
               </w:rPr>
-              <w:instrText xml:space="preserve"> PAGEREF _Toc244258880 \h </w:instrText>
+              <w:instrText xml:space="preserve"> PAGEREF _Toc244259569 \h </w:instrText>
             </w:r>
             <w:r>
               <w:rPr>
@@ -1683,7 +1683,7 @@
               <w:noProof/>
             </w:rPr>
           </w:pPr>
-          <w:hyperlink w:anchor="_Toc244258881" w:history="1">
+          <w:hyperlink w:anchor="_Toc244259570" w:history="1">
             <w:r>
               <w:rPr>
                 <w:rStyle w:val="Collegamentoipertestuale"/>
@@ -1707,7 +1707,7 @@
               <w:rPr>
                 <w:noProof/>
               </w:rPr>
-              <w:instrText xml:space="preserve"> PAGEREF _Toc244258881 \h </w:instrText>
+              <w:instrText xml:space="preserve"> PAGEREF _Toc244259570 \h </w:instrText>
             </w:r>
             <w:r>
               <w:rPr>
@@ -1744,7 +1744,7 @@
               <w:noProof/>
             </w:rPr>
           </w:pPr>
-          <w:hyperlink w:anchor="_Toc244258882" w:history="1">
+          <w:hyperlink w:anchor="_Toc244259571" w:history="1">
             <w:r>
               <w:rPr>
                 <w:rStyle w:val="Collegamentoipertestuale"/>
@@ -1768,7 +1768,7 @@
               <w:rPr>
                 <w:noProof/>
               </w:rPr>
-              <w:instrText xml:space="preserve"> PAGEREF _Toc244258882 \h </w:instrText>
+              <w:instrText xml:space="preserve"> PAGEREF _Toc244259571 \h </w:instrText>
             </w:r>
             <w:r>
               <w:rPr>
@@ -1805,7 +1805,7 @@
               <w:noProof/>
             </w:rPr>
           </w:pPr>
-          <w:hyperlink w:anchor="_Toc244258883" w:history="1">
+          <w:hyperlink w:anchor="_Toc244259572" w:history="1">
             <w:r>
               <w:rPr>
                 <w:rStyle w:val="Collegamentoipertestuale"/>
@@ -1829,7 +1829,7 @@
               <w:rPr>
                 <w:noProof/>
               </w:rPr>
-              <w:instrText xml:space="preserve"> PAGEREF _Toc244258883 \h </w:instrText>
+              <w:instrText xml:space="preserve"> PAGEREF _Toc244259572 \h </w:instrText>
             </w:r>
             <w:r>
               <w:rPr>
@@ -1866,7 +1866,7 @@
               <w:noProof/>
             </w:rPr>
           </w:pPr>
-          <w:hyperlink w:anchor="_Toc244258884" w:history="1">
+          <w:hyperlink w:anchor="_Toc244259573" w:history="1">
             <w:r>
               <w:rPr>
                 <w:rStyle w:val="Collegamentoipertestuale"/>
@@ -1890,7 +1890,7 @@
               <w:rPr>
                 <w:noProof/>
               </w:rPr>
-              <w:instrText xml:space="preserve"> PAGEREF _Toc244258884 \h </w:instrText>
+              <w:instrText xml:space="preserve"> PAGEREF _Toc244259573 \h </w:instrText>
             </w:r>
             <w:r>
               <w:rPr>
@@ -1927,7 +1927,7 @@
               <w:noProof/>
             </w:rPr>
           </w:pPr>
-          <w:hyperlink w:anchor="_Toc244258885" w:history="1">
+          <w:hyperlink w:anchor="_Toc244259574" w:history="1">
             <w:r>
               <w:rPr>
                 <w:rStyle w:val="Collegamentoipertestuale"/>
@@ -1951,7 +1951,7 @@
               <w:rPr>
                 <w:noProof/>
               </w:rPr>
-              <w:instrText xml:space="preserve"> PAGEREF _Toc244258885 \h </w:instrText>
+              <w:instrText xml:space="preserve"> PAGEREF _Toc244259574 \h </w:instrText>
             </w:r>
             <w:r>
               <w:rPr>
@@ -1988,7 +1988,7 @@
               <w:noProof/>
             </w:rPr>
           </w:pPr>
-          <w:hyperlink w:anchor="_Toc244258886" w:history="1">
+          <w:hyperlink w:anchor="_Toc244259575" w:history="1">
             <w:r>
               <w:rPr>
                 <w:rStyle w:val="Collegamentoipertestuale"/>
@@ -2012,7 +2012,7 @@
               <w:rPr>
                 <w:noProof/>
               </w:rPr>
-              <w:instrText xml:space="preserve"> PAGEREF _Toc244258886 \h </w:instrText>
+              <w:instrText xml:space="preserve"> PAGEREF _Toc244259575 \h </w:instrText>
             </w:r>
             <w:r>
               <w:rPr>
@@ -2049,7 +2049,7 @@
               <w:noProof/>
             </w:rPr>
           </w:pPr>
-          <w:hyperlink w:anchor="_Toc244258887" w:history="1">
+          <w:hyperlink w:anchor="_Toc244259576" w:history="1">
             <w:r>
               <w:rPr>
                 <w:rStyle w:val="Collegamentoipertestuale"/>
@@ -2073,7 +2073,7 @@
               <w:rPr>
                 <w:noProof/>
               </w:rPr>
-              <w:instrText xml:space="preserve"> PAGEREF _Toc244258887 \h </w:instrText>
+              <w:instrText xml:space="preserve"> PAGEREF _Toc244259576 \h </w:instrText>
             </w:r>
             <w:r>
               <w:rPr>
@@ -2110,7 +2110,7 @@
               <w:noProof/>
             </w:rPr>
           </w:pPr>
-          <w:hyperlink w:anchor="_Toc244258888" w:history="1">
+          <w:hyperlink w:anchor="_Toc244259577" w:history="1">
             <w:r>
               <w:rPr>
                 <w:rStyle w:val="Collegamentoipertestuale"/>
@@ -2134,7 +2134,7 @@
               <w:rPr>
                 <w:noProof/>
               </w:rPr>
-              <w:instrText xml:space="preserve"> PAGEREF _Toc244258888 \h </w:instrText>
+              <w:instrText xml:space="preserve"> PAGEREF _Toc244259577 \h </w:instrText>
             </w:r>
             <w:r>
               <w:rPr>
@@ -2171,7 +2171,7 @@
               <w:noProof/>
             </w:rPr>
           </w:pPr>
-          <w:hyperlink w:anchor="_Toc244258889" w:history="1">
+          <w:hyperlink w:anchor="_Toc244259578" w:history="1">
             <w:r>
               <w:rPr>
                 <w:rStyle w:val="Collegamentoipertestuale"/>
@@ -2195,7 +2195,7 @@
               <w:rPr>
                 <w:noProof/>
               </w:rPr>
-              <w:instrText xml:space="preserve"> PAGEREF _Toc244258889 \h </w:instrText>
+              <w:instrText xml:space="preserve"> PAGEREF _Toc244259578 \h </w:instrText>
             </w:r>
             <w:r>
               <w:rPr>
@@ -2232,7 +2232,7 @@
               <w:noProof/>
             </w:rPr>
           </w:pPr>
-          <w:hyperlink w:anchor="_Toc244258890" w:history="1">
+          <w:hyperlink w:anchor="_Toc244259579" w:history="1">
             <w:r>
               <w:rPr>
                 <w:rStyle w:val="Collegamentoipertestuale"/>
@@ -2256,7 +2256,7 @@
               <w:rPr>
                 <w:noProof/>
               </w:rPr>
-              <w:instrText xml:space="preserve"> PAGEREF _Toc244258890 \h </w:instrText>
+              <w:instrText xml:space="preserve"> PAGEREF _Toc244259579 \h </w:instrText>
             </w:r>
             <w:r>
               <w:rPr>
@@ -2293,7 +2293,7 @@
               <w:noProof/>
             </w:rPr>
           </w:pPr>
-          <w:hyperlink w:anchor="_Toc244258891" w:history="1">
+          <w:hyperlink w:anchor="_Toc244259580" w:history="1">
             <w:r>
               <w:rPr>
                 <w:rStyle w:val="Collegamentoipertestuale"/>
@@ -2317,7 +2317,7 @@
               <w:rPr>
                 <w:noProof/>
               </w:rPr>
-              <w:instrText xml:space="preserve"> PAGEREF _Toc244258891 \h </w:instrText>
+              <w:instrText xml:space="preserve"> PAGEREF _Toc244259580 \h </w:instrText>
             </w:r>
             <w:r>
               <w:rPr>
@@ -2354,7 +2354,7 @@
               <w:noProof/>
             </w:rPr>
           </w:pPr>
-          <w:hyperlink w:anchor="_Toc244258892" w:history="1">
+          <w:hyperlink w:anchor="_Toc244259581" w:history="1">
             <w:r>
               <w:rPr>
                 <w:rStyle w:val="Collegamentoipertestuale"/>
@@ -2378,7 +2378,7 @@
               <w:rPr>
                 <w:noProof/>
               </w:rPr>
-              <w:instrText xml:space="preserve"> PAGEREF _Toc244258892 \h </w:instrText>
+              <w:instrText xml:space="preserve"> PAGEREF _Toc244259581 \h </w:instrText>
             </w:r>
             <w:r>
               <w:rPr>
@@ -2415,7 +2415,7 @@
               <w:noProof/>
             </w:rPr>
           </w:pPr>
-          <w:hyperlink w:anchor="_Toc244258893" w:history="1">
+          <w:hyperlink w:anchor="_Toc244259582" w:history="1">
             <w:r>
               <w:rPr>
                 <w:rStyle w:val="Collegamentoipertestuale"/>
@@ -2439,7 +2439,7 @@
               <w:rPr>
                 <w:noProof/>
               </w:rPr>
-              <w:instrText xml:space="preserve"> PAGEREF _Toc244258893 \h </w:instrText>
+              <w:instrText xml:space="preserve"> PAGEREF _Toc244259582 \h </w:instrText>
             </w:r>
             <w:r>
               <w:rPr>
@@ -2476,7 +2476,7 @@
               <w:noProof/>
             </w:rPr>
           </w:pPr>
-          <w:hyperlink w:anchor="_Toc244258894" w:history="1">
+          <w:hyperlink w:anchor="_Toc244259583" w:history="1">
             <w:r>
               <w:rPr>
                 <w:rStyle w:val="Collegamentoipertestuale"/>
@@ -2500,7 +2500,7 @@
               <w:rPr>
                 <w:noProof/>
               </w:rPr>
-              <w:instrText xml:space="preserve"> PAGEREF _Toc244258894 \h </w:instrText>
+              <w:instrText xml:space="preserve"> PAGEREF _Toc244259583 \h </w:instrText>
             </w:r>
             <w:r>
               <w:rPr>
@@ -2537,7 +2537,7 @@
               <w:noProof/>
             </w:rPr>
           </w:pPr>
-          <w:hyperlink w:anchor="_Toc244258895" w:history="1">
+          <w:hyperlink w:anchor="_Toc244259584" w:history="1">
             <w:r>
               <w:rPr>
                 <w:rStyle w:val="Collegamentoipertestuale"/>
@@ -2561,7 +2561,7 @@
               <w:rPr>
                 <w:noProof/>
               </w:rPr>
-              <w:instrText xml:space="preserve"> PAGEREF _Toc244258895 \h </w:instrText>
+              <w:instrText xml:space="preserve"> PAGEREF _Toc244259584 \h </w:instrText>
             </w:r>
             <w:r>
               <w:rPr>
@@ -2598,7 +2598,7 @@
               <w:noProof/>
             </w:rPr>
           </w:pPr>
-          <w:hyperlink w:anchor="_Toc244258896" w:history="1">
+          <w:hyperlink w:anchor="_Toc244259585" w:history="1">
             <w:r>
               <w:rPr>
                 <w:rStyle w:val="Collegamentoipertestuale"/>
@@ -2622,7 +2622,7 @@
               <w:rPr>
                 <w:noProof/>
               </w:rPr>
-              <w:instrText xml:space="preserve"> PAGEREF _Toc244258896 \h </w:instrText>
+              <w:instrText xml:space="preserve"> PAGEREF _Toc244259585 \h </w:instrText>
             </w:r>
             <w:r>
               <w:rPr>
@@ -2659,7 +2659,7 @@
               <w:noProof/>
             </w:rPr>
           </w:pPr>
-          <w:hyperlink w:anchor="_Toc244258897" w:history="1">
+          <w:hyperlink w:anchor="_Toc244259586" w:history="1">
             <w:r>
               <w:rPr>
                 <w:rStyle w:val="Collegamentoipertestuale"/>
@@ -2683,7 +2683,7 @@
               <w:rPr>
                 <w:noProof/>
               </w:rPr>
-              <w:instrText xml:space="preserve"> PAGEREF _Toc244258897 \h </w:instrText>
+              <w:instrText xml:space="preserve"> PAGEREF _Toc244259586 \h </w:instrText>
             </w:r>
             <w:r>
               <w:rPr>
@@ -2720,7 +2720,7 @@
               <w:noProof/>
             </w:rPr>
           </w:pPr>
-          <w:hyperlink w:anchor="_Toc244258898" w:history="1">
+          <w:hyperlink w:anchor="_Toc244259587" w:history="1">
             <w:r>
               <w:rPr>
                 <w:rStyle w:val="Collegamentoipertestuale"/>
@@ -2744,7 +2744,7 @@
               <w:rPr>
                 <w:noProof/>
               </w:rPr>
-              <w:instrText xml:space="preserve"> PAGEREF _Toc244258898 \h </w:instrText>
+              <w:instrText xml:space="preserve"> PAGEREF _Toc244259587 \h </w:instrText>
             </w:r>
             <w:r>
               <w:rPr>
@@ -2781,7 +2781,7 @@
               <w:noProof/>
             </w:rPr>
           </w:pPr>
-          <w:hyperlink w:anchor="_Toc244258899" w:history="1">
+          <w:hyperlink w:anchor="_Toc244259588" w:history="1">
             <w:r>
               <w:rPr>
                 <w:rStyle w:val="Collegamentoipertestuale"/>
@@ -2805,7 +2805,7 @@
               <w:rPr>
                 <w:noProof/>
               </w:rPr>
-              <w:instrText xml:space="preserve"> PAGEREF _Toc244258899 \h </w:instrText>
+              <w:instrText xml:space="preserve"> PAGEREF _Toc244259588 \h </w:instrText>
             </w:r>
             <w:r>
               <w:rPr>
@@ -2842,7 +2842,7 @@
               <w:noProof/>
             </w:rPr>
           </w:pPr>
-          <w:hyperlink w:anchor="_Toc244258900" w:history="1">
+          <w:hyperlink w:anchor="_Toc244259589" w:history="1">
             <w:r>
               <w:rPr>
                 <w:rStyle w:val="Collegamentoipertestuale"/>
@@ -2866,7 +2866,7 @@
               <w:rPr>
                 <w:noProof/>
               </w:rPr>
-              <w:instrText xml:space="preserve"> PAGEREF _Toc244258900 \h </w:instrText>
+              <w:instrText xml:space="preserve"> PAGEREF _Toc244259589 \h </w:instrText>
             </w:r>
             <w:r>
               <w:rPr>
@@ -2903,7 +2903,7 @@
               <w:noProof/>
             </w:rPr>
           </w:pPr>
-          <w:hyperlink w:anchor="_Toc244258901" w:history="1">
+          <w:hyperlink w:anchor="_Toc244259590" w:history="1">
             <w:r>
               <w:rPr>
                 <w:rStyle w:val="Collegamentoipertestuale"/>
@@ -2927,7 +2927,7 @@
               <w:rPr>
                 <w:noProof/>
               </w:rPr>
-              <w:instrText xml:space="preserve"> PAGEREF _Toc244258901 \h </w:instrText>
+              <w:instrText xml:space="preserve"> PAGEREF _Toc244259590 \h </w:instrText>
             </w:r>
             <w:r>
               <w:rPr>
@@ -2964,7 +2964,7 @@
               <w:noProof/>
             </w:rPr>
           </w:pPr>
-          <w:hyperlink w:anchor="_Toc244258902" w:history="1">
+          <w:hyperlink w:anchor="_Toc244259591" w:history="1">
             <w:r>
               <w:rPr>
                 <w:rStyle w:val="Collegamentoipertestuale"/>
@@ -2988,7 +2988,7 @@
               <w:rPr>
                 <w:noProof/>
               </w:rPr>
-              <w:instrText xml:space="preserve"> PAGEREF _Toc244258902 \h </w:instrText>
+              <w:instrText xml:space="preserve"> PAGEREF _Toc244259591 \h </w:instrText>
             </w:r>
             <w:r>
               <w:rPr>
@@ -3025,7 +3025,7 @@
               <w:noProof/>
             </w:rPr>
           </w:pPr>
-          <w:hyperlink w:anchor="_Toc244258903" w:history="1">
+          <w:hyperlink w:anchor="_Toc244259592" w:history="1">
             <w:r>
               <w:rPr>
                 <w:rStyle w:val="Collegamentoipertestuale"/>
@@ -3049,7 +3049,7 @@
               <w:rPr>
                 <w:noProof/>
               </w:rPr>
-              <w:instrText xml:space="preserve"> PAGEREF _Toc244258903 \h </w:instrText>
+              <w:instrText xml:space="preserve"> PAGEREF _Toc244259592 \h </w:instrText>
             </w:r>
             <w:r>
               <w:rPr>
@@ -3086,7 +3086,7 @@
               <w:noProof/>
             </w:rPr>
           </w:pPr>
-          <w:hyperlink w:anchor="_Toc244258904" w:history="1">
+          <w:hyperlink w:anchor="_Toc244259593" w:history="1">
             <w:r>
               <w:rPr>
                 <w:rStyle w:val="Collegamentoipertestuale"/>
@@ -3110,7 +3110,7 @@
               <w:rPr>
                 <w:noProof/>
               </w:rPr>
-              <w:instrText xml:space="preserve"> PAGEREF _Toc244258904 \h </w:instrText>
+              <w:instrText xml:space="preserve"> PAGEREF _Toc244259593 \h </w:instrText>
             </w:r>
             <w:r>
               <w:rPr>
@@ -3147,7 +3147,7 @@
               <w:noProof/>
             </w:rPr>
           </w:pPr>
-          <w:hyperlink w:anchor="_Toc244258905" w:history="1">
+          <w:hyperlink w:anchor="_Toc244259594" w:history="1">
             <w:r>
               <w:rPr>
                 <w:rStyle w:val="Collegamentoipertestuale"/>
@@ -3171,7 +3171,7 @@
               <w:rPr>
                 <w:noProof/>
               </w:rPr>
-              <w:instrText xml:space="preserve"> PAGEREF _Toc244258905 \h </w:instrText>
+              <w:instrText xml:space="preserve"> PAGEREF _Toc244259594 \h </w:instrText>
             </w:r>
             <w:r>
               <w:rPr>
@@ -3208,7 +3208,7 @@
               <w:noProof/>
             </w:rPr>
           </w:pPr>
-          <w:hyperlink w:anchor="_Toc244258906" w:history="1">
+          <w:hyperlink w:anchor="_Toc244259595" w:history="1">
             <w:r>
               <w:rPr>
                 <w:rStyle w:val="Collegamentoipertestuale"/>
@@ -3232,7 +3232,7 @@
               <w:rPr>
                 <w:noProof/>
               </w:rPr>
-              <w:instrText xml:space="preserve"> PAGEREF _Toc244258906 \h </w:instrText>
+              <w:instrText xml:space="preserve"> PAGEREF _Toc244259595 \h </w:instrText>
             </w:r>
             <w:r>
               <w:rPr>
@@ -3269,7 +3269,7 @@
               <w:noProof/>
             </w:rPr>
           </w:pPr>
-          <w:hyperlink w:anchor="_Toc244258907" w:history="1">
+          <w:hyperlink w:anchor="_Toc244259596" w:history="1">
             <w:r>
               <w:rPr>
                 <w:rStyle w:val="Collegamentoipertestuale"/>
@@ -3293,7 +3293,7 @@
               <w:rPr>
                 <w:noProof/>
               </w:rPr>
-              <w:instrText xml:space="preserve"> PAGEREF _Toc244258907 \h </w:instrText>
+              <w:instrText xml:space="preserve"> PAGEREF _Toc244259596 \h </w:instrText>
             </w:r>
             <w:r>
               <w:rPr>
@@ -3330,7 +3330,7 @@
               <w:noProof/>
             </w:rPr>
           </w:pPr>
-          <w:hyperlink w:anchor="_Toc244258908" w:history="1">
+          <w:hyperlink w:anchor="_Toc244259597" w:history="1">
             <w:r>
               <w:rPr>
                 <w:rStyle w:val="Collegamentoipertestuale"/>
@@ -3354,7 +3354,7 @@
               <w:rPr>
                 <w:noProof/>
               </w:rPr>
-              <w:instrText xml:space="preserve"> PAGEREF _Toc244258908 \h </w:instrText>
+              <w:instrText xml:space="preserve"> PAGEREF _Toc244259597 \h </w:instrText>
             </w:r>
             <w:r>
               <w:rPr>
@@ -3391,7 +3391,7 @@
               <w:noProof/>
             </w:rPr>
           </w:pPr>
-          <w:hyperlink w:anchor="_Toc244258909" w:history="1">
+          <w:hyperlink w:anchor="_Toc244259598" w:history="1">
             <w:r>
               <w:rPr>
                 <w:rStyle w:val="Collegamentoipertestuale"/>
@@ -3415,7 +3415,7 @@
               <w:rPr>
                 <w:noProof/>
               </w:rPr>
-              <w:instrText xml:space="preserve"> PAGEREF _Toc244258909 \h </w:instrText>
+              <w:instrText xml:space="preserve"> PAGEREF _Toc244259598 \h </w:instrText>
             </w:r>
             <w:r>
               <w:rPr>
@@ -3452,7 +3452,7 @@
               <w:noProof/>
             </w:rPr>
           </w:pPr>
-          <w:hyperlink w:anchor="_Toc244258910" w:history="1">
+          <w:hyperlink w:anchor="_Toc244259599" w:history="1">
             <w:r>
               <w:rPr>
                 <w:rStyle w:val="Collegamentoipertestuale"/>
@@ -3476,7 +3476,7 @@
               <w:rPr>
                 <w:noProof/>
               </w:rPr>
-              <w:instrText xml:space="preserve"> PAGEREF _Toc244258910 \h </w:instrText>
+              <w:instrText xml:space="preserve"> PAGEREF _Toc244259599 \h </w:instrText>
             </w:r>
             <w:r>
               <w:rPr>
@@ -3513,7 +3513,7 @@
               <w:noProof/>
             </w:rPr>
           </w:pPr>
-          <w:hyperlink w:anchor="_Toc244258911" w:history="1">
+          <w:hyperlink w:anchor="_Toc244259600" w:history="1">
             <w:r>
               <w:rPr>
                 <w:rStyle w:val="Collegamentoipertestuale"/>
@@ -3537,7 +3537,7 @@
               <w:rPr>
                 <w:noProof/>
               </w:rPr>
-              <w:instrText xml:space="preserve"> PAGEREF _Toc244258911 \h </w:instrText>
+              <w:instrText xml:space="preserve"> PAGEREF _Toc244259600 \h </w:instrText>
             </w:r>
             <w:r>
               <w:rPr>
@@ -3574,7 +3574,7 @@
               <w:noProof/>
             </w:rPr>
           </w:pPr>
-          <w:hyperlink w:anchor="_Toc244258912" w:history="1">
+          <w:hyperlink w:anchor="_Toc244259601" w:history="1">
             <w:r>
               <w:rPr>
                 <w:rStyle w:val="Collegamentoipertestuale"/>
@@ -3598,7 +3598,7 @@
               <w:rPr>
                 <w:noProof/>
               </w:rPr>
-              <w:instrText xml:space="preserve"> PAGEREF _Toc244258912 \h </w:instrText>
+              <w:instrText xml:space="preserve"> PAGEREF _Toc244259601 \h </w:instrText>
             </w:r>
             <w:r>
               <w:rPr>
@@ -3635,7 +3635,7 @@
               <w:noProof/>
             </w:rPr>
           </w:pPr>
-          <w:hyperlink w:anchor="_Toc244258913" w:history="1">
+          <w:hyperlink w:anchor="_Toc244259602" w:history="1">
             <w:r>
               <w:rPr>
                 <w:rStyle w:val="Collegamentoipertestuale"/>
@@ -3659,7 +3659,7 @@
               <w:rPr>
                 <w:noProof/>
               </w:rPr>
-              <w:instrText xml:space="preserve"> PAGEREF _Toc244258913 \h </w:instrText>
+              <w:instrText xml:space="preserve"> PAGEREF _Toc244259602 \h </w:instrText>
             </w:r>
             <w:r>
               <w:rPr>
@@ -3696,7 +3696,7 @@
               <w:noProof/>
             </w:rPr>
           </w:pPr>
-          <w:hyperlink w:anchor="_Toc244258914" w:history="1">
+          <w:hyperlink w:anchor="_Toc244259603" w:history="1">
             <w:r>
               <w:rPr>
                 <w:rStyle w:val="Collegamentoipertestuale"/>
@@ -3720,7 +3720,7 @@
               <w:rPr>
                 <w:noProof/>
               </w:rPr>
-              <w:instrText xml:space="preserve"> PAGEREF _Toc244258914 \h </w:instrText>
+              <w:instrText xml:space="preserve"> PAGEREF _Toc244259603 \h </w:instrText>
             </w:r>
             <w:r>
               <w:rPr>
@@ -3757,7 +3757,7 @@
               <w:noProof/>
             </w:rPr>
           </w:pPr>
-          <w:hyperlink w:anchor="_Toc244258915" w:history="1">
+          <w:hyperlink w:anchor="_Toc244259604" w:history="1">
             <w:r>
               <w:rPr>
                 <w:rStyle w:val="Collegamentoipertestuale"/>
@@ -3781,7 +3781,7 @@
               <w:rPr>
                 <w:noProof/>
               </w:rPr>
-              <w:instrText xml:space="preserve"> PAGEREF _Toc244258915 \h </w:instrText>
+              <w:instrText xml:space="preserve"> PAGEREF _Toc244259604 \h </w:instrText>
             </w:r>
             <w:r>
               <w:rPr>
@@ -3818,7 +3818,7 @@
               <w:noProof/>
             </w:rPr>
           </w:pPr>
-          <w:hyperlink w:anchor="_Toc244258916" w:history="1">
+          <w:hyperlink w:anchor="_Toc244259605" w:history="1">
             <w:r>
               <w:rPr>
                 <w:rStyle w:val="Collegamentoipertestuale"/>
@@ -3842,7 +3842,7 @@
               <w:rPr>
                 <w:noProof/>
               </w:rPr>
-              <w:instrText xml:space="preserve"> PAGEREF _Toc244258916 \h </w:instrText>
+              <w:instrText xml:space="preserve"> PAGEREF _Toc244259605 \h </w:instrText>
             </w:r>
             <w:r>
               <w:rPr>
@@ -3879,7 +3879,7 @@
               <w:noProof/>
             </w:rPr>
           </w:pPr>
-          <w:hyperlink w:anchor="_Toc244258917" w:history="1">
+          <w:hyperlink w:anchor="_Toc244259606" w:history="1">
             <w:r>
               <w:rPr>
                 <w:rStyle w:val="Collegamentoipertestuale"/>
@@ -3903,7 +3903,7 @@
               <w:rPr>
                 <w:noProof/>
               </w:rPr>
-              <w:instrText xml:space="preserve"> PAGEREF _Toc244258917 \h </w:instrText>
+              <w:instrText xml:space="preserve"> PAGEREF _Toc244259606 \h </w:instrText>
             </w:r>
             <w:r>
               <w:rPr>
@@ -3940,7 +3940,7 @@
               <w:noProof/>
             </w:rPr>
           </w:pPr>
-          <w:hyperlink w:anchor="_Toc244258918" w:history="1">
+          <w:hyperlink w:anchor="_Toc244259607" w:history="1">
             <w:r>
               <w:rPr>
                 <w:rStyle w:val="Collegamentoipertestuale"/>
@@ -3964,7 +3964,7 @@
               <w:rPr>
                 <w:noProof/>
               </w:rPr>
-              <w:instrText xml:space="preserve"> PAGEREF _Toc244258918 \h </w:instrText>
+              <w:instrText xml:space="preserve"> PAGEREF _Toc244259607 \h </w:instrText>
             </w:r>
             <w:r>
               <w:rPr>
@@ -4001,7 +4001,7 @@
               <w:noProof/>
             </w:rPr>
           </w:pPr>
-          <w:hyperlink w:anchor="_Toc244258919" w:history="1">
+          <w:hyperlink w:anchor="_Toc244259608" w:history="1">
             <w:r>
               <w:rPr>
                 <w:rStyle w:val="Collegamentoipertestuale"/>
@@ -4025,7 +4025,7 @@
               <w:rPr>
                 <w:noProof/>
               </w:rPr>
-              <w:instrText xml:space="preserve"> PAGEREF _Toc244258919 \h </w:instrText>
+              <w:instrText xml:space="preserve"> PAGEREF _Toc244259608 \h </w:instrText>
             </w:r>
             <w:r>
               <w:rPr>
@@ -4062,7 +4062,7 @@
               <w:noProof/>
             </w:rPr>
           </w:pPr>
-          <w:hyperlink w:anchor="_Toc244258920" w:history="1">
+          <w:hyperlink w:anchor="_Toc244259609" w:history="1">
             <w:r>
               <w:rPr>
                 <w:rStyle w:val="Collegamentoipertestuale"/>
@@ -4086,7 +4086,7 @@
               <w:rPr>
                 <w:noProof/>
               </w:rPr>
-              <w:instrText xml:space="preserve"> PAGEREF _Toc244258920 \h </w:instrText>
+              <w:instrText xml:space="preserve"> PAGEREF _Toc244259609 \h </w:instrText>
             </w:r>
             <w:r>
               <w:rPr>
@@ -4123,7 +4123,7 @@
               <w:noProof/>
             </w:rPr>
           </w:pPr>
-          <w:hyperlink w:anchor="_Toc244258921" w:history="1">
+          <w:hyperlink w:anchor="_Toc244259610" w:history="1">
             <w:r>
               <w:rPr>
                 <w:rStyle w:val="Collegamentoipertestuale"/>
@@ -4147,7 +4147,7 @@
               <w:rPr>
                 <w:noProof/>
               </w:rPr>
-              <w:instrText xml:space="preserve"> PAGEREF _Toc244258921 \h </w:instrText>
+              <w:instrText xml:space="preserve"> PAGEREF _Toc244259610 \h </w:instrText>
             </w:r>
             <w:r>
               <w:rPr>
@@ -4190,7 +4190,7 @@
       <w:pPr>
         <w:pStyle w:val="Titolo1"/>
       </w:pPr>
-      <w:bookmarkStart w:id="0" w:name="_Toc244258856"/>
+      <w:bookmarkStart w:id="0" w:name="_Toc244259545"/>
       <w:r>
         <w:t>1. In breve</w:t>
       </w:r>
@@ -4631,7 +4631,7 @@
       <w:pPr>
         <w:pStyle w:val="Titolo1"/>
       </w:pPr>
-      <w:bookmarkStart w:id="1" w:name="_Toc244258857"/>
+      <w:bookmarkStart w:id="1" w:name="_Toc244259546"/>
       <w:r>
         <w:t>2. Nuovo marchio</w:t>
       </w:r>
@@ -4641,7 +4641,7 @@
       <w:pPr>
         <w:pStyle w:val="Titolo2"/>
       </w:pPr>
-      <w:bookmarkStart w:id="2" w:name="_Toc244258858"/>
+      <w:bookmarkStart w:id="2" w:name="_Toc244259547"/>
       <w:r>
         <w:t>2.1 Nomi e identificativi</w:t>
       </w:r>
@@ -5187,7 +5187,7 @@
       <w:pPr>
         <w:pStyle w:val="Titolo2"/>
       </w:pPr>
-      <w:bookmarkStart w:id="3" w:name="_Toc244258859"/>
+      <w:bookmarkStart w:id="3" w:name="_Toc244259548"/>
       <w:r>
         <w:t>2.2 Colori</w:t>
       </w:r>
@@ -5582,7 +5582,7 @@
       <w:pPr>
         <w:pStyle w:val="Titolo2"/>
       </w:pPr>
-      <w:bookmarkStart w:id="4" w:name="_Toc244258860"/>
+      <w:bookmarkStart w:id="4" w:name="_Toc244259549"/>
       <w:r>
         <w:t>2.3 Icona in uso: 24 «Foglio senza fondo» (serie 6, 22 ottobre)</w:t>
       </w:r>
@@ -5616,7 +5616,7 @@
           <w:noProof/>
         </w:rPr>
         <w:drawing>
-          <wp:inline distT="0" distB="0" distL="0" distR="0" wp14:anchorId="0280F173" wp14:editId="27BB8C97">
+          <wp:inline distT="0" distB="0" distL="0" distR="0" wp14:anchorId="39911691" wp14:editId="0E1B90A5">
             <wp:extent cx="3429000" cy="4000500"/>
             <wp:effectExtent l="0" t="0" r="0" b="0"/>
             <wp:docPr id="2" name="Immagine 2"/>
@@ -5675,7 +5675,7 @@
       <w:pPr>
         <w:pStyle w:val="Titolo2"/>
       </w:pPr>
-      <w:bookmarkStart w:id="5" w:name="_Toc244258861"/>
+      <w:bookmarkStart w:id="5" w:name="_Toc244259550"/>
       <w:r>
         <w:t>2.4 Serie 4: la 17 «Foglio oro», in uso fino al 21 ottobre</w:t>
       </w:r>
@@ -5709,7 +5709,7 @@
           <w:noProof/>
         </w:rPr>
         <w:drawing>
-          <wp:inline distT="0" distB="0" distL="0" distR="0" wp14:anchorId="610D3F18" wp14:editId="543A5C13">
+          <wp:inline distT="0" distB="0" distL="0" distR="0" wp14:anchorId="5288C6DB" wp14:editId="6441B33F">
             <wp:extent cx="5334000" cy="5895975"/>
             <wp:effectExtent l="0" t="0" r="0" b="0"/>
             <wp:docPr id="3" name="Immagine 3"/>
@@ -6122,7 +6122,7 @@
       <w:pPr>
         <w:pStyle w:val="Titolo2"/>
       </w:pPr>
-      <w:bookmarkStart w:id="6" w:name="_Toc244258862"/>
+      <w:bookmarkStart w:id="6" w:name="_Toc244259551"/>
       <w:r>
         <w:t>2.5 Serie 5: la 17 con più bianco, la 19 in uso il 21 ottobre</w:t>
       </w:r>
@@ -6156,7 +6156,7 @@
           <w:noProof/>
         </w:rPr>
         <w:drawing>
-          <wp:inline distT="0" distB="0" distL="0" distR="0" wp14:anchorId="5DEB355E" wp14:editId="236B49A4">
+          <wp:inline distT="0" distB="0" distL="0" distR="0" wp14:anchorId="4786631C" wp14:editId="0995003E">
             <wp:extent cx="5715000" cy="3295650"/>
             <wp:effectExtent l="0" t="0" r="0" b="0"/>
             <wp:docPr id="4" name="Immagine 4"/>
@@ -6703,7 +6703,7 @@
       <w:pPr>
         <w:pStyle w:val="Titolo2"/>
       </w:pPr>
-      <w:bookmarkStart w:id="7" w:name="_Toc244258863"/>
+      <w:bookmarkStart w:id="7" w:name="_Toc244259552"/>
       <w:r>
         <w:t>2.6 Serie 3, non scelta (la 11 è diventata la serie 4)</w:t>
       </w:r>
@@ -6727,7 +6727,7 @@
           <w:noProof/>
         </w:rPr>
         <w:drawing>
-          <wp:inline distT="0" distB="0" distL="0" distR="0" wp14:anchorId="65F4E108" wp14:editId="7E69E28B">
+          <wp:inline distT="0" distB="0" distL="0" distR="0" wp14:anchorId="3437008C" wp14:editId="3D1CD346">
             <wp:extent cx="5905500" cy="4133850"/>
             <wp:effectExtent l="0" t="0" r="0" b="0"/>
             <wp:docPr id="5" name="Immagine 5"/>
@@ -7413,7 +7413,7 @@
       <w:pPr>
         <w:pStyle w:val="Titolo2"/>
       </w:pPr>
-      <w:bookmarkStart w:id="8" w:name="_Toc244258864"/>
+      <w:bookmarkStart w:id="8" w:name="_Toc244259553"/>
       <w:r>
         <w:t>2.7 Serie 2, non scelta</w:t>
       </w:r>
@@ -7437,7 +7437,7 @@
           <w:noProof/>
         </w:rPr>
         <w:drawing>
-          <wp:inline distT="0" distB="0" distL="0" distR="0" wp14:anchorId="3F24EB41" wp14:editId="0661E0BA">
+          <wp:inline distT="0" distB="0" distL="0" distR="0" wp14:anchorId="15E20B29" wp14:editId="1BD2D87F">
             <wp:extent cx="5905500" cy="4133850"/>
             <wp:effectExtent l="0" t="0" r="0" b="0"/>
             <wp:docPr id="6" name="Immagine 6"/>
@@ -8157,7 +8157,7 @@
       <w:pPr>
         <w:pStyle w:val="Titolo2"/>
       </w:pPr>
-      <w:bookmarkStart w:id="9" w:name="_Toc244258865"/>
+      <w:bookmarkStart w:id="9" w:name="_Toc244259554"/>
       <w:r>
         <w:t>2.8 Serie 1, scartata</w:t>
       </w:r>
@@ -8181,7 +8181,7 @@
           <w:noProof/>
         </w:rPr>
         <w:drawing>
-          <wp:inline distT="0" distB="0" distL="0" distR="0" wp14:anchorId="73F6F750" wp14:editId="647ABDA8">
+          <wp:inline distT="0" distB="0" distL="0" distR="0" wp14:anchorId="02C8473F" wp14:editId="5861FDD3">
             <wp:extent cx="4000500" cy="2800350"/>
             <wp:effectExtent l="0" t="0" r="0" b="0"/>
             <wp:docPr id="7" name="Immagine 7"/>
@@ -8240,7 +8240,7 @@
       <w:pPr>
         <w:pStyle w:val="Titolo2"/>
       </w:pPr>
-      <w:bookmarkStart w:id="10" w:name="_Toc244258866"/>
+      <w:bookmarkStart w:id="10" w:name="_Toc244259555"/>
       <w:r>
         <w:t>2.9 Verifica dei marchi registrati</w:t>
       </w:r>
@@ -8492,7 +8492,7 @@
       <w:pPr>
         <w:pStyle w:val="Titolo1"/>
       </w:pPr>
-      <w:bookmarkStart w:id="11" w:name="_Toc244258867"/>
+      <w:bookmarkStart w:id="11" w:name="_Toc244259556"/>
       <w:r>
         <w:t>3. Temi colore</w:t>
       </w:r>
@@ -8526,7 +8526,7 @@
           <w:noProof/>
         </w:rPr>
         <w:drawing>
-          <wp:inline distT="0" distB="0" distL="0" distR="0" wp14:anchorId="53CAD123" wp14:editId="26C61644">
+          <wp:inline distT="0" distB="0" distL="0" distR="0" wp14:anchorId="42535B80" wp14:editId="12EA11CC">
             <wp:extent cx="4572000" cy="3429000"/>
             <wp:effectExtent l="0" t="0" r="0" b="0"/>
             <wp:docPr id="8" name="Immagine 8"/>
@@ -9236,7 +9236,7 @@
       <w:pPr>
         <w:pStyle w:val="Titolo1"/>
       </w:pPr>
-      <w:bookmarkStart w:id="12" w:name="_Toc244258868"/>
+      <w:bookmarkStart w:id="12" w:name="_Toc244259557"/>
       <w:r>
         <w:t>4. Correzione: avvisi «come JavaScript»</w:t>
       </w:r>
@@ -9246,7 +9246,7 @@
       <w:pPr>
         <w:pStyle w:val="Titolo2"/>
       </w:pPr>
-      <w:bookmarkStart w:id="13" w:name="_Toc244258869"/>
+      <w:bookmarkStart w:id="13" w:name="_Toc244259558"/>
       <w:r>
         <w:t>4.1 Il problema</w:t>
       </w:r>
@@ -9649,7 +9649,7 @@
       <w:pPr>
         <w:pStyle w:val="Titolo2"/>
       </w:pPr>
-      <w:bookmarkStart w:id="14" w:name="_Toc244258870"/>
+      <w:bookmarkStart w:id="14" w:name="_Toc244259559"/>
       <w:r>
         <w:t>4.2 La soluzione</w:t>
       </w:r>
@@ -9782,7 +9782,7 @@
           <w:noProof/>
         </w:rPr>
         <w:drawing>
-          <wp:inline distT="0" distB="0" distL="0" distR="0" wp14:anchorId="1850ED6C" wp14:editId="73B0FCFB">
+          <wp:inline distT="0" distB="0" distL="0" distR="0" wp14:anchorId="38B97FD9" wp14:editId="3F6A7F46">
             <wp:extent cx="4572000" cy="3429000"/>
             <wp:effectExtent l="0" t="0" r="0" b="0"/>
             <wp:docPr id="9" name="Immagine 9"/>
@@ -9841,7 +9841,7 @@
       <w:pPr>
         <w:pStyle w:val="Titolo2"/>
       </w:pPr>
-      <w:bookmarkStart w:id="15" w:name="_Toc244258871"/>
+      <w:bookmarkStart w:id="15" w:name="_Toc244259560"/>
       <w:r>
         <w:t>4.3 Verifiche</w:t>
       </w:r>
@@ -9888,7 +9888,7 @@
       <w:pPr>
         <w:pStyle w:val="Titolo2"/>
       </w:pPr>
-      <w:bookmarkStart w:id="16" w:name="_Toc244258872"/>
+      <w:bookmarkStart w:id="16" w:name="_Toc244259561"/>
       <w:r>
         <w:t>4.4 Android: menu Tema e notifiche (versione 1.0.1)</w:t>
       </w:r>
@@ -10223,7 +10223,7 @@
       <w:pPr>
         <w:pStyle w:val="Titolo2"/>
       </w:pPr>
-      <w:bookmarkStart w:id="17" w:name="_Toc244258873"/>
+      <w:bookmarkStart w:id="17" w:name="_Toc244259562"/>
       <w:r>
         <w:t>4.5 App più leggera: traduzione tolta</w:t>
       </w:r>
@@ -10656,7 +10656,7 @@
       <w:pPr>
         <w:pStyle w:val="Titolo2"/>
       </w:pPr>
-      <w:bookmarkStart w:id="18" w:name="_Toc244258874"/>
+      <w:bookmarkStart w:id="18" w:name="_Toc244259563"/>
       <w:r>
         <w:t>4.6 Schede in una nuova finestra</w:t>
       </w:r>
@@ -10774,7 +10774,7 @@
           <w:noProof/>
         </w:rPr>
         <w:drawing>
-          <wp:inline distT="0" distB="0" distL="0" distR="0" wp14:anchorId="67E62497" wp14:editId="031694FE">
+          <wp:inline distT="0" distB="0" distL="0" distR="0" wp14:anchorId="73A1794B" wp14:editId="14B71C6C">
             <wp:extent cx="5715000" cy="857250"/>
             <wp:effectExtent l="0" t="0" r="0" b="0"/>
             <wp:docPr id="10" name="Immagine 10"/>
@@ -11063,7 +11063,7 @@
       <w:pPr>
         <w:pStyle w:val="Titolo2"/>
       </w:pPr>
-      <w:bookmarkStart w:id="19" w:name="_Toc244258875"/>
+      <w:bookmarkStart w:id="19" w:name="_Toc244259564"/>
       <w:r>
         <w:t>4.7 Riunire le finestre</w:t>
       </w:r>
@@ -11165,7 +11165,7 @@
       <w:pPr>
         <w:pStyle w:val="Titolo2"/>
       </w:pPr>
-      <w:bookmarkStart w:id="20" w:name="_Toc244258876"/>
+      <w:bookmarkStart w:id="20" w:name="_Toc244259565"/>
       <w:r>
         <w:t>4.8 Correzioni di «Modifica testo»</w:t>
       </w:r>
@@ -11430,7 +11430,7 @@
           <w:noProof/>
         </w:rPr>
         <w:drawing>
-          <wp:inline distT="0" distB="0" distL="0" distR="0" wp14:anchorId="145E897A" wp14:editId="09CCBF74">
+          <wp:inline distT="0" distB="0" distL="0" distR="0" wp14:anchorId="4FCA1D8C" wp14:editId="17DC542F">
             <wp:extent cx="3286125" cy="2286000"/>
             <wp:effectExtent l="0" t="0" r="0" b="0"/>
             <wp:docPr id="11" name="Immagine 11"/>
@@ -11495,7 +11495,7 @@
           <w:noProof/>
         </w:rPr>
         <w:drawing>
-          <wp:inline distT="0" distB="0" distL="0" distR="0" wp14:anchorId="0ED97D1E" wp14:editId="48A18F4F">
+          <wp:inline distT="0" distB="0" distL="0" distR="0" wp14:anchorId="7A965E1F" wp14:editId="75A5BD4D">
             <wp:extent cx="3286125" cy="2286000"/>
             <wp:effectExtent l="0" t="0" r="0" b="0"/>
             <wp:docPr id="12" name="Immagine 12"/>
@@ -11562,7 +11562,7 @@
       <w:pPr>
         <w:pStyle w:val="Titolo2"/>
       </w:pPr>
-      <w:bookmarkStart w:id="21" w:name="_Toc244258877"/>
+      <w:bookmarkStart w:id="21" w:name="_Toc244259566"/>
       <w:r>
         <w:t>4.9 Web app per iPhone</w:t>
       </w:r>
@@ -12001,7 +12001,7 @@
       <w:pPr>
         <w:pStyle w:val="Titolo2"/>
       </w:pPr>
-      <w:bookmarkStart w:id="22" w:name="_Toc244258878"/>
+      <w:bookmarkStart w:id="22" w:name="_Toc244259567"/>
       <w:r>
         <w:t>4.10 Aggiornamenti su Cloudflare (repository privato)</w:t>
       </w:r>
@@ -12515,7 +12515,7 @@
       <w:pPr>
         <w:pStyle w:val="Titolo2"/>
       </w:pPr>
-      <w:bookmarkStart w:id="23" w:name="_Toc244258879"/>
+      <w:bookmarkStart w:id="23" w:name="_Toc244259568"/>
       <w:r>
         <w:t>4.11 Eliminare firme, timbri e testi già applicati (versione 1.4.0)</w:t>
       </w:r>
@@ -12846,7 +12846,7 @@
           <w:noProof/>
         </w:rPr>
         <w:drawing>
-          <wp:inline distT="0" distB="0" distL="0" distR="0" wp14:anchorId="7903B85D" wp14:editId="1EC4D2DB">
+          <wp:inline distT="0" distB="0" distL="0" distR="0" wp14:anchorId="725C1E7E" wp14:editId="530ABACA">
             <wp:extent cx="2095500" cy="4533900"/>
             <wp:effectExtent l="0" t="0" r="0" b="0"/>
             <wp:docPr id="13" name="Immagine 13"/>
@@ -12943,7 +12943,7 @@
       <w:pPr>
         <w:pStyle w:val="Titolo2"/>
       </w:pPr>
-      <w:bookmarkStart w:id="24" w:name="_Toc244258880"/>
+      <w:bookmarkStart w:id="24" w:name="_Toc244259569"/>
       <w:r>
         <w:t>4.12 Telefono: pannello più grande e caselle di testo comode (versione 1.4.0)</w:t>
       </w:r>
@@ -13011,7 +13011,7 @@
           <w:noProof/>
         </w:rPr>
         <w:drawing>
-          <wp:inline distT="0" distB="0" distL="0" distR="0" wp14:anchorId="7FD9D3D4" wp14:editId="62A055AA">
+          <wp:inline distT="0" distB="0" distL="0" distR="0" wp14:anchorId="5DACAA54" wp14:editId="440F3547">
             <wp:extent cx="2095500" cy="4533900"/>
             <wp:effectExtent l="0" t="0" r="0" b="0"/>
             <wp:docPr id="14" name="Immagine 14"/>
@@ -13076,7 +13076,7 @@
           <w:noProof/>
         </w:rPr>
         <w:drawing>
-          <wp:inline distT="0" distB="0" distL="0" distR="0" wp14:anchorId="3C033918" wp14:editId="62B21B7E">
+          <wp:inline distT="0" distB="0" distL="0" distR="0" wp14:anchorId="167BB9B1" wp14:editId="238F6710">
             <wp:extent cx="2095500" cy="4533900"/>
             <wp:effectExtent l="0" t="0" r="0" b="0"/>
             <wp:docPr id="15" name="Immagine 15"/>
@@ -13135,7 +13135,7 @@
       <w:pPr>
         <w:pStyle w:val="Titolo2"/>
       </w:pPr>
-      <w:bookmarkStart w:id="25" w:name="_Toc244258881"/>
+      <w:bookmarkStart w:id="25" w:name="_Toc244259570"/>
       <w:r>
         <w:t>4.13 Spostare firme, timbri e testi già applicati (versione 1.5.0)</w:t>
       </w:r>
@@ -13187,7 +13187,7 @@
           <w:noProof/>
         </w:rPr>
         <w:drawing>
-          <wp:inline distT="0" distB="0" distL="0" distR="0" wp14:anchorId="65D59F71" wp14:editId="4F5296C1">
+          <wp:inline distT="0" distB="0" distL="0" distR="0" wp14:anchorId="4F718749" wp14:editId="515FD762">
             <wp:extent cx="4953000" cy="3095625"/>
             <wp:effectExtent l="0" t="0" r="0" b="0"/>
             <wp:docPr id="16" name="Immagine 16"/>
@@ -13246,7 +13246,7 @@
       <w:pPr>
         <w:pStyle w:val="Titolo2"/>
       </w:pPr>
-      <w:bookmarkStart w:id="26" w:name="_Toc244258882"/>
+      <w:bookmarkStart w:id="26" w:name="_Toc244259571"/>
       <w:r>
         <w:t>4.14 Modi di lettura e presentazione (versione 1.5.0)</w:t>
       </w:r>
@@ -13383,7 +13383,7 @@
           <w:noProof/>
         </w:rPr>
         <w:drawing>
-          <wp:inline distT="0" distB="0" distL="0" distR="0" wp14:anchorId="2E6E48C0" wp14:editId="57E9B109">
+          <wp:inline distT="0" distB="0" distL="0" distR="0" wp14:anchorId="64D6989A" wp14:editId="17A92929">
             <wp:extent cx="4953000" cy="3095625"/>
             <wp:effectExtent l="0" t="0" r="0" b="0"/>
             <wp:docPr id="17" name="Immagine 17"/>
@@ -13448,7 +13448,7 @@
           <w:noProof/>
         </w:rPr>
         <w:drawing>
-          <wp:inline distT="0" distB="0" distL="0" distR="0" wp14:anchorId="3B398474" wp14:editId="289B3C58">
+          <wp:inline distT="0" distB="0" distL="0" distR="0" wp14:anchorId="4F9CBBDF" wp14:editId="4AE039C5">
             <wp:extent cx="1905000" cy="4124325"/>
             <wp:effectExtent l="0" t="0" r="0" b="0"/>
             <wp:docPr id="18" name="Immagine 18"/>
@@ -13507,7 +13507,7 @@
       <w:pPr>
         <w:pStyle w:val="Titolo2"/>
       </w:pPr>
-      <w:bookmarkStart w:id="27" w:name="_Toc244258883"/>
+      <w:bookmarkStart w:id="27" w:name="_Toc244259572"/>
       <w:r>
         <w:t>4.15 Correzione: immagini sulle pagine ruotate (versione 1.5.0)</w:t>
       </w:r>
@@ -13535,7 +13535,7 @@
       <w:pPr>
         <w:pStyle w:val="Titolo2"/>
       </w:pPr>
-      <w:bookmarkStart w:id="28" w:name="_Toc244258884"/>
+      <w:bookmarkStart w:id="28" w:name="_Toc244259573"/>
       <w:r>
         <w:t>4.16 Niente più «Applica» (versione 1.6.0)</w:t>
       </w:r>
@@ -13579,7 +13579,7 @@
           <w:noProof/>
         </w:rPr>
         <w:drawing>
-          <wp:inline distT="0" distB="0" distL="0" distR="0" wp14:anchorId="6666CC84" wp14:editId="10C0C7E9">
+          <wp:inline distT="0" distB="0" distL="0" distR="0" wp14:anchorId="171519A7" wp14:editId="1F85E267">
             <wp:extent cx="4953000" cy="3095625"/>
             <wp:effectExtent l="0" t="0" r="0" b="0"/>
             <wp:docPr id="19" name="Immagine 19"/>
@@ -13638,7 +13638,7 @@
       <w:pPr>
         <w:pStyle w:val="Titolo2"/>
       </w:pPr>
-      <w:bookmarkStart w:id="29" w:name="_Toc244258885"/>
+      <w:bookmarkStart w:id="29" w:name="_Toc244259574"/>
       <w:r>
         <w:t>4.17 Schermata «Cosa vuoi fare?» (versione 1.6.0)</w:t>
       </w:r>
@@ -13672,7 +13672,7 @@
           <w:noProof/>
         </w:rPr>
         <w:drawing>
-          <wp:inline distT="0" distB="0" distL="0" distR="0" wp14:anchorId="4EC1F4F5" wp14:editId="01DF4781">
+          <wp:inline distT="0" distB="0" distL="0" distR="0" wp14:anchorId="6E4B4EE0" wp14:editId="5A1DCFD3">
             <wp:extent cx="4953000" cy="3095625"/>
             <wp:effectExtent l="0" t="0" r="0" b="0"/>
             <wp:docPr id="20" name="Immagine 20"/>
@@ -13731,7 +13731,7 @@
       <w:pPr>
         <w:pStyle w:val="Titolo2"/>
       </w:pPr>
-      <w:bookmarkStart w:id="30" w:name="_Toc244258886"/>
+      <w:bookmarkStart w:id="30" w:name="_Toc244259575"/>
       <w:r>
         <w:t>4.18 Modalità Semplice e Completa (versione 1.6.0)</w:t>
       </w:r>
@@ -13775,7 +13775,7 @@
           <w:noProof/>
         </w:rPr>
         <w:drawing>
-          <wp:inline distT="0" distB="0" distL="0" distR="0" wp14:anchorId="6DC6D3F0" wp14:editId="7FBD813E">
+          <wp:inline distT="0" distB="0" distL="0" distR="0" wp14:anchorId="44BAB395" wp14:editId="4988447A">
             <wp:extent cx="1905000" cy="4124325"/>
             <wp:effectExtent l="0" t="0" r="0" b="0"/>
             <wp:docPr id="21" name="Immagine 21"/>
@@ -13834,7 +13834,7 @@
       <w:pPr>
         <w:pStyle w:val="Titolo2"/>
       </w:pPr>
-      <w:bookmarkStart w:id="31" w:name="_Toc244258887"/>
+      <w:bookmarkStart w:id="31" w:name="_Toc244259576"/>
       <w:r>
         <w:t>4.19 Guide 1-2-3 (versione 1.6.0)</w:t>
       </w:r>
@@ -13858,7 +13858,7 @@
           <w:noProof/>
         </w:rPr>
         <w:drawing>
-          <wp:inline distT="0" distB="0" distL="0" distR="0" wp14:anchorId="24141D63" wp14:editId="32B82E2A">
+          <wp:inline distT="0" distB="0" distL="0" distR="0" wp14:anchorId="0BB7E500" wp14:editId="28D8DAF6">
             <wp:extent cx="4953000" cy="3095625"/>
             <wp:effectExtent l="0" t="0" r="0" b="0"/>
             <wp:docPr id="22" name="Immagine 22"/>
@@ -13923,7 +13923,7 @@
           <w:noProof/>
         </w:rPr>
         <w:drawing>
-          <wp:inline distT="0" distB="0" distL="0" distR="0" wp14:anchorId="5ECFDADF" wp14:editId="670C8024">
+          <wp:inline distT="0" distB="0" distL="0" distR="0" wp14:anchorId="2254DE6B" wp14:editId="2CE57A8D">
             <wp:extent cx="1905000" cy="4124325"/>
             <wp:effectExtent l="0" t="0" r="0" b="0"/>
             <wp:docPr id="23" name="Immagine 23"/>
@@ -13982,7 +13982,7 @@
       <w:pPr>
         <w:pStyle w:val="Titolo2"/>
       </w:pPr>
-      <w:bookmarkStart w:id="32" w:name="_Toc244258888"/>
+      <w:bookmarkStart w:id="32" w:name="_Toc244259577"/>
       <w:r>
         <w:t>4.20 Parole semplici e piccoli difetti (versione 1.6.0)</w:t>
       </w:r>
@@ -14000,7 +14000,7 @@
       <w:pPr>
         <w:pStyle w:val="Titolo1"/>
       </w:pPr>
-      <w:bookmarkStart w:id="33" w:name="_Toc244258889"/>
+      <w:bookmarkStart w:id="33" w:name="_Toc244259578"/>
       <w:r>
         <w:t>5. Decisioni</w:t>
       </w:r>
@@ -14018,7 +14018,7 @@
       <w:pPr>
         <w:pStyle w:val="Titolo2"/>
       </w:pPr>
-      <w:bookmarkStart w:id="34" w:name="_Toc244258890"/>
+      <w:bookmarkStart w:id="34" w:name="_Toc244259579"/>
       <w:r>
         <w:t>5.1 Canale degli aggiornamenti</w:t>
       </w:r>
@@ -14525,7 +14525,7 @@
       <w:pPr>
         <w:pStyle w:val="Titolo2"/>
       </w:pPr>
-      <w:bookmarkStart w:id="35" w:name="_Toc244258891"/>
+      <w:bookmarkStart w:id="35" w:name="_Toc244259580"/>
       <w:r>
         <w:t>5.2 Storia del repository</w:t>
       </w:r>
@@ -15032,7 +15032,7 @@
       <w:pPr>
         <w:pStyle w:val="Titolo2"/>
       </w:pPr>
-      <w:bookmarkStart w:id="36" w:name="_Toc244258892"/>
+      <w:bookmarkStart w:id="36" w:name="_Toc244259581"/>
       <w:r>
         <w:t>5.3 Identificativi del prodotto</w:t>
       </w:r>
@@ -15532,7 +15532,7 @@
       <w:pPr>
         <w:pStyle w:val="Titolo2"/>
       </w:pPr>
-      <w:bookmarkStart w:id="37" w:name="_Toc244258893"/>
+      <w:bookmarkStart w:id="37" w:name="_Toc244259582"/>
       <w:r>
         <w:t>5.4 Avvisi e domande</w:t>
       </w:r>
@@ -16039,7 +16039,7 @@
       <w:pPr>
         <w:pStyle w:val="Titolo2"/>
       </w:pPr>
-      <w:bookmarkStart w:id="38" w:name="_Toc244258894"/>
+      <w:bookmarkStart w:id="38" w:name="_Toc244259583"/>
       <w:r>
         <w:t>5.5 Traduzione offline</w:t>
       </w:r>
@@ -16546,7 +16546,7 @@
       <w:pPr>
         <w:pStyle w:val="Titolo2"/>
       </w:pPr>
-      <w:bookmarkStart w:id="39" w:name="_Toc244258895"/>
+      <w:bookmarkStart w:id="39" w:name="_Toc244259584"/>
       <w:r>
         <w:t>5.6 Passaggio della scheda alla nuova finestra</w:t>
       </w:r>
@@ -17068,7 +17068,7 @@
       <w:pPr>
         <w:pStyle w:val="Titolo2"/>
       </w:pPr>
-      <w:bookmarkStart w:id="40" w:name="_Toc244258896"/>
+      <w:bookmarkStart w:id="40" w:name="_Toc244259585"/>
       <w:r>
         <w:t>5.7 Come si cancella la riga in «Modifica testo»</w:t>
       </w:r>
@@ -17575,7 +17575,7 @@
       <w:pPr>
         <w:pStyle w:val="Titolo2"/>
       </w:pPr>
-      <w:bookmarkStart w:id="41" w:name="_Toc244258897"/>
+      <w:bookmarkStart w:id="41" w:name="_Toc244259586"/>
       <w:r>
         <w:t>5.9 Lettura a libro e presentazione</w:t>
       </w:r>
@@ -18082,7 +18082,7 @@
       <w:pPr>
         <w:pStyle w:val="Titolo2"/>
       </w:pPr>
-      <w:bookmarkStart w:id="42" w:name="_Toc244258898"/>
+      <w:bookmarkStart w:id="42" w:name="_Toc244259587"/>
       <w:r>
         <w:t>5.8 Come si ritrovano firme e timbri applicati</w:t>
       </w:r>
@@ -18619,7 +18619,7 @@
       <w:pPr>
         <w:pStyle w:val="Titolo1"/>
       </w:pPr>
-      <w:bookmarkStart w:id="43" w:name="_Toc244258899"/>
+      <w:bookmarkStart w:id="43" w:name="_Toc244259588"/>
       <w:r>
         <w:t>6. Come si lavora</w:t>
       </w:r>
@@ -18629,7 +18629,7 @@
       <w:pPr>
         <w:pStyle w:val="Titolo2"/>
       </w:pPr>
-      <w:bookmarkStart w:id="44" w:name="_Toc244258900"/>
+      <w:bookmarkStart w:id="44" w:name="_Toc244259589"/>
       <w:r>
         <w:t>6.1 Comandi</w:t>
       </w:r>
@@ -18699,7 +18699,7 @@
       <w:pPr>
         <w:pStyle w:val="Titolo2"/>
       </w:pPr>
-      <w:bookmarkStart w:id="45" w:name="_Toc244258901"/>
+      <w:bookmarkStart w:id="45" w:name="_Toc244259590"/>
       <w:r>
         <w:t>6.2 Pubblicare una versione</w:t>
       </w:r>
@@ -18827,7 +18827,7 @@
       <w:pPr>
         <w:pStyle w:val="Titolo2"/>
       </w:pPr>
-      <w:bookmarkStart w:id="46" w:name="_Toc244258902"/>
+      <w:bookmarkStart w:id="46" w:name="_Toc244259591"/>
       <w:r>
         <w:t>6.3 Release 1.0.0 (pubblicata il 16 ottobre 2026)</w:t>
       </w:r>
@@ -19554,7 +19554,7 @@
       <w:pPr>
         <w:pStyle w:val="Titolo2"/>
       </w:pPr>
-      <w:bookmarkStart w:id="47" w:name="_Toc244258903"/>
+      <w:bookmarkStart w:id="47" w:name="_Toc244259592"/>
       <w:r>
         <w:t>6.4 Release 1.0.1</w:t>
       </w:r>
@@ -19851,7 +19851,7 @@
       <w:pPr>
         <w:pStyle w:val="Titolo2"/>
       </w:pPr>
-      <w:bookmarkStart w:id="48" w:name="_Toc244258904"/>
+      <w:bookmarkStart w:id="48" w:name="_Toc244259593"/>
       <w:r>
         <w:t>6.5 Release 1.0.2 e repository pubblico</w:t>
       </w:r>
@@ -20273,7 +20273,7 @@
       <w:pPr>
         <w:pStyle w:val="Titolo2"/>
       </w:pPr>
-      <w:bookmarkStart w:id="49" w:name="_Toc244258905"/>
+      <w:bookmarkStart w:id="49" w:name="_Toc244259594"/>
       <w:r>
         <w:t>6.6 Nuova versione: link diretto per ogni sistema</w:t>
       </w:r>
@@ -20690,7 +20690,7 @@
           <w:noProof/>
         </w:rPr>
         <w:drawing>
-          <wp:inline distT="0" distB="0" distL="0" distR="0" wp14:anchorId="659CCAD4" wp14:editId="4B1E1A7B">
+          <wp:inline distT="0" distB="0" distL="0" distR="0" wp14:anchorId="7A9B383A" wp14:editId="2FC91470">
             <wp:extent cx="4572000" cy="4429125"/>
             <wp:effectExtent l="0" t="0" r="0" b="0"/>
             <wp:docPr id="24" name="Immagine 24"/>
@@ -20765,7 +20765,7 @@
       <w:pPr>
         <w:pStyle w:val="Titolo2"/>
       </w:pPr>
-      <w:bookmarkStart w:id="50" w:name="_Toc244258906"/>
+      <w:bookmarkStart w:id="50" w:name="_Toc244259595"/>
       <w:r>
         <w:t>6.7 Release 1.1.0</w:t>
       </w:r>
@@ -21329,7 +21329,7 @@
       <w:pPr>
         <w:pStyle w:val="Titolo2"/>
       </w:pPr>
-      <w:bookmarkStart w:id="51" w:name="_Toc244258907"/>
+      <w:bookmarkStart w:id="51" w:name="_Toc244259596"/>
       <w:r>
         <w:t>6.8 Versione 1.2.0</w:t>
       </w:r>
@@ -21878,7 +21878,7 @@
       <w:pPr>
         <w:pStyle w:val="Titolo2"/>
       </w:pPr>
-      <w:bookmarkStart w:id="52" w:name="_Toc244258908"/>
+      <w:bookmarkStart w:id="52" w:name="_Toc244259597"/>
       <w:r>
         <w:t>6.9 Versione 1.2.1</w:t>
       </w:r>
@@ -21896,7 +21896,7 @@
       <w:pPr>
         <w:pStyle w:val="Titolo2"/>
       </w:pPr>
-      <w:bookmarkStart w:id="53" w:name="_Toc244258909"/>
+      <w:bookmarkStart w:id="53" w:name="_Toc244259598"/>
       <w:r>
         <w:t>6.10 Versione 1.3.0</w:t>
       </w:r>
@@ -21928,7 +21928,7 @@
       <w:pPr>
         <w:pStyle w:val="Titolo2"/>
       </w:pPr>
-      <w:bookmarkStart w:id="54" w:name="_Toc244258910"/>
+      <w:bookmarkStart w:id="54" w:name="_Toc244259599"/>
       <w:r>
         <w:t>6.11 Versione 1.3.1 (ponte verso Cloudflare)</w:t>
       </w:r>
@@ -21946,7 +21946,7 @@
       <w:pPr>
         <w:pStyle w:val="Titolo2"/>
       </w:pPr>
-      <w:bookmarkStart w:id="55" w:name="_Toc244258911"/>
+      <w:bookmarkStart w:id="55" w:name="_Toc244259600"/>
       <w:r>
         <w:t>6.12 Versione 1.4.0</w:t>
       </w:r>
@@ -21964,7 +21964,7 @@
       <w:pPr>
         <w:pStyle w:val="Titolo2"/>
       </w:pPr>
-      <w:bookmarkStart w:id="56" w:name="_Toc244258912"/>
+      <w:bookmarkStart w:id="56" w:name="_Toc244259601"/>
       <w:r>
         <w:t>6.13 Versione 1.5.0</w:t>
       </w:r>
@@ -21982,7 +21982,7 @@
       <w:pPr>
         <w:pStyle w:val="Titolo2"/>
       </w:pPr>
-      <w:bookmarkStart w:id="57" w:name="_Toc244258913"/>
+      <w:bookmarkStart w:id="57" w:name="_Toc244259602"/>
       <w:r>
         <w:t>6.14 Versione 1.6.0</w:t>
       </w:r>
@@ -21993,7 +21993,7 @@
         <w:spacing w:after="120"/>
       </w:pPr>
       <w:r>
-        <w:t xml:space="preserve">Preparata il 30 ottobre 2026 (installer Windows 101.6.0, Android 1001006000): schermata iniziale, modalità Semplice, guide 1-2-3, niente «Applica», parole semplici. Scelta dell'autore: strada </w:t>
+        <w:t xml:space="preserve">Pubblicata il 30 ottobre 2026 (release in 7 minuti, sito Cloudflare aggiornato da solo subito dopo; installer Windows 101.6.0, Android 1001006000): schermata iniziale, modalità Semplice, guide 1-2-3, niente «Applica», parole semplici. Scelta dell'autore: strada </w:t>
       </w:r>
       <w:r>
         <w:t>💎</w:t>
@@ -22006,7 +22006,7 @@
       <w:pPr>
         <w:pStyle w:val="Titolo2"/>
       </w:pPr>
-      <w:bookmarkStart w:id="58" w:name="_Toc244258914"/>
+      <w:bookmarkStart w:id="58" w:name="_Toc244259603"/>
       <w:r>
         <w:t>6.15 Ruoli</w:t>
       </w:r>
@@ -22279,7 +22279,7 @@
       <w:pPr>
         <w:pStyle w:val="Titolo1"/>
       </w:pPr>
-      <w:bookmarkStart w:id="59" w:name="_Toc244258915"/>
+      <w:bookmarkStart w:id="59" w:name="_Toc244259604"/>
       <w:r>
         <w:t>7. Sicurezza</w:t>
       </w:r>
@@ -22578,7 +22578,7 @@
       <w:pPr>
         <w:pStyle w:val="Titolo1"/>
       </w:pPr>
-      <w:bookmarkStart w:id="60" w:name="_Toc244258916"/>
+      <w:bookmarkStart w:id="60" w:name="_Toc244259605"/>
       <w:r>
         <w:t>8. Punti aperti</w:t>
       </w:r>
@@ -22867,7 +22867,7 @@
       <w:pPr>
         <w:pStyle w:val="Titolo1"/>
       </w:pPr>
-      <w:bookmarkStart w:id="61" w:name="_Toc244258917"/>
+      <w:bookmarkStart w:id="61" w:name="_Toc244259606"/>
       <w:r>
         <w:t>9. Pensato per i prossimi 10 anni</w:t>
       </w:r>
@@ -23061,7 +23061,7 @@
       <w:pPr>
         <w:pStyle w:val="Titolo1"/>
       </w:pPr>
-      <w:bookmarkStart w:id="62" w:name="_Toc244258918"/>
+      <w:bookmarkStart w:id="62" w:name="_Toc244259607"/>
       <w:r>
         <w:t>10. Facilità d'uso: analisi e proposte (30 ottobre 2026)</w:t>
       </w:r>
@@ -23149,7 +23149,7 @@
       <w:pPr>
         <w:pStyle w:val="Titolo2"/>
       </w:pPr>
-      <w:bookmarkStart w:id="63" w:name="_Toc244258919"/>
+      <w:bookmarkStart w:id="63" w:name="_Toc244259608"/>
       <w:r>
         <w:t>10.1 Opinione</w:t>
       </w:r>
@@ -23677,7 +23677,7 @@
       <w:pPr>
         <w:pStyle w:val="Titolo2"/>
       </w:pPr>
-      <w:bookmarkStart w:id="64" w:name="_Toc244258920"/>
+      <w:bookmarkStart w:id="64" w:name="_Toc244259609"/>
       <w:r>
         <w:t>10.2 Punti da migliorare</w:t>
       </w:r>
@@ -23826,7 +23826,7 @@
           <w:noProof/>
         </w:rPr>
         <w:drawing>
-          <wp:inline distT="0" distB="0" distL="0" distR="0" wp14:anchorId="5CEAB700" wp14:editId="337B5E6E">
+          <wp:inline distT="0" distB="0" distL="0" distR="0" wp14:anchorId="5021E0D5" wp14:editId="3EBB248B">
             <wp:extent cx="1905000" cy="4124325"/>
             <wp:effectExtent l="0" t="0" r="0" b="0"/>
             <wp:docPr id="25" name="Immagine 25"/>
@@ -23891,7 +23891,7 @@
           <w:noProof/>
         </w:rPr>
         <w:drawing>
-          <wp:inline distT="0" distB="0" distL="0" distR="0" wp14:anchorId="1EE27D3A" wp14:editId="71EAD6AF">
+          <wp:inline distT="0" distB="0" distL="0" distR="0" wp14:anchorId="2C75C82E" wp14:editId="3D8D64D4">
             <wp:extent cx="1905000" cy="4124325"/>
             <wp:effectExtent l="0" t="0" r="0" b="0"/>
             <wp:docPr id="26" name="Immagine 26"/>
@@ -23956,7 +23956,7 @@
           <w:noProof/>
         </w:rPr>
         <w:drawing>
-          <wp:inline distT="0" distB="0" distL="0" distR="0" wp14:anchorId="593AF5C1" wp14:editId="45F2C275">
+          <wp:inline distT="0" distB="0" distL="0" distR="0" wp14:anchorId="7461E3DE" wp14:editId="6A6FA718">
             <wp:extent cx="4953000" cy="3095625"/>
             <wp:effectExtent l="0" t="0" r="0" b="0"/>
             <wp:docPr id="27" name="Immagine 27"/>
@@ -24015,7 +24015,7 @@
       <w:pPr>
         <w:pStyle w:val="Titolo2"/>
       </w:pPr>
-      <w:bookmarkStart w:id="65" w:name="_Toc244258921"/>
+      <w:bookmarkStart w:id="65" w:name="_Toc244259610"/>
       <w:r>
         <w:t>10.3 Cinque proposte</w:t>
       </w:r>
@@ -24895,10 +24895,96 @@
 <file path=word/numbering.xml><?xml version="1.0" encoding="utf-8"?>
 <w:numbering xmlns:wpc="http://schemas.microsoft.com/office/word/2010/wordprocessingCanvas" xmlns:cx="http://schemas.microsoft.com/office/drawing/2014/chartex" xmlns:cx1="http://schemas.microsoft.com/office/drawing/2015/9/8/chartex" xmlns:cx2="http://schemas.microsoft.com/office/drawing/2015/10/21/chartex" xmlns:cx3="http://schemas.microsoft.com/office/drawing/2016/5/9/chartex" xmlns:cx4="http://schemas.microsoft.com/office/drawing/2016/5/10/chartex" xmlns:cx5="http://schemas.microsoft.com/office/drawing/2016/5/11/chartex" xmlns:cx6="http://schemas.microsoft.com/office/drawing/2016/5/12/chartex" xmlns:cx7="http://schemas.microsoft.com/office/drawing/2016/5/13/chartex" xmlns:cx8="http://schemas.microsoft.com/office/drawing/2016/5/14/chartex" xmlns:mc="http://schemas.openxmlformats.org/markup-compatibility/2006" xmlns:aink="http://schemas.microsoft.com/office/drawing/2016/ink" xmlns:am3d="http://schemas.microsoft.com/office/drawing/2017/model3d" xmlns:o="urn:schemas-microsoft-com:office:office" xmlns:oel="http://schemas.microsoft.com/office/2019/extlst" xmlns:r="http://schemas.openxmlformats.org/officeDocument/2006/relationships" xmlns:m="http://schemas.openxmlformats.org/officeDocument/2006/math" xmlns:v="urn:schemas-microsoft-com:vml" xmlns:wp14="http://schemas.microsoft.com/office/word/2010/wordprocessingDrawing" xmlns:wp="http://schemas.openxmlformats.org/drawingml/2006/wordprocessingDrawing" xmlns:w10="urn:schemas-microsoft-com:office:word" xmlns:w="http://schemas.openxmlformats.org/wordprocessingml/2006/main" xmlns:w14="http://schemas.microsoft.com/office/word/2010/wordml" xmlns:w15="http://schemas.microsoft.com/office/word/2012/wordml" xmlns:w16cex="http://schemas.microsoft.com/office/word/2018/wordml/cex" xmlns:w16cid="http://schemas.microsoft.com/office/word/2016/wordml/cid" xmlns:w16="http://schemas.microsoft.com/office/word/2018/wordml" xmlns:w16du="http://schemas.microsoft.com/office/word/2023/wordml/word16du" xmlns:w16sdtdh="http://schemas.microsoft.com/office/word/2020/wordml/sdtdatahash" xmlns:w16sdtfl="http://schemas.microsoft.com/office/word/2024/wordml/sdtformatlock" xmlns:w16se="http://schemas.microsoft.com/office/word/2015/wordml/symex" xmlns:wpg="http://schemas.microsoft.com/office/word/2010/wordprocessingGroup" xmlns:wpi="http://schemas.microsoft.com/office/word/2010/wordprocessingInk" xmlns:wne="http://schemas.microsoft.com/office/word/2006/wordml" xmlns:wps="http://schemas.microsoft.com/office/word/2010/wordprocessingShape" mc:Ignorable="w14 w15 w16se w16cid w16 w16cex w16sdtdh w16sdtfl w16du wp14">
   <w:abstractNum w:abstractNumId="0" w15:restartNumberingAfterBreak="0">
-    <w:nsid w:val="0D564077"/>
+    <w:nsid w:val="098E3FF6"/>
     <w:multiLevelType w:val="hybridMultilevel"/>
-    <w:tmpl w:val="A05A4900"/>
-    <w:lvl w:ilvl="0" w:tplc="FA8A3304">
+    <w:tmpl w:val="551EDB1A"/>
+    <w:lvl w:ilvl="0" w:tplc="20023938" w:tentative="1">
+      <w:start w:val="1"/>
+      <w:numFmt w:val="bullet"/>
+      <w:lvlText w:val="●"/>
+      <w:lvlJc w:val="left"/>
+      <w:pPr>
+        <w:ind w:left="720" w:hanging="360"/>
+      </w:pPr>
+    </w:lvl>
+    <w:lvl w:ilvl="1" w:tplc="A73E99B8" w:tentative="1">
+      <w:start w:val="1"/>
+      <w:numFmt w:val="bullet"/>
+      <w:lvlText w:val="○"/>
+      <w:lvlJc w:val="left"/>
+      <w:pPr>
+        <w:ind w:left="1440" w:hanging="360"/>
+      </w:pPr>
+    </w:lvl>
+    <w:lvl w:ilvl="2" w:tplc="D2FE03BE" w:tentative="1">
+      <w:start w:val="1"/>
+      <w:numFmt w:val="bullet"/>
+      <w:lvlText w:val="■"/>
+      <w:lvlJc w:val="left"/>
+      <w:pPr>
+        <w:ind w:left="2160" w:hanging="360"/>
+      </w:pPr>
+    </w:lvl>
+    <w:lvl w:ilvl="3" w:tplc="C87CAF82" w:tentative="1">
+      <w:start w:val="1"/>
+      <w:numFmt w:val="bullet"/>
+      <w:lvlText w:val="●"/>
+      <w:lvlJc w:val="left"/>
+      <w:pPr>
+        <w:ind w:left="2880" w:hanging="360"/>
+      </w:pPr>
+    </w:lvl>
+    <w:lvl w:ilvl="4" w:tplc="C15217B8" w:tentative="1">
+      <w:start w:val="1"/>
+      <w:numFmt w:val="bullet"/>
+      <w:lvlText w:val="○"/>
+      <w:lvlJc w:val="left"/>
+      <w:pPr>
+        <w:ind w:left="3600" w:hanging="360"/>
+      </w:pPr>
+    </w:lvl>
+    <w:lvl w:ilvl="5" w:tplc="55DC5D02" w:tentative="1">
+      <w:start w:val="1"/>
+      <w:numFmt w:val="bullet"/>
+      <w:lvlText w:val="■"/>
+      <w:lvlJc w:val="left"/>
+      <w:pPr>
+        <w:ind w:left="4320" w:hanging="360"/>
+      </w:pPr>
+    </w:lvl>
+    <w:lvl w:ilvl="6" w:tplc="A9C2F97C" w:tentative="1">
+      <w:start w:val="1"/>
+      <w:numFmt w:val="bullet"/>
+      <w:lvlText w:val="●"/>
+      <w:lvlJc w:val="left"/>
+      <w:pPr>
+        <w:ind w:left="5040" w:hanging="360"/>
+      </w:pPr>
+    </w:lvl>
+    <w:lvl w:ilvl="7" w:tplc="C77090AA" w:tentative="1">
+      <w:start w:val="1"/>
+      <w:numFmt w:val="bullet"/>
+      <w:lvlText w:val="●"/>
+      <w:lvlJc w:val="left"/>
+      <w:pPr>
+        <w:ind w:left="5760" w:hanging="360"/>
+      </w:pPr>
+    </w:lvl>
+    <w:lvl w:ilvl="8" w:tplc="5C84BA86" w:tentative="1">
+      <w:start w:val="1"/>
+      <w:numFmt w:val="bullet"/>
+      <w:lvlText w:val="●"/>
+      <w:lvlJc w:val="left"/>
+      <w:pPr>
+        <w:ind w:left="6480" w:hanging="360"/>
+      </w:pPr>
+    </w:lvl>
+  </w:abstractNum>
+  <w:abstractNum w:abstractNumId="1" w15:restartNumberingAfterBreak="0">
+    <w:nsid w:val="1EAC528C"/>
+    <w:multiLevelType w:val="hybridMultilevel"/>
+    <w:tmpl w:val="34D2D76E"/>
+    <w:lvl w:ilvl="0" w:tplc="4DDC417A">
       <w:start w:val="1"/>
       <w:numFmt w:val="decimal"/>
       <w:lvlText w:val="%1."/>
@@ -24907,192 +24993,52 @@
         <w:ind w:left="540" w:hanging="300"/>
       </w:pPr>
     </w:lvl>
-    <w:lvl w:ilvl="1" w:tplc="AAD8D2D4">
+    <w:lvl w:ilvl="1" w:tplc="7268A408">
       <w:numFmt w:val="decimal"/>
       <w:lvlText w:val=""/>
       <w:lvlJc w:val="left"/>
     </w:lvl>
-    <w:lvl w:ilvl="2" w:tplc="95FA3E2E">
+    <w:lvl w:ilvl="2" w:tplc="723CE44C">
       <w:numFmt w:val="decimal"/>
       <w:lvlText w:val=""/>
       <w:lvlJc w:val="left"/>
     </w:lvl>
-    <w:lvl w:ilvl="3" w:tplc="DD1AEF00">
+    <w:lvl w:ilvl="3" w:tplc="FB347BA4">
       <w:numFmt w:val="decimal"/>
       <w:lvlText w:val=""/>
       <w:lvlJc w:val="left"/>
     </w:lvl>
-    <w:lvl w:ilvl="4" w:tplc="7B96B1FC">
+    <w:lvl w:ilvl="4" w:tplc="A1C208D0">
       <w:numFmt w:val="decimal"/>
       <w:lvlText w:val=""/>
       <w:lvlJc w:val="left"/>
     </w:lvl>
-    <w:lvl w:ilvl="5" w:tplc="953A54C6">
+    <w:lvl w:ilvl="5" w:tplc="61FA4BC0">
       <w:numFmt w:val="decimal"/>
       <w:lvlText w:val=""/>
       <w:lvlJc w:val="left"/>
     </w:lvl>
-    <w:lvl w:ilvl="6" w:tplc="AF328728">
+    <w:lvl w:ilvl="6" w:tplc="56D4819E">
       <w:numFmt w:val="decimal"/>
       <w:lvlText w:val=""/>
       <w:lvlJc w:val="left"/>
     </w:lvl>
-    <w:lvl w:ilvl="7" w:tplc="945AEB32">
+    <w:lvl w:ilvl="7" w:tplc="1BFE5DBA">
       <w:numFmt w:val="decimal"/>
       <w:lvlText w:val=""/>
       <w:lvlJc w:val="left"/>
     </w:lvl>
-    <w:lvl w:ilvl="8" w:tplc="5A503E2E">
-      <w:numFmt w:val="decimal"/>
-      <w:lvlText w:val=""/>
-      <w:lvlJc w:val="left"/>
-    </w:lvl>
-  </w:abstractNum>
-  <w:abstractNum w:abstractNumId="1" w15:restartNumberingAfterBreak="0">
-    <w:nsid w:val="4B927439"/>
-    <w:multiLevelType w:val="hybridMultilevel"/>
-    <w:tmpl w:val="FC84DDEC"/>
-    <w:lvl w:ilvl="0" w:tplc="3ABE094E">
-      <w:start w:val="1"/>
-      <w:numFmt w:val="decimal"/>
-      <w:lvlText w:val="%1."/>
-      <w:lvlJc w:val="left"/>
-      <w:pPr>
-        <w:ind w:left="540" w:hanging="300"/>
-      </w:pPr>
-    </w:lvl>
-    <w:lvl w:ilvl="1" w:tplc="7A1E7042">
-      <w:numFmt w:val="decimal"/>
-      <w:lvlText w:val=""/>
-      <w:lvlJc w:val="left"/>
-    </w:lvl>
-    <w:lvl w:ilvl="2" w:tplc="33442090">
-      <w:numFmt w:val="decimal"/>
-      <w:lvlText w:val=""/>
-      <w:lvlJc w:val="left"/>
-    </w:lvl>
-    <w:lvl w:ilvl="3" w:tplc="BA946A50">
-      <w:numFmt w:val="decimal"/>
-      <w:lvlText w:val=""/>
-      <w:lvlJc w:val="left"/>
-    </w:lvl>
-    <w:lvl w:ilvl="4" w:tplc="E95ADC66">
-      <w:numFmt w:val="decimal"/>
-      <w:lvlText w:val=""/>
-      <w:lvlJc w:val="left"/>
-    </w:lvl>
-    <w:lvl w:ilvl="5" w:tplc="F98CF9B0">
-      <w:numFmt w:val="decimal"/>
-      <w:lvlText w:val=""/>
-      <w:lvlJc w:val="left"/>
-    </w:lvl>
-    <w:lvl w:ilvl="6" w:tplc="6A164F84">
-      <w:numFmt w:val="decimal"/>
-      <w:lvlText w:val=""/>
-      <w:lvlJc w:val="left"/>
-    </w:lvl>
-    <w:lvl w:ilvl="7" w:tplc="FA8092CC">
-      <w:numFmt w:val="decimal"/>
-      <w:lvlText w:val=""/>
-      <w:lvlJc w:val="left"/>
-    </w:lvl>
-    <w:lvl w:ilvl="8" w:tplc="2534C0A8">
+    <w:lvl w:ilvl="8" w:tplc="0D04AF1C">
       <w:numFmt w:val="decimal"/>
       <w:lvlText w:val=""/>
       <w:lvlJc w:val="left"/>
     </w:lvl>
   </w:abstractNum>
   <w:abstractNum w:abstractNumId="2" w15:restartNumberingAfterBreak="0">
-    <w:nsid w:val="4D5620BC"/>
+    <w:nsid w:val="44A950FE"/>
     <w:multiLevelType w:val="hybridMultilevel"/>
-    <w:tmpl w:val="26562A50"/>
-    <w:lvl w:ilvl="0" w:tplc="87ECCBA2" w:tentative="1">
-      <w:start w:val="1"/>
-      <w:numFmt w:val="bullet"/>
-      <w:lvlText w:val="●"/>
-      <w:lvlJc w:val="left"/>
-      <w:pPr>
-        <w:ind w:left="720" w:hanging="360"/>
-      </w:pPr>
-    </w:lvl>
-    <w:lvl w:ilvl="1" w:tplc="9B1AB682" w:tentative="1">
-      <w:start w:val="1"/>
-      <w:numFmt w:val="bullet"/>
-      <w:lvlText w:val="○"/>
-      <w:lvlJc w:val="left"/>
-      <w:pPr>
-        <w:ind w:left="1440" w:hanging="360"/>
-      </w:pPr>
-    </w:lvl>
-    <w:lvl w:ilvl="2" w:tplc="42F289D6" w:tentative="1">
-      <w:start w:val="1"/>
-      <w:numFmt w:val="bullet"/>
-      <w:lvlText w:val="■"/>
-      <w:lvlJc w:val="left"/>
-      <w:pPr>
-        <w:ind w:left="2160" w:hanging="360"/>
-      </w:pPr>
-    </w:lvl>
-    <w:lvl w:ilvl="3" w:tplc="75BA03E0" w:tentative="1">
-      <w:start w:val="1"/>
-      <w:numFmt w:val="bullet"/>
-      <w:lvlText w:val="●"/>
-      <w:lvlJc w:val="left"/>
-      <w:pPr>
-        <w:ind w:left="2880" w:hanging="360"/>
-      </w:pPr>
-    </w:lvl>
-    <w:lvl w:ilvl="4" w:tplc="11D097E8" w:tentative="1">
-      <w:start w:val="1"/>
-      <w:numFmt w:val="bullet"/>
-      <w:lvlText w:val="○"/>
-      <w:lvlJc w:val="left"/>
-      <w:pPr>
-        <w:ind w:left="3600" w:hanging="360"/>
-      </w:pPr>
-    </w:lvl>
-    <w:lvl w:ilvl="5" w:tplc="06761C44" w:tentative="1">
-      <w:start w:val="1"/>
-      <w:numFmt w:val="bullet"/>
-      <w:lvlText w:val="■"/>
-      <w:lvlJc w:val="left"/>
-      <w:pPr>
-        <w:ind w:left="4320" w:hanging="360"/>
-      </w:pPr>
-    </w:lvl>
-    <w:lvl w:ilvl="6" w:tplc="B69897D8" w:tentative="1">
-      <w:start w:val="1"/>
-      <w:numFmt w:val="bullet"/>
-      <w:lvlText w:val="●"/>
-      <w:lvlJc w:val="left"/>
-      <w:pPr>
-        <w:ind w:left="5040" w:hanging="360"/>
-      </w:pPr>
-    </w:lvl>
-    <w:lvl w:ilvl="7" w:tplc="E2045E76" w:tentative="1">
-      <w:start w:val="1"/>
-      <w:numFmt w:val="bullet"/>
-      <w:lvlText w:val="●"/>
-      <w:lvlJc w:val="left"/>
-      <w:pPr>
-        <w:ind w:left="5760" w:hanging="360"/>
-      </w:pPr>
-    </w:lvl>
-    <w:lvl w:ilvl="8" w:tplc="6178A814" w:tentative="1">
-      <w:start w:val="1"/>
-      <w:numFmt w:val="bullet"/>
-      <w:lvlText w:val="●"/>
-      <w:lvlJc w:val="left"/>
-      <w:pPr>
-        <w:ind w:left="6480" w:hanging="360"/>
-      </w:pPr>
-    </w:lvl>
-  </w:abstractNum>
-  <w:abstractNum w:abstractNumId="3" w15:restartNumberingAfterBreak="0">
-    <w:nsid w:val="78867C85"/>
-    <w:multiLevelType w:val="hybridMultilevel"/>
-    <w:tmpl w:val="82F432DA"/>
-    <w:lvl w:ilvl="0" w:tplc="353EF25A">
+    <w:tmpl w:val="DA8CCEC4"/>
+    <w:lvl w:ilvl="0" w:tplc="DF2EA3D6">
       <w:start w:val="1"/>
       <w:numFmt w:val="bullet"/>
       <w:lvlText w:val="•"/>
@@ -25101,66 +25047,120 @@
         <w:ind w:left="540" w:hanging="270"/>
       </w:pPr>
     </w:lvl>
-    <w:lvl w:ilvl="1" w:tplc="24CC1754">
+    <w:lvl w:ilvl="1" w:tplc="C2C23672">
       <w:numFmt w:val="decimal"/>
       <w:lvlText w:val=""/>
       <w:lvlJc w:val="left"/>
     </w:lvl>
-    <w:lvl w:ilvl="2" w:tplc="76BEEB32">
+    <w:lvl w:ilvl="2" w:tplc="30CA0A04">
       <w:numFmt w:val="decimal"/>
       <w:lvlText w:val=""/>
       <w:lvlJc w:val="left"/>
     </w:lvl>
-    <w:lvl w:ilvl="3" w:tplc="727A0FA8">
+    <w:lvl w:ilvl="3" w:tplc="91D4FA5C">
       <w:numFmt w:val="decimal"/>
       <w:lvlText w:val=""/>
       <w:lvlJc w:val="left"/>
     </w:lvl>
-    <w:lvl w:ilvl="4" w:tplc="F4D65CE4">
+    <w:lvl w:ilvl="4" w:tplc="2BBEA6C6">
       <w:numFmt w:val="decimal"/>
       <w:lvlText w:val=""/>
       <w:lvlJc w:val="left"/>
     </w:lvl>
-    <w:lvl w:ilvl="5" w:tplc="1C30DAB8">
+    <w:lvl w:ilvl="5" w:tplc="8280CF9A">
       <w:numFmt w:val="decimal"/>
       <w:lvlText w:val=""/>
       <w:lvlJc w:val="left"/>
     </w:lvl>
-    <w:lvl w:ilvl="6" w:tplc="7104190A">
+    <w:lvl w:ilvl="6" w:tplc="DF28A7E0">
       <w:numFmt w:val="decimal"/>
       <w:lvlText w:val=""/>
       <w:lvlJc w:val="left"/>
     </w:lvl>
-    <w:lvl w:ilvl="7" w:tplc="06FA091A">
+    <w:lvl w:ilvl="7" w:tplc="CBBEDFAE">
       <w:numFmt w:val="decimal"/>
       <w:lvlText w:val=""/>
       <w:lvlJc w:val="left"/>
     </w:lvl>
-    <w:lvl w:ilvl="8" w:tplc="6450CDB8">
+    <w:lvl w:ilvl="8" w:tplc="C5F836F2">
       <w:numFmt w:val="decimal"/>
       <w:lvlText w:val=""/>
       <w:lvlJc w:val="left"/>
     </w:lvl>
   </w:abstractNum>
-  <w:num w:numId="1" w16cid:durableId="2095197858">
+  <w:abstractNum w:abstractNumId="3" w15:restartNumberingAfterBreak="0">
+    <w:nsid w:val="6FF9001F"/>
+    <w:multiLevelType w:val="hybridMultilevel"/>
+    <w:tmpl w:val="AE4E92BE"/>
+    <w:lvl w:ilvl="0" w:tplc="0A34DA74">
+      <w:start w:val="1"/>
+      <w:numFmt w:val="decimal"/>
+      <w:lvlText w:val="%1."/>
+      <w:lvlJc w:val="left"/>
+      <w:pPr>
+        <w:ind w:left="540" w:hanging="300"/>
+      </w:pPr>
+    </w:lvl>
+    <w:lvl w:ilvl="1" w:tplc="4F668A80">
+      <w:numFmt w:val="decimal"/>
+      <w:lvlText w:val=""/>
+      <w:lvlJc w:val="left"/>
+    </w:lvl>
+    <w:lvl w:ilvl="2" w:tplc="E7601444">
+      <w:numFmt w:val="decimal"/>
+      <w:lvlText w:val=""/>
+      <w:lvlJc w:val="left"/>
+    </w:lvl>
+    <w:lvl w:ilvl="3" w:tplc="B18E085A">
+      <w:numFmt w:val="decimal"/>
+      <w:lvlText w:val=""/>
+      <w:lvlJc w:val="left"/>
+    </w:lvl>
+    <w:lvl w:ilvl="4" w:tplc="AB58C516">
+      <w:numFmt w:val="decimal"/>
+      <w:lvlText w:val=""/>
+      <w:lvlJc w:val="left"/>
+    </w:lvl>
+    <w:lvl w:ilvl="5" w:tplc="874A96C2">
+      <w:numFmt w:val="decimal"/>
+      <w:lvlText w:val=""/>
+      <w:lvlJc w:val="left"/>
+    </w:lvl>
+    <w:lvl w:ilvl="6" w:tplc="245AED9C">
+      <w:numFmt w:val="decimal"/>
+      <w:lvlText w:val=""/>
+      <w:lvlJc w:val="left"/>
+    </w:lvl>
+    <w:lvl w:ilvl="7" w:tplc="058ABA20">
+      <w:numFmt w:val="decimal"/>
+      <w:lvlText w:val=""/>
+      <w:lvlJc w:val="left"/>
+    </w:lvl>
+    <w:lvl w:ilvl="8" w:tplc="CF4AF6E0">
+      <w:numFmt w:val="decimal"/>
+      <w:lvlText w:val=""/>
+      <w:lvlJc w:val="left"/>
+    </w:lvl>
+  </w:abstractNum>
+  <w:num w:numId="1" w16cid:durableId="251476278">
+    <w:abstractNumId w:val="0"/>
+    <w:lvlOverride w:ilvl="0">
+      <w:startOverride w:val="1"/>
+    </w:lvlOverride>
+  </w:num>
+  <w:num w:numId="2" w16cid:durableId="1759212157">
     <w:abstractNumId w:val="2"/>
     <w:lvlOverride w:ilvl="0">
       <w:startOverride w:val="1"/>
     </w:lvlOverride>
   </w:num>
-  <w:num w:numId="2" w16cid:durableId="760833870">
+  <w:num w:numId="3" w16cid:durableId="1990985180">
     <w:abstractNumId w:val="3"/>
     <w:lvlOverride w:ilvl="0">
       <w:startOverride w:val="1"/>
     </w:lvlOverride>
   </w:num>
-  <w:num w:numId="3" w16cid:durableId="520435084">
-    <w:abstractNumId w:val="0"/>
-    <w:lvlOverride w:ilvl="0">
-      <w:startOverride w:val="1"/>
-    </w:lvlOverride>
-  </w:num>
-  <w:num w:numId="4" w16cid:durableId="1562012629">
+  <w:num w:numId="4" w16cid:durableId="737944116">
     <w:abstractNumId w:val="1"/>
     <w:lvlOverride w:ilvl="0">
       <w:startOverride w:val="1"/>
@@ -25802,7 +25802,7 @@
     <w:autoRedefine/>
     <w:uiPriority w:val="39"/>
     <w:unhideWhenUsed/>
-    <w:rsid w:val="00A144C6"/>
+    <w:rsid w:val="00F01313"/>
     <w:pPr>
       <w:spacing w:after="100"/>
     </w:pPr>
@@ -25814,7 +25814,7 @@
     <w:autoRedefine/>
     <w:uiPriority w:val="39"/>
     <w:unhideWhenUsed/>
-    <w:rsid w:val="00A144C6"/>
+    <w:rsid w:val="00F01313"/>
     <w:pPr>
       <w:spacing w:after="100"/>
       <w:ind w:left="210"/>

</xml_diff>

<commit_message>
PDFz 1.6.1: sito degli aggiornamenti su https://pdfz.agjin.com/
- le app cercano gli aggiornamenti sul dominio dell'autore (UPDATE_BASE_URL); pdfz.pages.dev resta attivo per le app
  già installate
- pagina degli aggiornamenti con link relativi: da iPhone e iPad la web app si apre sull'indirizzo da cui si entra
- documentazione, Word 2026-10-30, CLAUDE.md

Co-Authored-By: Claude Opus 5.5 <noreply@anthropic.com>
</commit_message>
<xml_diff>
--- a/docs/PDFz_20261030.docx
+++ b/docs/PDFz_20261030.docx
@@ -16,7 +16,7 @@
           <w:noProof/>
         </w:rPr>
         <w:drawing>
-          <wp:inline distT="0" distB="0" distL="0" distR="0" wp14:anchorId="689416B3" wp14:editId="1437BE6D">
+          <wp:inline distT="0" distB="0" distL="0" distR="0" wp14:anchorId="58FAC3F0" wp14:editId="273BC387">
             <wp:extent cx="3619500" cy="1285875"/>
             <wp:effectExtent l="0" t="0" r="0" b="0"/>
             <wp:docPr id="1" name="Immagine 1"/>
@@ -95,7 +95,7 @@
           <w:sz w:val="22"/>
           <w:szCs w:val="22"/>
         </w:rPr>
-        <w:t>Versione 1.6.0  ·  30 ottobre 2026  ·  autore: agjin</w:t>
+        <w:t>Versione 1.6.1  ·  30 ottobre 2026  ·  autore: agjin</w:t>
       </w:r>
     </w:p>
     <w:p>
@@ -135,7 +135,7 @@
     <w:sdt>
       <w:sdtPr>
         <w:alias w:val="Indice"/>
-        <w:id w:val="-436367873"/>
+        <w:id w:val="-437514897"/>
       </w:sdtPr>
       <w:sdtEndPr/>
       <w:sdtContent>
@@ -158,7 +158,7 @@
           <w:r>
             <w:fldChar w:fldCharType="separate"/>
           </w:r>
-          <w:hyperlink w:anchor="_Toc244259545" w:history="1">
+          <w:hyperlink w:anchor="_Toc244263987" w:history="1">
             <w:r>
               <w:rPr>
                 <w:rStyle w:val="Collegamentoipertestuale"/>
@@ -182,7 +182,7 @@
               <w:rPr>
                 <w:noProof/>
               </w:rPr>
-              <w:instrText xml:space="preserve"> PAGEREF _Toc244259545 \h </w:instrText>
+              <w:instrText xml:space="preserve"> PAGEREF _Toc244263987 \h </w:instrText>
             </w:r>
             <w:r>
               <w:rPr>
@@ -219,7 +219,7 @@
               <w:noProof/>
             </w:rPr>
           </w:pPr>
-          <w:hyperlink w:anchor="_Toc244259546" w:history="1">
+          <w:hyperlink w:anchor="_Toc244263988" w:history="1">
             <w:r>
               <w:rPr>
                 <w:rStyle w:val="Collegamentoipertestuale"/>
@@ -243,7 +243,7 @@
               <w:rPr>
                 <w:noProof/>
               </w:rPr>
-              <w:instrText xml:space="preserve"> PAGEREF _Toc244259546 \h </w:instrText>
+              <w:instrText xml:space="preserve"> PAGEREF _Toc244263988 \h </w:instrText>
             </w:r>
             <w:r>
               <w:rPr>
@@ -280,7 +280,7 @@
               <w:noProof/>
             </w:rPr>
           </w:pPr>
-          <w:hyperlink w:anchor="_Toc244259547" w:history="1">
+          <w:hyperlink w:anchor="_Toc244263989" w:history="1">
             <w:r>
               <w:rPr>
                 <w:rStyle w:val="Collegamentoipertestuale"/>
@@ -304,7 +304,7 @@
               <w:rPr>
                 <w:noProof/>
               </w:rPr>
-              <w:instrText xml:space="preserve"> PAGEREF _Toc244259547 \h </w:instrText>
+              <w:instrText xml:space="preserve"> PAGEREF _Toc244263989 \h </w:instrText>
             </w:r>
             <w:r>
               <w:rPr>
@@ -341,7 +341,7 @@
               <w:noProof/>
             </w:rPr>
           </w:pPr>
-          <w:hyperlink w:anchor="_Toc244259548" w:history="1">
+          <w:hyperlink w:anchor="_Toc244263990" w:history="1">
             <w:r>
               <w:rPr>
                 <w:rStyle w:val="Collegamentoipertestuale"/>
@@ -365,7 +365,7 @@
               <w:rPr>
                 <w:noProof/>
               </w:rPr>
-              <w:instrText xml:space="preserve"> PAGEREF _Toc244259548 \h </w:instrText>
+              <w:instrText xml:space="preserve"> PAGEREF _Toc244263990 \h </w:instrText>
             </w:r>
             <w:r>
               <w:rPr>
@@ -402,7 +402,7 @@
               <w:noProof/>
             </w:rPr>
           </w:pPr>
-          <w:hyperlink w:anchor="_Toc244259549" w:history="1">
+          <w:hyperlink w:anchor="_Toc244263991" w:history="1">
             <w:r>
               <w:rPr>
                 <w:rStyle w:val="Collegamentoipertestuale"/>
@@ -426,7 +426,7 @@
               <w:rPr>
                 <w:noProof/>
               </w:rPr>
-              <w:instrText xml:space="preserve"> PAGEREF _Toc244259549 \h </w:instrText>
+              <w:instrText xml:space="preserve"> PAGEREF _Toc244263991 \h </w:instrText>
             </w:r>
             <w:r>
               <w:rPr>
@@ -463,7 +463,7 @@
               <w:noProof/>
             </w:rPr>
           </w:pPr>
-          <w:hyperlink w:anchor="_Toc244259550" w:history="1">
+          <w:hyperlink w:anchor="_Toc244263992" w:history="1">
             <w:r>
               <w:rPr>
                 <w:rStyle w:val="Collegamentoipertestuale"/>
@@ -487,7 +487,7 @@
               <w:rPr>
                 <w:noProof/>
               </w:rPr>
-              <w:instrText xml:space="preserve"> PAGEREF _Toc244259550 \h </w:instrText>
+              <w:instrText xml:space="preserve"> PAGEREF _Toc244263992 \h </w:instrText>
             </w:r>
             <w:r>
               <w:rPr>
@@ -524,7 +524,7 @@
               <w:noProof/>
             </w:rPr>
           </w:pPr>
-          <w:hyperlink w:anchor="_Toc244259551" w:history="1">
+          <w:hyperlink w:anchor="_Toc244263993" w:history="1">
             <w:r>
               <w:rPr>
                 <w:rStyle w:val="Collegamentoipertestuale"/>
@@ -548,7 +548,7 @@
               <w:rPr>
                 <w:noProof/>
               </w:rPr>
-              <w:instrText xml:space="preserve"> PAGEREF _Toc244259551 \h </w:instrText>
+              <w:instrText xml:space="preserve"> PAGEREF _Toc244263993 \h </w:instrText>
             </w:r>
             <w:r>
               <w:rPr>
@@ -585,7 +585,7 @@
               <w:noProof/>
             </w:rPr>
           </w:pPr>
-          <w:hyperlink w:anchor="_Toc244259552" w:history="1">
+          <w:hyperlink w:anchor="_Toc244263994" w:history="1">
             <w:r>
               <w:rPr>
                 <w:rStyle w:val="Collegamentoipertestuale"/>
@@ -609,7 +609,7 @@
               <w:rPr>
                 <w:noProof/>
               </w:rPr>
-              <w:instrText xml:space="preserve"> PAGEREF _Toc244259552 \h </w:instrText>
+              <w:instrText xml:space="preserve"> PAGEREF _Toc244263994 \h </w:instrText>
             </w:r>
             <w:r>
               <w:rPr>
@@ -626,7 +626,7 @@
               <w:rPr>
                 <w:noProof/>
               </w:rPr>
-              <w:t>7</w:t>
+              <w:t>8</w:t>
             </w:r>
             <w:r>
               <w:rPr>
@@ -646,7 +646,7 @@
               <w:noProof/>
             </w:rPr>
           </w:pPr>
-          <w:hyperlink w:anchor="_Toc244259553" w:history="1">
+          <w:hyperlink w:anchor="_Toc244263995" w:history="1">
             <w:r>
               <w:rPr>
                 <w:rStyle w:val="Collegamentoipertestuale"/>
@@ -670,7 +670,7 @@
               <w:rPr>
                 <w:noProof/>
               </w:rPr>
-              <w:instrText xml:space="preserve"> PAGEREF _Toc244259553 \h </w:instrText>
+              <w:instrText xml:space="preserve"> PAGEREF _Toc244263995 \h </w:instrText>
             </w:r>
             <w:r>
               <w:rPr>
@@ -687,7 +687,7 @@
               <w:rPr>
                 <w:noProof/>
               </w:rPr>
-              <w:t>8</w:t>
+              <w:t>9</w:t>
             </w:r>
             <w:r>
               <w:rPr>
@@ -707,7 +707,7 @@
               <w:noProof/>
             </w:rPr>
           </w:pPr>
-          <w:hyperlink w:anchor="_Toc244259554" w:history="1">
+          <w:hyperlink w:anchor="_Toc244263996" w:history="1">
             <w:r>
               <w:rPr>
                 <w:rStyle w:val="Collegamentoipertestuale"/>
@@ -731,7 +731,7 @@
               <w:rPr>
                 <w:noProof/>
               </w:rPr>
-              <w:instrText xml:space="preserve"> PAGEREF _Toc244259554 \h </w:instrText>
+              <w:instrText xml:space="preserve"> PAGEREF _Toc244263996 \h </w:instrText>
             </w:r>
             <w:r>
               <w:rPr>
@@ -748,7 +748,7 @@
               <w:rPr>
                 <w:noProof/>
               </w:rPr>
-              <w:t>9</w:t>
+              <w:t>10</w:t>
             </w:r>
             <w:r>
               <w:rPr>
@@ -768,7 +768,7 @@
               <w:noProof/>
             </w:rPr>
           </w:pPr>
-          <w:hyperlink w:anchor="_Toc244259555" w:history="1">
+          <w:hyperlink w:anchor="_Toc244263997" w:history="1">
             <w:r>
               <w:rPr>
                 <w:rStyle w:val="Collegamentoipertestuale"/>
@@ -792,7 +792,7 @@
               <w:rPr>
                 <w:noProof/>
               </w:rPr>
-              <w:instrText xml:space="preserve"> PAGEREF _Toc244259555 \h </w:instrText>
+              <w:instrText xml:space="preserve"> PAGEREF _Toc244263997 \h </w:instrText>
             </w:r>
             <w:r>
               <w:rPr>
@@ -809,7 +809,7 @@
               <w:rPr>
                 <w:noProof/>
               </w:rPr>
-              <w:t>10</w:t>
+              <w:t>11</w:t>
             </w:r>
             <w:r>
               <w:rPr>
@@ -829,7 +829,7 @@
               <w:noProof/>
             </w:rPr>
           </w:pPr>
-          <w:hyperlink w:anchor="_Toc244259556" w:history="1">
+          <w:hyperlink w:anchor="_Toc244263998" w:history="1">
             <w:r>
               <w:rPr>
                 <w:rStyle w:val="Collegamentoipertestuale"/>
@@ -853,7 +853,7 @@
               <w:rPr>
                 <w:noProof/>
               </w:rPr>
-              <w:instrText xml:space="preserve"> PAGEREF _Toc244259556 \h </w:instrText>
+              <w:instrText xml:space="preserve"> PAGEREF _Toc244263998 \h </w:instrText>
             </w:r>
             <w:r>
               <w:rPr>
@@ -870,7 +870,7 @@
               <w:rPr>
                 <w:noProof/>
               </w:rPr>
-              <w:t>10</w:t>
+              <w:t>11</w:t>
             </w:r>
             <w:r>
               <w:rPr>
@@ -890,7 +890,7 @@
               <w:noProof/>
             </w:rPr>
           </w:pPr>
-          <w:hyperlink w:anchor="_Toc244259557" w:history="1">
+          <w:hyperlink w:anchor="_Toc244263999" w:history="1">
             <w:r>
               <w:rPr>
                 <w:rStyle w:val="Collegamentoipertestuale"/>
@@ -914,7 +914,7 @@
               <w:rPr>
                 <w:noProof/>
               </w:rPr>
-              <w:instrText xml:space="preserve"> PAGEREF _Toc244259557 \h </w:instrText>
+              <w:instrText xml:space="preserve"> PAGEREF _Toc244263999 \h </w:instrText>
             </w:r>
             <w:r>
               <w:rPr>
@@ -931,7 +931,7 @@
               <w:rPr>
                 <w:noProof/>
               </w:rPr>
-              <w:t>11</w:t>
+              <w:t>12</w:t>
             </w:r>
             <w:r>
               <w:rPr>
@@ -951,7 +951,7 @@
               <w:noProof/>
             </w:rPr>
           </w:pPr>
-          <w:hyperlink w:anchor="_Toc244259558" w:history="1">
+          <w:hyperlink w:anchor="_Toc244264000" w:history="1">
             <w:r>
               <w:rPr>
                 <w:rStyle w:val="Collegamentoipertestuale"/>
@@ -975,7 +975,7 @@
               <w:rPr>
                 <w:noProof/>
               </w:rPr>
-              <w:instrText xml:space="preserve"> PAGEREF _Toc244259558 \h </w:instrText>
+              <w:instrText xml:space="preserve"> PAGEREF _Toc244264000 \h </w:instrText>
             </w:r>
             <w:r>
               <w:rPr>
@@ -992,7 +992,7 @@
               <w:rPr>
                 <w:noProof/>
               </w:rPr>
-              <w:t>11</w:t>
+              <w:t>12</w:t>
             </w:r>
             <w:r>
               <w:rPr>
@@ -1012,7 +1012,7 @@
               <w:noProof/>
             </w:rPr>
           </w:pPr>
-          <w:hyperlink w:anchor="_Toc244259559" w:history="1">
+          <w:hyperlink w:anchor="_Toc244264001" w:history="1">
             <w:r>
               <w:rPr>
                 <w:rStyle w:val="Collegamentoipertestuale"/>
@@ -1036,7 +1036,7 @@
               <w:rPr>
                 <w:noProof/>
               </w:rPr>
-              <w:instrText xml:space="preserve"> PAGEREF _Toc244259559 \h </w:instrText>
+              <w:instrText xml:space="preserve"> PAGEREF _Toc244264001 \h </w:instrText>
             </w:r>
             <w:r>
               <w:rPr>
@@ -1053,7 +1053,7 @@
               <w:rPr>
                 <w:noProof/>
               </w:rPr>
-              <w:t>12</w:t>
+              <w:t>13</w:t>
             </w:r>
             <w:r>
               <w:rPr>
@@ -1073,7 +1073,7 @@
               <w:noProof/>
             </w:rPr>
           </w:pPr>
-          <w:hyperlink w:anchor="_Toc244259560" w:history="1">
+          <w:hyperlink w:anchor="_Toc244264002" w:history="1">
             <w:r>
               <w:rPr>
                 <w:rStyle w:val="Collegamentoipertestuale"/>
@@ -1097,7 +1097,7 @@
               <w:rPr>
                 <w:noProof/>
               </w:rPr>
-              <w:instrText xml:space="preserve"> PAGEREF _Toc244259560 \h </w:instrText>
+              <w:instrText xml:space="preserve"> PAGEREF _Toc244264002 \h </w:instrText>
             </w:r>
             <w:r>
               <w:rPr>
@@ -1114,7 +1114,7 @@
               <w:rPr>
                 <w:noProof/>
               </w:rPr>
-              <w:t>12</w:t>
+              <w:t>13</w:t>
             </w:r>
             <w:r>
               <w:rPr>
@@ -1134,7 +1134,7 @@
               <w:noProof/>
             </w:rPr>
           </w:pPr>
-          <w:hyperlink w:anchor="_Toc244259561" w:history="1">
+          <w:hyperlink w:anchor="_Toc244264003" w:history="1">
             <w:r>
               <w:rPr>
                 <w:rStyle w:val="Collegamentoipertestuale"/>
@@ -1158,7 +1158,7 @@
               <w:rPr>
                 <w:noProof/>
               </w:rPr>
-              <w:instrText xml:space="preserve"> PAGEREF _Toc244259561 \h </w:instrText>
+              <w:instrText xml:space="preserve"> PAGEREF _Toc244264003 \h </w:instrText>
             </w:r>
             <w:r>
               <w:rPr>
@@ -1175,7 +1175,7 @@
               <w:rPr>
                 <w:noProof/>
               </w:rPr>
-              <w:t>12</w:t>
+              <w:t>13</w:t>
             </w:r>
             <w:r>
               <w:rPr>
@@ -1195,7 +1195,7 @@
               <w:noProof/>
             </w:rPr>
           </w:pPr>
-          <w:hyperlink w:anchor="_Toc244259562" w:history="1">
+          <w:hyperlink w:anchor="_Toc244264004" w:history="1">
             <w:r>
               <w:rPr>
                 <w:rStyle w:val="Collegamentoipertestuale"/>
@@ -1219,7 +1219,7 @@
               <w:rPr>
                 <w:noProof/>
               </w:rPr>
-              <w:instrText xml:space="preserve"> PAGEREF _Toc244259562 \h </w:instrText>
+              <w:instrText xml:space="preserve"> PAGEREF _Toc244264004 \h </w:instrText>
             </w:r>
             <w:r>
               <w:rPr>
@@ -1236,7 +1236,7 @@
               <w:rPr>
                 <w:noProof/>
               </w:rPr>
-              <w:t>13</w:t>
+              <w:t>14</w:t>
             </w:r>
             <w:r>
               <w:rPr>
@@ -1256,7 +1256,7 @@
               <w:noProof/>
             </w:rPr>
           </w:pPr>
-          <w:hyperlink w:anchor="_Toc244259563" w:history="1">
+          <w:hyperlink w:anchor="_Toc244264005" w:history="1">
             <w:r>
               <w:rPr>
                 <w:rStyle w:val="Collegamentoipertestuale"/>
@@ -1280,7 +1280,7 @@
               <w:rPr>
                 <w:noProof/>
               </w:rPr>
-              <w:instrText xml:space="preserve"> PAGEREF _Toc244259563 \h </w:instrText>
+              <w:instrText xml:space="preserve"> PAGEREF _Toc244264005 \h </w:instrText>
             </w:r>
             <w:r>
               <w:rPr>
@@ -1297,7 +1297,7 @@
               <w:rPr>
                 <w:noProof/>
               </w:rPr>
-              <w:t>13</w:t>
+              <w:t>14</w:t>
             </w:r>
             <w:r>
               <w:rPr>
@@ -1317,7 +1317,7 @@
               <w:noProof/>
             </w:rPr>
           </w:pPr>
-          <w:hyperlink w:anchor="_Toc244259564" w:history="1">
+          <w:hyperlink w:anchor="_Toc244264006" w:history="1">
             <w:r>
               <w:rPr>
                 <w:rStyle w:val="Collegamentoipertestuale"/>
@@ -1341,7 +1341,7 @@
               <w:rPr>
                 <w:noProof/>
               </w:rPr>
-              <w:instrText xml:space="preserve"> PAGEREF _Toc244259564 \h </w:instrText>
+              <w:instrText xml:space="preserve"> PAGEREF _Toc244264006 \h </w:instrText>
             </w:r>
             <w:r>
               <w:rPr>
@@ -1358,7 +1358,7 @@
               <w:rPr>
                 <w:noProof/>
               </w:rPr>
-              <w:t>14</w:t>
+              <w:t>15</w:t>
             </w:r>
             <w:r>
               <w:rPr>
@@ -1378,7 +1378,7 @@
               <w:noProof/>
             </w:rPr>
           </w:pPr>
-          <w:hyperlink w:anchor="_Toc244259565" w:history="1">
+          <w:hyperlink w:anchor="_Toc244264007" w:history="1">
             <w:r>
               <w:rPr>
                 <w:rStyle w:val="Collegamentoipertestuale"/>
@@ -1402,7 +1402,7 @@
               <w:rPr>
                 <w:noProof/>
               </w:rPr>
-              <w:instrText xml:space="preserve"> PAGEREF _Toc244259565 \h </w:instrText>
+              <w:instrText xml:space="preserve"> PAGEREF _Toc244264007 \h </w:instrText>
             </w:r>
             <w:r>
               <w:rPr>
@@ -1419,7 +1419,7 @@
               <w:rPr>
                 <w:noProof/>
               </w:rPr>
-              <w:t>14</w:t>
+              <w:t>15</w:t>
             </w:r>
             <w:r>
               <w:rPr>
@@ -1439,7 +1439,7 @@
               <w:noProof/>
             </w:rPr>
           </w:pPr>
-          <w:hyperlink w:anchor="_Toc244259566" w:history="1">
+          <w:hyperlink w:anchor="_Toc244264008" w:history="1">
             <w:r>
               <w:rPr>
                 <w:rStyle w:val="Collegamentoipertestuale"/>
@@ -1463,7 +1463,7 @@
               <w:rPr>
                 <w:noProof/>
               </w:rPr>
-              <w:instrText xml:space="preserve"> PAGEREF _Toc244259566 \h </w:instrText>
+              <w:instrText xml:space="preserve"> PAGEREF _Toc244264008 \h </w:instrText>
             </w:r>
             <w:r>
               <w:rPr>
@@ -1480,7 +1480,7 @@
               <w:rPr>
                 <w:noProof/>
               </w:rPr>
-              <w:t>15</w:t>
+              <w:t>16</w:t>
             </w:r>
             <w:r>
               <w:rPr>
@@ -1500,7 +1500,7 @@
               <w:noProof/>
             </w:rPr>
           </w:pPr>
-          <w:hyperlink w:anchor="_Toc244259567" w:history="1">
+          <w:hyperlink w:anchor="_Toc244264009" w:history="1">
             <w:r>
               <w:rPr>
                 <w:rStyle w:val="Collegamentoipertestuale"/>
@@ -1524,7 +1524,7 @@
               <w:rPr>
                 <w:noProof/>
               </w:rPr>
-              <w:instrText xml:space="preserve"> PAGEREF _Toc244259567 \h </w:instrText>
+              <w:instrText xml:space="preserve"> PAGEREF _Toc244264009 \h </w:instrText>
             </w:r>
             <w:r>
               <w:rPr>
@@ -1541,7 +1541,7 @@
               <w:rPr>
                 <w:noProof/>
               </w:rPr>
-              <w:t>16</w:t>
+              <w:t>17</w:t>
             </w:r>
             <w:r>
               <w:rPr>
@@ -1561,7 +1561,7 @@
               <w:noProof/>
             </w:rPr>
           </w:pPr>
-          <w:hyperlink w:anchor="_Toc244259568" w:history="1">
+          <w:hyperlink w:anchor="_Toc244264010" w:history="1">
             <w:r>
               <w:rPr>
                 <w:rStyle w:val="Collegamentoipertestuale"/>
@@ -1585,7 +1585,7 @@
               <w:rPr>
                 <w:noProof/>
               </w:rPr>
-              <w:instrText xml:space="preserve"> PAGEREF _Toc244259568 \h </w:instrText>
+              <w:instrText xml:space="preserve"> PAGEREF _Toc244264010 \h </w:instrText>
             </w:r>
             <w:r>
               <w:rPr>
@@ -1602,7 +1602,7 @@
               <w:rPr>
                 <w:noProof/>
               </w:rPr>
-              <w:t>16</w:t>
+              <w:t>17</w:t>
             </w:r>
             <w:r>
               <w:rPr>
@@ -1622,7 +1622,7 @@
               <w:noProof/>
             </w:rPr>
           </w:pPr>
-          <w:hyperlink w:anchor="_Toc244259569" w:history="1">
+          <w:hyperlink w:anchor="_Toc244264011" w:history="1">
             <w:r>
               <w:rPr>
                 <w:rStyle w:val="Collegamentoipertestuale"/>
@@ -1646,7 +1646,7 @@
               <w:rPr>
                 <w:noProof/>
               </w:rPr>
-              <w:instrText xml:space="preserve"> PAGEREF _Toc244259569 \h </w:instrText>
+              <w:instrText xml:space="preserve"> PAGEREF _Toc244264011 \h </w:instrText>
             </w:r>
             <w:r>
               <w:rPr>
@@ -1663,7 +1663,7 @@
               <w:rPr>
                 <w:noProof/>
               </w:rPr>
-              <w:t>17</w:t>
+              <w:t>18</w:t>
             </w:r>
             <w:r>
               <w:rPr>
@@ -1683,7 +1683,7 @@
               <w:noProof/>
             </w:rPr>
           </w:pPr>
-          <w:hyperlink w:anchor="_Toc244259570" w:history="1">
+          <w:hyperlink w:anchor="_Toc244264012" w:history="1">
             <w:r>
               <w:rPr>
                 <w:rStyle w:val="Collegamentoipertestuale"/>
@@ -1707,7 +1707,7 @@
               <w:rPr>
                 <w:noProof/>
               </w:rPr>
-              <w:instrText xml:space="preserve"> PAGEREF _Toc244259570 \h </w:instrText>
+              <w:instrText xml:space="preserve"> PAGEREF _Toc244264012 \h </w:instrText>
             </w:r>
             <w:r>
               <w:rPr>
@@ -1724,7 +1724,7 @@
               <w:rPr>
                 <w:noProof/>
               </w:rPr>
-              <w:t>19</w:t>
+              <w:t>20</w:t>
             </w:r>
             <w:r>
               <w:rPr>
@@ -1744,7 +1744,7 @@
               <w:noProof/>
             </w:rPr>
           </w:pPr>
-          <w:hyperlink w:anchor="_Toc244259571" w:history="1">
+          <w:hyperlink w:anchor="_Toc244264013" w:history="1">
             <w:r>
               <w:rPr>
                 <w:rStyle w:val="Collegamentoipertestuale"/>
@@ -1768,7 +1768,7 @@
               <w:rPr>
                 <w:noProof/>
               </w:rPr>
-              <w:instrText xml:space="preserve"> PAGEREF _Toc244259571 \h </w:instrText>
+              <w:instrText xml:space="preserve"> PAGEREF _Toc244264013 \h </w:instrText>
             </w:r>
             <w:r>
               <w:rPr>
@@ -1785,7 +1785,7 @@
               <w:rPr>
                 <w:noProof/>
               </w:rPr>
-              <w:t>20</w:t>
+              <w:t>21</w:t>
             </w:r>
             <w:r>
               <w:rPr>
@@ -1805,7 +1805,7 @@
               <w:noProof/>
             </w:rPr>
           </w:pPr>
-          <w:hyperlink w:anchor="_Toc244259572" w:history="1">
+          <w:hyperlink w:anchor="_Toc244264014" w:history="1">
             <w:r>
               <w:rPr>
                 <w:rStyle w:val="Collegamentoipertestuale"/>
@@ -1829,7 +1829,7 @@
               <w:rPr>
                 <w:noProof/>
               </w:rPr>
-              <w:instrText xml:space="preserve"> PAGEREF _Toc244259572 \h </w:instrText>
+              <w:instrText xml:space="preserve"> PAGEREF _Toc244264014 \h </w:instrText>
             </w:r>
             <w:r>
               <w:rPr>
@@ -1846,7 +1846,7 @@
               <w:rPr>
                 <w:noProof/>
               </w:rPr>
-              <w:t>21</w:t>
+              <w:t>22</w:t>
             </w:r>
             <w:r>
               <w:rPr>
@@ -1866,7 +1866,7 @@
               <w:noProof/>
             </w:rPr>
           </w:pPr>
-          <w:hyperlink w:anchor="_Toc244259573" w:history="1">
+          <w:hyperlink w:anchor="_Toc244264015" w:history="1">
             <w:r>
               <w:rPr>
                 <w:rStyle w:val="Collegamentoipertestuale"/>
@@ -1890,7 +1890,7 @@
               <w:rPr>
                 <w:noProof/>
               </w:rPr>
-              <w:instrText xml:space="preserve"> PAGEREF _Toc244259573 \h </w:instrText>
+              <w:instrText xml:space="preserve"> PAGEREF _Toc244264015 \h </w:instrText>
             </w:r>
             <w:r>
               <w:rPr>
@@ -1907,7 +1907,7 @@
               <w:rPr>
                 <w:noProof/>
               </w:rPr>
-              <w:t>21</w:t>
+              <w:t>22</w:t>
             </w:r>
             <w:r>
               <w:rPr>
@@ -1927,7 +1927,7 @@
               <w:noProof/>
             </w:rPr>
           </w:pPr>
-          <w:hyperlink w:anchor="_Toc244259574" w:history="1">
+          <w:hyperlink w:anchor="_Toc244264016" w:history="1">
             <w:r>
               <w:rPr>
                 <w:rStyle w:val="Collegamentoipertestuale"/>
@@ -1951,7 +1951,7 @@
               <w:rPr>
                 <w:noProof/>
               </w:rPr>
-              <w:instrText xml:space="preserve"> PAGEREF _Toc244259574 \h </w:instrText>
+              <w:instrText xml:space="preserve"> PAGEREF _Toc244264016 \h </w:instrText>
             </w:r>
             <w:r>
               <w:rPr>
@@ -1968,7 +1968,7 @@
               <w:rPr>
                 <w:noProof/>
               </w:rPr>
-              <w:t>22</w:t>
+              <w:t>23</w:t>
             </w:r>
             <w:r>
               <w:rPr>
@@ -1988,7 +1988,7 @@
               <w:noProof/>
             </w:rPr>
           </w:pPr>
-          <w:hyperlink w:anchor="_Toc244259575" w:history="1">
+          <w:hyperlink w:anchor="_Toc244264017" w:history="1">
             <w:r>
               <w:rPr>
                 <w:rStyle w:val="Collegamentoipertestuale"/>
@@ -2012,7 +2012,7 @@
               <w:rPr>
                 <w:noProof/>
               </w:rPr>
-              <w:instrText xml:space="preserve"> PAGEREF _Toc244259575 \h </w:instrText>
+              <w:instrText xml:space="preserve"> PAGEREF _Toc244264017 \h </w:instrText>
             </w:r>
             <w:r>
               <w:rPr>
@@ -2029,7 +2029,7 @@
               <w:rPr>
                 <w:noProof/>
               </w:rPr>
-              <w:t>22</w:t>
+              <w:t>23</w:t>
             </w:r>
             <w:r>
               <w:rPr>
@@ -2049,7 +2049,7 @@
               <w:noProof/>
             </w:rPr>
           </w:pPr>
-          <w:hyperlink w:anchor="_Toc244259576" w:history="1">
+          <w:hyperlink w:anchor="_Toc244264018" w:history="1">
             <w:r>
               <w:rPr>
                 <w:rStyle w:val="Collegamentoipertestuale"/>
@@ -2073,7 +2073,7 @@
               <w:rPr>
                 <w:noProof/>
               </w:rPr>
-              <w:instrText xml:space="preserve"> PAGEREF _Toc244259576 \h </w:instrText>
+              <w:instrText xml:space="preserve"> PAGEREF _Toc244264018 \h </w:instrText>
             </w:r>
             <w:r>
               <w:rPr>
@@ -2090,7 +2090,7 @@
               <w:rPr>
                 <w:noProof/>
               </w:rPr>
-              <w:t>23</w:t>
+              <w:t>24</w:t>
             </w:r>
             <w:r>
               <w:rPr>
@@ -2110,7 +2110,7 @@
               <w:noProof/>
             </w:rPr>
           </w:pPr>
-          <w:hyperlink w:anchor="_Toc244259577" w:history="1">
+          <w:hyperlink w:anchor="_Toc244264019" w:history="1">
             <w:r>
               <w:rPr>
                 <w:rStyle w:val="Collegamentoipertestuale"/>
@@ -2134,7 +2134,7 @@
               <w:rPr>
                 <w:noProof/>
               </w:rPr>
-              <w:instrText xml:space="preserve"> PAGEREF _Toc244259577 \h </w:instrText>
+              <w:instrText xml:space="preserve"> PAGEREF _Toc244264019 \h </w:instrText>
             </w:r>
             <w:r>
               <w:rPr>
@@ -2151,7 +2151,68 @@
               <w:rPr>
                 <w:noProof/>
               </w:rPr>
-              <w:t>24</w:t>
+              <w:t>25</w:t>
+            </w:r>
+            <w:r>
+              <w:rPr>
+                <w:noProof/>
+              </w:rPr>
+              <w:fldChar w:fldCharType="end"/>
+            </w:r>
+          </w:hyperlink>
+        </w:p>
+        <w:p>
+          <w:pPr>
+            <w:pStyle w:val="Sommario2"/>
+            <w:tabs>
+              <w:tab w:val="right" w:leader="dot" w:pos="9628"/>
+            </w:tabs>
+            <w:rPr>
+              <w:noProof/>
+            </w:rPr>
+          </w:pPr>
+          <w:hyperlink w:anchor="_Toc244264020" w:history="1">
+            <w:r>
+              <w:rPr>
+                <w:rStyle w:val="Collegamentoipertestuale"/>
+                <w:noProof/>
+              </w:rPr>
+              <w:t>4.21 Dominio dell'autore: pdfz.agjin.com (versione 1.6.1)</w:t>
+            </w:r>
+            <w:r>
+              <w:rPr>
+                <w:noProof/>
+              </w:rPr>
+              <w:tab/>
+            </w:r>
+            <w:r>
+              <w:rPr>
+                <w:noProof/>
+              </w:rPr>
+              <w:fldChar w:fldCharType="begin"/>
+            </w:r>
+            <w:r>
+              <w:rPr>
+                <w:noProof/>
+              </w:rPr>
+              <w:instrText xml:space="preserve"> PAGEREF _Toc244264020 \h </w:instrText>
+            </w:r>
+            <w:r>
+              <w:rPr>
+                <w:noProof/>
+              </w:rPr>
+            </w:r>
+            <w:r>
+              <w:rPr>
+                <w:noProof/>
+              </w:rPr>
+              <w:fldChar w:fldCharType="separate"/>
+            </w:r>
+            <w:r>
+              <w:rPr>
+                <w:noProof/>
+              </w:rPr>
+              <w:t>25</w:t>
             </w:r>
             <w:r>
               <w:rPr>
@@ -2171,7 +2232,7 @@
               <w:noProof/>
             </w:rPr>
           </w:pPr>
-          <w:hyperlink w:anchor="_Toc244259578" w:history="1">
+          <w:hyperlink w:anchor="_Toc244264021" w:history="1">
             <w:r>
               <w:rPr>
                 <w:rStyle w:val="Collegamentoipertestuale"/>
@@ -2195,7 +2256,7 @@
               <w:rPr>
                 <w:noProof/>
               </w:rPr>
-              <w:instrText xml:space="preserve"> PAGEREF _Toc244259578 \h </w:instrText>
+              <w:instrText xml:space="preserve"> PAGEREF _Toc244264021 \h </w:instrText>
             </w:r>
             <w:r>
               <w:rPr>
@@ -2212,7 +2273,7 @@
               <w:rPr>
                 <w:noProof/>
               </w:rPr>
-              <w:t>24</w:t>
+              <w:t>25</w:t>
             </w:r>
             <w:r>
               <w:rPr>
@@ -2232,7 +2293,7 @@
               <w:noProof/>
             </w:rPr>
           </w:pPr>
-          <w:hyperlink w:anchor="_Toc244259579" w:history="1">
+          <w:hyperlink w:anchor="_Toc244264022" w:history="1">
             <w:r>
               <w:rPr>
                 <w:rStyle w:val="Collegamentoipertestuale"/>
@@ -2256,7 +2317,7 @@
               <w:rPr>
                 <w:noProof/>
               </w:rPr>
-              <w:instrText xml:space="preserve"> PAGEREF _Toc244259579 \h </w:instrText>
+              <w:instrText xml:space="preserve"> PAGEREF _Toc244264022 \h </w:instrText>
             </w:r>
             <w:r>
               <w:rPr>
@@ -2273,7 +2334,7 @@
               <w:rPr>
                 <w:noProof/>
               </w:rPr>
-              <w:t>24</w:t>
+              <w:t>25</w:t>
             </w:r>
             <w:r>
               <w:rPr>
@@ -2293,7 +2354,7 @@
               <w:noProof/>
             </w:rPr>
           </w:pPr>
-          <w:hyperlink w:anchor="_Toc244259580" w:history="1">
+          <w:hyperlink w:anchor="_Toc244264023" w:history="1">
             <w:r>
               <w:rPr>
                 <w:rStyle w:val="Collegamentoipertestuale"/>
@@ -2317,7 +2378,7 @@
               <w:rPr>
                 <w:noProof/>
               </w:rPr>
-              <w:instrText xml:space="preserve"> PAGEREF _Toc244259580 \h </w:instrText>
+              <w:instrText xml:space="preserve"> PAGEREF _Toc244264023 \h </w:instrText>
             </w:r>
             <w:r>
               <w:rPr>
@@ -2334,7 +2395,7 @@
               <w:rPr>
                 <w:noProof/>
               </w:rPr>
-              <w:t>25</w:t>
+              <w:t>26</w:t>
             </w:r>
             <w:r>
               <w:rPr>
@@ -2354,7 +2415,7 @@
               <w:noProof/>
             </w:rPr>
           </w:pPr>
-          <w:hyperlink w:anchor="_Toc244259581" w:history="1">
+          <w:hyperlink w:anchor="_Toc244264024" w:history="1">
             <w:r>
               <w:rPr>
                 <w:rStyle w:val="Collegamentoipertestuale"/>
@@ -2378,7 +2439,7 @@
               <w:rPr>
                 <w:noProof/>
               </w:rPr>
-              <w:instrText xml:space="preserve"> PAGEREF _Toc244259581 \h </w:instrText>
+              <w:instrText xml:space="preserve"> PAGEREF _Toc244264024 \h </w:instrText>
             </w:r>
             <w:r>
               <w:rPr>
@@ -2395,7 +2456,7 @@
               <w:rPr>
                 <w:noProof/>
               </w:rPr>
-              <w:t>25</w:t>
+              <w:t>26</w:t>
             </w:r>
             <w:r>
               <w:rPr>
@@ -2415,7 +2476,7 @@
               <w:noProof/>
             </w:rPr>
           </w:pPr>
-          <w:hyperlink w:anchor="_Toc244259582" w:history="1">
+          <w:hyperlink w:anchor="_Toc244264025" w:history="1">
             <w:r>
               <w:rPr>
                 <w:rStyle w:val="Collegamentoipertestuale"/>
@@ -2439,7 +2500,7 @@
               <w:rPr>
                 <w:noProof/>
               </w:rPr>
-              <w:instrText xml:space="preserve"> PAGEREF _Toc244259582 \h </w:instrText>
+              <w:instrText xml:space="preserve"> PAGEREF _Toc244264025 \h </w:instrText>
             </w:r>
             <w:r>
               <w:rPr>
@@ -2456,7 +2517,7 @@
               <w:rPr>
                 <w:noProof/>
               </w:rPr>
-              <w:t>26</w:t>
+              <w:t>27</w:t>
             </w:r>
             <w:r>
               <w:rPr>
@@ -2476,7 +2537,7 @@
               <w:noProof/>
             </w:rPr>
           </w:pPr>
-          <w:hyperlink w:anchor="_Toc244259583" w:history="1">
+          <w:hyperlink w:anchor="_Toc244264026" w:history="1">
             <w:r>
               <w:rPr>
                 <w:rStyle w:val="Collegamentoipertestuale"/>
@@ -2500,7 +2561,7 @@
               <w:rPr>
                 <w:noProof/>
               </w:rPr>
-              <w:instrText xml:space="preserve"> PAGEREF _Toc244259583 \h </w:instrText>
+              <w:instrText xml:space="preserve"> PAGEREF _Toc244264026 \h </w:instrText>
             </w:r>
             <w:r>
               <w:rPr>
@@ -2517,7 +2578,7 @@
               <w:rPr>
                 <w:noProof/>
               </w:rPr>
-              <w:t>26</w:t>
+              <w:t>27</w:t>
             </w:r>
             <w:r>
               <w:rPr>
@@ -2537,7 +2598,7 @@
               <w:noProof/>
             </w:rPr>
           </w:pPr>
-          <w:hyperlink w:anchor="_Toc244259584" w:history="1">
+          <w:hyperlink w:anchor="_Toc244264027" w:history="1">
             <w:r>
               <w:rPr>
                 <w:rStyle w:val="Collegamentoipertestuale"/>
@@ -2561,7 +2622,7 @@
               <w:rPr>
                 <w:noProof/>
               </w:rPr>
-              <w:instrText xml:space="preserve"> PAGEREF _Toc244259584 \h </w:instrText>
+              <w:instrText xml:space="preserve"> PAGEREF _Toc244264027 \h </w:instrText>
             </w:r>
             <w:r>
               <w:rPr>
@@ -2578,7 +2639,7 @@
               <w:rPr>
                 <w:noProof/>
               </w:rPr>
-              <w:t>26</w:t>
+              <w:t>27</w:t>
             </w:r>
             <w:r>
               <w:rPr>
@@ -2598,7 +2659,7 @@
               <w:noProof/>
             </w:rPr>
           </w:pPr>
-          <w:hyperlink w:anchor="_Toc244259585" w:history="1">
+          <w:hyperlink w:anchor="_Toc244264028" w:history="1">
             <w:r>
               <w:rPr>
                 <w:rStyle w:val="Collegamentoipertestuale"/>
@@ -2622,7 +2683,7 @@
               <w:rPr>
                 <w:noProof/>
               </w:rPr>
-              <w:instrText xml:space="preserve"> PAGEREF _Toc244259585 \h </w:instrText>
+              <w:instrText xml:space="preserve"> PAGEREF _Toc244264028 \h </w:instrText>
             </w:r>
             <w:r>
               <w:rPr>
@@ -2639,7 +2700,7 @@
               <w:rPr>
                 <w:noProof/>
               </w:rPr>
-              <w:t>27</w:t>
+              <w:t>28</w:t>
             </w:r>
             <w:r>
               <w:rPr>
@@ -2659,7 +2720,7 @@
               <w:noProof/>
             </w:rPr>
           </w:pPr>
-          <w:hyperlink w:anchor="_Toc244259586" w:history="1">
+          <w:hyperlink w:anchor="_Toc244264029" w:history="1">
             <w:r>
               <w:rPr>
                 <w:rStyle w:val="Collegamentoipertestuale"/>
@@ -2683,7 +2744,7 @@
               <w:rPr>
                 <w:noProof/>
               </w:rPr>
-              <w:instrText xml:space="preserve"> PAGEREF _Toc244259586 \h </w:instrText>
+              <w:instrText xml:space="preserve"> PAGEREF _Toc244264029 \h </w:instrText>
             </w:r>
             <w:r>
               <w:rPr>
@@ -2700,7 +2761,7 @@
               <w:rPr>
                 <w:noProof/>
               </w:rPr>
-              <w:t>27</w:t>
+              <w:t>28</w:t>
             </w:r>
             <w:r>
               <w:rPr>
@@ -2720,7 +2781,7 @@
               <w:noProof/>
             </w:rPr>
           </w:pPr>
-          <w:hyperlink w:anchor="_Toc244259587" w:history="1">
+          <w:hyperlink w:anchor="_Toc244264030" w:history="1">
             <w:r>
               <w:rPr>
                 <w:rStyle w:val="Collegamentoipertestuale"/>
@@ -2744,7 +2805,7 @@
               <w:rPr>
                 <w:noProof/>
               </w:rPr>
-              <w:instrText xml:space="preserve"> PAGEREF _Toc244259587 \h </w:instrText>
+              <w:instrText xml:space="preserve"> PAGEREF _Toc244264030 \h </w:instrText>
             </w:r>
             <w:r>
               <w:rPr>
@@ -2761,7 +2822,7 @@
               <w:rPr>
                 <w:noProof/>
               </w:rPr>
-              <w:t>28</w:t>
+              <w:t>29</w:t>
             </w:r>
             <w:r>
               <w:rPr>
@@ -2781,7 +2842,7 @@
               <w:noProof/>
             </w:rPr>
           </w:pPr>
-          <w:hyperlink w:anchor="_Toc244259588" w:history="1">
+          <w:hyperlink w:anchor="_Toc244264031" w:history="1">
             <w:r>
               <w:rPr>
                 <w:rStyle w:val="Collegamentoipertestuale"/>
@@ -2805,7 +2866,7 @@
               <w:rPr>
                 <w:noProof/>
               </w:rPr>
-              <w:instrText xml:space="preserve"> PAGEREF _Toc244259588 \h </w:instrText>
+              <w:instrText xml:space="preserve"> PAGEREF _Toc244264031 \h </w:instrText>
             </w:r>
             <w:r>
               <w:rPr>
@@ -2822,7 +2883,7 @@
               <w:rPr>
                 <w:noProof/>
               </w:rPr>
-              <w:t>28</w:t>
+              <w:t>29</w:t>
             </w:r>
             <w:r>
               <w:rPr>
@@ -2842,7 +2903,7 @@
               <w:noProof/>
             </w:rPr>
           </w:pPr>
-          <w:hyperlink w:anchor="_Toc244259589" w:history="1">
+          <w:hyperlink w:anchor="_Toc244264032" w:history="1">
             <w:r>
               <w:rPr>
                 <w:rStyle w:val="Collegamentoipertestuale"/>
@@ -2866,7 +2927,7 @@
               <w:rPr>
                 <w:noProof/>
               </w:rPr>
-              <w:instrText xml:space="preserve"> PAGEREF _Toc244259589 \h </w:instrText>
+              <w:instrText xml:space="preserve"> PAGEREF _Toc244264032 \h </w:instrText>
             </w:r>
             <w:r>
               <w:rPr>
@@ -2883,7 +2944,7 @@
               <w:rPr>
                 <w:noProof/>
               </w:rPr>
-              <w:t>28</w:t>
+              <w:t>29</w:t>
             </w:r>
             <w:r>
               <w:rPr>
@@ -2903,7 +2964,7 @@
               <w:noProof/>
             </w:rPr>
           </w:pPr>
-          <w:hyperlink w:anchor="_Toc244259590" w:history="1">
+          <w:hyperlink w:anchor="_Toc244264033" w:history="1">
             <w:r>
               <w:rPr>
                 <w:rStyle w:val="Collegamentoipertestuale"/>
@@ -2927,7 +2988,7 @@
               <w:rPr>
                 <w:noProof/>
               </w:rPr>
-              <w:instrText xml:space="preserve"> PAGEREF _Toc244259590 \h </w:instrText>
+              <w:instrText xml:space="preserve"> PAGEREF _Toc244264033 \h </w:instrText>
             </w:r>
             <w:r>
               <w:rPr>
@@ -2944,7 +3005,7 @@
               <w:rPr>
                 <w:noProof/>
               </w:rPr>
-              <w:t>28</w:t>
+              <w:t>29</w:t>
             </w:r>
             <w:r>
               <w:rPr>
@@ -2964,7 +3025,7 @@
               <w:noProof/>
             </w:rPr>
           </w:pPr>
-          <w:hyperlink w:anchor="_Toc244259591" w:history="1">
+          <w:hyperlink w:anchor="_Toc244264034" w:history="1">
             <w:r>
               <w:rPr>
                 <w:rStyle w:val="Collegamentoipertestuale"/>
@@ -2988,7 +3049,7 @@
               <w:rPr>
                 <w:noProof/>
               </w:rPr>
-              <w:instrText xml:space="preserve"> PAGEREF _Toc244259591 \h </w:instrText>
+              <w:instrText xml:space="preserve"> PAGEREF _Toc244264034 \h </w:instrText>
             </w:r>
             <w:r>
               <w:rPr>
@@ -3005,7 +3066,7 @@
               <w:rPr>
                 <w:noProof/>
               </w:rPr>
-              <w:t>28</w:t>
+              <w:t>30</w:t>
             </w:r>
             <w:r>
               <w:rPr>
@@ -3025,7 +3086,7 @@
               <w:noProof/>
             </w:rPr>
           </w:pPr>
-          <w:hyperlink w:anchor="_Toc244259592" w:history="1">
+          <w:hyperlink w:anchor="_Toc244264035" w:history="1">
             <w:r>
               <w:rPr>
                 <w:rStyle w:val="Collegamentoipertestuale"/>
@@ -3049,7 +3110,7 @@
               <w:rPr>
                 <w:noProof/>
               </w:rPr>
-              <w:instrText xml:space="preserve"> PAGEREF _Toc244259592 \h </w:instrText>
+              <w:instrText xml:space="preserve"> PAGEREF _Toc244264035 \h </w:instrText>
             </w:r>
             <w:r>
               <w:rPr>
@@ -3066,7 +3127,7 @@
               <w:rPr>
                 <w:noProof/>
               </w:rPr>
-              <w:t>29</w:t>
+              <w:t>30</w:t>
             </w:r>
             <w:r>
               <w:rPr>
@@ -3086,7 +3147,7 @@
               <w:noProof/>
             </w:rPr>
           </w:pPr>
-          <w:hyperlink w:anchor="_Toc244259593" w:history="1">
+          <w:hyperlink w:anchor="_Toc244264036" w:history="1">
             <w:r>
               <w:rPr>
                 <w:rStyle w:val="Collegamentoipertestuale"/>
@@ -3110,7 +3171,7 @@
               <w:rPr>
                 <w:noProof/>
               </w:rPr>
-              <w:instrText xml:space="preserve"> PAGEREF _Toc244259593 \h </w:instrText>
+              <w:instrText xml:space="preserve"> PAGEREF _Toc244264036 \h </w:instrText>
             </w:r>
             <w:r>
               <w:rPr>
@@ -3127,7 +3188,7 @@
               <w:rPr>
                 <w:noProof/>
               </w:rPr>
-              <w:t>29</w:t>
+              <w:t>31</w:t>
             </w:r>
             <w:r>
               <w:rPr>
@@ -3147,7 +3208,7 @@
               <w:noProof/>
             </w:rPr>
           </w:pPr>
-          <w:hyperlink w:anchor="_Toc244259594" w:history="1">
+          <w:hyperlink w:anchor="_Toc244264037" w:history="1">
             <w:r>
               <w:rPr>
                 <w:rStyle w:val="Collegamentoipertestuale"/>
@@ -3171,7 +3232,7 @@
               <w:rPr>
                 <w:noProof/>
               </w:rPr>
-              <w:instrText xml:space="preserve"> PAGEREF _Toc244259594 \h </w:instrText>
+              <w:instrText xml:space="preserve"> PAGEREF _Toc244264037 \h </w:instrText>
             </w:r>
             <w:r>
               <w:rPr>
@@ -3188,7 +3249,7 @@
               <w:rPr>
                 <w:noProof/>
               </w:rPr>
-              <w:t>30</w:t>
+              <w:t>31</w:t>
             </w:r>
             <w:r>
               <w:rPr>
@@ -3208,7 +3269,7 @@
               <w:noProof/>
             </w:rPr>
           </w:pPr>
-          <w:hyperlink w:anchor="_Toc244259595" w:history="1">
+          <w:hyperlink w:anchor="_Toc244264038" w:history="1">
             <w:r>
               <w:rPr>
                 <w:rStyle w:val="Collegamentoipertestuale"/>
@@ -3232,7 +3293,7 @@
               <w:rPr>
                 <w:noProof/>
               </w:rPr>
-              <w:instrText xml:space="preserve"> PAGEREF _Toc244259595 \h </w:instrText>
+              <w:instrText xml:space="preserve"> PAGEREF _Toc244264038 \h </w:instrText>
             </w:r>
             <w:r>
               <w:rPr>
@@ -3249,7 +3310,7 @@
               <w:rPr>
                 <w:noProof/>
               </w:rPr>
-              <w:t>31</w:t>
+              <w:t>32</w:t>
             </w:r>
             <w:r>
               <w:rPr>
@@ -3269,7 +3330,7 @@
               <w:noProof/>
             </w:rPr>
           </w:pPr>
-          <w:hyperlink w:anchor="_Toc244259596" w:history="1">
+          <w:hyperlink w:anchor="_Toc244264039" w:history="1">
             <w:r>
               <w:rPr>
                 <w:rStyle w:val="Collegamentoipertestuale"/>
@@ -3293,7 +3354,7 @@
               <w:rPr>
                 <w:noProof/>
               </w:rPr>
-              <w:instrText xml:space="preserve"> PAGEREF _Toc244259596 \h </w:instrText>
+              <w:instrText xml:space="preserve"> PAGEREF _Toc244264039 \h </w:instrText>
             </w:r>
             <w:r>
               <w:rPr>
@@ -3310,7 +3371,7 @@
               <w:rPr>
                 <w:noProof/>
               </w:rPr>
-              <w:t>32</w:t>
+              <w:t>33</w:t>
             </w:r>
             <w:r>
               <w:rPr>
@@ -3330,7 +3391,7 @@
               <w:noProof/>
             </w:rPr>
           </w:pPr>
-          <w:hyperlink w:anchor="_Toc244259597" w:history="1">
+          <w:hyperlink w:anchor="_Toc244264040" w:history="1">
             <w:r>
               <w:rPr>
                 <w:rStyle w:val="Collegamentoipertestuale"/>
@@ -3354,7 +3415,7 @@
               <w:rPr>
                 <w:noProof/>
               </w:rPr>
-              <w:instrText xml:space="preserve"> PAGEREF _Toc244259597 \h </w:instrText>
+              <w:instrText xml:space="preserve"> PAGEREF _Toc244264040 \h </w:instrText>
             </w:r>
             <w:r>
               <w:rPr>
@@ -3371,7 +3432,7 @@
               <w:rPr>
                 <w:noProof/>
               </w:rPr>
-              <w:t>32</w:t>
+              <w:t>33</w:t>
             </w:r>
             <w:r>
               <w:rPr>
@@ -3391,7 +3452,7 @@
               <w:noProof/>
             </w:rPr>
           </w:pPr>
-          <w:hyperlink w:anchor="_Toc244259598" w:history="1">
+          <w:hyperlink w:anchor="_Toc244264041" w:history="1">
             <w:r>
               <w:rPr>
                 <w:rStyle w:val="Collegamentoipertestuale"/>
@@ -3415,7 +3476,7 @@
               <w:rPr>
                 <w:noProof/>
               </w:rPr>
-              <w:instrText xml:space="preserve"> PAGEREF _Toc244259598 \h </w:instrText>
+              <w:instrText xml:space="preserve"> PAGEREF _Toc244264041 \h </w:instrText>
             </w:r>
             <w:r>
               <w:rPr>
@@ -3432,7 +3493,7 @@
               <w:rPr>
                 <w:noProof/>
               </w:rPr>
-              <w:t>32</w:t>
+              <w:t>33</w:t>
             </w:r>
             <w:r>
               <w:rPr>
@@ -3452,7 +3513,7 @@
               <w:noProof/>
             </w:rPr>
           </w:pPr>
-          <w:hyperlink w:anchor="_Toc244259599" w:history="1">
+          <w:hyperlink w:anchor="_Toc244264042" w:history="1">
             <w:r>
               <w:rPr>
                 <w:rStyle w:val="Collegamentoipertestuale"/>
@@ -3476,7 +3537,7 @@
               <w:rPr>
                 <w:noProof/>
               </w:rPr>
-              <w:instrText xml:space="preserve"> PAGEREF _Toc244259599 \h </w:instrText>
+              <w:instrText xml:space="preserve"> PAGEREF _Toc244264042 \h </w:instrText>
             </w:r>
             <w:r>
               <w:rPr>
@@ -3493,7 +3554,7 @@
               <w:rPr>
                 <w:noProof/>
               </w:rPr>
-              <w:t>32</w:t>
+              <w:t>33</w:t>
             </w:r>
             <w:r>
               <w:rPr>
@@ -3513,7 +3574,7 @@
               <w:noProof/>
             </w:rPr>
           </w:pPr>
-          <w:hyperlink w:anchor="_Toc244259600" w:history="1">
+          <w:hyperlink w:anchor="_Toc244264043" w:history="1">
             <w:r>
               <w:rPr>
                 <w:rStyle w:val="Collegamentoipertestuale"/>
@@ -3537,7 +3598,7 @@
               <w:rPr>
                 <w:noProof/>
               </w:rPr>
-              <w:instrText xml:space="preserve"> PAGEREF _Toc244259600 \h </w:instrText>
+              <w:instrText xml:space="preserve"> PAGEREF _Toc244264043 \h </w:instrText>
             </w:r>
             <w:r>
               <w:rPr>
@@ -3554,7 +3615,7 @@
               <w:rPr>
                 <w:noProof/>
               </w:rPr>
-              <w:t>32</w:t>
+              <w:t>33</w:t>
             </w:r>
             <w:r>
               <w:rPr>
@@ -3574,7 +3635,7 @@
               <w:noProof/>
             </w:rPr>
           </w:pPr>
-          <w:hyperlink w:anchor="_Toc244259601" w:history="1">
+          <w:hyperlink w:anchor="_Toc244264044" w:history="1">
             <w:r>
               <w:rPr>
                 <w:rStyle w:val="Collegamentoipertestuale"/>
@@ -3598,7 +3659,7 @@
               <w:rPr>
                 <w:noProof/>
               </w:rPr>
-              <w:instrText xml:space="preserve"> PAGEREF _Toc244259601 \h </w:instrText>
+              <w:instrText xml:space="preserve"> PAGEREF _Toc244264044 \h </w:instrText>
             </w:r>
             <w:r>
               <w:rPr>
@@ -3615,7 +3676,7 @@
               <w:rPr>
                 <w:noProof/>
               </w:rPr>
-              <w:t>32</w:t>
+              <w:t>33</w:t>
             </w:r>
             <w:r>
               <w:rPr>
@@ -3635,7 +3696,7 @@
               <w:noProof/>
             </w:rPr>
           </w:pPr>
-          <w:hyperlink w:anchor="_Toc244259602" w:history="1">
+          <w:hyperlink w:anchor="_Toc244264045" w:history="1">
             <w:r>
               <w:rPr>
                 <w:rStyle w:val="Collegamentoipertestuale"/>
@@ -3659,7 +3720,7 @@
               <w:rPr>
                 <w:noProof/>
               </w:rPr>
-              <w:instrText xml:space="preserve"> PAGEREF _Toc244259602 \h </w:instrText>
+              <w:instrText xml:space="preserve"> PAGEREF _Toc244264045 \h </w:instrText>
             </w:r>
             <w:r>
               <w:rPr>
@@ -3676,7 +3737,7 @@
               <w:rPr>
                 <w:noProof/>
               </w:rPr>
-              <w:t>33</w:t>
+              <w:t>34</w:t>
             </w:r>
             <w:r>
               <w:rPr>
@@ -3696,13 +3757,13 @@
               <w:noProof/>
             </w:rPr>
           </w:pPr>
-          <w:hyperlink w:anchor="_Toc244259603" w:history="1">
+          <w:hyperlink w:anchor="_Toc244264046" w:history="1">
             <w:r>
               <w:rPr>
                 <w:rStyle w:val="Collegamentoipertestuale"/>
                 <w:noProof/>
               </w:rPr>
-              <w:t>6.15 Ruoli</w:t>
+              <w:t>6.15 Versione 1.6.1</w:t>
             </w:r>
             <w:r>
               <w:rPr>
@@ -3720,7 +3781,7 @@
               <w:rPr>
                 <w:noProof/>
               </w:rPr>
-              <w:instrText xml:space="preserve"> PAGEREF _Toc244259603 \h </w:instrText>
+              <w:instrText xml:space="preserve"> PAGEREF _Toc244264046 \h </w:instrText>
             </w:r>
             <w:r>
               <w:rPr>
@@ -3737,7 +3798,68 @@
               <w:rPr>
                 <w:noProof/>
               </w:rPr>
-              <w:t>33</w:t>
+              <w:t>34</w:t>
+            </w:r>
+            <w:r>
+              <w:rPr>
+                <w:noProof/>
+              </w:rPr>
+              <w:fldChar w:fldCharType="end"/>
+            </w:r>
+          </w:hyperlink>
+        </w:p>
+        <w:p>
+          <w:pPr>
+            <w:pStyle w:val="Sommario2"/>
+            <w:tabs>
+              <w:tab w:val="right" w:leader="dot" w:pos="9628"/>
+            </w:tabs>
+            <w:rPr>
+              <w:noProof/>
+            </w:rPr>
+          </w:pPr>
+          <w:hyperlink w:anchor="_Toc244264047" w:history="1">
+            <w:r>
+              <w:rPr>
+                <w:rStyle w:val="Collegamentoipertestuale"/>
+                <w:noProof/>
+              </w:rPr>
+              <w:t>6.16 Ruoli</w:t>
+            </w:r>
+            <w:r>
+              <w:rPr>
+                <w:noProof/>
+              </w:rPr>
+              <w:tab/>
+            </w:r>
+            <w:r>
+              <w:rPr>
+                <w:noProof/>
+              </w:rPr>
+              <w:fldChar w:fldCharType="begin"/>
+            </w:r>
+            <w:r>
+              <w:rPr>
+                <w:noProof/>
+              </w:rPr>
+              <w:instrText xml:space="preserve"> PAGEREF _Toc244264047 \h </w:instrText>
+            </w:r>
+            <w:r>
+              <w:rPr>
+                <w:noProof/>
+              </w:rPr>
+            </w:r>
+            <w:r>
+              <w:rPr>
+                <w:noProof/>
+              </w:rPr>
+              <w:fldChar w:fldCharType="separate"/>
+            </w:r>
+            <w:r>
+              <w:rPr>
+                <w:noProof/>
+              </w:rPr>
+              <w:t>34</w:t>
             </w:r>
             <w:r>
               <w:rPr>
@@ -3757,7 +3879,7 @@
               <w:noProof/>
             </w:rPr>
           </w:pPr>
-          <w:hyperlink w:anchor="_Toc244259604" w:history="1">
+          <w:hyperlink w:anchor="_Toc244264048" w:history="1">
             <w:r>
               <w:rPr>
                 <w:rStyle w:val="Collegamentoipertestuale"/>
@@ -3781,7 +3903,7 @@
               <w:rPr>
                 <w:noProof/>
               </w:rPr>
-              <w:instrText xml:space="preserve"> PAGEREF _Toc244259604 \h </w:instrText>
+              <w:instrText xml:space="preserve"> PAGEREF _Toc244264048 \h </w:instrText>
             </w:r>
             <w:r>
               <w:rPr>
@@ -3798,7 +3920,7 @@
               <w:rPr>
                 <w:noProof/>
               </w:rPr>
-              <w:t>33</w:t>
+              <w:t>34</w:t>
             </w:r>
             <w:r>
               <w:rPr>
@@ -3818,7 +3940,7 @@
               <w:noProof/>
             </w:rPr>
           </w:pPr>
-          <w:hyperlink w:anchor="_Toc244259605" w:history="1">
+          <w:hyperlink w:anchor="_Toc244264049" w:history="1">
             <w:r>
               <w:rPr>
                 <w:rStyle w:val="Collegamentoipertestuale"/>
@@ -3842,7 +3964,7 @@
               <w:rPr>
                 <w:noProof/>
               </w:rPr>
-              <w:instrText xml:space="preserve"> PAGEREF _Toc244259605 \h </w:instrText>
+              <w:instrText xml:space="preserve"> PAGEREF _Toc244264049 \h </w:instrText>
             </w:r>
             <w:r>
               <w:rPr>
@@ -3859,7 +3981,7 @@
               <w:rPr>
                 <w:noProof/>
               </w:rPr>
-              <w:t>33</w:t>
+              <w:t>34</w:t>
             </w:r>
             <w:r>
               <w:rPr>
@@ -3879,7 +4001,7 @@
               <w:noProof/>
             </w:rPr>
           </w:pPr>
-          <w:hyperlink w:anchor="_Toc244259606" w:history="1">
+          <w:hyperlink w:anchor="_Toc244264050" w:history="1">
             <w:r>
               <w:rPr>
                 <w:rStyle w:val="Collegamentoipertestuale"/>
@@ -3903,7 +4025,7 @@
               <w:rPr>
                 <w:noProof/>
               </w:rPr>
-              <w:instrText xml:space="preserve"> PAGEREF _Toc244259606 \h </w:instrText>
+              <w:instrText xml:space="preserve"> PAGEREF _Toc244264050 \h </w:instrText>
             </w:r>
             <w:r>
               <w:rPr>
@@ -3920,7 +4042,7 @@
               <w:rPr>
                 <w:noProof/>
               </w:rPr>
-              <w:t>34</w:t>
+              <w:t>35</w:t>
             </w:r>
             <w:r>
               <w:rPr>
@@ -3940,7 +4062,7 @@
               <w:noProof/>
             </w:rPr>
           </w:pPr>
-          <w:hyperlink w:anchor="_Toc244259607" w:history="1">
+          <w:hyperlink w:anchor="_Toc244264051" w:history="1">
             <w:r>
               <w:rPr>
                 <w:rStyle w:val="Collegamentoipertestuale"/>
@@ -3964,7 +4086,7 @@
               <w:rPr>
                 <w:noProof/>
               </w:rPr>
-              <w:instrText xml:space="preserve"> PAGEREF _Toc244259607 \h </w:instrText>
+              <w:instrText xml:space="preserve"> PAGEREF _Toc244264051 \h </w:instrText>
             </w:r>
             <w:r>
               <w:rPr>
@@ -3981,7 +4103,7 @@
               <w:rPr>
                 <w:noProof/>
               </w:rPr>
-              <w:t>34</w:t>
+              <w:t>35</w:t>
             </w:r>
             <w:r>
               <w:rPr>
@@ -4001,7 +4123,7 @@
               <w:noProof/>
             </w:rPr>
           </w:pPr>
-          <w:hyperlink w:anchor="_Toc244259608" w:history="1">
+          <w:hyperlink w:anchor="_Toc244264052" w:history="1">
             <w:r>
               <w:rPr>
                 <w:rStyle w:val="Collegamentoipertestuale"/>
@@ -4025,7 +4147,7 @@
               <w:rPr>
                 <w:noProof/>
               </w:rPr>
-              <w:instrText xml:space="preserve"> PAGEREF _Toc244259608 \h </w:instrText>
+              <w:instrText xml:space="preserve"> PAGEREF _Toc244264052 \h </w:instrText>
             </w:r>
             <w:r>
               <w:rPr>
@@ -4042,7 +4164,7 @@
               <w:rPr>
                 <w:noProof/>
               </w:rPr>
-              <w:t>34</w:t>
+              <w:t>35</w:t>
             </w:r>
             <w:r>
               <w:rPr>
@@ -4062,7 +4184,7 @@
               <w:noProof/>
             </w:rPr>
           </w:pPr>
-          <w:hyperlink w:anchor="_Toc244259609" w:history="1">
+          <w:hyperlink w:anchor="_Toc244264053" w:history="1">
             <w:r>
               <w:rPr>
                 <w:rStyle w:val="Collegamentoipertestuale"/>
@@ -4086,7 +4208,7 @@
               <w:rPr>
                 <w:noProof/>
               </w:rPr>
-              <w:instrText xml:space="preserve"> PAGEREF _Toc244259609 \h </w:instrText>
+              <w:instrText xml:space="preserve"> PAGEREF _Toc244264053 \h </w:instrText>
             </w:r>
             <w:r>
               <w:rPr>
@@ -4103,7 +4225,7 @@
               <w:rPr>
                 <w:noProof/>
               </w:rPr>
-              <w:t>34</w:t>
+              <w:t>36</w:t>
             </w:r>
             <w:r>
               <w:rPr>
@@ -4123,7 +4245,7 @@
               <w:noProof/>
             </w:rPr>
           </w:pPr>
-          <w:hyperlink w:anchor="_Toc244259610" w:history="1">
+          <w:hyperlink w:anchor="_Toc244264054" w:history="1">
             <w:r>
               <w:rPr>
                 <w:rStyle w:val="Collegamentoipertestuale"/>
@@ -4147,7 +4269,7 @@
               <w:rPr>
                 <w:noProof/>
               </w:rPr>
-              <w:instrText xml:space="preserve"> PAGEREF _Toc244259610 \h </w:instrText>
+              <w:instrText xml:space="preserve"> PAGEREF _Toc244264054 \h </w:instrText>
             </w:r>
             <w:r>
               <w:rPr>
@@ -4164,7 +4286,7 @@
               <w:rPr>
                 <w:noProof/>
               </w:rPr>
-              <w:t>36</w:t>
+              <w:t>37</w:t>
             </w:r>
             <w:r>
               <w:rPr>
@@ -4190,7 +4312,7 @@
       <w:pPr>
         <w:pStyle w:val="Titolo1"/>
       </w:pPr>
-      <w:bookmarkStart w:id="0" w:name="_Toc244259545"/>
+      <w:bookmarkStart w:id="0" w:name="_Toc244263987"/>
       <w:r>
         <w:t>1. In breve</w:t>
       </w:r>
@@ -4435,30 +4557,20 @@
           <w:b/>
           <w:bCs/>
         </w:rPr>
-        <w:t>versione 1.6.0</w:t>
-      </w:r>
-      <w:r>
-        <w:t xml:space="preserve"> (30 ottobre): </w:t>
+        <w:t>versione 1.6.1</w:t>
+      </w:r>
+      <w:r>
+        <w:t xml:space="preserve"> (30 ottobre): il sito degli aggiornamenti è sul dominio dell'autore </w:t>
       </w:r>
       <w:r>
         <w:rPr>
           <w:b/>
           <w:bCs/>
         </w:rPr>
-        <w:t>più semplice</w:t>
-      </w:r>
-      <w:r>
-        <w:t xml:space="preserve"> — schermata «Cosa vuoi fare?», modalità Semplice a sei pulsanti, guide 1-2-3 al primo uso, </w:t>
-      </w:r>
-      <w:r>
-        <w:rPr>
-          <w:b/>
-          <w:bCs/>
-        </w:rPr>
-        <w:t>niente più «Applica»</w:t>
-      </w:r>
-      <w:r>
-        <w:t xml:space="preserve"> e parole semplici (vedi 4.16-4.20);</w:t>
+        <w:t>https://pdfz.agjin.com/</w:t>
+      </w:r>
+      <w:r>
+        <w:t xml:space="preserve"> (vedi 4.10);</w:t>
       </w:r>
     </w:p>
     <w:p>
@@ -4475,50 +4587,30 @@
           <w:b/>
           <w:bCs/>
         </w:rPr>
-        <w:t>versione 1.5.0</w:t>
-      </w:r>
-      <w:r>
-        <w:t xml:space="preserve"> (30 ottobre): firme, timbri e testi già applicati </w:t>
+        <w:t>versione 1.6.0</w:t>
+      </w:r>
+      <w:r>
+        <w:t xml:space="preserve"> (30 ottobre): </w:t>
       </w:r>
       <w:r>
         <w:rPr>
           <w:b/>
           <w:bCs/>
         </w:rPr>
-        <w:t>si spostano</w:t>
-      </w:r>
-      <w:r>
-        <w:t xml:space="preserve">; </w:t>
+        <w:t>più semplice</w:t>
+      </w:r>
+      <w:r>
+        <w:t xml:space="preserve"> — schermata «Cosa vuoi fare?», modalità Semplice a sei pulsanti, guide 1-2-3 al primo uso, </w:t>
       </w:r>
       <w:r>
         <w:rPr>
           <w:b/>
           <w:bCs/>
         </w:rPr>
-        <w:t>due pagine affiancate</w:t>
-      </w:r>
-      <w:r>
-        <w:t xml:space="preserve">, </w:t>
-      </w:r>
-      <w:r>
-        <w:rPr>
-          <w:b/>
-          <w:bCs/>
-        </w:rPr>
-        <w:t>lettura a libro</w:t>
-      </w:r>
-      <w:r>
-        <w:t xml:space="preserve"> e </w:t>
-      </w:r>
-      <w:r>
-        <w:rPr>
-          <w:b/>
-          <w:bCs/>
-        </w:rPr>
-        <w:t>presentazione a schermo intero con Ctrl+L</w:t>
-      </w:r>
-      <w:r>
-        <w:t>; immagini diritte sulle pagine ruotate (vedi 4.13-4.15). In fondo, al capitolo 10, un'analisi della facilità d'uso con 5 proposte;</w:t>
+        <w:t>niente più «Applica»</w:t>
+      </w:r>
+      <w:r>
+        <w:t xml:space="preserve"> e parole semplici (vedi 4.16-4.20);</w:t>
       </w:r>
     </w:p>
     <w:p>
@@ -4535,40 +4627,50 @@
           <w:b/>
           <w:bCs/>
         </w:rPr>
-        <w:t>versione 1.4.0</w:t>
-      </w:r>
-      <w:r>
-        <w:t xml:space="preserve"> (24 ottobre): </w:t>
+        <w:t>versione 1.5.0</w:t>
+      </w:r>
+      <w:r>
+        <w:t xml:space="preserve"> (30 ottobre): firme, timbri e testi già applicati </w:t>
       </w:r>
       <w:r>
         <w:rPr>
           <w:b/>
           <w:bCs/>
         </w:rPr>
-        <w:t>firme, timbri, testi aggiunti, filigrane e numeri di pagina si eliminano anche dopo averli applicati</w:t>
-      </w:r>
-      <w:r>
-        <w:t xml:space="preserve">, le firme digitali una per volta; sul telefono </w:t>
+        <w:t>si spostano</w:t>
+      </w:r>
+      <w:r>
+        <w:t xml:space="preserve">; </w:t>
       </w:r>
       <w:r>
         <w:rPr>
           <w:b/>
           <w:bCs/>
         </w:rPr>
-        <w:t>pannello degli strumenti ingrandibile</w:t>
-      </w:r>
-      <w:r>
-        <w:t xml:space="preserve"> e </w:t>
+        <w:t>due pagine affiancate</w:t>
+      </w:r>
+      <w:r>
+        <w:t xml:space="preserve">, </w:t>
       </w:r>
       <w:r>
         <w:rPr>
           <w:b/>
           <w:bCs/>
         </w:rPr>
-        <w:t>caselle di testo più grandi</w:t>
-      </w:r>
-      <w:r>
-        <w:t xml:space="preserve"> (vedi 4.11 e 4.12);</w:t>
+        <w:t>lettura a libro</w:t>
+      </w:r>
+      <w:r>
+        <w:t xml:space="preserve"> e </w:t>
+      </w:r>
+      <w:r>
+        <w:rPr>
+          <w:b/>
+          <w:bCs/>
+        </w:rPr>
+        <w:t>presentazione a schermo intero con Ctrl+L</w:t>
+      </w:r>
+      <w:r>
+        <w:t>; immagini diritte sulle pagine ruotate (vedi 4.13-4.15). In fondo, al capitolo 10, un'analisi della facilità d'uso con 5 proposte;</w:t>
       </w:r>
     </w:p>
     <w:p>
@@ -4585,6 +4687,56 @@
           <w:b/>
           <w:bCs/>
         </w:rPr>
+        <w:t>versione 1.4.0</w:t>
+      </w:r>
+      <w:r>
+        <w:t xml:space="preserve"> (24 ottobre): </w:t>
+      </w:r>
+      <w:r>
+        <w:rPr>
+          <w:b/>
+          <w:bCs/>
+        </w:rPr>
+        <w:t>firme, timbri, testi aggiunti, filigrane e numeri di pagina si eliminano anche dopo averli applicati</w:t>
+      </w:r>
+      <w:r>
+        <w:t xml:space="preserve">, le firme digitali una per volta; sul telefono </w:t>
+      </w:r>
+      <w:r>
+        <w:rPr>
+          <w:b/>
+          <w:bCs/>
+        </w:rPr>
+        <w:t>pannello degli strumenti ingrandibile</w:t>
+      </w:r>
+      <w:r>
+        <w:t xml:space="preserve"> e </w:t>
+      </w:r>
+      <w:r>
+        <w:rPr>
+          <w:b/>
+          <w:bCs/>
+        </w:rPr>
+        <w:t>caselle di testo più grandi</w:t>
+      </w:r>
+      <w:r>
+        <w:t xml:space="preserve"> (vedi 4.11 e 4.12);</w:t>
+      </w:r>
+    </w:p>
+    <w:p>
+      <w:pPr>
+        <w:pStyle w:val="Paragrafoelenco"/>
+        <w:numPr>
+          <w:ilvl w:val="0"/>
+          <w:numId w:val="2"/>
+        </w:numPr>
+        <w:spacing w:after="60"/>
+      </w:pPr>
+      <w:r>
+        <w:rPr>
+          <w:b/>
+          <w:bCs/>
+        </w:rPr>
         <w:t>versione 1.2.0</w:t>
       </w:r>
       <w:r>
@@ -4631,7 +4783,7 @@
       <w:pPr>
         <w:pStyle w:val="Titolo1"/>
       </w:pPr>
-      <w:bookmarkStart w:id="1" w:name="_Toc244259546"/>
+      <w:bookmarkStart w:id="1" w:name="_Toc244263988"/>
       <w:r>
         <w:t>2. Nuovo marchio</w:t>
       </w:r>
@@ -4641,7 +4793,7 @@
       <w:pPr>
         <w:pStyle w:val="Titolo2"/>
       </w:pPr>
-      <w:bookmarkStart w:id="2" w:name="_Toc244259547"/>
+      <w:bookmarkStart w:id="2" w:name="_Toc244263989"/>
       <w:r>
         <w:t>2.1 Nomi e identificativi</w:t>
       </w:r>
@@ -5187,7 +5339,7 @@
       <w:pPr>
         <w:pStyle w:val="Titolo2"/>
       </w:pPr>
-      <w:bookmarkStart w:id="3" w:name="_Toc244259548"/>
+      <w:bookmarkStart w:id="3" w:name="_Toc244263990"/>
       <w:r>
         <w:t>2.2 Colori</w:t>
       </w:r>
@@ -5582,7 +5734,7 @@
       <w:pPr>
         <w:pStyle w:val="Titolo2"/>
       </w:pPr>
-      <w:bookmarkStart w:id="4" w:name="_Toc244259549"/>
+      <w:bookmarkStart w:id="4" w:name="_Toc244263991"/>
       <w:r>
         <w:t>2.3 Icona in uso: 24 «Foglio senza fondo» (serie 6, 22 ottobre)</w:t>
       </w:r>
@@ -5616,7 +5768,7 @@
           <w:noProof/>
         </w:rPr>
         <w:drawing>
-          <wp:inline distT="0" distB="0" distL="0" distR="0" wp14:anchorId="39911691" wp14:editId="0E1B90A5">
+          <wp:inline distT="0" distB="0" distL="0" distR="0" wp14:anchorId="3AC8D6C1" wp14:editId="45E3733E">
             <wp:extent cx="3429000" cy="4000500"/>
             <wp:effectExtent l="0" t="0" r="0" b="0"/>
             <wp:docPr id="2" name="Immagine 2"/>
@@ -5675,7 +5827,7 @@
       <w:pPr>
         <w:pStyle w:val="Titolo2"/>
       </w:pPr>
-      <w:bookmarkStart w:id="5" w:name="_Toc244259550"/>
+      <w:bookmarkStart w:id="5" w:name="_Toc244263992"/>
       <w:r>
         <w:t>2.4 Serie 4: la 17 «Foglio oro», in uso fino al 21 ottobre</w:t>
       </w:r>
@@ -5709,7 +5861,7 @@
           <w:noProof/>
         </w:rPr>
         <w:drawing>
-          <wp:inline distT="0" distB="0" distL="0" distR="0" wp14:anchorId="5288C6DB" wp14:editId="6441B33F">
+          <wp:inline distT="0" distB="0" distL="0" distR="0" wp14:anchorId="41C8F627" wp14:editId="55980DD5">
             <wp:extent cx="5334000" cy="5895975"/>
             <wp:effectExtent l="0" t="0" r="0" b="0"/>
             <wp:docPr id="3" name="Immagine 3"/>
@@ -6122,7 +6274,7 @@
       <w:pPr>
         <w:pStyle w:val="Titolo2"/>
       </w:pPr>
-      <w:bookmarkStart w:id="6" w:name="_Toc244259551"/>
+      <w:bookmarkStart w:id="6" w:name="_Toc244263993"/>
       <w:r>
         <w:t>2.5 Serie 5: la 17 con più bianco, la 19 in uso il 21 ottobre</w:t>
       </w:r>
@@ -6156,7 +6308,7 @@
           <w:noProof/>
         </w:rPr>
         <w:drawing>
-          <wp:inline distT="0" distB="0" distL="0" distR="0" wp14:anchorId="4786631C" wp14:editId="0995003E">
+          <wp:inline distT="0" distB="0" distL="0" distR="0" wp14:anchorId="45579226" wp14:editId="4B8E999D">
             <wp:extent cx="5715000" cy="3295650"/>
             <wp:effectExtent l="0" t="0" r="0" b="0"/>
             <wp:docPr id="4" name="Immagine 4"/>
@@ -6703,7 +6855,7 @@
       <w:pPr>
         <w:pStyle w:val="Titolo2"/>
       </w:pPr>
-      <w:bookmarkStart w:id="7" w:name="_Toc244259552"/>
+      <w:bookmarkStart w:id="7" w:name="_Toc244263994"/>
       <w:r>
         <w:t>2.6 Serie 3, non scelta (la 11 è diventata la serie 4)</w:t>
       </w:r>
@@ -6727,7 +6879,7 @@
           <w:noProof/>
         </w:rPr>
         <w:drawing>
-          <wp:inline distT="0" distB="0" distL="0" distR="0" wp14:anchorId="3437008C" wp14:editId="3D1CD346">
+          <wp:inline distT="0" distB="0" distL="0" distR="0" wp14:anchorId="38A805C2" wp14:editId="20F1C8A2">
             <wp:extent cx="5905500" cy="4133850"/>
             <wp:effectExtent l="0" t="0" r="0" b="0"/>
             <wp:docPr id="5" name="Immagine 5"/>
@@ -7413,7 +7565,7 @@
       <w:pPr>
         <w:pStyle w:val="Titolo2"/>
       </w:pPr>
-      <w:bookmarkStart w:id="8" w:name="_Toc244259553"/>
+      <w:bookmarkStart w:id="8" w:name="_Toc244263995"/>
       <w:r>
         <w:t>2.7 Serie 2, non scelta</w:t>
       </w:r>
@@ -7437,7 +7589,7 @@
           <w:noProof/>
         </w:rPr>
         <w:drawing>
-          <wp:inline distT="0" distB="0" distL="0" distR="0" wp14:anchorId="15E20B29" wp14:editId="1BD2D87F">
+          <wp:inline distT="0" distB="0" distL="0" distR="0" wp14:anchorId="76AAAA91" wp14:editId="0C5E73F7">
             <wp:extent cx="5905500" cy="4133850"/>
             <wp:effectExtent l="0" t="0" r="0" b="0"/>
             <wp:docPr id="6" name="Immagine 6"/>
@@ -8157,7 +8309,7 @@
       <w:pPr>
         <w:pStyle w:val="Titolo2"/>
       </w:pPr>
-      <w:bookmarkStart w:id="9" w:name="_Toc244259554"/>
+      <w:bookmarkStart w:id="9" w:name="_Toc244263996"/>
       <w:r>
         <w:t>2.8 Serie 1, scartata</w:t>
       </w:r>
@@ -8181,7 +8333,7 @@
           <w:noProof/>
         </w:rPr>
         <w:drawing>
-          <wp:inline distT="0" distB="0" distL="0" distR="0" wp14:anchorId="02C8473F" wp14:editId="5861FDD3">
+          <wp:inline distT="0" distB="0" distL="0" distR="0" wp14:anchorId="1E9384CD" wp14:editId="1C5A7D8C">
             <wp:extent cx="4000500" cy="2800350"/>
             <wp:effectExtent l="0" t="0" r="0" b="0"/>
             <wp:docPr id="7" name="Immagine 7"/>
@@ -8240,7 +8392,7 @@
       <w:pPr>
         <w:pStyle w:val="Titolo2"/>
       </w:pPr>
-      <w:bookmarkStart w:id="10" w:name="_Toc244259555"/>
+      <w:bookmarkStart w:id="10" w:name="_Toc244263997"/>
       <w:r>
         <w:t>2.9 Verifica dei marchi registrati</w:t>
       </w:r>
@@ -8492,7 +8644,7 @@
       <w:pPr>
         <w:pStyle w:val="Titolo1"/>
       </w:pPr>
-      <w:bookmarkStart w:id="11" w:name="_Toc244259556"/>
+      <w:bookmarkStart w:id="11" w:name="_Toc244263998"/>
       <w:r>
         <w:t>3. Temi colore</w:t>
       </w:r>
@@ -8526,7 +8678,7 @@
           <w:noProof/>
         </w:rPr>
         <w:drawing>
-          <wp:inline distT="0" distB="0" distL="0" distR="0" wp14:anchorId="42535B80" wp14:editId="12EA11CC">
+          <wp:inline distT="0" distB="0" distL="0" distR="0" wp14:anchorId="568F2BDD" wp14:editId="4D92AC7A">
             <wp:extent cx="4572000" cy="3429000"/>
             <wp:effectExtent l="0" t="0" r="0" b="0"/>
             <wp:docPr id="8" name="Immagine 8"/>
@@ -9236,7 +9388,7 @@
       <w:pPr>
         <w:pStyle w:val="Titolo1"/>
       </w:pPr>
-      <w:bookmarkStart w:id="12" w:name="_Toc244259557"/>
+      <w:bookmarkStart w:id="12" w:name="_Toc244263999"/>
       <w:r>
         <w:t>4. Correzione: avvisi «come JavaScript»</w:t>
       </w:r>
@@ -9246,7 +9398,7 @@
       <w:pPr>
         <w:pStyle w:val="Titolo2"/>
       </w:pPr>
-      <w:bookmarkStart w:id="13" w:name="_Toc244259558"/>
+      <w:bookmarkStart w:id="13" w:name="_Toc244264000"/>
       <w:r>
         <w:t>4.1 Il problema</w:t>
       </w:r>
@@ -9649,7 +9801,7 @@
       <w:pPr>
         <w:pStyle w:val="Titolo2"/>
       </w:pPr>
-      <w:bookmarkStart w:id="14" w:name="_Toc244259559"/>
+      <w:bookmarkStart w:id="14" w:name="_Toc244264001"/>
       <w:r>
         <w:t>4.2 La soluzione</w:t>
       </w:r>
@@ -9782,7 +9934,7 @@
           <w:noProof/>
         </w:rPr>
         <w:drawing>
-          <wp:inline distT="0" distB="0" distL="0" distR="0" wp14:anchorId="38B97FD9" wp14:editId="3F6A7F46">
+          <wp:inline distT="0" distB="0" distL="0" distR="0" wp14:anchorId="0EEFB371" wp14:editId="1CC3B7D7">
             <wp:extent cx="4572000" cy="3429000"/>
             <wp:effectExtent l="0" t="0" r="0" b="0"/>
             <wp:docPr id="9" name="Immagine 9"/>
@@ -9841,7 +9993,7 @@
       <w:pPr>
         <w:pStyle w:val="Titolo2"/>
       </w:pPr>
-      <w:bookmarkStart w:id="15" w:name="_Toc244259560"/>
+      <w:bookmarkStart w:id="15" w:name="_Toc244264002"/>
       <w:r>
         <w:t>4.3 Verifiche</w:t>
       </w:r>
@@ -9888,7 +10040,7 @@
       <w:pPr>
         <w:pStyle w:val="Titolo2"/>
       </w:pPr>
-      <w:bookmarkStart w:id="16" w:name="_Toc244259561"/>
+      <w:bookmarkStart w:id="16" w:name="_Toc244264003"/>
       <w:r>
         <w:t>4.4 Android: menu Tema e notifiche (versione 1.0.1)</w:t>
       </w:r>
@@ -10223,7 +10375,7 @@
       <w:pPr>
         <w:pStyle w:val="Titolo2"/>
       </w:pPr>
-      <w:bookmarkStart w:id="17" w:name="_Toc244259562"/>
+      <w:bookmarkStart w:id="17" w:name="_Toc244264004"/>
       <w:r>
         <w:t>4.5 App più leggera: traduzione tolta</w:t>
       </w:r>
@@ -10656,7 +10808,7 @@
       <w:pPr>
         <w:pStyle w:val="Titolo2"/>
       </w:pPr>
-      <w:bookmarkStart w:id="18" w:name="_Toc244259563"/>
+      <w:bookmarkStart w:id="18" w:name="_Toc244264005"/>
       <w:r>
         <w:t>4.6 Schede in una nuova finestra</w:t>
       </w:r>
@@ -10774,7 +10926,7 @@
           <w:noProof/>
         </w:rPr>
         <w:drawing>
-          <wp:inline distT="0" distB="0" distL="0" distR="0" wp14:anchorId="73A1794B" wp14:editId="14B71C6C">
+          <wp:inline distT="0" distB="0" distL="0" distR="0" wp14:anchorId="1B707904" wp14:editId="44DF53FD">
             <wp:extent cx="5715000" cy="857250"/>
             <wp:effectExtent l="0" t="0" r="0" b="0"/>
             <wp:docPr id="10" name="Immagine 10"/>
@@ -11063,7 +11215,7 @@
       <w:pPr>
         <w:pStyle w:val="Titolo2"/>
       </w:pPr>
-      <w:bookmarkStart w:id="19" w:name="_Toc244259564"/>
+      <w:bookmarkStart w:id="19" w:name="_Toc244264006"/>
       <w:r>
         <w:t>4.7 Riunire le finestre</w:t>
       </w:r>
@@ -11165,7 +11317,7 @@
       <w:pPr>
         <w:pStyle w:val="Titolo2"/>
       </w:pPr>
-      <w:bookmarkStart w:id="20" w:name="_Toc244259565"/>
+      <w:bookmarkStart w:id="20" w:name="_Toc244264007"/>
       <w:r>
         <w:t>4.8 Correzioni di «Modifica testo»</w:t>
       </w:r>
@@ -11430,7 +11582,7 @@
           <w:noProof/>
         </w:rPr>
         <w:drawing>
-          <wp:inline distT="0" distB="0" distL="0" distR="0" wp14:anchorId="4FCA1D8C" wp14:editId="17DC542F">
+          <wp:inline distT="0" distB="0" distL="0" distR="0" wp14:anchorId="46A5D9F7" wp14:editId="63A7B664">
             <wp:extent cx="3286125" cy="2286000"/>
             <wp:effectExtent l="0" t="0" r="0" b="0"/>
             <wp:docPr id="11" name="Immagine 11"/>
@@ -11495,7 +11647,7 @@
           <w:noProof/>
         </w:rPr>
         <w:drawing>
-          <wp:inline distT="0" distB="0" distL="0" distR="0" wp14:anchorId="7A965E1F" wp14:editId="75A5BD4D">
+          <wp:inline distT="0" distB="0" distL="0" distR="0" wp14:anchorId="340CF61E" wp14:editId="704AA3EE">
             <wp:extent cx="3286125" cy="2286000"/>
             <wp:effectExtent l="0" t="0" r="0" b="0"/>
             <wp:docPr id="12" name="Immagine 12"/>
@@ -11562,7 +11714,7 @@
       <w:pPr>
         <w:pStyle w:val="Titolo2"/>
       </w:pPr>
-      <w:bookmarkStart w:id="21" w:name="_Toc244259566"/>
+      <w:bookmarkStart w:id="21" w:name="_Toc244264008"/>
       <w:r>
         <w:t>4.9 Web app per iPhone</w:t>
       </w:r>
@@ -12001,7 +12153,7 @@
       <w:pPr>
         <w:pStyle w:val="Titolo2"/>
       </w:pPr>
-      <w:bookmarkStart w:id="22" w:name="_Toc244259567"/>
+      <w:bookmarkStart w:id="22" w:name="_Toc244264009"/>
       <w:r>
         <w:t>4.10 Aggiornamenti su Cloudflare (repository privato)</w:t>
       </w:r>
@@ -12515,7 +12667,7 @@
       <w:pPr>
         <w:pStyle w:val="Titolo2"/>
       </w:pPr>
-      <w:bookmarkStart w:id="23" w:name="_Toc244259568"/>
+      <w:bookmarkStart w:id="23" w:name="_Toc244264010"/>
       <w:r>
         <w:t>4.11 Eliminare firme, timbri e testi già applicati (versione 1.4.0)</w:t>
       </w:r>
@@ -12846,7 +12998,7 @@
           <w:noProof/>
         </w:rPr>
         <w:drawing>
-          <wp:inline distT="0" distB="0" distL="0" distR="0" wp14:anchorId="725C1E7E" wp14:editId="530ABACA">
+          <wp:inline distT="0" distB="0" distL="0" distR="0" wp14:anchorId="7A7FC2CA" wp14:editId="1260BDCA">
             <wp:extent cx="2095500" cy="4533900"/>
             <wp:effectExtent l="0" t="0" r="0" b="0"/>
             <wp:docPr id="13" name="Immagine 13"/>
@@ -12943,7 +13095,7 @@
       <w:pPr>
         <w:pStyle w:val="Titolo2"/>
       </w:pPr>
-      <w:bookmarkStart w:id="24" w:name="_Toc244259569"/>
+      <w:bookmarkStart w:id="24" w:name="_Toc244264011"/>
       <w:r>
         <w:t>4.12 Telefono: pannello più grande e caselle di testo comode (versione 1.4.0)</w:t>
       </w:r>
@@ -13011,7 +13163,7 @@
           <w:noProof/>
         </w:rPr>
         <w:drawing>
-          <wp:inline distT="0" distB="0" distL="0" distR="0" wp14:anchorId="5DACAA54" wp14:editId="440F3547">
+          <wp:inline distT="0" distB="0" distL="0" distR="0" wp14:anchorId="245DB258" wp14:editId="398FAA25">
             <wp:extent cx="2095500" cy="4533900"/>
             <wp:effectExtent l="0" t="0" r="0" b="0"/>
             <wp:docPr id="14" name="Immagine 14"/>
@@ -13076,7 +13228,7 @@
           <w:noProof/>
         </w:rPr>
         <w:drawing>
-          <wp:inline distT="0" distB="0" distL="0" distR="0" wp14:anchorId="167BB9B1" wp14:editId="238F6710">
+          <wp:inline distT="0" distB="0" distL="0" distR="0" wp14:anchorId="577F0E8E" wp14:editId="405E3182">
             <wp:extent cx="2095500" cy="4533900"/>
             <wp:effectExtent l="0" t="0" r="0" b="0"/>
             <wp:docPr id="15" name="Immagine 15"/>
@@ -13135,7 +13287,7 @@
       <w:pPr>
         <w:pStyle w:val="Titolo2"/>
       </w:pPr>
-      <w:bookmarkStart w:id="25" w:name="_Toc244259570"/>
+      <w:bookmarkStart w:id="25" w:name="_Toc244264012"/>
       <w:r>
         <w:t>4.13 Spostare firme, timbri e testi già applicati (versione 1.5.0)</w:t>
       </w:r>
@@ -13187,7 +13339,7 @@
           <w:noProof/>
         </w:rPr>
         <w:drawing>
-          <wp:inline distT="0" distB="0" distL="0" distR="0" wp14:anchorId="4F718749" wp14:editId="515FD762">
+          <wp:inline distT="0" distB="0" distL="0" distR="0" wp14:anchorId="789E0C7C" wp14:editId="6251DD17">
             <wp:extent cx="4953000" cy="3095625"/>
             <wp:effectExtent l="0" t="0" r="0" b="0"/>
             <wp:docPr id="16" name="Immagine 16"/>
@@ -13246,7 +13398,7 @@
       <w:pPr>
         <w:pStyle w:val="Titolo2"/>
       </w:pPr>
-      <w:bookmarkStart w:id="26" w:name="_Toc244259571"/>
+      <w:bookmarkStart w:id="26" w:name="_Toc244264013"/>
       <w:r>
         <w:t>4.14 Modi di lettura e presentazione (versione 1.5.0)</w:t>
       </w:r>
@@ -13383,7 +13535,7 @@
           <w:noProof/>
         </w:rPr>
         <w:drawing>
-          <wp:inline distT="0" distB="0" distL="0" distR="0" wp14:anchorId="64D6989A" wp14:editId="17A92929">
+          <wp:inline distT="0" distB="0" distL="0" distR="0" wp14:anchorId="799BB8DB" wp14:editId="660FB346">
             <wp:extent cx="4953000" cy="3095625"/>
             <wp:effectExtent l="0" t="0" r="0" b="0"/>
             <wp:docPr id="17" name="Immagine 17"/>
@@ -13448,7 +13600,7 @@
           <w:noProof/>
         </w:rPr>
         <w:drawing>
-          <wp:inline distT="0" distB="0" distL="0" distR="0" wp14:anchorId="4F9CBBDF" wp14:editId="4AE039C5">
+          <wp:inline distT="0" distB="0" distL="0" distR="0" wp14:anchorId="035D7F3E" wp14:editId="34E715D6">
             <wp:extent cx="1905000" cy="4124325"/>
             <wp:effectExtent l="0" t="0" r="0" b="0"/>
             <wp:docPr id="18" name="Immagine 18"/>
@@ -13507,7 +13659,7 @@
       <w:pPr>
         <w:pStyle w:val="Titolo2"/>
       </w:pPr>
-      <w:bookmarkStart w:id="27" w:name="_Toc244259572"/>
+      <w:bookmarkStart w:id="27" w:name="_Toc244264014"/>
       <w:r>
         <w:t>4.15 Correzione: immagini sulle pagine ruotate (versione 1.5.0)</w:t>
       </w:r>
@@ -13535,7 +13687,7 @@
       <w:pPr>
         <w:pStyle w:val="Titolo2"/>
       </w:pPr>
-      <w:bookmarkStart w:id="28" w:name="_Toc244259573"/>
+      <w:bookmarkStart w:id="28" w:name="_Toc244264015"/>
       <w:r>
         <w:t>4.16 Niente più «Applica» (versione 1.6.0)</w:t>
       </w:r>
@@ -13579,7 +13731,7 @@
           <w:noProof/>
         </w:rPr>
         <w:drawing>
-          <wp:inline distT="0" distB="0" distL="0" distR="0" wp14:anchorId="171519A7" wp14:editId="1F85E267">
+          <wp:inline distT="0" distB="0" distL="0" distR="0" wp14:anchorId="203D81F2" wp14:editId="72AED42A">
             <wp:extent cx="4953000" cy="3095625"/>
             <wp:effectExtent l="0" t="0" r="0" b="0"/>
             <wp:docPr id="19" name="Immagine 19"/>
@@ -13638,7 +13790,7 @@
       <w:pPr>
         <w:pStyle w:val="Titolo2"/>
       </w:pPr>
-      <w:bookmarkStart w:id="29" w:name="_Toc244259574"/>
+      <w:bookmarkStart w:id="29" w:name="_Toc244264016"/>
       <w:r>
         <w:t>4.17 Schermata «Cosa vuoi fare?» (versione 1.6.0)</w:t>
       </w:r>
@@ -13672,7 +13824,7 @@
           <w:noProof/>
         </w:rPr>
         <w:drawing>
-          <wp:inline distT="0" distB="0" distL="0" distR="0" wp14:anchorId="6E4B4EE0" wp14:editId="5A1DCFD3">
+          <wp:inline distT="0" distB="0" distL="0" distR="0" wp14:anchorId="380E3264" wp14:editId="13AFE5CC">
             <wp:extent cx="4953000" cy="3095625"/>
             <wp:effectExtent l="0" t="0" r="0" b="0"/>
             <wp:docPr id="20" name="Immagine 20"/>
@@ -13731,7 +13883,7 @@
       <w:pPr>
         <w:pStyle w:val="Titolo2"/>
       </w:pPr>
-      <w:bookmarkStart w:id="30" w:name="_Toc244259575"/>
+      <w:bookmarkStart w:id="30" w:name="_Toc244264017"/>
       <w:r>
         <w:t>4.18 Modalità Semplice e Completa (versione 1.6.0)</w:t>
       </w:r>
@@ -13775,7 +13927,7 @@
           <w:noProof/>
         </w:rPr>
         <w:drawing>
-          <wp:inline distT="0" distB="0" distL="0" distR="0" wp14:anchorId="44BAB395" wp14:editId="4988447A">
+          <wp:inline distT="0" distB="0" distL="0" distR="0" wp14:anchorId="5E0F70D0" wp14:editId="1167D420">
             <wp:extent cx="1905000" cy="4124325"/>
             <wp:effectExtent l="0" t="0" r="0" b="0"/>
             <wp:docPr id="21" name="Immagine 21"/>
@@ -13834,7 +13986,7 @@
       <w:pPr>
         <w:pStyle w:val="Titolo2"/>
       </w:pPr>
-      <w:bookmarkStart w:id="31" w:name="_Toc244259576"/>
+      <w:bookmarkStart w:id="31" w:name="_Toc244264018"/>
       <w:r>
         <w:t>4.19 Guide 1-2-3 (versione 1.6.0)</w:t>
       </w:r>
@@ -13858,7 +14010,7 @@
           <w:noProof/>
         </w:rPr>
         <w:drawing>
-          <wp:inline distT="0" distB="0" distL="0" distR="0" wp14:anchorId="0BB7E500" wp14:editId="28D8DAF6">
+          <wp:inline distT="0" distB="0" distL="0" distR="0" wp14:anchorId="57418D11" wp14:editId="08CD9CEC">
             <wp:extent cx="4953000" cy="3095625"/>
             <wp:effectExtent l="0" t="0" r="0" b="0"/>
             <wp:docPr id="22" name="Immagine 22"/>
@@ -13923,7 +14075,7 @@
           <w:noProof/>
         </w:rPr>
         <w:drawing>
-          <wp:inline distT="0" distB="0" distL="0" distR="0" wp14:anchorId="2254DE6B" wp14:editId="2CE57A8D">
+          <wp:inline distT="0" distB="0" distL="0" distR="0" wp14:anchorId="5309B1BF" wp14:editId="35F4C614">
             <wp:extent cx="1905000" cy="4124325"/>
             <wp:effectExtent l="0" t="0" r="0" b="0"/>
             <wp:docPr id="23" name="Immagine 23"/>
@@ -13982,7 +14134,7 @@
       <w:pPr>
         <w:pStyle w:val="Titolo2"/>
       </w:pPr>
-      <w:bookmarkStart w:id="32" w:name="_Toc244259577"/>
+      <w:bookmarkStart w:id="32" w:name="_Toc244264019"/>
       <w:r>
         <w:t>4.20 Parole semplici e piccoli difetti (versione 1.6.0)</w:t>
       </w:r>
@@ -13998,13 +14150,78 @@
     </w:p>
     <w:p>
       <w:pPr>
+        <w:pStyle w:val="Titolo2"/>
+      </w:pPr>
+      <w:bookmarkStart w:id="33" w:name="_Toc244264020"/>
+      <w:r>
+        <w:t>4.21 Dominio dell'autore: pdfz.agjin.com (versione 1.6.1)</w:t>
+      </w:r>
+      <w:bookmarkEnd w:id="33"/>
+    </w:p>
+    <w:p>
+      <w:pPr>
+        <w:spacing w:after="120"/>
+      </w:pPr>
+      <w:r>
+        <w:t xml:space="preserve">L'autore ha aggiunto al progetto Cloudflare Pages il suo dominio </w:t>
+      </w:r>
+      <w:r>
+        <w:rPr>
+          <w:b/>
+          <w:bCs/>
+        </w:rPr>
+        <w:t>pdfz.agjin.com</w:t>
+      </w:r>
+      <w:r>
+        <w:t xml:space="preserve"> e ha cambiato </w:t>
+      </w:r>
+      <w:r>
+        <w:rPr>
+          <w:rFonts w:ascii="Consolas" w:eastAsia="Consolas" w:hAnsi="Consolas" w:cs="Consolas"/>
+          <w:sz w:val="19"/>
+          <w:szCs w:val="19"/>
+        </w:rPr>
+        <w:t>UPDATE_BASE_URL</w:t>
+      </w:r>
+      <w:r>
+        <w:t xml:space="preserve">. Dalla 1.6.1 le app cercano gli aggiornamenti e scaricano da lì; la web app per iPhone e iPad è su https://pdfz.agjin.com/app/. Il vecchio indirizzo pdfz.pages.dev </w:t>
+      </w:r>
+      <w:r>
+        <w:rPr>
+          <w:b/>
+          <w:bCs/>
+        </w:rPr>
+        <w:t>resta attivo</w:t>
+      </w:r>
+      <w:r>
+        <w:t xml:space="preserve"> (stessi file) per le app già installate, che lo usano ancora. Corretto anche il pulsante della web app nella pagina, che da iPhone e iPad apriva il vecchio indirizzo: ora i link della pagina restano sull'indirizzo da cui la si apre.</w:t>
+      </w:r>
+    </w:p>
+    <w:p>
+      <w:pPr>
+        <w:pBdr>
+          <w:left w:val="single" w:sz="18" w:space="6" w:color="C9A227"/>
+        </w:pBdr>
+        <w:shd w:val="clear" w:color="auto" w:fill="FBF3DA"/>
+        <w:spacing w:before="80" w:after="160"/>
+        <w:ind w:left="120" w:right="120"/>
+      </w:pPr>
+      <w:r>
+        <w:rPr>
+          <w:color w:val="3B3632"/>
+        </w:rPr>
+        <w:t>Web app per iPhone: firme salvate e impostazioni sono legate all'indirizzo. Chi l'ha già sulla Home da pdfz.pages.dev può continuare a usarla; passando a pdfz.agjin.com va riaggiunta alla Home e le firme salvate vanno rifatte.</w:t>
+      </w:r>
+    </w:p>
+    <w:p>
+      <w:pPr>
         <w:pStyle w:val="Titolo1"/>
       </w:pPr>
-      <w:bookmarkStart w:id="33" w:name="_Toc244259578"/>
+      <w:bookmarkStart w:id="34" w:name="_Toc244264021"/>
       <w:r>
         <w:t>5. Decisioni</w:t>
       </w:r>
-      <w:bookmarkEnd w:id="33"/>
+      <w:bookmarkEnd w:id="34"/>
     </w:p>
     <w:p>
       <w:pPr>
@@ -14018,11 +14235,11 @@
       <w:pPr>
         <w:pStyle w:val="Titolo2"/>
       </w:pPr>
-      <w:bookmarkStart w:id="34" w:name="_Toc244259579"/>
+      <w:bookmarkStart w:id="35" w:name="_Toc244264022"/>
       <w:r>
         <w:t>5.1 Canale degli aggiornamenti</w:t>
       </w:r>
-      <w:bookmarkEnd w:id="34"/>
+      <w:bookmarkEnd w:id="35"/>
     </w:p>
     <w:p>
       <w:pPr>
@@ -14525,11 +14742,11 @@
       <w:pPr>
         <w:pStyle w:val="Titolo2"/>
       </w:pPr>
-      <w:bookmarkStart w:id="35" w:name="_Toc244259580"/>
+      <w:bookmarkStart w:id="36" w:name="_Toc244264023"/>
       <w:r>
         <w:t>5.2 Storia del repository</w:t>
       </w:r>
-      <w:bookmarkEnd w:id="35"/>
+      <w:bookmarkEnd w:id="36"/>
     </w:p>
     <w:p>
       <w:pPr>
@@ -15032,11 +15249,11 @@
       <w:pPr>
         <w:pStyle w:val="Titolo2"/>
       </w:pPr>
-      <w:bookmarkStart w:id="36" w:name="_Toc244259581"/>
+      <w:bookmarkStart w:id="37" w:name="_Toc244264024"/>
       <w:r>
         <w:t>5.3 Identificativi del prodotto</w:t>
       </w:r>
-      <w:bookmarkEnd w:id="36"/>
+      <w:bookmarkEnd w:id="37"/>
     </w:p>
     <w:p>
       <w:pPr>
@@ -15532,11 +15749,11 @@
       <w:pPr>
         <w:pStyle w:val="Titolo2"/>
       </w:pPr>
-      <w:bookmarkStart w:id="37" w:name="_Toc244259582"/>
+      <w:bookmarkStart w:id="38" w:name="_Toc244264025"/>
       <w:r>
         <w:t>5.4 Avvisi e domande</w:t>
       </w:r>
-      <w:bookmarkEnd w:id="37"/>
+      <w:bookmarkEnd w:id="38"/>
     </w:p>
     <w:p>
       <w:pPr>
@@ -16039,11 +16256,11 @@
       <w:pPr>
         <w:pStyle w:val="Titolo2"/>
       </w:pPr>
-      <w:bookmarkStart w:id="38" w:name="_Toc244259583"/>
+      <w:bookmarkStart w:id="39" w:name="_Toc244264026"/>
       <w:r>
         <w:t>5.5 Traduzione offline</w:t>
       </w:r>
-      <w:bookmarkEnd w:id="38"/>
+      <w:bookmarkEnd w:id="39"/>
     </w:p>
     <w:p>
       <w:pPr>
@@ -16546,11 +16763,11 @@
       <w:pPr>
         <w:pStyle w:val="Titolo2"/>
       </w:pPr>
-      <w:bookmarkStart w:id="39" w:name="_Toc244259584"/>
+      <w:bookmarkStart w:id="40" w:name="_Toc244264027"/>
       <w:r>
         <w:t>5.6 Passaggio della scheda alla nuova finestra</w:t>
       </w:r>
-      <w:bookmarkEnd w:id="39"/>
+      <w:bookmarkEnd w:id="40"/>
     </w:p>
     <w:p>
       <w:pPr>
@@ -17068,11 +17285,11 @@
       <w:pPr>
         <w:pStyle w:val="Titolo2"/>
       </w:pPr>
-      <w:bookmarkStart w:id="40" w:name="_Toc244259585"/>
+      <w:bookmarkStart w:id="41" w:name="_Toc244264028"/>
       <w:r>
         <w:t>5.7 Come si cancella la riga in «Modifica testo»</w:t>
       </w:r>
-      <w:bookmarkEnd w:id="40"/>
+      <w:bookmarkEnd w:id="41"/>
     </w:p>
     <w:p>
       <w:pPr>
@@ -17575,11 +17792,11 @@
       <w:pPr>
         <w:pStyle w:val="Titolo2"/>
       </w:pPr>
-      <w:bookmarkStart w:id="41" w:name="_Toc244259586"/>
+      <w:bookmarkStart w:id="42" w:name="_Toc244264029"/>
       <w:r>
         <w:t>5.9 Lettura a libro e presentazione</w:t>
       </w:r>
-      <w:bookmarkEnd w:id="41"/>
+      <w:bookmarkEnd w:id="42"/>
     </w:p>
     <w:p>
       <w:pPr>
@@ -18082,11 +18299,11 @@
       <w:pPr>
         <w:pStyle w:val="Titolo2"/>
       </w:pPr>
-      <w:bookmarkStart w:id="42" w:name="_Toc244259587"/>
+      <w:bookmarkStart w:id="43" w:name="_Toc244264030"/>
       <w:r>
         <w:t>5.8 Come si ritrovano firme e timbri applicati</w:t>
       </w:r>
-      <w:bookmarkEnd w:id="42"/>
+      <w:bookmarkEnd w:id="43"/>
     </w:p>
     <w:p>
       <w:pPr>
@@ -18619,21 +18836,21 @@
       <w:pPr>
         <w:pStyle w:val="Titolo1"/>
       </w:pPr>
-      <w:bookmarkStart w:id="43" w:name="_Toc244259588"/>
+      <w:bookmarkStart w:id="44" w:name="_Toc244264031"/>
       <w:r>
         <w:t>6. Come si lavora</w:t>
       </w:r>
-      <w:bookmarkEnd w:id="43"/>
+      <w:bookmarkEnd w:id="44"/>
     </w:p>
     <w:p>
       <w:pPr>
         <w:pStyle w:val="Titolo2"/>
       </w:pPr>
-      <w:bookmarkStart w:id="44" w:name="_Toc244259589"/>
+      <w:bookmarkStart w:id="45" w:name="_Toc244264032"/>
       <w:r>
         <w:t>6.1 Comandi</w:t>
       </w:r>
-      <w:bookmarkEnd w:id="44"/>
+      <w:bookmarkEnd w:id="45"/>
     </w:p>
     <w:p>
       <w:pPr>
@@ -18699,11 +18916,11 @@
       <w:pPr>
         <w:pStyle w:val="Titolo2"/>
       </w:pPr>
-      <w:bookmarkStart w:id="45" w:name="_Toc244259590"/>
+      <w:bookmarkStart w:id="46" w:name="_Toc244264033"/>
       <w:r>
         <w:t>6.2 Pubblicare una versione</w:t>
       </w:r>
-      <w:bookmarkEnd w:id="45"/>
+      <w:bookmarkEnd w:id="46"/>
     </w:p>
     <w:p>
       <w:pPr>
@@ -18827,11 +19044,11 @@
       <w:pPr>
         <w:pStyle w:val="Titolo2"/>
       </w:pPr>
-      <w:bookmarkStart w:id="46" w:name="_Toc244259591"/>
+      <w:bookmarkStart w:id="47" w:name="_Toc244264034"/>
       <w:r>
         <w:t>6.3 Release 1.0.0 (pubblicata il 16 ottobre 2026)</w:t>
       </w:r>
-      <w:bookmarkEnd w:id="46"/>
+      <w:bookmarkEnd w:id="47"/>
     </w:p>
     <w:p>
       <w:pPr>
@@ -19554,11 +19771,11 @@
       <w:pPr>
         <w:pStyle w:val="Titolo2"/>
       </w:pPr>
-      <w:bookmarkStart w:id="47" w:name="_Toc244259592"/>
+      <w:bookmarkStart w:id="48" w:name="_Toc244264035"/>
       <w:r>
         <w:t>6.4 Release 1.0.1</w:t>
       </w:r>
-      <w:bookmarkEnd w:id="47"/>
+      <w:bookmarkEnd w:id="48"/>
     </w:p>
     <w:p>
       <w:pPr>
@@ -19851,11 +20068,11 @@
       <w:pPr>
         <w:pStyle w:val="Titolo2"/>
       </w:pPr>
-      <w:bookmarkStart w:id="48" w:name="_Toc244259593"/>
+      <w:bookmarkStart w:id="49" w:name="_Toc244264036"/>
       <w:r>
         <w:t>6.5 Release 1.0.2 e repository pubblico</w:t>
       </w:r>
-      <w:bookmarkEnd w:id="48"/>
+      <w:bookmarkEnd w:id="49"/>
     </w:p>
     <w:p>
       <w:pPr>
@@ -20273,11 +20490,11 @@
       <w:pPr>
         <w:pStyle w:val="Titolo2"/>
       </w:pPr>
-      <w:bookmarkStart w:id="49" w:name="_Toc244259594"/>
+      <w:bookmarkStart w:id="50" w:name="_Toc244264037"/>
       <w:r>
         <w:t>6.6 Nuova versione: link diretto per ogni sistema</w:t>
       </w:r>
-      <w:bookmarkEnd w:id="49"/>
+      <w:bookmarkEnd w:id="50"/>
     </w:p>
     <w:p>
       <w:pPr>
@@ -20690,7 +20907,7 @@
           <w:noProof/>
         </w:rPr>
         <w:drawing>
-          <wp:inline distT="0" distB="0" distL="0" distR="0" wp14:anchorId="7A9B383A" wp14:editId="2FC91470">
+          <wp:inline distT="0" distB="0" distL="0" distR="0" wp14:anchorId="0A5FB101" wp14:editId="14162EA2">
             <wp:extent cx="4572000" cy="4429125"/>
             <wp:effectExtent l="0" t="0" r="0" b="0"/>
             <wp:docPr id="24" name="Immagine 24"/>
@@ -20765,11 +20982,11 @@
       <w:pPr>
         <w:pStyle w:val="Titolo2"/>
       </w:pPr>
-      <w:bookmarkStart w:id="50" w:name="_Toc244259595"/>
+      <w:bookmarkStart w:id="51" w:name="_Toc244264038"/>
       <w:r>
         <w:t>6.7 Release 1.1.0</w:t>
       </w:r>
-      <w:bookmarkEnd w:id="50"/>
+      <w:bookmarkEnd w:id="51"/>
     </w:p>
     <w:p>
       <w:pPr>
@@ -21329,11 +21546,11 @@
       <w:pPr>
         <w:pStyle w:val="Titolo2"/>
       </w:pPr>
-      <w:bookmarkStart w:id="51" w:name="_Toc244259596"/>
+      <w:bookmarkStart w:id="52" w:name="_Toc244264039"/>
       <w:r>
         <w:t>6.8 Versione 1.2.0</w:t>
       </w:r>
-      <w:bookmarkEnd w:id="51"/>
+      <w:bookmarkEnd w:id="52"/>
     </w:p>
     <w:p>
       <w:pPr>
@@ -21878,11 +22095,11 @@
       <w:pPr>
         <w:pStyle w:val="Titolo2"/>
       </w:pPr>
-      <w:bookmarkStart w:id="52" w:name="_Toc244259597"/>
+      <w:bookmarkStart w:id="53" w:name="_Toc244264040"/>
       <w:r>
         <w:t>6.9 Versione 1.2.1</w:t>
       </w:r>
-      <w:bookmarkEnd w:id="52"/>
+      <w:bookmarkEnd w:id="53"/>
     </w:p>
     <w:p>
       <w:pPr>
@@ -21896,11 +22113,11 @@
       <w:pPr>
         <w:pStyle w:val="Titolo2"/>
       </w:pPr>
-      <w:bookmarkStart w:id="53" w:name="_Toc244259598"/>
+      <w:bookmarkStart w:id="54" w:name="_Toc244264041"/>
       <w:r>
         <w:t>6.10 Versione 1.3.0</w:t>
       </w:r>
-      <w:bookmarkEnd w:id="53"/>
+      <w:bookmarkEnd w:id="54"/>
     </w:p>
     <w:p>
       <w:pPr>
@@ -21928,11 +22145,11 @@
       <w:pPr>
         <w:pStyle w:val="Titolo2"/>
       </w:pPr>
-      <w:bookmarkStart w:id="54" w:name="_Toc244259599"/>
+      <w:bookmarkStart w:id="55" w:name="_Toc244264042"/>
       <w:r>
         <w:t>6.11 Versione 1.3.1 (ponte verso Cloudflare)</w:t>
       </w:r>
-      <w:bookmarkEnd w:id="54"/>
+      <w:bookmarkEnd w:id="55"/>
     </w:p>
     <w:p>
       <w:pPr>
@@ -21946,11 +22163,11 @@
       <w:pPr>
         <w:pStyle w:val="Titolo2"/>
       </w:pPr>
-      <w:bookmarkStart w:id="55" w:name="_Toc244259600"/>
+      <w:bookmarkStart w:id="56" w:name="_Toc244264043"/>
       <w:r>
         <w:t>6.12 Versione 1.4.0</w:t>
       </w:r>
-      <w:bookmarkEnd w:id="55"/>
+      <w:bookmarkEnd w:id="56"/>
     </w:p>
     <w:p>
       <w:pPr>
@@ -21964,11 +22181,11 @@
       <w:pPr>
         <w:pStyle w:val="Titolo2"/>
       </w:pPr>
-      <w:bookmarkStart w:id="56" w:name="_Toc244259601"/>
+      <w:bookmarkStart w:id="57" w:name="_Toc244264044"/>
       <w:r>
         <w:t>6.13 Versione 1.5.0</w:t>
       </w:r>
-      <w:bookmarkEnd w:id="56"/>
+      <w:bookmarkEnd w:id="57"/>
     </w:p>
     <w:p>
       <w:pPr>
@@ -21982,11 +22199,11 @@
       <w:pPr>
         <w:pStyle w:val="Titolo2"/>
       </w:pPr>
-      <w:bookmarkStart w:id="57" w:name="_Toc244259602"/>
+      <w:bookmarkStart w:id="58" w:name="_Toc244264045"/>
       <w:r>
         <w:t>6.14 Versione 1.6.0</w:t>
       </w:r>
-      <w:bookmarkEnd w:id="57"/>
+      <w:bookmarkEnd w:id="58"/>
     </w:p>
     <w:p>
       <w:pPr>
@@ -22006,11 +22223,29 @@
       <w:pPr>
         <w:pStyle w:val="Titolo2"/>
       </w:pPr>
-      <w:bookmarkStart w:id="58" w:name="_Toc244259603"/>
-      <w:r>
-        <w:t>6.15 Ruoli</w:t>
-      </w:r>
-      <w:bookmarkEnd w:id="58"/>
+      <w:bookmarkStart w:id="59" w:name="_Toc244264046"/>
+      <w:r>
+        <w:t>6.15 Versione 1.6.1</w:t>
+      </w:r>
+      <w:bookmarkEnd w:id="59"/>
+    </w:p>
+    <w:p>
+      <w:pPr>
+        <w:spacing w:after="120"/>
+      </w:pPr>
+      <w:r>
+        <w:t>Preparata il 30 ottobre 2026 (installer Windows 101.6.1, Android 1001006001): compilata con l'indirizzo degli aggiornamenti https://pdfz.agjin.com/; pagina degli aggiornamenti con link relativi.</w:t>
+      </w:r>
+    </w:p>
+    <w:p>
+      <w:pPr>
+        <w:pStyle w:val="Titolo2"/>
+      </w:pPr>
+      <w:bookmarkStart w:id="60" w:name="_Toc244264047"/>
+      <w:r>
+        <w:t>6.16 Ruoli</w:t>
+      </w:r>
+      <w:bookmarkEnd w:id="60"/>
     </w:p>
     <w:tbl>
       <w:tblPr>
@@ -22279,11 +22514,11 @@
       <w:pPr>
         <w:pStyle w:val="Titolo1"/>
       </w:pPr>
-      <w:bookmarkStart w:id="59" w:name="_Toc244259604"/>
+      <w:bookmarkStart w:id="61" w:name="_Toc244264048"/>
       <w:r>
         <w:t>7. Sicurezza</w:t>
       </w:r>
-      <w:bookmarkEnd w:id="59"/>
+      <w:bookmarkEnd w:id="61"/>
     </w:p>
     <w:p>
       <w:pPr>
@@ -22578,11 +22813,11 @@
       <w:pPr>
         <w:pStyle w:val="Titolo1"/>
       </w:pPr>
-      <w:bookmarkStart w:id="60" w:name="_Toc244259605"/>
+      <w:bookmarkStart w:id="62" w:name="_Toc244264049"/>
       <w:r>
         <w:t>8. Punti aperti</w:t>
       </w:r>
-      <w:bookmarkEnd w:id="60"/>
+      <w:bookmarkEnd w:id="62"/>
     </w:p>
     <w:p>
       <w:pPr>
@@ -22867,11 +23102,11 @@
       <w:pPr>
         <w:pStyle w:val="Titolo1"/>
       </w:pPr>
-      <w:bookmarkStart w:id="61" w:name="_Toc244259606"/>
+      <w:bookmarkStart w:id="63" w:name="_Toc244264050"/>
       <w:r>
         <w:t>9. Pensato per i prossimi 10 anni</w:t>
       </w:r>
-      <w:bookmarkEnd w:id="61"/>
+      <w:bookmarkEnd w:id="63"/>
     </w:p>
     <w:p>
       <w:pPr>
@@ -23061,11 +23296,11 @@
       <w:pPr>
         <w:pStyle w:val="Titolo1"/>
       </w:pPr>
-      <w:bookmarkStart w:id="62" w:name="_Toc244259607"/>
+      <w:bookmarkStart w:id="64" w:name="_Toc244264051"/>
       <w:r>
         <w:t>10. Facilità d'uso: analisi e proposte (30 ottobre 2026)</w:t>
       </w:r>
-      <w:bookmarkEnd w:id="62"/>
+      <w:bookmarkEnd w:id="64"/>
     </w:p>
     <w:p>
       <w:pPr>
@@ -23149,11 +23384,11 @@
       <w:pPr>
         <w:pStyle w:val="Titolo2"/>
       </w:pPr>
-      <w:bookmarkStart w:id="63" w:name="_Toc244259608"/>
+      <w:bookmarkStart w:id="65" w:name="_Toc244264052"/>
       <w:r>
         <w:t>10.1 Opinione</w:t>
       </w:r>
-      <w:bookmarkEnd w:id="63"/>
+      <w:bookmarkEnd w:id="65"/>
     </w:p>
     <w:p>
       <w:pPr>
@@ -23677,11 +23912,11 @@
       <w:pPr>
         <w:pStyle w:val="Titolo2"/>
       </w:pPr>
-      <w:bookmarkStart w:id="64" w:name="_Toc244259609"/>
+      <w:bookmarkStart w:id="66" w:name="_Toc244264053"/>
       <w:r>
         <w:t>10.2 Punti da migliorare</w:t>
       </w:r>
-      <w:bookmarkEnd w:id="64"/>
+      <w:bookmarkEnd w:id="66"/>
     </w:p>
     <w:p>
       <w:pPr>
@@ -23826,7 +24061,7 @@
           <w:noProof/>
         </w:rPr>
         <w:drawing>
-          <wp:inline distT="0" distB="0" distL="0" distR="0" wp14:anchorId="5021E0D5" wp14:editId="3EBB248B">
+          <wp:inline distT="0" distB="0" distL="0" distR="0" wp14:anchorId="3207CA54" wp14:editId="6FE9CB4F">
             <wp:extent cx="1905000" cy="4124325"/>
             <wp:effectExtent l="0" t="0" r="0" b="0"/>
             <wp:docPr id="25" name="Immagine 25"/>
@@ -23891,7 +24126,7 @@
           <w:noProof/>
         </w:rPr>
         <w:drawing>
-          <wp:inline distT="0" distB="0" distL="0" distR="0" wp14:anchorId="2C75C82E" wp14:editId="3D8D64D4">
+          <wp:inline distT="0" distB="0" distL="0" distR="0" wp14:anchorId="77298AE2" wp14:editId="0FC2039B">
             <wp:extent cx="1905000" cy="4124325"/>
             <wp:effectExtent l="0" t="0" r="0" b="0"/>
             <wp:docPr id="26" name="Immagine 26"/>
@@ -23956,7 +24191,7 @@
           <w:noProof/>
         </w:rPr>
         <w:drawing>
-          <wp:inline distT="0" distB="0" distL="0" distR="0" wp14:anchorId="7461E3DE" wp14:editId="6A6FA718">
+          <wp:inline distT="0" distB="0" distL="0" distR="0" wp14:anchorId="2110FC65" wp14:editId="23AF732E">
             <wp:extent cx="4953000" cy="3095625"/>
             <wp:effectExtent l="0" t="0" r="0" b="0"/>
             <wp:docPr id="27" name="Immagine 27"/>
@@ -24015,11 +24250,11 @@
       <w:pPr>
         <w:pStyle w:val="Titolo2"/>
       </w:pPr>
-      <w:bookmarkStart w:id="65" w:name="_Toc244259610"/>
+      <w:bookmarkStart w:id="67" w:name="_Toc244264054"/>
       <w:r>
         <w:t>10.3 Cinque proposte</w:t>
       </w:r>
-      <w:bookmarkEnd w:id="65"/>
+      <w:bookmarkEnd w:id="67"/>
     </w:p>
     <w:tbl>
       <w:tblPr>
@@ -24895,96 +25130,10 @@
 <file path=word/numbering.xml><?xml version="1.0" encoding="utf-8"?>
 <w:numbering xmlns:wpc="http://schemas.microsoft.com/office/word/2010/wordprocessingCanvas" xmlns:cx="http://schemas.microsoft.com/office/drawing/2014/chartex" xmlns:cx1="http://schemas.microsoft.com/office/drawing/2015/9/8/chartex" xmlns:cx2="http://schemas.microsoft.com/office/drawing/2015/10/21/chartex" xmlns:cx3="http://schemas.microsoft.com/office/drawing/2016/5/9/chartex" xmlns:cx4="http://schemas.microsoft.com/office/drawing/2016/5/10/chartex" xmlns:cx5="http://schemas.microsoft.com/office/drawing/2016/5/11/chartex" xmlns:cx6="http://schemas.microsoft.com/office/drawing/2016/5/12/chartex" xmlns:cx7="http://schemas.microsoft.com/office/drawing/2016/5/13/chartex" xmlns:cx8="http://schemas.microsoft.com/office/drawing/2016/5/14/chartex" xmlns:mc="http://schemas.openxmlformats.org/markup-compatibility/2006" xmlns:aink="http://schemas.microsoft.com/office/drawing/2016/ink" xmlns:am3d="http://schemas.microsoft.com/office/drawing/2017/model3d" xmlns:o="urn:schemas-microsoft-com:office:office" xmlns:oel="http://schemas.microsoft.com/office/2019/extlst" xmlns:r="http://schemas.openxmlformats.org/officeDocument/2006/relationships" xmlns:m="http://schemas.openxmlformats.org/officeDocument/2006/math" xmlns:v="urn:schemas-microsoft-com:vml" xmlns:wp14="http://schemas.microsoft.com/office/word/2010/wordprocessingDrawing" xmlns:wp="http://schemas.openxmlformats.org/drawingml/2006/wordprocessingDrawing" xmlns:w10="urn:schemas-microsoft-com:office:word" xmlns:w="http://schemas.openxmlformats.org/wordprocessingml/2006/main" xmlns:w14="http://schemas.microsoft.com/office/word/2010/wordml" xmlns:w15="http://schemas.microsoft.com/office/word/2012/wordml" xmlns:w16cex="http://schemas.microsoft.com/office/word/2018/wordml/cex" xmlns:w16cid="http://schemas.microsoft.com/office/word/2016/wordml/cid" xmlns:w16="http://schemas.microsoft.com/office/word/2018/wordml" xmlns:w16du="http://schemas.microsoft.com/office/word/2023/wordml/word16du" xmlns:w16sdtdh="http://schemas.microsoft.com/office/word/2020/wordml/sdtdatahash" xmlns:w16sdtfl="http://schemas.microsoft.com/office/word/2024/wordml/sdtformatlock" xmlns:w16se="http://schemas.microsoft.com/office/word/2015/wordml/symex" xmlns:wpg="http://schemas.microsoft.com/office/word/2010/wordprocessingGroup" xmlns:wpi="http://schemas.microsoft.com/office/word/2010/wordprocessingInk" xmlns:wne="http://schemas.microsoft.com/office/word/2006/wordml" xmlns:wps="http://schemas.microsoft.com/office/word/2010/wordprocessingShape" mc:Ignorable="w14 w15 w16se w16cid w16 w16cex w16sdtdh w16sdtfl w16du wp14">
   <w:abstractNum w:abstractNumId="0" w15:restartNumberingAfterBreak="0">
-    <w:nsid w:val="098E3FF6"/>
+    <w:nsid w:val="10F40DD7"/>
     <w:multiLevelType w:val="hybridMultilevel"/>
-    <w:tmpl w:val="551EDB1A"/>
-    <w:lvl w:ilvl="0" w:tplc="20023938" w:tentative="1">
-      <w:start w:val="1"/>
-      <w:numFmt w:val="bullet"/>
-      <w:lvlText w:val="●"/>
-      <w:lvlJc w:val="left"/>
-      <w:pPr>
-        <w:ind w:left="720" w:hanging="360"/>
-      </w:pPr>
-    </w:lvl>
-    <w:lvl w:ilvl="1" w:tplc="A73E99B8" w:tentative="1">
-      <w:start w:val="1"/>
-      <w:numFmt w:val="bullet"/>
-      <w:lvlText w:val="○"/>
-      <w:lvlJc w:val="left"/>
-      <w:pPr>
-        <w:ind w:left="1440" w:hanging="360"/>
-      </w:pPr>
-    </w:lvl>
-    <w:lvl w:ilvl="2" w:tplc="D2FE03BE" w:tentative="1">
-      <w:start w:val="1"/>
-      <w:numFmt w:val="bullet"/>
-      <w:lvlText w:val="■"/>
-      <w:lvlJc w:val="left"/>
-      <w:pPr>
-        <w:ind w:left="2160" w:hanging="360"/>
-      </w:pPr>
-    </w:lvl>
-    <w:lvl w:ilvl="3" w:tplc="C87CAF82" w:tentative="1">
-      <w:start w:val="1"/>
-      <w:numFmt w:val="bullet"/>
-      <w:lvlText w:val="●"/>
-      <w:lvlJc w:val="left"/>
-      <w:pPr>
-        <w:ind w:left="2880" w:hanging="360"/>
-      </w:pPr>
-    </w:lvl>
-    <w:lvl w:ilvl="4" w:tplc="C15217B8" w:tentative="1">
-      <w:start w:val="1"/>
-      <w:numFmt w:val="bullet"/>
-      <w:lvlText w:val="○"/>
-      <w:lvlJc w:val="left"/>
-      <w:pPr>
-        <w:ind w:left="3600" w:hanging="360"/>
-      </w:pPr>
-    </w:lvl>
-    <w:lvl w:ilvl="5" w:tplc="55DC5D02" w:tentative="1">
-      <w:start w:val="1"/>
-      <w:numFmt w:val="bullet"/>
-      <w:lvlText w:val="■"/>
-      <w:lvlJc w:val="left"/>
-      <w:pPr>
-        <w:ind w:left="4320" w:hanging="360"/>
-      </w:pPr>
-    </w:lvl>
-    <w:lvl w:ilvl="6" w:tplc="A9C2F97C" w:tentative="1">
-      <w:start w:val="1"/>
-      <w:numFmt w:val="bullet"/>
-      <w:lvlText w:val="●"/>
-      <w:lvlJc w:val="left"/>
-      <w:pPr>
-        <w:ind w:left="5040" w:hanging="360"/>
-      </w:pPr>
-    </w:lvl>
-    <w:lvl w:ilvl="7" w:tplc="C77090AA" w:tentative="1">
-      <w:start w:val="1"/>
-      <w:numFmt w:val="bullet"/>
-      <w:lvlText w:val="●"/>
-      <w:lvlJc w:val="left"/>
-      <w:pPr>
-        <w:ind w:left="5760" w:hanging="360"/>
-      </w:pPr>
-    </w:lvl>
-    <w:lvl w:ilvl="8" w:tplc="5C84BA86" w:tentative="1">
-      <w:start w:val="1"/>
-      <w:numFmt w:val="bullet"/>
-      <w:lvlText w:val="●"/>
-      <w:lvlJc w:val="left"/>
-      <w:pPr>
-        <w:ind w:left="6480" w:hanging="360"/>
-      </w:pPr>
-    </w:lvl>
-  </w:abstractNum>
-  <w:abstractNum w:abstractNumId="1" w15:restartNumberingAfterBreak="0">
-    <w:nsid w:val="1EAC528C"/>
-    <w:multiLevelType w:val="hybridMultilevel"/>
-    <w:tmpl w:val="34D2D76E"/>
-    <w:lvl w:ilvl="0" w:tplc="4DDC417A">
+    <w:tmpl w:val="6B5659D8"/>
+    <w:lvl w:ilvl="0" w:tplc="07AA757E">
       <w:start w:val="1"/>
       <w:numFmt w:val="decimal"/>
       <w:lvlText w:val="%1."/>
@@ -24993,175 +25142,261 @@
         <w:ind w:left="540" w:hanging="300"/>
       </w:pPr>
     </w:lvl>
-    <w:lvl w:ilvl="1" w:tplc="7268A408">
+    <w:lvl w:ilvl="1" w:tplc="C994AFA0">
       <w:numFmt w:val="decimal"/>
       <w:lvlText w:val=""/>
       <w:lvlJc w:val="left"/>
     </w:lvl>
-    <w:lvl w:ilvl="2" w:tplc="723CE44C">
+    <w:lvl w:ilvl="2" w:tplc="FFECB604">
       <w:numFmt w:val="decimal"/>
       <w:lvlText w:val=""/>
       <w:lvlJc w:val="left"/>
     </w:lvl>
-    <w:lvl w:ilvl="3" w:tplc="FB347BA4">
+    <w:lvl w:ilvl="3" w:tplc="303CFAFE">
       <w:numFmt w:val="decimal"/>
       <w:lvlText w:val=""/>
       <w:lvlJc w:val="left"/>
     </w:lvl>
-    <w:lvl w:ilvl="4" w:tplc="A1C208D0">
+    <w:lvl w:ilvl="4" w:tplc="7AD816AA">
       <w:numFmt w:val="decimal"/>
       <w:lvlText w:val=""/>
       <w:lvlJc w:val="left"/>
     </w:lvl>
-    <w:lvl w:ilvl="5" w:tplc="61FA4BC0">
+    <w:lvl w:ilvl="5" w:tplc="EE025450">
       <w:numFmt w:val="decimal"/>
       <w:lvlText w:val=""/>
       <w:lvlJc w:val="left"/>
     </w:lvl>
-    <w:lvl w:ilvl="6" w:tplc="56D4819E">
+    <w:lvl w:ilvl="6" w:tplc="1988F8D8">
       <w:numFmt w:val="decimal"/>
       <w:lvlText w:val=""/>
       <w:lvlJc w:val="left"/>
     </w:lvl>
-    <w:lvl w:ilvl="7" w:tplc="1BFE5DBA">
+    <w:lvl w:ilvl="7" w:tplc="17185B04">
       <w:numFmt w:val="decimal"/>
       <w:lvlText w:val=""/>
       <w:lvlJc w:val="left"/>
     </w:lvl>
-    <w:lvl w:ilvl="8" w:tplc="0D04AF1C">
+    <w:lvl w:ilvl="8" w:tplc="1CB8117A">
+      <w:numFmt w:val="decimal"/>
+      <w:lvlText w:val=""/>
+      <w:lvlJc w:val="left"/>
+    </w:lvl>
+  </w:abstractNum>
+  <w:abstractNum w:abstractNumId="1" w15:restartNumberingAfterBreak="0">
+    <w:nsid w:val="17B9485C"/>
+    <w:multiLevelType w:val="hybridMultilevel"/>
+    <w:tmpl w:val="47BC7576"/>
+    <w:lvl w:ilvl="0" w:tplc="9FF2919E">
+      <w:start w:val="1"/>
+      <w:numFmt w:val="bullet"/>
+      <w:lvlText w:val="•"/>
+      <w:lvlJc w:val="left"/>
+      <w:pPr>
+        <w:ind w:left="540" w:hanging="270"/>
+      </w:pPr>
+    </w:lvl>
+    <w:lvl w:ilvl="1" w:tplc="BE681712">
+      <w:numFmt w:val="decimal"/>
+      <w:lvlText w:val=""/>
+      <w:lvlJc w:val="left"/>
+    </w:lvl>
+    <w:lvl w:ilvl="2" w:tplc="5F1AC17E">
+      <w:numFmt w:val="decimal"/>
+      <w:lvlText w:val=""/>
+      <w:lvlJc w:val="left"/>
+    </w:lvl>
+    <w:lvl w:ilvl="3" w:tplc="7DFE0CA8">
+      <w:numFmt w:val="decimal"/>
+      <w:lvlText w:val=""/>
+      <w:lvlJc w:val="left"/>
+    </w:lvl>
+    <w:lvl w:ilvl="4" w:tplc="F2DA39CA">
+      <w:numFmt w:val="decimal"/>
+      <w:lvlText w:val=""/>
+      <w:lvlJc w:val="left"/>
+    </w:lvl>
+    <w:lvl w:ilvl="5" w:tplc="59C6882E">
+      <w:numFmt w:val="decimal"/>
+      <w:lvlText w:val=""/>
+      <w:lvlJc w:val="left"/>
+    </w:lvl>
+    <w:lvl w:ilvl="6" w:tplc="C802B272">
+      <w:numFmt w:val="decimal"/>
+      <w:lvlText w:val=""/>
+      <w:lvlJc w:val="left"/>
+    </w:lvl>
+    <w:lvl w:ilvl="7" w:tplc="4F640524">
+      <w:numFmt w:val="decimal"/>
+      <w:lvlText w:val=""/>
+      <w:lvlJc w:val="left"/>
+    </w:lvl>
+    <w:lvl w:ilvl="8" w:tplc="965248AC">
       <w:numFmt w:val="decimal"/>
       <w:lvlText w:val=""/>
       <w:lvlJc w:val="left"/>
     </w:lvl>
   </w:abstractNum>
   <w:abstractNum w:abstractNumId="2" w15:restartNumberingAfterBreak="0">
-    <w:nsid w:val="44A950FE"/>
+    <w:nsid w:val="2CAF6990"/>
     <w:multiLevelType w:val="hybridMultilevel"/>
-    <w:tmpl w:val="DA8CCEC4"/>
-    <w:lvl w:ilvl="0" w:tplc="DF2EA3D6">
+    <w:tmpl w:val="5156D59E"/>
+    <w:lvl w:ilvl="0" w:tplc="870E98CC" w:tentative="1">
       <w:start w:val="1"/>
       <w:numFmt w:val="bullet"/>
-      <w:lvlText w:val="•"/>
+      <w:lvlText w:val="●"/>
       <w:lvlJc w:val="left"/>
       <w:pPr>
-        <w:ind w:left="540" w:hanging="270"/>
+        <w:ind w:left="720" w:hanging="360"/>
       </w:pPr>
     </w:lvl>
-    <w:lvl w:ilvl="1" w:tplc="C2C23672">
+    <w:lvl w:ilvl="1" w:tplc="4922145A" w:tentative="1">
+      <w:start w:val="1"/>
+      <w:numFmt w:val="bullet"/>
+      <w:lvlText w:val="○"/>
+      <w:lvlJc w:val="left"/>
+      <w:pPr>
+        <w:ind w:left="1440" w:hanging="360"/>
+      </w:pPr>
+    </w:lvl>
+    <w:lvl w:ilvl="2" w:tplc="10B2FAA6" w:tentative="1">
+      <w:start w:val="1"/>
+      <w:numFmt w:val="bullet"/>
+      <w:lvlText w:val="■"/>
+      <w:lvlJc w:val="left"/>
+      <w:pPr>
+        <w:ind w:left="2160" w:hanging="360"/>
+      </w:pPr>
+    </w:lvl>
+    <w:lvl w:ilvl="3" w:tplc="6A887D70" w:tentative="1">
+      <w:start w:val="1"/>
+      <w:numFmt w:val="bullet"/>
+      <w:lvlText w:val="●"/>
+      <w:lvlJc w:val="left"/>
+      <w:pPr>
+        <w:ind w:left="2880" w:hanging="360"/>
+      </w:pPr>
+    </w:lvl>
+    <w:lvl w:ilvl="4" w:tplc="CC78A54A" w:tentative="1">
+      <w:start w:val="1"/>
+      <w:numFmt w:val="bullet"/>
+      <w:lvlText w:val="○"/>
+      <w:lvlJc w:val="left"/>
+      <w:pPr>
+        <w:ind w:left="3600" w:hanging="360"/>
+      </w:pPr>
+    </w:lvl>
+    <w:lvl w:ilvl="5" w:tplc="A6C0A1CE" w:tentative="1">
+      <w:start w:val="1"/>
+      <w:numFmt w:val="bullet"/>
+      <w:lvlText w:val="■"/>
+      <w:lvlJc w:val="left"/>
+      <w:pPr>
+        <w:ind w:left="4320" w:hanging="360"/>
+      </w:pPr>
+    </w:lvl>
+    <w:lvl w:ilvl="6" w:tplc="FE42CD12" w:tentative="1">
+      <w:start w:val="1"/>
+      <w:numFmt w:val="bullet"/>
+      <w:lvlText w:val="●"/>
+      <w:lvlJc w:val="left"/>
+      <w:pPr>
+        <w:ind w:left="5040" w:hanging="360"/>
+      </w:pPr>
+    </w:lvl>
+    <w:lvl w:ilvl="7" w:tplc="CA0A7042" w:tentative="1">
+      <w:start w:val="1"/>
+      <w:numFmt w:val="bullet"/>
+      <w:lvlText w:val="●"/>
+      <w:lvlJc w:val="left"/>
+      <w:pPr>
+        <w:ind w:left="5760" w:hanging="360"/>
+      </w:pPr>
+    </w:lvl>
+    <w:lvl w:ilvl="8" w:tplc="0ED2D2D8" w:tentative="1">
+      <w:start w:val="1"/>
+      <w:numFmt w:val="bullet"/>
+      <w:lvlText w:val="●"/>
+      <w:lvlJc w:val="left"/>
+      <w:pPr>
+        <w:ind w:left="6480" w:hanging="360"/>
+      </w:pPr>
+    </w:lvl>
+  </w:abstractNum>
+  <w:abstractNum w:abstractNumId="3" w15:restartNumberingAfterBreak="0">
+    <w:nsid w:val="6E563022"/>
+    <w:multiLevelType w:val="hybridMultilevel"/>
+    <w:tmpl w:val="919A331C"/>
+    <w:lvl w:ilvl="0" w:tplc="425299EE">
+      <w:start w:val="1"/>
+      <w:numFmt w:val="decimal"/>
+      <w:lvlText w:val="%1."/>
+      <w:lvlJc w:val="left"/>
+      <w:pPr>
+        <w:ind w:left="540" w:hanging="300"/>
+      </w:pPr>
+    </w:lvl>
+    <w:lvl w:ilvl="1" w:tplc="B3D8D766">
       <w:numFmt w:val="decimal"/>
       <w:lvlText w:val=""/>
       <w:lvlJc w:val="left"/>
     </w:lvl>
-    <w:lvl w:ilvl="2" w:tplc="30CA0A04">
+    <w:lvl w:ilvl="2" w:tplc="17602D6C">
       <w:numFmt w:val="decimal"/>
       <w:lvlText w:val=""/>
       <w:lvlJc w:val="left"/>
     </w:lvl>
-    <w:lvl w:ilvl="3" w:tplc="91D4FA5C">
+    <w:lvl w:ilvl="3" w:tplc="FD147B06">
       <w:numFmt w:val="decimal"/>
       <w:lvlText w:val=""/>
       <w:lvlJc w:val="left"/>
     </w:lvl>
-    <w:lvl w:ilvl="4" w:tplc="2BBEA6C6">
+    <w:lvl w:ilvl="4" w:tplc="1304EBDC">
       <w:numFmt w:val="decimal"/>
       <w:lvlText w:val=""/>
       <w:lvlJc w:val="left"/>
     </w:lvl>
-    <w:lvl w:ilvl="5" w:tplc="8280CF9A">
+    <w:lvl w:ilvl="5" w:tplc="1902A13E">
       <w:numFmt w:val="decimal"/>
       <w:lvlText w:val=""/>
       <w:lvlJc w:val="left"/>
     </w:lvl>
-    <w:lvl w:ilvl="6" w:tplc="DF28A7E0">
+    <w:lvl w:ilvl="6" w:tplc="5ED6D588">
       <w:numFmt w:val="decimal"/>
       <w:lvlText w:val=""/>
       <w:lvlJc w:val="left"/>
     </w:lvl>
-    <w:lvl w:ilvl="7" w:tplc="CBBEDFAE">
+    <w:lvl w:ilvl="7" w:tplc="4C8E5800">
       <w:numFmt w:val="decimal"/>
       <w:lvlText w:val=""/>
       <w:lvlJc w:val="left"/>
     </w:lvl>
-    <w:lvl w:ilvl="8" w:tplc="C5F836F2">
+    <w:lvl w:ilvl="8" w:tplc="80E0A476">
       <w:numFmt w:val="decimal"/>
       <w:lvlText w:val=""/>
       <w:lvlJc w:val="left"/>
     </w:lvl>
   </w:abstractNum>
-  <w:abstractNum w:abstractNumId="3" w15:restartNumberingAfterBreak="0">
-    <w:nsid w:val="6FF9001F"/>
-    <w:multiLevelType w:val="hybridMultilevel"/>
-    <w:tmpl w:val="AE4E92BE"/>
-    <w:lvl w:ilvl="0" w:tplc="0A34DA74">
-      <w:start w:val="1"/>
-      <w:numFmt w:val="decimal"/>
-      <w:lvlText w:val="%1."/>
-      <w:lvlJc w:val="left"/>
-      <w:pPr>
-        <w:ind w:left="540" w:hanging="300"/>
-      </w:pPr>
-    </w:lvl>
-    <w:lvl w:ilvl="1" w:tplc="4F668A80">
-      <w:numFmt w:val="decimal"/>
-      <w:lvlText w:val=""/>
-      <w:lvlJc w:val="left"/>
-    </w:lvl>
-    <w:lvl w:ilvl="2" w:tplc="E7601444">
-      <w:numFmt w:val="decimal"/>
-      <w:lvlText w:val=""/>
-      <w:lvlJc w:val="left"/>
-    </w:lvl>
-    <w:lvl w:ilvl="3" w:tplc="B18E085A">
-      <w:numFmt w:val="decimal"/>
-      <w:lvlText w:val=""/>
-      <w:lvlJc w:val="left"/>
-    </w:lvl>
-    <w:lvl w:ilvl="4" w:tplc="AB58C516">
-      <w:numFmt w:val="decimal"/>
-      <w:lvlText w:val=""/>
-      <w:lvlJc w:val="left"/>
-    </w:lvl>
-    <w:lvl w:ilvl="5" w:tplc="874A96C2">
-      <w:numFmt w:val="decimal"/>
-      <w:lvlText w:val=""/>
-      <w:lvlJc w:val="left"/>
-    </w:lvl>
-    <w:lvl w:ilvl="6" w:tplc="245AED9C">
-      <w:numFmt w:val="decimal"/>
-      <w:lvlText w:val=""/>
-      <w:lvlJc w:val="left"/>
-    </w:lvl>
-    <w:lvl w:ilvl="7" w:tplc="058ABA20">
-      <w:numFmt w:val="decimal"/>
-      <w:lvlText w:val=""/>
-      <w:lvlJc w:val="left"/>
-    </w:lvl>
-    <w:lvl w:ilvl="8" w:tplc="CF4AF6E0">
-      <w:numFmt w:val="decimal"/>
-      <w:lvlText w:val=""/>
-      <w:lvlJc w:val="left"/>
-    </w:lvl>
-  </w:abstractNum>
-  <w:num w:numId="1" w16cid:durableId="251476278">
+  <w:num w:numId="1" w16cid:durableId="1934315609">
+    <w:abstractNumId w:val="2"/>
+    <w:lvlOverride w:ilvl="0">
+      <w:startOverride w:val="1"/>
+    </w:lvlOverride>
+  </w:num>
+  <w:num w:numId="2" w16cid:durableId="707798874">
+    <w:abstractNumId w:val="1"/>
+    <w:lvlOverride w:ilvl="0">
+      <w:startOverride w:val="1"/>
+    </w:lvlOverride>
+  </w:num>
+  <w:num w:numId="3" w16cid:durableId="999624817">
     <w:abstractNumId w:val="0"/>
     <w:lvlOverride w:ilvl="0">
       <w:startOverride w:val="1"/>
     </w:lvlOverride>
   </w:num>
-  <w:num w:numId="2" w16cid:durableId="1759212157">
-    <w:abstractNumId w:val="2"/>
-    <w:lvlOverride w:ilvl="0">
-      <w:startOverride w:val="1"/>
-    </w:lvlOverride>
-  </w:num>
-  <w:num w:numId="3" w16cid:durableId="1990985180">
+  <w:num w:numId="4" w16cid:durableId="228345135">
     <w:abstractNumId w:val="3"/>
-    <w:lvlOverride w:ilvl="0">
-      <w:startOverride w:val="1"/>
-    </w:lvlOverride>
-  </w:num>
-  <w:num w:numId="4" w16cid:durableId="737944116">
-    <w:abstractNumId w:val="1"/>
     <w:lvlOverride w:ilvl="0">
       <w:startOverride w:val="1"/>
     </w:lvlOverride>
@@ -25802,7 +26037,7 @@
     <w:autoRedefine/>
     <w:uiPriority w:val="39"/>
     <w:unhideWhenUsed/>
-    <w:rsid w:val="00F01313"/>
+    <w:rsid w:val="008D66BF"/>
     <w:pPr>
       <w:spacing w:after="100"/>
     </w:pPr>
@@ -25814,7 +26049,7 @@
     <w:autoRedefine/>
     <w:uiPriority w:val="39"/>
     <w:unhideWhenUsed/>
-    <w:rsid w:val="00F01313"/>
+    <w:rsid w:val="008D66BF"/>
     <w:pPr>
       <w:spacing w:after="100"/>
       <w:ind w:left="210"/>

</xml_diff>

<commit_message>
PDFz 1.6.2: sito degli aggiornamenti su https://pdfz.agjin.com/ (la 1.6.1 non è uscita)
- UPDATE_BASE_URL senza https:// o senza la barra finale si completa da sola (imposta-url-aggiornamenti.sh,
  cloudflare.yml): la 1.6.1 si era fermata su "pdfz.agjin.com"
- stessa versione della 1.6.1: aggiornamenti dal dominio dell'autore, pagina con link relativi

Co-Authored-By: Claude Opus 5.5 <noreply@anthropic.com>
</commit_message>
<xml_diff>
--- a/docs/PDFz_20261030.docx
+++ b/docs/PDFz_20261030.docx
@@ -16,7 +16,7 @@
           <w:noProof/>
         </w:rPr>
         <w:drawing>
-          <wp:inline distT="0" distB="0" distL="0" distR="0" wp14:anchorId="58FAC3F0" wp14:editId="273BC387">
+          <wp:inline distT="0" distB="0" distL="0" distR="0" wp14:anchorId="52C8BA21" wp14:editId="79996C6F">
             <wp:extent cx="3619500" cy="1285875"/>
             <wp:effectExtent l="0" t="0" r="0" b="0"/>
             <wp:docPr id="1" name="Immagine 1"/>
@@ -95,7 +95,7 @@
           <w:sz w:val="22"/>
           <w:szCs w:val="22"/>
         </w:rPr>
-        <w:t>Versione 1.6.1  ·  30 ottobre 2026  ·  autore: agjin</w:t>
+        <w:t>Versione 1.6.2  ·  30 ottobre 2026  ·  autore: agjin</w:t>
       </w:r>
     </w:p>
     <w:p>
@@ -135,7 +135,7 @@
     <w:sdt>
       <w:sdtPr>
         <w:alias w:val="Indice"/>
-        <w:id w:val="-437514897"/>
+        <w:id w:val="1717004672"/>
       </w:sdtPr>
       <w:sdtEndPr/>
       <w:sdtContent>
@@ -158,7 +158,7 @@
           <w:r>
             <w:fldChar w:fldCharType="separate"/>
           </w:r>
-          <w:hyperlink w:anchor="_Toc244263987" w:history="1">
+          <w:hyperlink w:anchor="_Toc244264321" w:history="1">
             <w:r>
               <w:rPr>
                 <w:rStyle w:val="Collegamentoipertestuale"/>
@@ -182,7 +182,7 @@
               <w:rPr>
                 <w:noProof/>
               </w:rPr>
-              <w:instrText xml:space="preserve"> PAGEREF _Toc244263987 \h </w:instrText>
+              <w:instrText xml:space="preserve"> PAGEREF _Toc244264321 \h </w:instrText>
             </w:r>
             <w:r>
               <w:rPr>
@@ -219,7 +219,7 @@
               <w:noProof/>
             </w:rPr>
           </w:pPr>
-          <w:hyperlink w:anchor="_Toc244263988" w:history="1">
+          <w:hyperlink w:anchor="_Toc244264322" w:history="1">
             <w:r>
               <w:rPr>
                 <w:rStyle w:val="Collegamentoipertestuale"/>
@@ -243,7 +243,7 @@
               <w:rPr>
                 <w:noProof/>
               </w:rPr>
-              <w:instrText xml:space="preserve"> PAGEREF _Toc244263988 \h </w:instrText>
+              <w:instrText xml:space="preserve"> PAGEREF _Toc244264322 \h </w:instrText>
             </w:r>
             <w:r>
               <w:rPr>
@@ -280,7 +280,7 @@
               <w:noProof/>
             </w:rPr>
           </w:pPr>
-          <w:hyperlink w:anchor="_Toc244263989" w:history="1">
+          <w:hyperlink w:anchor="_Toc244264323" w:history="1">
             <w:r>
               <w:rPr>
                 <w:rStyle w:val="Collegamentoipertestuale"/>
@@ -304,7 +304,7 @@
               <w:rPr>
                 <w:noProof/>
               </w:rPr>
-              <w:instrText xml:space="preserve"> PAGEREF _Toc244263989 \h </w:instrText>
+              <w:instrText xml:space="preserve"> PAGEREF _Toc244264323 \h </w:instrText>
             </w:r>
             <w:r>
               <w:rPr>
@@ -341,7 +341,7 @@
               <w:noProof/>
             </w:rPr>
           </w:pPr>
-          <w:hyperlink w:anchor="_Toc244263990" w:history="1">
+          <w:hyperlink w:anchor="_Toc244264324" w:history="1">
             <w:r>
               <w:rPr>
                 <w:rStyle w:val="Collegamentoipertestuale"/>
@@ -365,7 +365,7 @@
               <w:rPr>
                 <w:noProof/>
               </w:rPr>
-              <w:instrText xml:space="preserve"> PAGEREF _Toc244263990 \h </w:instrText>
+              <w:instrText xml:space="preserve"> PAGEREF _Toc244264324 \h </w:instrText>
             </w:r>
             <w:r>
               <w:rPr>
@@ -402,7 +402,7 @@
               <w:noProof/>
             </w:rPr>
           </w:pPr>
-          <w:hyperlink w:anchor="_Toc244263991" w:history="1">
+          <w:hyperlink w:anchor="_Toc244264325" w:history="1">
             <w:r>
               <w:rPr>
                 <w:rStyle w:val="Collegamentoipertestuale"/>
@@ -426,7 +426,7 @@
               <w:rPr>
                 <w:noProof/>
               </w:rPr>
-              <w:instrText xml:space="preserve"> PAGEREF _Toc244263991 \h </w:instrText>
+              <w:instrText xml:space="preserve"> PAGEREF _Toc244264325 \h </w:instrText>
             </w:r>
             <w:r>
               <w:rPr>
@@ -463,7 +463,7 @@
               <w:noProof/>
             </w:rPr>
           </w:pPr>
-          <w:hyperlink w:anchor="_Toc244263992" w:history="1">
+          <w:hyperlink w:anchor="_Toc244264326" w:history="1">
             <w:r>
               <w:rPr>
                 <w:rStyle w:val="Collegamentoipertestuale"/>
@@ -487,7 +487,7 @@
               <w:rPr>
                 <w:noProof/>
               </w:rPr>
-              <w:instrText xml:space="preserve"> PAGEREF _Toc244263992 \h </w:instrText>
+              <w:instrText xml:space="preserve"> PAGEREF _Toc244264326 \h </w:instrText>
             </w:r>
             <w:r>
               <w:rPr>
@@ -524,7 +524,7 @@
               <w:noProof/>
             </w:rPr>
           </w:pPr>
-          <w:hyperlink w:anchor="_Toc244263993" w:history="1">
+          <w:hyperlink w:anchor="_Toc244264327" w:history="1">
             <w:r>
               <w:rPr>
                 <w:rStyle w:val="Collegamentoipertestuale"/>
@@ -548,7 +548,7 @@
               <w:rPr>
                 <w:noProof/>
               </w:rPr>
-              <w:instrText xml:space="preserve"> PAGEREF _Toc244263993 \h </w:instrText>
+              <w:instrText xml:space="preserve"> PAGEREF _Toc244264327 \h </w:instrText>
             </w:r>
             <w:r>
               <w:rPr>
@@ -585,7 +585,7 @@
               <w:noProof/>
             </w:rPr>
           </w:pPr>
-          <w:hyperlink w:anchor="_Toc244263994" w:history="1">
+          <w:hyperlink w:anchor="_Toc244264328" w:history="1">
             <w:r>
               <w:rPr>
                 <w:rStyle w:val="Collegamentoipertestuale"/>
@@ -609,7 +609,7 @@
               <w:rPr>
                 <w:noProof/>
               </w:rPr>
-              <w:instrText xml:space="preserve"> PAGEREF _Toc244263994 \h </w:instrText>
+              <w:instrText xml:space="preserve"> PAGEREF _Toc244264328 \h </w:instrText>
             </w:r>
             <w:r>
               <w:rPr>
@@ -646,7 +646,7 @@
               <w:noProof/>
             </w:rPr>
           </w:pPr>
-          <w:hyperlink w:anchor="_Toc244263995" w:history="1">
+          <w:hyperlink w:anchor="_Toc244264329" w:history="1">
             <w:r>
               <w:rPr>
                 <w:rStyle w:val="Collegamentoipertestuale"/>
@@ -670,7 +670,7 @@
               <w:rPr>
                 <w:noProof/>
               </w:rPr>
-              <w:instrText xml:space="preserve"> PAGEREF _Toc244263995 \h </w:instrText>
+              <w:instrText xml:space="preserve"> PAGEREF _Toc244264329 \h </w:instrText>
             </w:r>
             <w:r>
               <w:rPr>
@@ -707,7 +707,7 @@
               <w:noProof/>
             </w:rPr>
           </w:pPr>
-          <w:hyperlink w:anchor="_Toc244263996" w:history="1">
+          <w:hyperlink w:anchor="_Toc244264330" w:history="1">
             <w:r>
               <w:rPr>
                 <w:rStyle w:val="Collegamentoipertestuale"/>
@@ -731,7 +731,7 @@
               <w:rPr>
                 <w:noProof/>
               </w:rPr>
-              <w:instrText xml:space="preserve"> PAGEREF _Toc244263996 \h </w:instrText>
+              <w:instrText xml:space="preserve"> PAGEREF _Toc244264330 \h </w:instrText>
             </w:r>
             <w:r>
               <w:rPr>
@@ -768,7 +768,7 @@
               <w:noProof/>
             </w:rPr>
           </w:pPr>
-          <w:hyperlink w:anchor="_Toc244263997" w:history="1">
+          <w:hyperlink w:anchor="_Toc244264331" w:history="1">
             <w:r>
               <w:rPr>
                 <w:rStyle w:val="Collegamentoipertestuale"/>
@@ -792,7 +792,7 @@
               <w:rPr>
                 <w:noProof/>
               </w:rPr>
-              <w:instrText xml:space="preserve"> PAGEREF _Toc244263997 \h </w:instrText>
+              <w:instrText xml:space="preserve"> PAGEREF _Toc244264331 \h </w:instrText>
             </w:r>
             <w:r>
               <w:rPr>
@@ -829,7 +829,7 @@
               <w:noProof/>
             </w:rPr>
           </w:pPr>
-          <w:hyperlink w:anchor="_Toc244263998" w:history="1">
+          <w:hyperlink w:anchor="_Toc244264332" w:history="1">
             <w:r>
               <w:rPr>
                 <w:rStyle w:val="Collegamentoipertestuale"/>
@@ -853,7 +853,7 @@
               <w:rPr>
                 <w:noProof/>
               </w:rPr>
-              <w:instrText xml:space="preserve"> PAGEREF _Toc244263998 \h </w:instrText>
+              <w:instrText xml:space="preserve"> PAGEREF _Toc244264332 \h </w:instrText>
             </w:r>
             <w:r>
               <w:rPr>
@@ -890,7 +890,7 @@
               <w:noProof/>
             </w:rPr>
           </w:pPr>
-          <w:hyperlink w:anchor="_Toc244263999" w:history="1">
+          <w:hyperlink w:anchor="_Toc244264333" w:history="1">
             <w:r>
               <w:rPr>
                 <w:rStyle w:val="Collegamentoipertestuale"/>
@@ -914,7 +914,7 @@
               <w:rPr>
                 <w:noProof/>
               </w:rPr>
-              <w:instrText xml:space="preserve"> PAGEREF _Toc244263999 \h </w:instrText>
+              <w:instrText xml:space="preserve"> PAGEREF _Toc244264333 \h </w:instrText>
             </w:r>
             <w:r>
               <w:rPr>
@@ -951,7 +951,7 @@
               <w:noProof/>
             </w:rPr>
           </w:pPr>
-          <w:hyperlink w:anchor="_Toc244264000" w:history="1">
+          <w:hyperlink w:anchor="_Toc244264334" w:history="1">
             <w:r>
               <w:rPr>
                 <w:rStyle w:val="Collegamentoipertestuale"/>
@@ -975,7 +975,7 @@
               <w:rPr>
                 <w:noProof/>
               </w:rPr>
-              <w:instrText xml:space="preserve"> PAGEREF _Toc244264000 \h </w:instrText>
+              <w:instrText xml:space="preserve"> PAGEREF _Toc244264334 \h </w:instrText>
             </w:r>
             <w:r>
               <w:rPr>
@@ -1012,7 +1012,7 @@
               <w:noProof/>
             </w:rPr>
           </w:pPr>
-          <w:hyperlink w:anchor="_Toc244264001" w:history="1">
+          <w:hyperlink w:anchor="_Toc244264335" w:history="1">
             <w:r>
               <w:rPr>
                 <w:rStyle w:val="Collegamentoipertestuale"/>
@@ -1036,7 +1036,7 @@
               <w:rPr>
                 <w:noProof/>
               </w:rPr>
-              <w:instrText xml:space="preserve"> PAGEREF _Toc244264001 \h </w:instrText>
+              <w:instrText xml:space="preserve"> PAGEREF _Toc244264335 \h </w:instrText>
             </w:r>
             <w:r>
               <w:rPr>
@@ -1073,7 +1073,7 @@
               <w:noProof/>
             </w:rPr>
           </w:pPr>
-          <w:hyperlink w:anchor="_Toc244264002" w:history="1">
+          <w:hyperlink w:anchor="_Toc244264336" w:history="1">
             <w:r>
               <w:rPr>
                 <w:rStyle w:val="Collegamentoipertestuale"/>
@@ -1097,7 +1097,7 @@
               <w:rPr>
                 <w:noProof/>
               </w:rPr>
-              <w:instrText xml:space="preserve"> PAGEREF _Toc244264002 \h </w:instrText>
+              <w:instrText xml:space="preserve"> PAGEREF _Toc244264336 \h </w:instrText>
             </w:r>
             <w:r>
               <w:rPr>
@@ -1134,7 +1134,7 @@
               <w:noProof/>
             </w:rPr>
           </w:pPr>
-          <w:hyperlink w:anchor="_Toc244264003" w:history="1">
+          <w:hyperlink w:anchor="_Toc244264337" w:history="1">
             <w:r>
               <w:rPr>
                 <w:rStyle w:val="Collegamentoipertestuale"/>
@@ -1158,7 +1158,7 @@
               <w:rPr>
                 <w:noProof/>
               </w:rPr>
-              <w:instrText xml:space="preserve"> PAGEREF _Toc244264003 \h </w:instrText>
+              <w:instrText xml:space="preserve"> PAGEREF _Toc244264337 \h </w:instrText>
             </w:r>
             <w:r>
               <w:rPr>
@@ -1195,7 +1195,7 @@
               <w:noProof/>
             </w:rPr>
           </w:pPr>
-          <w:hyperlink w:anchor="_Toc244264004" w:history="1">
+          <w:hyperlink w:anchor="_Toc244264338" w:history="1">
             <w:r>
               <w:rPr>
                 <w:rStyle w:val="Collegamentoipertestuale"/>
@@ -1219,7 +1219,7 @@
               <w:rPr>
                 <w:noProof/>
               </w:rPr>
-              <w:instrText xml:space="preserve"> PAGEREF _Toc244264004 \h </w:instrText>
+              <w:instrText xml:space="preserve"> PAGEREF _Toc244264338 \h </w:instrText>
             </w:r>
             <w:r>
               <w:rPr>
@@ -1256,7 +1256,7 @@
               <w:noProof/>
             </w:rPr>
           </w:pPr>
-          <w:hyperlink w:anchor="_Toc244264005" w:history="1">
+          <w:hyperlink w:anchor="_Toc244264339" w:history="1">
             <w:r>
               <w:rPr>
                 <w:rStyle w:val="Collegamentoipertestuale"/>
@@ -1280,7 +1280,7 @@
               <w:rPr>
                 <w:noProof/>
               </w:rPr>
-              <w:instrText xml:space="preserve"> PAGEREF _Toc244264005 \h </w:instrText>
+              <w:instrText xml:space="preserve"> PAGEREF _Toc244264339 \h </w:instrText>
             </w:r>
             <w:r>
               <w:rPr>
@@ -1317,7 +1317,7 @@
               <w:noProof/>
             </w:rPr>
           </w:pPr>
-          <w:hyperlink w:anchor="_Toc244264006" w:history="1">
+          <w:hyperlink w:anchor="_Toc244264340" w:history="1">
             <w:r>
               <w:rPr>
                 <w:rStyle w:val="Collegamentoipertestuale"/>
@@ -1341,7 +1341,7 @@
               <w:rPr>
                 <w:noProof/>
               </w:rPr>
-              <w:instrText xml:space="preserve"> PAGEREF _Toc244264006 \h </w:instrText>
+              <w:instrText xml:space="preserve"> PAGEREF _Toc244264340 \h </w:instrText>
             </w:r>
             <w:r>
               <w:rPr>
@@ -1378,7 +1378,7 @@
               <w:noProof/>
             </w:rPr>
           </w:pPr>
-          <w:hyperlink w:anchor="_Toc244264007" w:history="1">
+          <w:hyperlink w:anchor="_Toc244264341" w:history="1">
             <w:r>
               <w:rPr>
                 <w:rStyle w:val="Collegamentoipertestuale"/>
@@ -1402,7 +1402,7 @@
               <w:rPr>
                 <w:noProof/>
               </w:rPr>
-              <w:instrText xml:space="preserve"> PAGEREF _Toc244264007 \h </w:instrText>
+              <w:instrText xml:space="preserve"> PAGEREF _Toc244264341 \h </w:instrText>
             </w:r>
             <w:r>
               <w:rPr>
@@ -1439,7 +1439,7 @@
               <w:noProof/>
             </w:rPr>
           </w:pPr>
-          <w:hyperlink w:anchor="_Toc244264008" w:history="1">
+          <w:hyperlink w:anchor="_Toc244264342" w:history="1">
             <w:r>
               <w:rPr>
                 <w:rStyle w:val="Collegamentoipertestuale"/>
@@ -1463,7 +1463,7 @@
               <w:rPr>
                 <w:noProof/>
               </w:rPr>
-              <w:instrText xml:space="preserve"> PAGEREF _Toc244264008 \h </w:instrText>
+              <w:instrText xml:space="preserve"> PAGEREF _Toc244264342 \h </w:instrText>
             </w:r>
             <w:r>
               <w:rPr>
@@ -1500,7 +1500,7 @@
               <w:noProof/>
             </w:rPr>
           </w:pPr>
-          <w:hyperlink w:anchor="_Toc244264009" w:history="1">
+          <w:hyperlink w:anchor="_Toc244264343" w:history="1">
             <w:r>
               <w:rPr>
                 <w:rStyle w:val="Collegamentoipertestuale"/>
@@ -1524,7 +1524,7 @@
               <w:rPr>
                 <w:noProof/>
               </w:rPr>
-              <w:instrText xml:space="preserve"> PAGEREF _Toc244264009 \h </w:instrText>
+              <w:instrText xml:space="preserve"> PAGEREF _Toc244264343 \h </w:instrText>
             </w:r>
             <w:r>
               <w:rPr>
@@ -1561,7 +1561,7 @@
               <w:noProof/>
             </w:rPr>
           </w:pPr>
-          <w:hyperlink w:anchor="_Toc244264010" w:history="1">
+          <w:hyperlink w:anchor="_Toc244264344" w:history="1">
             <w:r>
               <w:rPr>
                 <w:rStyle w:val="Collegamentoipertestuale"/>
@@ -1585,7 +1585,7 @@
               <w:rPr>
                 <w:noProof/>
               </w:rPr>
-              <w:instrText xml:space="preserve"> PAGEREF _Toc244264010 \h </w:instrText>
+              <w:instrText xml:space="preserve"> PAGEREF _Toc244264344 \h </w:instrText>
             </w:r>
             <w:r>
               <w:rPr>
@@ -1622,7 +1622,7 @@
               <w:noProof/>
             </w:rPr>
           </w:pPr>
-          <w:hyperlink w:anchor="_Toc244264011" w:history="1">
+          <w:hyperlink w:anchor="_Toc244264345" w:history="1">
             <w:r>
               <w:rPr>
                 <w:rStyle w:val="Collegamentoipertestuale"/>
@@ -1646,7 +1646,7 @@
               <w:rPr>
                 <w:noProof/>
               </w:rPr>
-              <w:instrText xml:space="preserve"> PAGEREF _Toc244264011 \h </w:instrText>
+              <w:instrText xml:space="preserve"> PAGEREF _Toc244264345 \h </w:instrText>
             </w:r>
             <w:r>
               <w:rPr>
@@ -1683,7 +1683,7 @@
               <w:noProof/>
             </w:rPr>
           </w:pPr>
-          <w:hyperlink w:anchor="_Toc244264012" w:history="1">
+          <w:hyperlink w:anchor="_Toc244264346" w:history="1">
             <w:r>
               <w:rPr>
                 <w:rStyle w:val="Collegamentoipertestuale"/>
@@ -1707,7 +1707,7 @@
               <w:rPr>
                 <w:noProof/>
               </w:rPr>
-              <w:instrText xml:space="preserve"> PAGEREF _Toc244264012 \h </w:instrText>
+              <w:instrText xml:space="preserve"> PAGEREF _Toc244264346 \h </w:instrText>
             </w:r>
             <w:r>
               <w:rPr>
@@ -1744,7 +1744,7 @@
               <w:noProof/>
             </w:rPr>
           </w:pPr>
-          <w:hyperlink w:anchor="_Toc244264013" w:history="1">
+          <w:hyperlink w:anchor="_Toc244264347" w:history="1">
             <w:r>
               <w:rPr>
                 <w:rStyle w:val="Collegamentoipertestuale"/>
@@ -1768,7 +1768,7 @@
               <w:rPr>
                 <w:noProof/>
               </w:rPr>
-              <w:instrText xml:space="preserve"> PAGEREF _Toc244264013 \h </w:instrText>
+              <w:instrText xml:space="preserve"> PAGEREF _Toc244264347 \h </w:instrText>
             </w:r>
             <w:r>
               <w:rPr>
@@ -1805,7 +1805,7 @@
               <w:noProof/>
             </w:rPr>
           </w:pPr>
-          <w:hyperlink w:anchor="_Toc244264014" w:history="1">
+          <w:hyperlink w:anchor="_Toc244264348" w:history="1">
             <w:r>
               <w:rPr>
                 <w:rStyle w:val="Collegamentoipertestuale"/>
@@ -1829,7 +1829,7 @@
               <w:rPr>
                 <w:noProof/>
               </w:rPr>
-              <w:instrText xml:space="preserve"> PAGEREF _Toc244264014 \h </w:instrText>
+              <w:instrText xml:space="preserve"> PAGEREF _Toc244264348 \h </w:instrText>
             </w:r>
             <w:r>
               <w:rPr>
@@ -1866,7 +1866,7 @@
               <w:noProof/>
             </w:rPr>
           </w:pPr>
-          <w:hyperlink w:anchor="_Toc244264015" w:history="1">
+          <w:hyperlink w:anchor="_Toc244264349" w:history="1">
             <w:r>
               <w:rPr>
                 <w:rStyle w:val="Collegamentoipertestuale"/>
@@ -1890,7 +1890,7 @@
               <w:rPr>
                 <w:noProof/>
               </w:rPr>
-              <w:instrText xml:space="preserve"> PAGEREF _Toc244264015 \h </w:instrText>
+              <w:instrText xml:space="preserve"> PAGEREF _Toc244264349 \h </w:instrText>
             </w:r>
             <w:r>
               <w:rPr>
@@ -1927,7 +1927,7 @@
               <w:noProof/>
             </w:rPr>
           </w:pPr>
-          <w:hyperlink w:anchor="_Toc244264016" w:history="1">
+          <w:hyperlink w:anchor="_Toc244264350" w:history="1">
             <w:r>
               <w:rPr>
                 <w:rStyle w:val="Collegamentoipertestuale"/>
@@ -1951,7 +1951,7 @@
               <w:rPr>
                 <w:noProof/>
               </w:rPr>
-              <w:instrText xml:space="preserve"> PAGEREF _Toc244264016 \h </w:instrText>
+              <w:instrText xml:space="preserve"> PAGEREF _Toc244264350 \h </w:instrText>
             </w:r>
             <w:r>
               <w:rPr>
@@ -1988,7 +1988,7 @@
               <w:noProof/>
             </w:rPr>
           </w:pPr>
-          <w:hyperlink w:anchor="_Toc244264017" w:history="1">
+          <w:hyperlink w:anchor="_Toc244264351" w:history="1">
             <w:r>
               <w:rPr>
                 <w:rStyle w:val="Collegamentoipertestuale"/>
@@ -2012,7 +2012,7 @@
               <w:rPr>
                 <w:noProof/>
               </w:rPr>
-              <w:instrText xml:space="preserve"> PAGEREF _Toc244264017 \h </w:instrText>
+              <w:instrText xml:space="preserve"> PAGEREF _Toc244264351 \h </w:instrText>
             </w:r>
             <w:r>
               <w:rPr>
@@ -2049,7 +2049,7 @@
               <w:noProof/>
             </w:rPr>
           </w:pPr>
-          <w:hyperlink w:anchor="_Toc244264018" w:history="1">
+          <w:hyperlink w:anchor="_Toc244264352" w:history="1">
             <w:r>
               <w:rPr>
                 <w:rStyle w:val="Collegamentoipertestuale"/>
@@ -2073,7 +2073,7 @@
               <w:rPr>
                 <w:noProof/>
               </w:rPr>
-              <w:instrText xml:space="preserve"> PAGEREF _Toc244264018 \h </w:instrText>
+              <w:instrText xml:space="preserve"> PAGEREF _Toc244264352 \h </w:instrText>
             </w:r>
             <w:r>
               <w:rPr>
@@ -2110,7 +2110,7 @@
               <w:noProof/>
             </w:rPr>
           </w:pPr>
-          <w:hyperlink w:anchor="_Toc244264019" w:history="1">
+          <w:hyperlink w:anchor="_Toc244264353" w:history="1">
             <w:r>
               <w:rPr>
                 <w:rStyle w:val="Collegamentoipertestuale"/>
@@ -2134,7 +2134,7 @@
               <w:rPr>
                 <w:noProof/>
               </w:rPr>
-              <w:instrText xml:space="preserve"> PAGEREF _Toc244264019 \h </w:instrText>
+              <w:instrText xml:space="preserve"> PAGEREF _Toc244264353 \h </w:instrText>
             </w:r>
             <w:r>
               <w:rPr>
@@ -2171,13 +2171,13 @@
               <w:noProof/>
             </w:rPr>
           </w:pPr>
-          <w:hyperlink w:anchor="_Toc244264020" w:history="1">
+          <w:hyperlink w:anchor="_Toc244264354" w:history="1">
             <w:r>
               <w:rPr>
                 <w:rStyle w:val="Collegamentoipertestuale"/>
                 <w:noProof/>
               </w:rPr>
-              <w:t>4.21 Dominio dell'autore: pdfz.agjin.com (versione 1.6.1)</w:t>
+              <w:t>4.21 Dominio dell'autore: pdfz.agjin.com (versione 1.6.2)</w:t>
             </w:r>
             <w:r>
               <w:rPr>
@@ -2195,7 +2195,7 @@
               <w:rPr>
                 <w:noProof/>
               </w:rPr>
-              <w:instrText xml:space="preserve"> PAGEREF _Toc244264020 \h </w:instrText>
+              <w:instrText xml:space="preserve"> PAGEREF _Toc244264354 \h </w:instrText>
             </w:r>
             <w:r>
               <w:rPr>
@@ -2232,7 +2232,7 @@
               <w:noProof/>
             </w:rPr>
           </w:pPr>
-          <w:hyperlink w:anchor="_Toc244264021" w:history="1">
+          <w:hyperlink w:anchor="_Toc244264355" w:history="1">
             <w:r>
               <w:rPr>
                 <w:rStyle w:val="Collegamentoipertestuale"/>
@@ -2256,7 +2256,7 @@
               <w:rPr>
                 <w:noProof/>
               </w:rPr>
-              <w:instrText xml:space="preserve"> PAGEREF _Toc244264021 \h </w:instrText>
+              <w:instrText xml:space="preserve"> PAGEREF _Toc244264355 \h </w:instrText>
             </w:r>
             <w:r>
               <w:rPr>
@@ -2293,7 +2293,7 @@
               <w:noProof/>
             </w:rPr>
           </w:pPr>
-          <w:hyperlink w:anchor="_Toc244264022" w:history="1">
+          <w:hyperlink w:anchor="_Toc244264356" w:history="1">
             <w:r>
               <w:rPr>
                 <w:rStyle w:val="Collegamentoipertestuale"/>
@@ -2317,7 +2317,7 @@
               <w:rPr>
                 <w:noProof/>
               </w:rPr>
-              <w:instrText xml:space="preserve"> PAGEREF _Toc244264022 \h </w:instrText>
+              <w:instrText xml:space="preserve"> PAGEREF _Toc244264356 \h </w:instrText>
             </w:r>
             <w:r>
               <w:rPr>
@@ -2354,7 +2354,7 @@
               <w:noProof/>
             </w:rPr>
           </w:pPr>
-          <w:hyperlink w:anchor="_Toc244264023" w:history="1">
+          <w:hyperlink w:anchor="_Toc244264357" w:history="1">
             <w:r>
               <w:rPr>
                 <w:rStyle w:val="Collegamentoipertestuale"/>
@@ -2378,7 +2378,7 @@
               <w:rPr>
                 <w:noProof/>
               </w:rPr>
-              <w:instrText xml:space="preserve"> PAGEREF _Toc244264023 \h </w:instrText>
+              <w:instrText xml:space="preserve"> PAGEREF _Toc244264357 \h </w:instrText>
             </w:r>
             <w:r>
               <w:rPr>
@@ -2415,7 +2415,7 @@
               <w:noProof/>
             </w:rPr>
           </w:pPr>
-          <w:hyperlink w:anchor="_Toc244264024" w:history="1">
+          <w:hyperlink w:anchor="_Toc244264358" w:history="1">
             <w:r>
               <w:rPr>
                 <w:rStyle w:val="Collegamentoipertestuale"/>
@@ -2439,7 +2439,7 @@
               <w:rPr>
                 <w:noProof/>
               </w:rPr>
-              <w:instrText xml:space="preserve"> PAGEREF _Toc244264024 \h </w:instrText>
+              <w:instrText xml:space="preserve"> PAGEREF _Toc244264358 \h </w:instrText>
             </w:r>
             <w:r>
               <w:rPr>
@@ -2476,7 +2476,7 @@
               <w:noProof/>
             </w:rPr>
           </w:pPr>
-          <w:hyperlink w:anchor="_Toc244264025" w:history="1">
+          <w:hyperlink w:anchor="_Toc244264359" w:history="1">
             <w:r>
               <w:rPr>
                 <w:rStyle w:val="Collegamentoipertestuale"/>
@@ -2500,7 +2500,7 @@
               <w:rPr>
                 <w:noProof/>
               </w:rPr>
-              <w:instrText xml:space="preserve"> PAGEREF _Toc244264025 \h </w:instrText>
+              <w:instrText xml:space="preserve"> PAGEREF _Toc244264359 \h </w:instrText>
             </w:r>
             <w:r>
               <w:rPr>
@@ -2537,7 +2537,7 @@
               <w:noProof/>
             </w:rPr>
           </w:pPr>
-          <w:hyperlink w:anchor="_Toc244264026" w:history="1">
+          <w:hyperlink w:anchor="_Toc244264360" w:history="1">
             <w:r>
               <w:rPr>
                 <w:rStyle w:val="Collegamentoipertestuale"/>
@@ -2561,7 +2561,7 @@
               <w:rPr>
                 <w:noProof/>
               </w:rPr>
-              <w:instrText xml:space="preserve"> PAGEREF _Toc244264026 \h </w:instrText>
+              <w:instrText xml:space="preserve"> PAGEREF _Toc244264360 \h </w:instrText>
             </w:r>
             <w:r>
               <w:rPr>
@@ -2598,7 +2598,7 @@
               <w:noProof/>
             </w:rPr>
           </w:pPr>
-          <w:hyperlink w:anchor="_Toc244264027" w:history="1">
+          <w:hyperlink w:anchor="_Toc244264361" w:history="1">
             <w:r>
               <w:rPr>
                 <w:rStyle w:val="Collegamentoipertestuale"/>
@@ -2622,7 +2622,7 @@
               <w:rPr>
                 <w:noProof/>
               </w:rPr>
-              <w:instrText xml:space="preserve"> PAGEREF _Toc244264027 \h </w:instrText>
+              <w:instrText xml:space="preserve"> PAGEREF _Toc244264361 \h </w:instrText>
             </w:r>
             <w:r>
               <w:rPr>
@@ -2659,7 +2659,7 @@
               <w:noProof/>
             </w:rPr>
           </w:pPr>
-          <w:hyperlink w:anchor="_Toc244264028" w:history="1">
+          <w:hyperlink w:anchor="_Toc244264362" w:history="1">
             <w:r>
               <w:rPr>
                 <w:rStyle w:val="Collegamentoipertestuale"/>
@@ -2683,7 +2683,7 @@
               <w:rPr>
                 <w:noProof/>
               </w:rPr>
-              <w:instrText xml:space="preserve"> PAGEREF _Toc244264028 \h </w:instrText>
+              <w:instrText xml:space="preserve"> PAGEREF _Toc244264362 \h </w:instrText>
             </w:r>
             <w:r>
               <w:rPr>
@@ -2720,7 +2720,7 @@
               <w:noProof/>
             </w:rPr>
           </w:pPr>
-          <w:hyperlink w:anchor="_Toc244264029" w:history="1">
+          <w:hyperlink w:anchor="_Toc244264363" w:history="1">
             <w:r>
               <w:rPr>
                 <w:rStyle w:val="Collegamentoipertestuale"/>
@@ -2744,7 +2744,7 @@
               <w:rPr>
                 <w:noProof/>
               </w:rPr>
-              <w:instrText xml:space="preserve"> PAGEREF _Toc244264029 \h </w:instrText>
+              <w:instrText xml:space="preserve"> PAGEREF _Toc244264363 \h </w:instrText>
             </w:r>
             <w:r>
               <w:rPr>
@@ -2781,7 +2781,7 @@
               <w:noProof/>
             </w:rPr>
           </w:pPr>
-          <w:hyperlink w:anchor="_Toc244264030" w:history="1">
+          <w:hyperlink w:anchor="_Toc244264364" w:history="1">
             <w:r>
               <w:rPr>
                 <w:rStyle w:val="Collegamentoipertestuale"/>
@@ -2805,7 +2805,7 @@
               <w:rPr>
                 <w:noProof/>
               </w:rPr>
-              <w:instrText xml:space="preserve"> PAGEREF _Toc244264030 \h </w:instrText>
+              <w:instrText xml:space="preserve"> PAGEREF _Toc244264364 \h </w:instrText>
             </w:r>
             <w:r>
               <w:rPr>
@@ -2842,7 +2842,7 @@
               <w:noProof/>
             </w:rPr>
           </w:pPr>
-          <w:hyperlink w:anchor="_Toc244264031" w:history="1">
+          <w:hyperlink w:anchor="_Toc244264365" w:history="1">
             <w:r>
               <w:rPr>
                 <w:rStyle w:val="Collegamentoipertestuale"/>
@@ -2866,7 +2866,7 @@
               <w:rPr>
                 <w:noProof/>
               </w:rPr>
-              <w:instrText xml:space="preserve"> PAGEREF _Toc244264031 \h </w:instrText>
+              <w:instrText xml:space="preserve"> PAGEREF _Toc244264365 \h </w:instrText>
             </w:r>
             <w:r>
               <w:rPr>
@@ -2903,7 +2903,7 @@
               <w:noProof/>
             </w:rPr>
           </w:pPr>
-          <w:hyperlink w:anchor="_Toc244264032" w:history="1">
+          <w:hyperlink w:anchor="_Toc244264366" w:history="1">
             <w:r>
               <w:rPr>
                 <w:rStyle w:val="Collegamentoipertestuale"/>
@@ -2927,7 +2927,7 @@
               <w:rPr>
                 <w:noProof/>
               </w:rPr>
-              <w:instrText xml:space="preserve"> PAGEREF _Toc244264032 \h </w:instrText>
+              <w:instrText xml:space="preserve"> PAGEREF _Toc244264366 \h </w:instrText>
             </w:r>
             <w:r>
               <w:rPr>
@@ -2964,7 +2964,7 @@
               <w:noProof/>
             </w:rPr>
           </w:pPr>
-          <w:hyperlink w:anchor="_Toc244264033" w:history="1">
+          <w:hyperlink w:anchor="_Toc244264367" w:history="1">
             <w:r>
               <w:rPr>
                 <w:rStyle w:val="Collegamentoipertestuale"/>
@@ -2988,7 +2988,7 @@
               <w:rPr>
                 <w:noProof/>
               </w:rPr>
-              <w:instrText xml:space="preserve"> PAGEREF _Toc244264033 \h </w:instrText>
+              <w:instrText xml:space="preserve"> PAGEREF _Toc244264367 \h </w:instrText>
             </w:r>
             <w:r>
               <w:rPr>
@@ -3025,7 +3025,7 @@
               <w:noProof/>
             </w:rPr>
           </w:pPr>
-          <w:hyperlink w:anchor="_Toc244264034" w:history="1">
+          <w:hyperlink w:anchor="_Toc244264368" w:history="1">
             <w:r>
               <w:rPr>
                 <w:rStyle w:val="Collegamentoipertestuale"/>
@@ -3049,7 +3049,7 @@
               <w:rPr>
                 <w:noProof/>
               </w:rPr>
-              <w:instrText xml:space="preserve"> PAGEREF _Toc244264034 \h </w:instrText>
+              <w:instrText xml:space="preserve"> PAGEREF _Toc244264368 \h </w:instrText>
             </w:r>
             <w:r>
               <w:rPr>
@@ -3086,7 +3086,7 @@
               <w:noProof/>
             </w:rPr>
           </w:pPr>
-          <w:hyperlink w:anchor="_Toc244264035" w:history="1">
+          <w:hyperlink w:anchor="_Toc244264369" w:history="1">
             <w:r>
               <w:rPr>
                 <w:rStyle w:val="Collegamentoipertestuale"/>
@@ -3110,7 +3110,7 @@
               <w:rPr>
                 <w:noProof/>
               </w:rPr>
-              <w:instrText xml:space="preserve"> PAGEREF _Toc244264035 \h </w:instrText>
+              <w:instrText xml:space="preserve"> PAGEREF _Toc244264369 \h </w:instrText>
             </w:r>
             <w:r>
               <w:rPr>
@@ -3147,7 +3147,7 @@
               <w:noProof/>
             </w:rPr>
           </w:pPr>
-          <w:hyperlink w:anchor="_Toc244264036" w:history="1">
+          <w:hyperlink w:anchor="_Toc244264370" w:history="1">
             <w:r>
               <w:rPr>
                 <w:rStyle w:val="Collegamentoipertestuale"/>
@@ -3171,7 +3171,7 @@
               <w:rPr>
                 <w:noProof/>
               </w:rPr>
-              <w:instrText xml:space="preserve"> PAGEREF _Toc244264036 \h </w:instrText>
+              <w:instrText xml:space="preserve"> PAGEREF _Toc244264370 \h </w:instrText>
             </w:r>
             <w:r>
               <w:rPr>
@@ -3208,7 +3208,7 @@
               <w:noProof/>
             </w:rPr>
           </w:pPr>
-          <w:hyperlink w:anchor="_Toc244264037" w:history="1">
+          <w:hyperlink w:anchor="_Toc244264371" w:history="1">
             <w:r>
               <w:rPr>
                 <w:rStyle w:val="Collegamentoipertestuale"/>
@@ -3232,7 +3232,7 @@
               <w:rPr>
                 <w:noProof/>
               </w:rPr>
-              <w:instrText xml:space="preserve"> PAGEREF _Toc244264037 \h </w:instrText>
+              <w:instrText xml:space="preserve"> PAGEREF _Toc244264371 \h </w:instrText>
             </w:r>
             <w:r>
               <w:rPr>
@@ -3269,7 +3269,7 @@
               <w:noProof/>
             </w:rPr>
           </w:pPr>
-          <w:hyperlink w:anchor="_Toc244264038" w:history="1">
+          <w:hyperlink w:anchor="_Toc244264372" w:history="1">
             <w:r>
               <w:rPr>
                 <w:rStyle w:val="Collegamentoipertestuale"/>
@@ -3293,7 +3293,7 @@
               <w:rPr>
                 <w:noProof/>
               </w:rPr>
-              <w:instrText xml:space="preserve"> PAGEREF _Toc244264038 \h </w:instrText>
+              <w:instrText xml:space="preserve"> PAGEREF _Toc244264372 \h </w:instrText>
             </w:r>
             <w:r>
               <w:rPr>
@@ -3330,7 +3330,7 @@
               <w:noProof/>
             </w:rPr>
           </w:pPr>
-          <w:hyperlink w:anchor="_Toc244264039" w:history="1">
+          <w:hyperlink w:anchor="_Toc244264373" w:history="1">
             <w:r>
               <w:rPr>
                 <w:rStyle w:val="Collegamentoipertestuale"/>
@@ -3354,7 +3354,7 @@
               <w:rPr>
                 <w:noProof/>
               </w:rPr>
-              <w:instrText xml:space="preserve"> PAGEREF _Toc244264039 \h </w:instrText>
+              <w:instrText xml:space="preserve"> PAGEREF _Toc244264373 \h </w:instrText>
             </w:r>
             <w:r>
               <w:rPr>
@@ -3391,7 +3391,7 @@
               <w:noProof/>
             </w:rPr>
           </w:pPr>
-          <w:hyperlink w:anchor="_Toc244264040" w:history="1">
+          <w:hyperlink w:anchor="_Toc244264374" w:history="1">
             <w:r>
               <w:rPr>
                 <w:rStyle w:val="Collegamentoipertestuale"/>
@@ -3415,7 +3415,7 @@
               <w:rPr>
                 <w:noProof/>
               </w:rPr>
-              <w:instrText xml:space="preserve"> PAGEREF _Toc244264040 \h </w:instrText>
+              <w:instrText xml:space="preserve"> PAGEREF _Toc244264374 \h </w:instrText>
             </w:r>
             <w:r>
               <w:rPr>
@@ -3452,7 +3452,7 @@
               <w:noProof/>
             </w:rPr>
           </w:pPr>
-          <w:hyperlink w:anchor="_Toc244264041" w:history="1">
+          <w:hyperlink w:anchor="_Toc244264375" w:history="1">
             <w:r>
               <w:rPr>
                 <w:rStyle w:val="Collegamentoipertestuale"/>
@@ -3476,7 +3476,7 @@
               <w:rPr>
                 <w:noProof/>
               </w:rPr>
-              <w:instrText xml:space="preserve"> PAGEREF _Toc244264041 \h </w:instrText>
+              <w:instrText xml:space="preserve"> PAGEREF _Toc244264375 \h </w:instrText>
             </w:r>
             <w:r>
               <w:rPr>
@@ -3513,7 +3513,7 @@
               <w:noProof/>
             </w:rPr>
           </w:pPr>
-          <w:hyperlink w:anchor="_Toc244264042" w:history="1">
+          <w:hyperlink w:anchor="_Toc244264376" w:history="1">
             <w:r>
               <w:rPr>
                 <w:rStyle w:val="Collegamentoipertestuale"/>
@@ -3537,7 +3537,7 @@
               <w:rPr>
                 <w:noProof/>
               </w:rPr>
-              <w:instrText xml:space="preserve"> PAGEREF _Toc244264042 \h </w:instrText>
+              <w:instrText xml:space="preserve"> PAGEREF _Toc244264376 \h </w:instrText>
             </w:r>
             <w:r>
               <w:rPr>
@@ -3574,7 +3574,7 @@
               <w:noProof/>
             </w:rPr>
           </w:pPr>
-          <w:hyperlink w:anchor="_Toc244264043" w:history="1">
+          <w:hyperlink w:anchor="_Toc244264377" w:history="1">
             <w:r>
               <w:rPr>
                 <w:rStyle w:val="Collegamentoipertestuale"/>
@@ -3598,7 +3598,7 @@
               <w:rPr>
                 <w:noProof/>
               </w:rPr>
-              <w:instrText xml:space="preserve"> PAGEREF _Toc244264043 \h </w:instrText>
+              <w:instrText xml:space="preserve"> PAGEREF _Toc244264377 \h </w:instrText>
             </w:r>
             <w:r>
               <w:rPr>
@@ -3635,7 +3635,7 @@
               <w:noProof/>
             </w:rPr>
           </w:pPr>
-          <w:hyperlink w:anchor="_Toc244264044" w:history="1">
+          <w:hyperlink w:anchor="_Toc244264378" w:history="1">
             <w:r>
               <w:rPr>
                 <w:rStyle w:val="Collegamentoipertestuale"/>
@@ -3659,7 +3659,7 @@
               <w:rPr>
                 <w:noProof/>
               </w:rPr>
-              <w:instrText xml:space="preserve"> PAGEREF _Toc244264044 \h </w:instrText>
+              <w:instrText xml:space="preserve"> PAGEREF _Toc244264378 \h </w:instrText>
             </w:r>
             <w:r>
               <w:rPr>
@@ -3696,7 +3696,7 @@
               <w:noProof/>
             </w:rPr>
           </w:pPr>
-          <w:hyperlink w:anchor="_Toc244264045" w:history="1">
+          <w:hyperlink w:anchor="_Toc244264379" w:history="1">
             <w:r>
               <w:rPr>
                 <w:rStyle w:val="Collegamentoipertestuale"/>
@@ -3720,7 +3720,7 @@
               <w:rPr>
                 <w:noProof/>
               </w:rPr>
-              <w:instrText xml:space="preserve"> PAGEREF _Toc244264045 \h </w:instrText>
+              <w:instrText xml:space="preserve"> PAGEREF _Toc244264379 \h </w:instrText>
             </w:r>
             <w:r>
               <w:rPr>
@@ -3757,13 +3757,13 @@
               <w:noProof/>
             </w:rPr>
           </w:pPr>
-          <w:hyperlink w:anchor="_Toc244264046" w:history="1">
+          <w:hyperlink w:anchor="_Toc244264380" w:history="1">
             <w:r>
               <w:rPr>
                 <w:rStyle w:val="Collegamentoipertestuale"/>
                 <w:noProof/>
               </w:rPr>
-              <w:t>6.15 Versione 1.6.1</w:t>
+              <w:t>6.15 Versione 1.6.2</w:t>
             </w:r>
             <w:r>
               <w:rPr>
@@ -3781,7 +3781,7 @@
               <w:rPr>
                 <w:noProof/>
               </w:rPr>
-              <w:instrText xml:space="preserve"> PAGEREF _Toc244264046 \h </w:instrText>
+              <w:instrText xml:space="preserve"> PAGEREF _Toc244264380 \h </w:instrText>
             </w:r>
             <w:r>
               <w:rPr>
@@ -3818,7 +3818,7 @@
               <w:noProof/>
             </w:rPr>
           </w:pPr>
-          <w:hyperlink w:anchor="_Toc244264047" w:history="1">
+          <w:hyperlink w:anchor="_Toc244264381" w:history="1">
             <w:r>
               <w:rPr>
                 <w:rStyle w:val="Collegamentoipertestuale"/>
@@ -3842,7 +3842,7 @@
               <w:rPr>
                 <w:noProof/>
               </w:rPr>
-              <w:instrText xml:space="preserve"> PAGEREF _Toc244264047 \h </w:instrText>
+              <w:instrText xml:space="preserve"> PAGEREF _Toc244264381 \h </w:instrText>
             </w:r>
             <w:r>
               <w:rPr>
@@ -3879,7 +3879,7 @@
               <w:noProof/>
             </w:rPr>
           </w:pPr>
-          <w:hyperlink w:anchor="_Toc244264048" w:history="1">
+          <w:hyperlink w:anchor="_Toc244264382" w:history="1">
             <w:r>
               <w:rPr>
                 <w:rStyle w:val="Collegamentoipertestuale"/>
@@ -3903,7 +3903,7 @@
               <w:rPr>
                 <w:noProof/>
               </w:rPr>
-              <w:instrText xml:space="preserve"> PAGEREF _Toc244264048 \h </w:instrText>
+              <w:instrText xml:space="preserve"> PAGEREF _Toc244264382 \h </w:instrText>
             </w:r>
             <w:r>
               <w:rPr>
@@ -3940,7 +3940,7 @@
               <w:noProof/>
             </w:rPr>
           </w:pPr>
-          <w:hyperlink w:anchor="_Toc244264049" w:history="1">
+          <w:hyperlink w:anchor="_Toc244264383" w:history="1">
             <w:r>
               <w:rPr>
                 <w:rStyle w:val="Collegamentoipertestuale"/>
@@ -3964,7 +3964,7 @@
               <w:rPr>
                 <w:noProof/>
               </w:rPr>
-              <w:instrText xml:space="preserve"> PAGEREF _Toc244264049 \h </w:instrText>
+              <w:instrText xml:space="preserve"> PAGEREF _Toc244264383 \h </w:instrText>
             </w:r>
             <w:r>
               <w:rPr>
@@ -4001,7 +4001,7 @@
               <w:noProof/>
             </w:rPr>
           </w:pPr>
-          <w:hyperlink w:anchor="_Toc244264050" w:history="1">
+          <w:hyperlink w:anchor="_Toc244264384" w:history="1">
             <w:r>
               <w:rPr>
                 <w:rStyle w:val="Collegamentoipertestuale"/>
@@ -4025,7 +4025,7 @@
               <w:rPr>
                 <w:noProof/>
               </w:rPr>
-              <w:instrText xml:space="preserve"> PAGEREF _Toc244264050 \h </w:instrText>
+              <w:instrText xml:space="preserve"> PAGEREF _Toc244264384 \h </w:instrText>
             </w:r>
             <w:r>
               <w:rPr>
@@ -4062,7 +4062,7 @@
               <w:noProof/>
             </w:rPr>
           </w:pPr>
-          <w:hyperlink w:anchor="_Toc244264051" w:history="1">
+          <w:hyperlink w:anchor="_Toc244264385" w:history="1">
             <w:r>
               <w:rPr>
                 <w:rStyle w:val="Collegamentoipertestuale"/>
@@ -4086,7 +4086,7 @@
               <w:rPr>
                 <w:noProof/>
               </w:rPr>
-              <w:instrText xml:space="preserve"> PAGEREF _Toc244264051 \h </w:instrText>
+              <w:instrText xml:space="preserve"> PAGEREF _Toc244264385 \h </w:instrText>
             </w:r>
             <w:r>
               <w:rPr>
@@ -4123,7 +4123,7 @@
               <w:noProof/>
             </w:rPr>
           </w:pPr>
-          <w:hyperlink w:anchor="_Toc244264052" w:history="1">
+          <w:hyperlink w:anchor="_Toc244264386" w:history="1">
             <w:r>
               <w:rPr>
                 <w:rStyle w:val="Collegamentoipertestuale"/>
@@ -4147,7 +4147,7 @@
               <w:rPr>
                 <w:noProof/>
               </w:rPr>
-              <w:instrText xml:space="preserve"> PAGEREF _Toc244264052 \h </w:instrText>
+              <w:instrText xml:space="preserve"> PAGEREF _Toc244264386 \h </w:instrText>
             </w:r>
             <w:r>
               <w:rPr>
@@ -4184,7 +4184,7 @@
               <w:noProof/>
             </w:rPr>
           </w:pPr>
-          <w:hyperlink w:anchor="_Toc244264053" w:history="1">
+          <w:hyperlink w:anchor="_Toc244264387" w:history="1">
             <w:r>
               <w:rPr>
                 <w:rStyle w:val="Collegamentoipertestuale"/>
@@ -4208,7 +4208,7 @@
               <w:rPr>
                 <w:noProof/>
               </w:rPr>
-              <w:instrText xml:space="preserve"> PAGEREF _Toc244264053 \h </w:instrText>
+              <w:instrText xml:space="preserve"> PAGEREF _Toc244264387 \h </w:instrText>
             </w:r>
             <w:r>
               <w:rPr>
@@ -4245,7 +4245,7 @@
               <w:noProof/>
             </w:rPr>
           </w:pPr>
-          <w:hyperlink w:anchor="_Toc244264054" w:history="1">
+          <w:hyperlink w:anchor="_Toc244264388" w:history="1">
             <w:r>
               <w:rPr>
                 <w:rStyle w:val="Collegamentoipertestuale"/>
@@ -4269,7 +4269,7 @@
               <w:rPr>
                 <w:noProof/>
               </w:rPr>
-              <w:instrText xml:space="preserve"> PAGEREF _Toc244264054 \h </w:instrText>
+              <w:instrText xml:space="preserve"> PAGEREF _Toc244264388 \h </w:instrText>
             </w:r>
             <w:r>
               <w:rPr>
@@ -4312,7 +4312,7 @@
       <w:pPr>
         <w:pStyle w:val="Titolo1"/>
       </w:pPr>
-      <w:bookmarkStart w:id="0" w:name="_Toc244263987"/>
+      <w:bookmarkStart w:id="0" w:name="_Toc244264321"/>
       <w:r>
         <w:t>1. In breve</w:t>
       </w:r>
@@ -4557,10 +4557,10 @@
           <w:b/>
           <w:bCs/>
         </w:rPr>
-        <w:t>versione 1.6.1</w:t>
-      </w:r>
-      <w:r>
-        <w:t xml:space="preserve"> (30 ottobre): il sito degli aggiornamenti è sul dominio dell'autore </w:t>
+        <w:t>versione 1.6.2</w:t>
+      </w:r>
+      <w:r>
+        <w:t xml:space="preserve"> (30 ottobre; la 1.6.1 non è uscita): il sito degli aggiornamenti è sul dominio dell'autore </w:t>
       </w:r>
       <w:r>
         <w:rPr>
@@ -4783,7 +4783,7 @@
       <w:pPr>
         <w:pStyle w:val="Titolo1"/>
       </w:pPr>
-      <w:bookmarkStart w:id="1" w:name="_Toc244263988"/>
+      <w:bookmarkStart w:id="1" w:name="_Toc244264322"/>
       <w:r>
         <w:t>2. Nuovo marchio</w:t>
       </w:r>
@@ -4793,7 +4793,7 @@
       <w:pPr>
         <w:pStyle w:val="Titolo2"/>
       </w:pPr>
-      <w:bookmarkStart w:id="2" w:name="_Toc244263989"/>
+      <w:bookmarkStart w:id="2" w:name="_Toc244264323"/>
       <w:r>
         <w:t>2.1 Nomi e identificativi</w:t>
       </w:r>
@@ -5339,7 +5339,7 @@
       <w:pPr>
         <w:pStyle w:val="Titolo2"/>
       </w:pPr>
-      <w:bookmarkStart w:id="3" w:name="_Toc244263990"/>
+      <w:bookmarkStart w:id="3" w:name="_Toc244264324"/>
       <w:r>
         <w:t>2.2 Colori</w:t>
       </w:r>
@@ -5734,7 +5734,7 @@
       <w:pPr>
         <w:pStyle w:val="Titolo2"/>
       </w:pPr>
-      <w:bookmarkStart w:id="4" w:name="_Toc244263991"/>
+      <w:bookmarkStart w:id="4" w:name="_Toc244264325"/>
       <w:r>
         <w:t>2.3 Icona in uso: 24 «Foglio senza fondo» (serie 6, 22 ottobre)</w:t>
       </w:r>
@@ -5768,7 +5768,7 @@
           <w:noProof/>
         </w:rPr>
         <w:drawing>
-          <wp:inline distT="0" distB="0" distL="0" distR="0" wp14:anchorId="3AC8D6C1" wp14:editId="45E3733E">
+          <wp:inline distT="0" distB="0" distL="0" distR="0" wp14:anchorId="0DE1E679" wp14:editId="2E536515">
             <wp:extent cx="3429000" cy="4000500"/>
             <wp:effectExtent l="0" t="0" r="0" b="0"/>
             <wp:docPr id="2" name="Immagine 2"/>
@@ -5827,7 +5827,7 @@
       <w:pPr>
         <w:pStyle w:val="Titolo2"/>
       </w:pPr>
-      <w:bookmarkStart w:id="5" w:name="_Toc244263992"/>
+      <w:bookmarkStart w:id="5" w:name="_Toc244264326"/>
       <w:r>
         <w:t>2.4 Serie 4: la 17 «Foglio oro», in uso fino al 21 ottobre</w:t>
       </w:r>
@@ -5861,7 +5861,7 @@
           <w:noProof/>
         </w:rPr>
         <w:drawing>
-          <wp:inline distT="0" distB="0" distL="0" distR="0" wp14:anchorId="41C8F627" wp14:editId="55980DD5">
+          <wp:inline distT="0" distB="0" distL="0" distR="0" wp14:anchorId="5059A826" wp14:editId="1A94ABA0">
             <wp:extent cx="5334000" cy="5895975"/>
             <wp:effectExtent l="0" t="0" r="0" b="0"/>
             <wp:docPr id="3" name="Immagine 3"/>
@@ -6274,7 +6274,7 @@
       <w:pPr>
         <w:pStyle w:val="Titolo2"/>
       </w:pPr>
-      <w:bookmarkStart w:id="6" w:name="_Toc244263993"/>
+      <w:bookmarkStart w:id="6" w:name="_Toc244264327"/>
       <w:r>
         <w:t>2.5 Serie 5: la 17 con più bianco, la 19 in uso il 21 ottobre</w:t>
       </w:r>
@@ -6308,7 +6308,7 @@
           <w:noProof/>
         </w:rPr>
         <w:drawing>
-          <wp:inline distT="0" distB="0" distL="0" distR="0" wp14:anchorId="45579226" wp14:editId="4B8E999D">
+          <wp:inline distT="0" distB="0" distL="0" distR="0" wp14:anchorId="5488C93A" wp14:editId="1E9CA770">
             <wp:extent cx="5715000" cy="3295650"/>
             <wp:effectExtent l="0" t="0" r="0" b="0"/>
             <wp:docPr id="4" name="Immagine 4"/>
@@ -6855,7 +6855,7 @@
       <w:pPr>
         <w:pStyle w:val="Titolo2"/>
       </w:pPr>
-      <w:bookmarkStart w:id="7" w:name="_Toc244263994"/>
+      <w:bookmarkStart w:id="7" w:name="_Toc244264328"/>
       <w:r>
         <w:t>2.6 Serie 3, non scelta (la 11 è diventata la serie 4)</w:t>
       </w:r>
@@ -6879,7 +6879,7 @@
           <w:noProof/>
         </w:rPr>
         <w:drawing>
-          <wp:inline distT="0" distB="0" distL="0" distR="0" wp14:anchorId="38A805C2" wp14:editId="20F1C8A2">
+          <wp:inline distT="0" distB="0" distL="0" distR="0" wp14:anchorId="7AD046B4" wp14:editId="2335717C">
             <wp:extent cx="5905500" cy="4133850"/>
             <wp:effectExtent l="0" t="0" r="0" b="0"/>
             <wp:docPr id="5" name="Immagine 5"/>
@@ -7565,7 +7565,7 @@
       <w:pPr>
         <w:pStyle w:val="Titolo2"/>
       </w:pPr>
-      <w:bookmarkStart w:id="8" w:name="_Toc244263995"/>
+      <w:bookmarkStart w:id="8" w:name="_Toc244264329"/>
       <w:r>
         <w:t>2.7 Serie 2, non scelta</w:t>
       </w:r>
@@ -7589,7 +7589,7 @@
           <w:noProof/>
         </w:rPr>
         <w:drawing>
-          <wp:inline distT="0" distB="0" distL="0" distR="0" wp14:anchorId="76AAAA91" wp14:editId="0C5E73F7">
+          <wp:inline distT="0" distB="0" distL="0" distR="0" wp14:anchorId="544F72E5" wp14:editId="06F794A9">
             <wp:extent cx="5905500" cy="4133850"/>
             <wp:effectExtent l="0" t="0" r="0" b="0"/>
             <wp:docPr id="6" name="Immagine 6"/>
@@ -8309,7 +8309,7 @@
       <w:pPr>
         <w:pStyle w:val="Titolo2"/>
       </w:pPr>
-      <w:bookmarkStart w:id="9" w:name="_Toc244263996"/>
+      <w:bookmarkStart w:id="9" w:name="_Toc244264330"/>
       <w:r>
         <w:t>2.8 Serie 1, scartata</w:t>
       </w:r>
@@ -8333,7 +8333,7 @@
           <w:noProof/>
         </w:rPr>
         <w:drawing>
-          <wp:inline distT="0" distB="0" distL="0" distR="0" wp14:anchorId="1E9384CD" wp14:editId="1C5A7D8C">
+          <wp:inline distT="0" distB="0" distL="0" distR="0" wp14:anchorId="630EC639" wp14:editId="48D766B4">
             <wp:extent cx="4000500" cy="2800350"/>
             <wp:effectExtent l="0" t="0" r="0" b="0"/>
             <wp:docPr id="7" name="Immagine 7"/>
@@ -8392,7 +8392,7 @@
       <w:pPr>
         <w:pStyle w:val="Titolo2"/>
       </w:pPr>
-      <w:bookmarkStart w:id="10" w:name="_Toc244263997"/>
+      <w:bookmarkStart w:id="10" w:name="_Toc244264331"/>
       <w:r>
         <w:t>2.9 Verifica dei marchi registrati</w:t>
       </w:r>
@@ -8644,7 +8644,7 @@
       <w:pPr>
         <w:pStyle w:val="Titolo1"/>
       </w:pPr>
-      <w:bookmarkStart w:id="11" w:name="_Toc244263998"/>
+      <w:bookmarkStart w:id="11" w:name="_Toc244264332"/>
       <w:r>
         <w:t>3. Temi colore</w:t>
       </w:r>
@@ -8678,7 +8678,7 @@
           <w:noProof/>
         </w:rPr>
         <w:drawing>
-          <wp:inline distT="0" distB="0" distL="0" distR="0" wp14:anchorId="568F2BDD" wp14:editId="4D92AC7A">
+          <wp:inline distT="0" distB="0" distL="0" distR="0" wp14:anchorId="0A8BD3BF" wp14:editId="3146FD63">
             <wp:extent cx="4572000" cy="3429000"/>
             <wp:effectExtent l="0" t="0" r="0" b="0"/>
             <wp:docPr id="8" name="Immagine 8"/>
@@ -9388,7 +9388,7 @@
       <w:pPr>
         <w:pStyle w:val="Titolo1"/>
       </w:pPr>
-      <w:bookmarkStart w:id="12" w:name="_Toc244263999"/>
+      <w:bookmarkStart w:id="12" w:name="_Toc244264333"/>
       <w:r>
         <w:t>4. Correzione: avvisi «come JavaScript»</w:t>
       </w:r>
@@ -9398,7 +9398,7 @@
       <w:pPr>
         <w:pStyle w:val="Titolo2"/>
       </w:pPr>
-      <w:bookmarkStart w:id="13" w:name="_Toc244264000"/>
+      <w:bookmarkStart w:id="13" w:name="_Toc244264334"/>
       <w:r>
         <w:t>4.1 Il problema</w:t>
       </w:r>
@@ -9801,7 +9801,7 @@
       <w:pPr>
         <w:pStyle w:val="Titolo2"/>
       </w:pPr>
-      <w:bookmarkStart w:id="14" w:name="_Toc244264001"/>
+      <w:bookmarkStart w:id="14" w:name="_Toc244264335"/>
       <w:r>
         <w:t>4.2 La soluzione</w:t>
       </w:r>
@@ -9934,7 +9934,7 @@
           <w:noProof/>
         </w:rPr>
         <w:drawing>
-          <wp:inline distT="0" distB="0" distL="0" distR="0" wp14:anchorId="0EEFB371" wp14:editId="1CC3B7D7">
+          <wp:inline distT="0" distB="0" distL="0" distR="0" wp14:anchorId="0B737EE2" wp14:editId="68D75541">
             <wp:extent cx="4572000" cy="3429000"/>
             <wp:effectExtent l="0" t="0" r="0" b="0"/>
             <wp:docPr id="9" name="Immagine 9"/>
@@ -9993,7 +9993,7 @@
       <w:pPr>
         <w:pStyle w:val="Titolo2"/>
       </w:pPr>
-      <w:bookmarkStart w:id="15" w:name="_Toc244264002"/>
+      <w:bookmarkStart w:id="15" w:name="_Toc244264336"/>
       <w:r>
         <w:t>4.3 Verifiche</w:t>
       </w:r>
@@ -10040,7 +10040,7 @@
       <w:pPr>
         <w:pStyle w:val="Titolo2"/>
       </w:pPr>
-      <w:bookmarkStart w:id="16" w:name="_Toc244264003"/>
+      <w:bookmarkStart w:id="16" w:name="_Toc244264337"/>
       <w:r>
         <w:t>4.4 Android: menu Tema e notifiche (versione 1.0.1)</w:t>
       </w:r>
@@ -10375,7 +10375,7 @@
       <w:pPr>
         <w:pStyle w:val="Titolo2"/>
       </w:pPr>
-      <w:bookmarkStart w:id="17" w:name="_Toc244264004"/>
+      <w:bookmarkStart w:id="17" w:name="_Toc244264338"/>
       <w:r>
         <w:t>4.5 App più leggera: traduzione tolta</w:t>
       </w:r>
@@ -10808,7 +10808,7 @@
       <w:pPr>
         <w:pStyle w:val="Titolo2"/>
       </w:pPr>
-      <w:bookmarkStart w:id="18" w:name="_Toc244264005"/>
+      <w:bookmarkStart w:id="18" w:name="_Toc244264339"/>
       <w:r>
         <w:t>4.6 Schede in una nuova finestra</w:t>
       </w:r>
@@ -10926,7 +10926,7 @@
           <w:noProof/>
         </w:rPr>
         <w:drawing>
-          <wp:inline distT="0" distB="0" distL="0" distR="0" wp14:anchorId="1B707904" wp14:editId="44DF53FD">
+          <wp:inline distT="0" distB="0" distL="0" distR="0" wp14:anchorId="27EE7E73" wp14:editId="0375C178">
             <wp:extent cx="5715000" cy="857250"/>
             <wp:effectExtent l="0" t="0" r="0" b="0"/>
             <wp:docPr id="10" name="Immagine 10"/>
@@ -11215,7 +11215,7 @@
       <w:pPr>
         <w:pStyle w:val="Titolo2"/>
       </w:pPr>
-      <w:bookmarkStart w:id="19" w:name="_Toc244264006"/>
+      <w:bookmarkStart w:id="19" w:name="_Toc244264340"/>
       <w:r>
         <w:t>4.7 Riunire le finestre</w:t>
       </w:r>
@@ -11317,7 +11317,7 @@
       <w:pPr>
         <w:pStyle w:val="Titolo2"/>
       </w:pPr>
-      <w:bookmarkStart w:id="20" w:name="_Toc244264007"/>
+      <w:bookmarkStart w:id="20" w:name="_Toc244264341"/>
       <w:r>
         <w:t>4.8 Correzioni di «Modifica testo»</w:t>
       </w:r>
@@ -11582,7 +11582,7 @@
           <w:noProof/>
         </w:rPr>
         <w:drawing>
-          <wp:inline distT="0" distB="0" distL="0" distR="0" wp14:anchorId="46A5D9F7" wp14:editId="63A7B664">
+          <wp:inline distT="0" distB="0" distL="0" distR="0" wp14:anchorId="578BDB34" wp14:editId="2B654617">
             <wp:extent cx="3286125" cy="2286000"/>
             <wp:effectExtent l="0" t="0" r="0" b="0"/>
             <wp:docPr id="11" name="Immagine 11"/>
@@ -11647,7 +11647,7 @@
           <w:noProof/>
         </w:rPr>
         <w:drawing>
-          <wp:inline distT="0" distB="0" distL="0" distR="0" wp14:anchorId="340CF61E" wp14:editId="704AA3EE">
+          <wp:inline distT="0" distB="0" distL="0" distR="0" wp14:anchorId="673E9EEB" wp14:editId="686390E9">
             <wp:extent cx="3286125" cy="2286000"/>
             <wp:effectExtent l="0" t="0" r="0" b="0"/>
             <wp:docPr id="12" name="Immagine 12"/>
@@ -11714,7 +11714,7 @@
       <w:pPr>
         <w:pStyle w:val="Titolo2"/>
       </w:pPr>
-      <w:bookmarkStart w:id="21" w:name="_Toc244264008"/>
+      <w:bookmarkStart w:id="21" w:name="_Toc244264342"/>
       <w:r>
         <w:t>4.9 Web app per iPhone</w:t>
       </w:r>
@@ -12153,7 +12153,7 @@
       <w:pPr>
         <w:pStyle w:val="Titolo2"/>
       </w:pPr>
-      <w:bookmarkStart w:id="22" w:name="_Toc244264009"/>
+      <w:bookmarkStart w:id="22" w:name="_Toc244264343"/>
       <w:r>
         <w:t>4.10 Aggiornamenti su Cloudflare (repository privato)</w:t>
       </w:r>
@@ -12667,7 +12667,7 @@
       <w:pPr>
         <w:pStyle w:val="Titolo2"/>
       </w:pPr>
-      <w:bookmarkStart w:id="23" w:name="_Toc244264010"/>
+      <w:bookmarkStart w:id="23" w:name="_Toc244264344"/>
       <w:r>
         <w:t>4.11 Eliminare firme, timbri e testi già applicati (versione 1.4.0)</w:t>
       </w:r>
@@ -12998,7 +12998,7 @@
           <w:noProof/>
         </w:rPr>
         <w:drawing>
-          <wp:inline distT="0" distB="0" distL="0" distR="0" wp14:anchorId="7A7FC2CA" wp14:editId="1260BDCA">
+          <wp:inline distT="0" distB="0" distL="0" distR="0" wp14:anchorId="4EBB17EE" wp14:editId="7A91E4C4">
             <wp:extent cx="2095500" cy="4533900"/>
             <wp:effectExtent l="0" t="0" r="0" b="0"/>
             <wp:docPr id="13" name="Immagine 13"/>
@@ -13095,7 +13095,7 @@
       <w:pPr>
         <w:pStyle w:val="Titolo2"/>
       </w:pPr>
-      <w:bookmarkStart w:id="24" w:name="_Toc244264011"/>
+      <w:bookmarkStart w:id="24" w:name="_Toc244264345"/>
       <w:r>
         <w:t>4.12 Telefono: pannello più grande e caselle di testo comode (versione 1.4.0)</w:t>
       </w:r>
@@ -13163,7 +13163,7 @@
           <w:noProof/>
         </w:rPr>
         <w:drawing>
-          <wp:inline distT="0" distB="0" distL="0" distR="0" wp14:anchorId="245DB258" wp14:editId="398FAA25">
+          <wp:inline distT="0" distB="0" distL="0" distR="0" wp14:anchorId="4A023534" wp14:editId="51BFEB6C">
             <wp:extent cx="2095500" cy="4533900"/>
             <wp:effectExtent l="0" t="0" r="0" b="0"/>
             <wp:docPr id="14" name="Immagine 14"/>
@@ -13228,7 +13228,7 @@
           <w:noProof/>
         </w:rPr>
         <w:drawing>
-          <wp:inline distT="0" distB="0" distL="0" distR="0" wp14:anchorId="577F0E8E" wp14:editId="405E3182">
+          <wp:inline distT="0" distB="0" distL="0" distR="0" wp14:anchorId="4AB77EC7" wp14:editId="7C876B63">
             <wp:extent cx="2095500" cy="4533900"/>
             <wp:effectExtent l="0" t="0" r="0" b="0"/>
             <wp:docPr id="15" name="Immagine 15"/>
@@ -13287,7 +13287,7 @@
       <w:pPr>
         <w:pStyle w:val="Titolo2"/>
       </w:pPr>
-      <w:bookmarkStart w:id="25" w:name="_Toc244264012"/>
+      <w:bookmarkStart w:id="25" w:name="_Toc244264346"/>
       <w:r>
         <w:t>4.13 Spostare firme, timbri e testi già applicati (versione 1.5.0)</w:t>
       </w:r>
@@ -13339,7 +13339,7 @@
           <w:noProof/>
         </w:rPr>
         <w:drawing>
-          <wp:inline distT="0" distB="0" distL="0" distR="0" wp14:anchorId="789E0C7C" wp14:editId="6251DD17">
+          <wp:inline distT="0" distB="0" distL="0" distR="0" wp14:anchorId="722F9FA9" wp14:editId="280D0969">
             <wp:extent cx="4953000" cy="3095625"/>
             <wp:effectExtent l="0" t="0" r="0" b="0"/>
             <wp:docPr id="16" name="Immagine 16"/>
@@ -13398,7 +13398,7 @@
       <w:pPr>
         <w:pStyle w:val="Titolo2"/>
       </w:pPr>
-      <w:bookmarkStart w:id="26" w:name="_Toc244264013"/>
+      <w:bookmarkStart w:id="26" w:name="_Toc244264347"/>
       <w:r>
         <w:t>4.14 Modi di lettura e presentazione (versione 1.5.0)</w:t>
       </w:r>
@@ -13535,7 +13535,7 @@
           <w:noProof/>
         </w:rPr>
         <w:drawing>
-          <wp:inline distT="0" distB="0" distL="0" distR="0" wp14:anchorId="799BB8DB" wp14:editId="660FB346">
+          <wp:inline distT="0" distB="0" distL="0" distR="0" wp14:anchorId="172ED418" wp14:editId="7A8B531D">
             <wp:extent cx="4953000" cy="3095625"/>
             <wp:effectExtent l="0" t="0" r="0" b="0"/>
             <wp:docPr id="17" name="Immagine 17"/>
@@ -13600,7 +13600,7 @@
           <w:noProof/>
         </w:rPr>
         <w:drawing>
-          <wp:inline distT="0" distB="0" distL="0" distR="0" wp14:anchorId="035D7F3E" wp14:editId="34E715D6">
+          <wp:inline distT="0" distB="0" distL="0" distR="0" wp14:anchorId="4E007ACB" wp14:editId="03738FF2">
             <wp:extent cx="1905000" cy="4124325"/>
             <wp:effectExtent l="0" t="0" r="0" b="0"/>
             <wp:docPr id="18" name="Immagine 18"/>
@@ -13659,7 +13659,7 @@
       <w:pPr>
         <w:pStyle w:val="Titolo2"/>
       </w:pPr>
-      <w:bookmarkStart w:id="27" w:name="_Toc244264014"/>
+      <w:bookmarkStart w:id="27" w:name="_Toc244264348"/>
       <w:r>
         <w:t>4.15 Correzione: immagini sulle pagine ruotate (versione 1.5.0)</w:t>
       </w:r>
@@ -13687,7 +13687,7 @@
       <w:pPr>
         <w:pStyle w:val="Titolo2"/>
       </w:pPr>
-      <w:bookmarkStart w:id="28" w:name="_Toc244264015"/>
+      <w:bookmarkStart w:id="28" w:name="_Toc244264349"/>
       <w:r>
         <w:t>4.16 Niente più «Applica» (versione 1.6.0)</w:t>
       </w:r>
@@ -13731,7 +13731,7 @@
           <w:noProof/>
         </w:rPr>
         <w:drawing>
-          <wp:inline distT="0" distB="0" distL="0" distR="0" wp14:anchorId="203D81F2" wp14:editId="72AED42A">
+          <wp:inline distT="0" distB="0" distL="0" distR="0" wp14:anchorId="0365F45C" wp14:editId="795C1ECC">
             <wp:extent cx="4953000" cy="3095625"/>
             <wp:effectExtent l="0" t="0" r="0" b="0"/>
             <wp:docPr id="19" name="Immagine 19"/>
@@ -13790,7 +13790,7 @@
       <w:pPr>
         <w:pStyle w:val="Titolo2"/>
       </w:pPr>
-      <w:bookmarkStart w:id="29" w:name="_Toc244264016"/>
+      <w:bookmarkStart w:id="29" w:name="_Toc244264350"/>
       <w:r>
         <w:t>4.17 Schermata «Cosa vuoi fare?» (versione 1.6.0)</w:t>
       </w:r>
@@ -13824,7 +13824,7 @@
           <w:noProof/>
         </w:rPr>
         <w:drawing>
-          <wp:inline distT="0" distB="0" distL="0" distR="0" wp14:anchorId="380E3264" wp14:editId="13AFE5CC">
+          <wp:inline distT="0" distB="0" distL="0" distR="0" wp14:anchorId="5E166CD9" wp14:editId="1D5A9AAC">
             <wp:extent cx="4953000" cy="3095625"/>
             <wp:effectExtent l="0" t="0" r="0" b="0"/>
             <wp:docPr id="20" name="Immagine 20"/>
@@ -13883,7 +13883,7 @@
       <w:pPr>
         <w:pStyle w:val="Titolo2"/>
       </w:pPr>
-      <w:bookmarkStart w:id="30" w:name="_Toc244264017"/>
+      <w:bookmarkStart w:id="30" w:name="_Toc244264351"/>
       <w:r>
         <w:t>4.18 Modalità Semplice e Completa (versione 1.6.0)</w:t>
       </w:r>
@@ -13927,7 +13927,7 @@
           <w:noProof/>
         </w:rPr>
         <w:drawing>
-          <wp:inline distT="0" distB="0" distL="0" distR="0" wp14:anchorId="5E0F70D0" wp14:editId="1167D420">
+          <wp:inline distT="0" distB="0" distL="0" distR="0" wp14:anchorId="37EC8A28" wp14:editId="087CF9ED">
             <wp:extent cx="1905000" cy="4124325"/>
             <wp:effectExtent l="0" t="0" r="0" b="0"/>
             <wp:docPr id="21" name="Immagine 21"/>
@@ -13986,7 +13986,7 @@
       <w:pPr>
         <w:pStyle w:val="Titolo2"/>
       </w:pPr>
-      <w:bookmarkStart w:id="31" w:name="_Toc244264018"/>
+      <w:bookmarkStart w:id="31" w:name="_Toc244264352"/>
       <w:r>
         <w:t>4.19 Guide 1-2-3 (versione 1.6.0)</w:t>
       </w:r>
@@ -14010,7 +14010,7 @@
           <w:noProof/>
         </w:rPr>
         <w:drawing>
-          <wp:inline distT="0" distB="0" distL="0" distR="0" wp14:anchorId="57418D11" wp14:editId="08CD9CEC">
+          <wp:inline distT="0" distB="0" distL="0" distR="0" wp14:anchorId="3D8CA0F6" wp14:editId="5707C91E">
             <wp:extent cx="4953000" cy="3095625"/>
             <wp:effectExtent l="0" t="0" r="0" b="0"/>
             <wp:docPr id="22" name="Immagine 22"/>
@@ -14075,7 +14075,7 @@
           <w:noProof/>
         </w:rPr>
         <w:drawing>
-          <wp:inline distT="0" distB="0" distL="0" distR="0" wp14:anchorId="5309B1BF" wp14:editId="35F4C614">
+          <wp:inline distT="0" distB="0" distL="0" distR="0" wp14:anchorId="60BB763D" wp14:editId="12B3E30C">
             <wp:extent cx="1905000" cy="4124325"/>
             <wp:effectExtent l="0" t="0" r="0" b="0"/>
             <wp:docPr id="23" name="Immagine 23"/>
@@ -14134,7 +14134,7 @@
       <w:pPr>
         <w:pStyle w:val="Titolo2"/>
       </w:pPr>
-      <w:bookmarkStart w:id="32" w:name="_Toc244264019"/>
+      <w:bookmarkStart w:id="32" w:name="_Toc244264353"/>
       <w:r>
         <w:t>4.20 Parole semplici e piccoli difetti (versione 1.6.0)</w:t>
       </w:r>
@@ -14152,9 +14152,9 @@
       <w:pPr>
         <w:pStyle w:val="Titolo2"/>
       </w:pPr>
-      <w:bookmarkStart w:id="33" w:name="_Toc244264020"/>
-      <w:r>
-        <w:t>4.21 Dominio dell'autore: pdfz.agjin.com (versione 1.6.1)</w:t>
+      <w:bookmarkStart w:id="33" w:name="_Toc244264354"/>
+      <w:r>
+        <w:t>4.21 Dominio dell'autore: pdfz.agjin.com (versione 1.6.2)</w:t>
       </w:r>
       <w:bookmarkEnd w:id="33"/>
     </w:p>
@@ -14184,7 +14184,7 @@
         <w:t>UPDATE_BASE_URL</w:t>
       </w:r>
       <w:r>
-        <w:t xml:space="preserve">. Dalla 1.6.1 le app cercano gli aggiornamenti e scaricano da lì; la web app per iPhone e iPad è su https://pdfz.agjin.com/app/. Il vecchio indirizzo pdfz.pages.dev </w:t>
+        <w:t xml:space="preserve">. Dalla 1.6.2 le app cercano gli aggiornamenti e scaricano da lì; la web app per iPhone e iPad è su https://pdfz.agjin.com/app/. Il vecchio indirizzo pdfz.pages.dev </w:t>
       </w:r>
       <w:r>
         <w:rPr>
@@ -14217,7 +14217,7 @@
       <w:pPr>
         <w:pStyle w:val="Titolo1"/>
       </w:pPr>
-      <w:bookmarkStart w:id="34" w:name="_Toc244264021"/>
+      <w:bookmarkStart w:id="34" w:name="_Toc244264355"/>
       <w:r>
         <w:t>5. Decisioni</w:t>
       </w:r>
@@ -14235,7 +14235,7 @@
       <w:pPr>
         <w:pStyle w:val="Titolo2"/>
       </w:pPr>
-      <w:bookmarkStart w:id="35" w:name="_Toc244264022"/>
+      <w:bookmarkStart w:id="35" w:name="_Toc244264356"/>
       <w:r>
         <w:t>5.1 Canale degli aggiornamenti</w:t>
       </w:r>
@@ -14742,7 +14742,7 @@
       <w:pPr>
         <w:pStyle w:val="Titolo2"/>
       </w:pPr>
-      <w:bookmarkStart w:id="36" w:name="_Toc244264023"/>
+      <w:bookmarkStart w:id="36" w:name="_Toc244264357"/>
       <w:r>
         <w:t>5.2 Storia del repository</w:t>
       </w:r>
@@ -15249,7 +15249,7 @@
       <w:pPr>
         <w:pStyle w:val="Titolo2"/>
       </w:pPr>
-      <w:bookmarkStart w:id="37" w:name="_Toc244264024"/>
+      <w:bookmarkStart w:id="37" w:name="_Toc244264358"/>
       <w:r>
         <w:t>5.3 Identificativi del prodotto</w:t>
       </w:r>
@@ -15749,7 +15749,7 @@
       <w:pPr>
         <w:pStyle w:val="Titolo2"/>
       </w:pPr>
-      <w:bookmarkStart w:id="38" w:name="_Toc244264025"/>
+      <w:bookmarkStart w:id="38" w:name="_Toc244264359"/>
       <w:r>
         <w:t>5.4 Avvisi e domande</w:t>
       </w:r>
@@ -16256,7 +16256,7 @@
       <w:pPr>
         <w:pStyle w:val="Titolo2"/>
       </w:pPr>
-      <w:bookmarkStart w:id="39" w:name="_Toc244264026"/>
+      <w:bookmarkStart w:id="39" w:name="_Toc244264360"/>
       <w:r>
         <w:t>5.5 Traduzione offline</w:t>
       </w:r>
@@ -16763,7 +16763,7 @@
       <w:pPr>
         <w:pStyle w:val="Titolo2"/>
       </w:pPr>
-      <w:bookmarkStart w:id="40" w:name="_Toc244264027"/>
+      <w:bookmarkStart w:id="40" w:name="_Toc244264361"/>
       <w:r>
         <w:t>5.6 Passaggio della scheda alla nuova finestra</w:t>
       </w:r>
@@ -17285,7 +17285,7 @@
       <w:pPr>
         <w:pStyle w:val="Titolo2"/>
       </w:pPr>
-      <w:bookmarkStart w:id="41" w:name="_Toc244264028"/>
+      <w:bookmarkStart w:id="41" w:name="_Toc244264362"/>
       <w:r>
         <w:t>5.7 Come si cancella la riga in «Modifica testo»</w:t>
       </w:r>
@@ -17792,7 +17792,7 @@
       <w:pPr>
         <w:pStyle w:val="Titolo2"/>
       </w:pPr>
-      <w:bookmarkStart w:id="42" w:name="_Toc244264029"/>
+      <w:bookmarkStart w:id="42" w:name="_Toc244264363"/>
       <w:r>
         <w:t>5.9 Lettura a libro e presentazione</w:t>
       </w:r>
@@ -18299,7 +18299,7 @@
       <w:pPr>
         <w:pStyle w:val="Titolo2"/>
       </w:pPr>
-      <w:bookmarkStart w:id="43" w:name="_Toc244264030"/>
+      <w:bookmarkStart w:id="43" w:name="_Toc244264364"/>
       <w:r>
         <w:t>5.8 Come si ritrovano firme e timbri applicati</w:t>
       </w:r>
@@ -18836,7 +18836,7 @@
       <w:pPr>
         <w:pStyle w:val="Titolo1"/>
       </w:pPr>
-      <w:bookmarkStart w:id="44" w:name="_Toc244264031"/>
+      <w:bookmarkStart w:id="44" w:name="_Toc244264365"/>
       <w:r>
         <w:t>6. Come si lavora</w:t>
       </w:r>
@@ -18846,7 +18846,7 @@
       <w:pPr>
         <w:pStyle w:val="Titolo2"/>
       </w:pPr>
-      <w:bookmarkStart w:id="45" w:name="_Toc244264032"/>
+      <w:bookmarkStart w:id="45" w:name="_Toc244264366"/>
       <w:r>
         <w:t>6.1 Comandi</w:t>
       </w:r>
@@ -18916,7 +18916,7 @@
       <w:pPr>
         <w:pStyle w:val="Titolo2"/>
       </w:pPr>
-      <w:bookmarkStart w:id="46" w:name="_Toc244264033"/>
+      <w:bookmarkStart w:id="46" w:name="_Toc244264367"/>
       <w:r>
         <w:t>6.2 Pubblicare una versione</w:t>
       </w:r>
@@ -19044,7 +19044,7 @@
       <w:pPr>
         <w:pStyle w:val="Titolo2"/>
       </w:pPr>
-      <w:bookmarkStart w:id="47" w:name="_Toc244264034"/>
+      <w:bookmarkStart w:id="47" w:name="_Toc244264368"/>
       <w:r>
         <w:t>6.3 Release 1.0.0 (pubblicata il 16 ottobre 2026)</w:t>
       </w:r>
@@ -19771,7 +19771,7 @@
       <w:pPr>
         <w:pStyle w:val="Titolo2"/>
       </w:pPr>
-      <w:bookmarkStart w:id="48" w:name="_Toc244264035"/>
+      <w:bookmarkStart w:id="48" w:name="_Toc244264369"/>
       <w:r>
         <w:t>6.4 Release 1.0.1</w:t>
       </w:r>
@@ -20068,7 +20068,7 @@
       <w:pPr>
         <w:pStyle w:val="Titolo2"/>
       </w:pPr>
-      <w:bookmarkStart w:id="49" w:name="_Toc244264036"/>
+      <w:bookmarkStart w:id="49" w:name="_Toc244264370"/>
       <w:r>
         <w:t>6.5 Release 1.0.2 e repository pubblico</w:t>
       </w:r>
@@ -20490,7 +20490,7 @@
       <w:pPr>
         <w:pStyle w:val="Titolo2"/>
       </w:pPr>
-      <w:bookmarkStart w:id="50" w:name="_Toc244264037"/>
+      <w:bookmarkStart w:id="50" w:name="_Toc244264371"/>
       <w:r>
         <w:t>6.6 Nuova versione: link diretto per ogni sistema</w:t>
       </w:r>
@@ -20907,7 +20907,7 @@
           <w:noProof/>
         </w:rPr>
         <w:drawing>
-          <wp:inline distT="0" distB="0" distL="0" distR="0" wp14:anchorId="0A5FB101" wp14:editId="14162EA2">
+          <wp:inline distT="0" distB="0" distL="0" distR="0" wp14:anchorId="1A19F185" wp14:editId="70532A98">
             <wp:extent cx="4572000" cy="4429125"/>
             <wp:effectExtent l="0" t="0" r="0" b="0"/>
             <wp:docPr id="24" name="Immagine 24"/>
@@ -20982,7 +20982,7 @@
       <w:pPr>
         <w:pStyle w:val="Titolo2"/>
       </w:pPr>
-      <w:bookmarkStart w:id="51" w:name="_Toc244264038"/>
+      <w:bookmarkStart w:id="51" w:name="_Toc244264372"/>
       <w:r>
         <w:t>6.7 Release 1.1.0</w:t>
       </w:r>
@@ -21546,7 +21546,7 @@
       <w:pPr>
         <w:pStyle w:val="Titolo2"/>
       </w:pPr>
-      <w:bookmarkStart w:id="52" w:name="_Toc244264039"/>
+      <w:bookmarkStart w:id="52" w:name="_Toc244264373"/>
       <w:r>
         <w:t>6.8 Versione 1.2.0</w:t>
       </w:r>
@@ -22095,7 +22095,7 @@
       <w:pPr>
         <w:pStyle w:val="Titolo2"/>
       </w:pPr>
-      <w:bookmarkStart w:id="53" w:name="_Toc244264040"/>
+      <w:bookmarkStart w:id="53" w:name="_Toc244264374"/>
       <w:r>
         <w:t>6.9 Versione 1.2.1</w:t>
       </w:r>
@@ -22113,7 +22113,7 @@
       <w:pPr>
         <w:pStyle w:val="Titolo2"/>
       </w:pPr>
-      <w:bookmarkStart w:id="54" w:name="_Toc244264041"/>
+      <w:bookmarkStart w:id="54" w:name="_Toc244264375"/>
       <w:r>
         <w:t>6.10 Versione 1.3.0</w:t>
       </w:r>
@@ -22145,7 +22145,7 @@
       <w:pPr>
         <w:pStyle w:val="Titolo2"/>
       </w:pPr>
-      <w:bookmarkStart w:id="55" w:name="_Toc244264042"/>
+      <w:bookmarkStart w:id="55" w:name="_Toc244264376"/>
       <w:r>
         <w:t>6.11 Versione 1.3.1 (ponte verso Cloudflare)</w:t>
       </w:r>
@@ -22163,7 +22163,7 @@
       <w:pPr>
         <w:pStyle w:val="Titolo2"/>
       </w:pPr>
-      <w:bookmarkStart w:id="56" w:name="_Toc244264043"/>
+      <w:bookmarkStart w:id="56" w:name="_Toc244264377"/>
       <w:r>
         <w:t>6.12 Versione 1.4.0</w:t>
       </w:r>
@@ -22181,7 +22181,7 @@
       <w:pPr>
         <w:pStyle w:val="Titolo2"/>
       </w:pPr>
-      <w:bookmarkStart w:id="57" w:name="_Toc244264044"/>
+      <w:bookmarkStart w:id="57" w:name="_Toc244264378"/>
       <w:r>
         <w:t>6.13 Versione 1.5.0</w:t>
       </w:r>
@@ -22199,7 +22199,7 @@
       <w:pPr>
         <w:pStyle w:val="Titolo2"/>
       </w:pPr>
-      <w:bookmarkStart w:id="58" w:name="_Toc244264045"/>
+      <w:bookmarkStart w:id="58" w:name="_Toc244264379"/>
       <w:r>
         <w:t>6.14 Versione 1.6.0</w:t>
       </w:r>
@@ -22223,9 +22223,9 @@
       <w:pPr>
         <w:pStyle w:val="Titolo2"/>
       </w:pPr>
-      <w:bookmarkStart w:id="59" w:name="_Toc244264046"/>
-      <w:r>
-        <w:t>6.15 Versione 1.6.1</w:t>
+      <w:bookmarkStart w:id="59" w:name="_Toc244264380"/>
+      <w:r>
+        <w:t>6.15 Versione 1.6.2</w:t>
       </w:r>
       <w:bookmarkEnd w:id="59"/>
     </w:p>
@@ -22234,14 +22234,14 @@
         <w:spacing w:after="120"/>
       </w:pPr>
       <w:r>
-        <w:t>Preparata il 30 ottobre 2026 (installer Windows 101.6.1, Android 1001006001): compilata con l'indirizzo degli aggiornamenti https://pdfz.agjin.com/; pagina degli aggiornamenti con link relativi.</w:t>
+        <w:t>Preparata il 30 ottobre 2026 (installer Windows 101.6.2, Android 1001006002): compilata con l'indirizzo degli aggiornamenti https://pdfz.agjin.com/; pagina degli aggiornamenti con link relativi. La 1.6.1 non è uscita: la variabile UPDATE_BASE_URL era scritta senza https:// e la pipeline si era fermata; ora l'indirizzo si completa da solo.</w:t>
       </w:r>
     </w:p>
     <w:p>
       <w:pPr>
         <w:pStyle w:val="Titolo2"/>
       </w:pPr>
-      <w:bookmarkStart w:id="60" w:name="_Toc244264047"/>
+      <w:bookmarkStart w:id="60" w:name="_Toc244264381"/>
       <w:r>
         <w:t>6.16 Ruoli</w:t>
       </w:r>
@@ -22514,7 +22514,7 @@
       <w:pPr>
         <w:pStyle w:val="Titolo1"/>
       </w:pPr>
-      <w:bookmarkStart w:id="61" w:name="_Toc244264048"/>
+      <w:bookmarkStart w:id="61" w:name="_Toc244264382"/>
       <w:r>
         <w:t>7. Sicurezza</w:t>
       </w:r>
@@ -22813,7 +22813,7 @@
       <w:pPr>
         <w:pStyle w:val="Titolo1"/>
       </w:pPr>
-      <w:bookmarkStart w:id="62" w:name="_Toc244264049"/>
+      <w:bookmarkStart w:id="62" w:name="_Toc244264383"/>
       <w:r>
         <w:t>8. Punti aperti</w:t>
       </w:r>
@@ -23102,7 +23102,7 @@
       <w:pPr>
         <w:pStyle w:val="Titolo1"/>
       </w:pPr>
-      <w:bookmarkStart w:id="63" w:name="_Toc244264050"/>
+      <w:bookmarkStart w:id="63" w:name="_Toc244264384"/>
       <w:r>
         <w:t>9. Pensato per i prossimi 10 anni</w:t>
       </w:r>
@@ -23296,7 +23296,7 @@
       <w:pPr>
         <w:pStyle w:val="Titolo1"/>
       </w:pPr>
-      <w:bookmarkStart w:id="64" w:name="_Toc244264051"/>
+      <w:bookmarkStart w:id="64" w:name="_Toc244264385"/>
       <w:r>
         <w:t>10. Facilità d'uso: analisi e proposte (30 ottobre 2026)</w:t>
       </w:r>
@@ -23384,7 +23384,7 @@
       <w:pPr>
         <w:pStyle w:val="Titolo2"/>
       </w:pPr>
-      <w:bookmarkStart w:id="65" w:name="_Toc244264052"/>
+      <w:bookmarkStart w:id="65" w:name="_Toc244264386"/>
       <w:r>
         <w:t>10.1 Opinione</w:t>
       </w:r>
@@ -23912,7 +23912,7 @@
       <w:pPr>
         <w:pStyle w:val="Titolo2"/>
       </w:pPr>
-      <w:bookmarkStart w:id="66" w:name="_Toc244264053"/>
+      <w:bookmarkStart w:id="66" w:name="_Toc244264387"/>
       <w:r>
         <w:t>10.2 Punti da migliorare</w:t>
       </w:r>
@@ -24061,7 +24061,7 @@
           <w:noProof/>
         </w:rPr>
         <w:drawing>
-          <wp:inline distT="0" distB="0" distL="0" distR="0" wp14:anchorId="3207CA54" wp14:editId="6FE9CB4F">
+          <wp:inline distT="0" distB="0" distL="0" distR="0" wp14:anchorId="4195FAA9" wp14:editId="31BDFF89">
             <wp:extent cx="1905000" cy="4124325"/>
             <wp:effectExtent l="0" t="0" r="0" b="0"/>
             <wp:docPr id="25" name="Immagine 25"/>
@@ -24126,7 +24126,7 @@
           <w:noProof/>
         </w:rPr>
         <w:drawing>
-          <wp:inline distT="0" distB="0" distL="0" distR="0" wp14:anchorId="77298AE2" wp14:editId="0FC2039B">
+          <wp:inline distT="0" distB="0" distL="0" distR="0" wp14:anchorId="6100F1F3" wp14:editId="7C4EE68B">
             <wp:extent cx="1905000" cy="4124325"/>
             <wp:effectExtent l="0" t="0" r="0" b="0"/>
             <wp:docPr id="26" name="Immagine 26"/>
@@ -24191,7 +24191,7 @@
           <w:noProof/>
         </w:rPr>
         <w:drawing>
-          <wp:inline distT="0" distB="0" distL="0" distR="0" wp14:anchorId="2110FC65" wp14:editId="23AF732E">
+          <wp:inline distT="0" distB="0" distL="0" distR="0" wp14:anchorId="79EF5894" wp14:editId="6E263028">
             <wp:extent cx="4953000" cy="3095625"/>
             <wp:effectExtent l="0" t="0" r="0" b="0"/>
             <wp:docPr id="27" name="Immagine 27"/>
@@ -24250,7 +24250,7 @@
       <w:pPr>
         <w:pStyle w:val="Titolo2"/>
       </w:pPr>
-      <w:bookmarkStart w:id="67" w:name="_Toc244264054"/>
+      <w:bookmarkStart w:id="67" w:name="_Toc244264388"/>
       <w:r>
         <w:t>10.3 Cinque proposte</w:t>
       </w:r>
@@ -25130,10 +25130,10 @@
 <file path=word/numbering.xml><?xml version="1.0" encoding="utf-8"?>
 <w:numbering xmlns:wpc="http://schemas.microsoft.com/office/word/2010/wordprocessingCanvas" xmlns:cx="http://schemas.microsoft.com/office/drawing/2014/chartex" xmlns:cx1="http://schemas.microsoft.com/office/drawing/2015/9/8/chartex" xmlns:cx2="http://schemas.microsoft.com/office/drawing/2015/10/21/chartex" xmlns:cx3="http://schemas.microsoft.com/office/drawing/2016/5/9/chartex" xmlns:cx4="http://schemas.microsoft.com/office/drawing/2016/5/10/chartex" xmlns:cx5="http://schemas.microsoft.com/office/drawing/2016/5/11/chartex" xmlns:cx6="http://schemas.microsoft.com/office/drawing/2016/5/12/chartex" xmlns:cx7="http://schemas.microsoft.com/office/drawing/2016/5/13/chartex" xmlns:cx8="http://schemas.microsoft.com/office/drawing/2016/5/14/chartex" xmlns:mc="http://schemas.openxmlformats.org/markup-compatibility/2006" xmlns:aink="http://schemas.microsoft.com/office/drawing/2016/ink" xmlns:am3d="http://schemas.microsoft.com/office/drawing/2017/model3d" xmlns:o="urn:schemas-microsoft-com:office:office" xmlns:oel="http://schemas.microsoft.com/office/2019/extlst" xmlns:r="http://schemas.openxmlformats.org/officeDocument/2006/relationships" xmlns:m="http://schemas.openxmlformats.org/officeDocument/2006/math" xmlns:v="urn:schemas-microsoft-com:vml" xmlns:wp14="http://schemas.microsoft.com/office/word/2010/wordprocessingDrawing" xmlns:wp="http://schemas.openxmlformats.org/drawingml/2006/wordprocessingDrawing" xmlns:w10="urn:schemas-microsoft-com:office:word" xmlns:w="http://schemas.openxmlformats.org/wordprocessingml/2006/main" xmlns:w14="http://schemas.microsoft.com/office/word/2010/wordml" xmlns:w15="http://schemas.microsoft.com/office/word/2012/wordml" xmlns:w16cex="http://schemas.microsoft.com/office/word/2018/wordml/cex" xmlns:w16cid="http://schemas.microsoft.com/office/word/2016/wordml/cid" xmlns:w16="http://schemas.microsoft.com/office/word/2018/wordml" xmlns:w16du="http://schemas.microsoft.com/office/word/2023/wordml/word16du" xmlns:w16sdtdh="http://schemas.microsoft.com/office/word/2020/wordml/sdtdatahash" xmlns:w16sdtfl="http://schemas.microsoft.com/office/word/2024/wordml/sdtformatlock" xmlns:w16se="http://schemas.microsoft.com/office/word/2015/wordml/symex" xmlns:wpg="http://schemas.microsoft.com/office/word/2010/wordprocessingGroup" xmlns:wpi="http://schemas.microsoft.com/office/word/2010/wordprocessingInk" xmlns:wne="http://schemas.microsoft.com/office/word/2006/wordml" xmlns:wps="http://schemas.microsoft.com/office/word/2010/wordprocessingShape" mc:Ignorable="w14 w15 w16se w16cid w16 w16cex w16sdtdh w16sdtfl w16du wp14">
   <w:abstractNum w:abstractNumId="0" w15:restartNumberingAfterBreak="0">
-    <w:nsid w:val="10F40DD7"/>
+    <w:nsid w:val="15F10406"/>
     <w:multiLevelType w:val="hybridMultilevel"/>
-    <w:tmpl w:val="6B5659D8"/>
-    <w:lvl w:ilvl="0" w:tplc="07AA757E">
+    <w:tmpl w:val="EDB4BA14"/>
+    <w:lvl w:ilvl="0" w:tplc="4588D118">
       <w:start w:val="1"/>
       <w:numFmt w:val="decimal"/>
       <w:lvlText w:val="%1."/>
@@ -25142,261 +25142,261 @@
         <w:ind w:left="540" w:hanging="300"/>
       </w:pPr>
     </w:lvl>
-    <w:lvl w:ilvl="1" w:tplc="C994AFA0">
+    <w:lvl w:ilvl="1" w:tplc="1052663C">
       <w:numFmt w:val="decimal"/>
       <w:lvlText w:val=""/>
       <w:lvlJc w:val="left"/>
     </w:lvl>
-    <w:lvl w:ilvl="2" w:tplc="FFECB604">
+    <w:lvl w:ilvl="2" w:tplc="8E365100">
       <w:numFmt w:val="decimal"/>
       <w:lvlText w:val=""/>
       <w:lvlJc w:val="left"/>
     </w:lvl>
-    <w:lvl w:ilvl="3" w:tplc="303CFAFE">
+    <w:lvl w:ilvl="3" w:tplc="D39A37F4">
       <w:numFmt w:val="decimal"/>
       <w:lvlText w:val=""/>
       <w:lvlJc w:val="left"/>
     </w:lvl>
-    <w:lvl w:ilvl="4" w:tplc="7AD816AA">
+    <w:lvl w:ilvl="4" w:tplc="FE4085E6">
       <w:numFmt w:val="decimal"/>
       <w:lvlText w:val=""/>
       <w:lvlJc w:val="left"/>
     </w:lvl>
-    <w:lvl w:ilvl="5" w:tplc="EE025450">
+    <w:lvl w:ilvl="5" w:tplc="3488C6EC">
       <w:numFmt w:val="decimal"/>
       <w:lvlText w:val=""/>
       <w:lvlJc w:val="left"/>
     </w:lvl>
-    <w:lvl w:ilvl="6" w:tplc="1988F8D8">
+    <w:lvl w:ilvl="6" w:tplc="F1447618">
       <w:numFmt w:val="decimal"/>
       <w:lvlText w:val=""/>
       <w:lvlJc w:val="left"/>
     </w:lvl>
-    <w:lvl w:ilvl="7" w:tplc="17185B04">
+    <w:lvl w:ilvl="7" w:tplc="D7D49096">
       <w:numFmt w:val="decimal"/>
       <w:lvlText w:val=""/>
       <w:lvlJc w:val="left"/>
     </w:lvl>
-    <w:lvl w:ilvl="8" w:tplc="1CB8117A">
+    <w:lvl w:ilvl="8" w:tplc="3A68164A">
       <w:numFmt w:val="decimal"/>
       <w:lvlText w:val=""/>
       <w:lvlJc w:val="left"/>
     </w:lvl>
   </w:abstractNum>
   <w:abstractNum w:abstractNumId="1" w15:restartNumberingAfterBreak="0">
-    <w:nsid w:val="17B9485C"/>
+    <w:nsid w:val="2D821C20"/>
     <w:multiLevelType w:val="hybridMultilevel"/>
-    <w:tmpl w:val="47BC7576"/>
-    <w:lvl w:ilvl="0" w:tplc="9FF2919E">
+    <w:tmpl w:val="3AC04A5A"/>
+    <w:lvl w:ilvl="0" w:tplc="DDC2208E" w:tentative="1">
       <w:start w:val="1"/>
       <w:numFmt w:val="bullet"/>
-      <w:lvlText w:val="•"/>
+      <w:lvlText w:val="●"/>
       <w:lvlJc w:val="left"/>
       <w:pPr>
-        <w:ind w:left="540" w:hanging="270"/>
+        <w:ind w:left="720" w:hanging="360"/>
       </w:pPr>
     </w:lvl>
-    <w:lvl w:ilvl="1" w:tplc="BE681712">
+    <w:lvl w:ilvl="1" w:tplc="66A8D36E" w:tentative="1">
+      <w:start w:val="1"/>
+      <w:numFmt w:val="bullet"/>
+      <w:lvlText w:val="○"/>
+      <w:lvlJc w:val="left"/>
+      <w:pPr>
+        <w:ind w:left="1440" w:hanging="360"/>
+      </w:pPr>
+    </w:lvl>
+    <w:lvl w:ilvl="2" w:tplc="9AAC64A2" w:tentative="1">
+      <w:start w:val="1"/>
+      <w:numFmt w:val="bullet"/>
+      <w:lvlText w:val="■"/>
+      <w:lvlJc w:val="left"/>
+      <w:pPr>
+        <w:ind w:left="2160" w:hanging="360"/>
+      </w:pPr>
+    </w:lvl>
+    <w:lvl w:ilvl="3" w:tplc="2166AD2C" w:tentative="1">
+      <w:start w:val="1"/>
+      <w:numFmt w:val="bullet"/>
+      <w:lvlText w:val="●"/>
+      <w:lvlJc w:val="left"/>
+      <w:pPr>
+        <w:ind w:left="2880" w:hanging="360"/>
+      </w:pPr>
+    </w:lvl>
+    <w:lvl w:ilvl="4" w:tplc="DBBE83D4" w:tentative="1">
+      <w:start w:val="1"/>
+      <w:numFmt w:val="bullet"/>
+      <w:lvlText w:val="○"/>
+      <w:lvlJc w:val="left"/>
+      <w:pPr>
+        <w:ind w:left="3600" w:hanging="360"/>
+      </w:pPr>
+    </w:lvl>
+    <w:lvl w:ilvl="5" w:tplc="F8A2E97E" w:tentative="1">
+      <w:start w:val="1"/>
+      <w:numFmt w:val="bullet"/>
+      <w:lvlText w:val="■"/>
+      <w:lvlJc w:val="left"/>
+      <w:pPr>
+        <w:ind w:left="4320" w:hanging="360"/>
+      </w:pPr>
+    </w:lvl>
+    <w:lvl w:ilvl="6" w:tplc="18FA720E" w:tentative="1">
+      <w:start w:val="1"/>
+      <w:numFmt w:val="bullet"/>
+      <w:lvlText w:val="●"/>
+      <w:lvlJc w:val="left"/>
+      <w:pPr>
+        <w:ind w:left="5040" w:hanging="360"/>
+      </w:pPr>
+    </w:lvl>
+    <w:lvl w:ilvl="7" w:tplc="0A6C250C" w:tentative="1">
+      <w:start w:val="1"/>
+      <w:numFmt w:val="bullet"/>
+      <w:lvlText w:val="●"/>
+      <w:lvlJc w:val="left"/>
+      <w:pPr>
+        <w:ind w:left="5760" w:hanging="360"/>
+      </w:pPr>
+    </w:lvl>
+    <w:lvl w:ilvl="8" w:tplc="A6DE285A" w:tentative="1">
+      <w:start w:val="1"/>
+      <w:numFmt w:val="bullet"/>
+      <w:lvlText w:val="●"/>
+      <w:lvlJc w:val="left"/>
+      <w:pPr>
+        <w:ind w:left="6480" w:hanging="360"/>
+      </w:pPr>
+    </w:lvl>
+  </w:abstractNum>
+  <w:abstractNum w:abstractNumId="2" w15:restartNumberingAfterBreak="0">
+    <w:nsid w:val="4A7369BF"/>
+    <w:multiLevelType w:val="hybridMultilevel"/>
+    <w:tmpl w:val="14A6675E"/>
+    <w:lvl w:ilvl="0" w:tplc="F9E20114">
+      <w:start w:val="1"/>
+      <w:numFmt w:val="decimal"/>
+      <w:lvlText w:val="%1."/>
+      <w:lvlJc w:val="left"/>
+      <w:pPr>
+        <w:ind w:left="540" w:hanging="300"/>
+      </w:pPr>
+    </w:lvl>
+    <w:lvl w:ilvl="1" w:tplc="D7927F96">
       <w:numFmt w:val="decimal"/>
       <w:lvlText w:val=""/>
       <w:lvlJc w:val="left"/>
     </w:lvl>
-    <w:lvl w:ilvl="2" w:tplc="5F1AC17E">
+    <w:lvl w:ilvl="2" w:tplc="FA448ED4">
       <w:numFmt w:val="decimal"/>
       <w:lvlText w:val=""/>
       <w:lvlJc w:val="left"/>
     </w:lvl>
-    <w:lvl w:ilvl="3" w:tplc="7DFE0CA8">
+    <w:lvl w:ilvl="3" w:tplc="DDE422E6">
       <w:numFmt w:val="decimal"/>
       <w:lvlText w:val=""/>
       <w:lvlJc w:val="left"/>
     </w:lvl>
-    <w:lvl w:ilvl="4" w:tplc="F2DA39CA">
+    <w:lvl w:ilvl="4" w:tplc="571AE79E">
       <w:numFmt w:val="decimal"/>
       <w:lvlText w:val=""/>
       <w:lvlJc w:val="left"/>
     </w:lvl>
-    <w:lvl w:ilvl="5" w:tplc="59C6882E">
+    <w:lvl w:ilvl="5" w:tplc="5D62FF04">
       <w:numFmt w:val="decimal"/>
       <w:lvlText w:val=""/>
       <w:lvlJc w:val="left"/>
     </w:lvl>
-    <w:lvl w:ilvl="6" w:tplc="C802B272">
+    <w:lvl w:ilvl="6" w:tplc="FECA32BE">
       <w:numFmt w:val="decimal"/>
       <w:lvlText w:val=""/>
       <w:lvlJc w:val="left"/>
     </w:lvl>
-    <w:lvl w:ilvl="7" w:tplc="4F640524">
+    <w:lvl w:ilvl="7" w:tplc="F1FCEA5A">
       <w:numFmt w:val="decimal"/>
       <w:lvlText w:val=""/>
       <w:lvlJc w:val="left"/>
     </w:lvl>
-    <w:lvl w:ilvl="8" w:tplc="965248AC">
+    <w:lvl w:ilvl="8" w:tplc="3B4400DC">
       <w:numFmt w:val="decimal"/>
       <w:lvlText w:val=""/>
       <w:lvlJc w:val="left"/>
     </w:lvl>
   </w:abstractNum>
-  <w:abstractNum w:abstractNumId="2" w15:restartNumberingAfterBreak="0">
-    <w:nsid w:val="2CAF6990"/>
+  <w:abstractNum w:abstractNumId="3" w15:restartNumberingAfterBreak="0">
+    <w:nsid w:val="67132316"/>
     <w:multiLevelType w:val="hybridMultilevel"/>
-    <w:tmpl w:val="5156D59E"/>
-    <w:lvl w:ilvl="0" w:tplc="870E98CC" w:tentative="1">
+    <w:tmpl w:val="7070DEB8"/>
+    <w:lvl w:ilvl="0" w:tplc="CFFC8898">
       <w:start w:val="1"/>
       <w:numFmt w:val="bullet"/>
-      <w:lvlText w:val="●"/>
+      <w:lvlText w:val="•"/>
       <w:lvlJc w:val="left"/>
       <w:pPr>
-        <w:ind w:left="720" w:hanging="360"/>
+        <w:ind w:left="540" w:hanging="270"/>
       </w:pPr>
     </w:lvl>
-    <w:lvl w:ilvl="1" w:tplc="4922145A" w:tentative="1">
-      <w:start w:val="1"/>
-      <w:numFmt w:val="bullet"/>
-      <w:lvlText w:val="○"/>
-      <w:lvlJc w:val="left"/>
-      <w:pPr>
-        <w:ind w:left="1440" w:hanging="360"/>
-      </w:pPr>
-    </w:lvl>
-    <w:lvl w:ilvl="2" w:tplc="10B2FAA6" w:tentative="1">
-      <w:start w:val="1"/>
-      <w:numFmt w:val="bullet"/>
-      <w:lvlText w:val="■"/>
-      <w:lvlJc w:val="left"/>
-      <w:pPr>
-        <w:ind w:left="2160" w:hanging="360"/>
-      </w:pPr>
-    </w:lvl>
-    <w:lvl w:ilvl="3" w:tplc="6A887D70" w:tentative="1">
-      <w:start w:val="1"/>
-      <w:numFmt w:val="bullet"/>
-      <w:lvlText w:val="●"/>
-      <w:lvlJc w:val="left"/>
-      <w:pPr>
-        <w:ind w:left="2880" w:hanging="360"/>
-      </w:pPr>
-    </w:lvl>
-    <w:lvl w:ilvl="4" w:tplc="CC78A54A" w:tentative="1">
-      <w:start w:val="1"/>
-      <w:numFmt w:val="bullet"/>
-      <w:lvlText w:val="○"/>
-      <w:lvlJc w:val="left"/>
-      <w:pPr>
-        <w:ind w:left="3600" w:hanging="360"/>
-      </w:pPr>
-    </w:lvl>
-    <w:lvl w:ilvl="5" w:tplc="A6C0A1CE" w:tentative="1">
-      <w:start w:val="1"/>
-      <w:numFmt w:val="bullet"/>
-      <w:lvlText w:val="■"/>
-      <w:lvlJc w:val="left"/>
-      <w:pPr>
-        <w:ind w:left="4320" w:hanging="360"/>
-      </w:pPr>
-    </w:lvl>
-    <w:lvl w:ilvl="6" w:tplc="FE42CD12" w:tentative="1">
-      <w:start w:val="1"/>
-      <w:numFmt w:val="bullet"/>
-      <w:lvlText w:val="●"/>
-      <w:lvlJc w:val="left"/>
-      <w:pPr>
-        <w:ind w:left="5040" w:hanging="360"/>
-      </w:pPr>
-    </w:lvl>
-    <w:lvl w:ilvl="7" w:tplc="CA0A7042" w:tentative="1">
-      <w:start w:val="1"/>
-      <w:numFmt w:val="bullet"/>
-      <w:lvlText w:val="●"/>
-      <w:lvlJc w:val="left"/>
-      <w:pPr>
-        <w:ind w:left="5760" w:hanging="360"/>
-      </w:pPr>
-    </w:lvl>
-    <w:lvl w:ilvl="8" w:tplc="0ED2D2D8" w:tentative="1">
-      <w:start w:val="1"/>
-      <w:numFmt w:val="bullet"/>
-      <w:lvlText w:val="●"/>
-      <w:lvlJc w:val="left"/>
-      <w:pPr>
-        <w:ind w:left="6480" w:hanging="360"/>
-      </w:pPr>
-    </w:lvl>
-  </w:abstractNum>
-  <w:abstractNum w:abstractNumId="3" w15:restartNumberingAfterBreak="0">
-    <w:nsid w:val="6E563022"/>
-    <w:multiLevelType w:val="hybridMultilevel"/>
-    <w:tmpl w:val="919A331C"/>
-    <w:lvl w:ilvl="0" w:tplc="425299EE">
-      <w:start w:val="1"/>
-      <w:numFmt w:val="decimal"/>
-      <w:lvlText w:val="%1."/>
-      <w:lvlJc w:val="left"/>
-      <w:pPr>
-        <w:ind w:left="540" w:hanging="300"/>
-      </w:pPr>
-    </w:lvl>
-    <w:lvl w:ilvl="1" w:tplc="B3D8D766">
+    <w:lvl w:ilvl="1" w:tplc="CB78699A">
       <w:numFmt w:val="decimal"/>
       <w:lvlText w:val=""/>
       <w:lvlJc w:val="left"/>
     </w:lvl>
-    <w:lvl w:ilvl="2" w:tplc="17602D6C">
+    <w:lvl w:ilvl="2" w:tplc="9F5057DC">
       <w:numFmt w:val="decimal"/>
       <w:lvlText w:val=""/>
       <w:lvlJc w:val="left"/>
     </w:lvl>
-    <w:lvl w:ilvl="3" w:tplc="FD147B06">
+    <w:lvl w:ilvl="3" w:tplc="1CBA4DD4">
       <w:numFmt w:val="decimal"/>
       <w:lvlText w:val=""/>
       <w:lvlJc w:val="left"/>
     </w:lvl>
-    <w:lvl w:ilvl="4" w:tplc="1304EBDC">
+    <w:lvl w:ilvl="4" w:tplc="260617A8">
       <w:numFmt w:val="decimal"/>
       <w:lvlText w:val=""/>
       <w:lvlJc w:val="left"/>
     </w:lvl>
-    <w:lvl w:ilvl="5" w:tplc="1902A13E">
+    <w:lvl w:ilvl="5" w:tplc="D5D6F576">
       <w:numFmt w:val="decimal"/>
       <w:lvlText w:val=""/>
       <w:lvlJc w:val="left"/>
     </w:lvl>
-    <w:lvl w:ilvl="6" w:tplc="5ED6D588">
+    <w:lvl w:ilvl="6" w:tplc="4D1C977E">
       <w:numFmt w:val="decimal"/>
       <w:lvlText w:val=""/>
       <w:lvlJc w:val="left"/>
     </w:lvl>
-    <w:lvl w:ilvl="7" w:tplc="4C8E5800">
+    <w:lvl w:ilvl="7" w:tplc="6A082674">
       <w:numFmt w:val="decimal"/>
       <w:lvlText w:val=""/>
       <w:lvlJc w:val="left"/>
     </w:lvl>
-    <w:lvl w:ilvl="8" w:tplc="80E0A476">
+    <w:lvl w:ilvl="8" w:tplc="7AF4692E">
       <w:numFmt w:val="decimal"/>
       <w:lvlText w:val=""/>
       <w:lvlJc w:val="left"/>
     </w:lvl>
   </w:abstractNum>
-  <w:num w:numId="1" w16cid:durableId="1934315609">
-    <w:abstractNumId w:val="2"/>
-    <w:lvlOverride w:ilvl="0">
-      <w:startOverride w:val="1"/>
-    </w:lvlOverride>
-  </w:num>
-  <w:num w:numId="2" w16cid:durableId="707798874">
+  <w:num w:numId="1" w16cid:durableId="48651171">
     <w:abstractNumId w:val="1"/>
     <w:lvlOverride w:ilvl="0">
       <w:startOverride w:val="1"/>
     </w:lvlOverride>
   </w:num>
-  <w:num w:numId="3" w16cid:durableId="999624817">
+  <w:num w:numId="2" w16cid:durableId="105123574">
+    <w:abstractNumId w:val="3"/>
+    <w:lvlOverride w:ilvl="0">
+      <w:startOverride w:val="1"/>
+    </w:lvlOverride>
+  </w:num>
+  <w:num w:numId="3" w16cid:durableId="1305820317">
     <w:abstractNumId w:val="0"/>
     <w:lvlOverride w:ilvl="0">
       <w:startOverride w:val="1"/>
     </w:lvlOverride>
   </w:num>
-  <w:num w:numId="4" w16cid:durableId="228345135">
-    <w:abstractNumId w:val="3"/>
+  <w:num w:numId="4" w16cid:durableId="1197541194">
+    <w:abstractNumId w:val="2"/>
     <w:lvlOverride w:ilvl="0">
       <w:startOverride w:val="1"/>
     </w:lvlOverride>
@@ -26037,7 +26037,7 @@
     <w:autoRedefine/>
     <w:uiPriority w:val="39"/>
     <w:unhideWhenUsed/>
-    <w:rsid w:val="008D66BF"/>
+    <w:rsid w:val="00554B7B"/>
     <w:pPr>
       <w:spacing w:after="100"/>
     </w:pPr>
@@ -26049,7 +26049,7 @@
     <w:autoRedefine/>
     <w:uiPriority w:val="39"/>
     <w:unhideWhenUsed/>
-    <w:rsid w:val="008D66BF"/>
+    <w:rsid w:val="00554B7B"/>
     <w:pPr>
       <w:spacing w:after="100"/>
       <w:ind w:left="210"/>

</xml_diff>

<commit_message>
PDFz 1.7.2: pulsante "chiudi" grande nelle notifiche, DMG per Mac di nuovo presente
- Avvisi, campanella delle notifiche e finestra delle novità: pulsante chiudi
  rotondo .chiudi-grande, 36 px con il mouse e 46 px su telefono e tablet.
- macOS: la 1.7.1 era uscita senza DMG (hdiutil "Resource busy"); ora il DMG si
  crea in due passi (UDRW, poi ULMO), con 3 tentativi e UDZO di riserva.
- Documentazione, CLAUDE.md e Word aggiornati (1.7.1 pubblicata senza Mac).

Co-Authored-By: Claude Opus 5.5 <noreply@anthropic.com>
</commit_message>
<xml_diff>
--- a/docs/PDFz_20261030.docx
+++ b/docs/PDFz_20261030.docx
@@ -16,7 +16,7 @@
           <w:noProof/>
         </w:rPr>
         <w:drawing>
-          <wp:inline distT="0" distB="0" distL="0" distR="0" wp14:anchorId="43770929" wp14:editId="48A73187">
+          <wp:inline distT="0" distB="0" distL="0" distR="0" wp14:anchorId="3263CAE0" wp14:editId="396AC592">
             <wp:extent cx="3619500" cy="1285875"/>
             <wp:effectExtent l="0" t="0" r="0" b="0"/>
             <wp:docPr id="1" name="Immagine 1"/>
@@ -95,7 +95,7 @@
           <w:sz w:val="22"/>
           <w:szCs w:val="22"/>
         </w:rPr>
-        <w:t>Versione 1.7.1  ·  30 ottobre 2026  ·  autore: agjin</w:t>
+        <w:t>Versione 1.7.2  ·  30 ottobre 2026  ·  autore: agjin</w:t>
       </w:r>
     </w:p>
     <w:p>
@@ -135,7 +135,7 @@
     <w:sdt>
       <w:sdtPr>
         <w:alias w:val="Indice"/>
-        <w:id w:val="1252086409"/>
+        <w:id w:val="271907022"/>
       </w:sdtPr>
       <w:sdtEndPr/>
       <w:sdtContent>
@@ -163,7 +163,7 @@
           <w:r>
             <w:fldChar w:fldCharType="separate"/>
           </w:r>
-          <w:hyperlink w:anchor="_Toc244270404" w:history="1">
+          <w:hyperlink w:anchor="_Toc244271043" w:history="1">
             <w:r>
               <w:rPr>
                 <w:rStyle w:val="Collegamentoipertestuale"/>
@@ -187,7 +187,7 @@
               <w:rPr>
                 <w:noProof/>
               </w:rPr>
-              <w:instrText xml:space="preserve"> PAGEREF _Toc244270404 \h </w:instrText>
+              <w:instrText xml:space="preserve"> PAGEREF _Toc244271043 \h </w:instrText>
             </w:r>
             <w:r>
               <w:rPr>
@@ -229,7 +229,7 @@
               <w14:ligatures w14:val="standardContextual"/>
             </w:rPr>
           </w:pPr>
-          <w:hyperlink w:anchor="_Toc244270405" w:history="1">
+          <w:hyperlink w:anchor="_Toc244271044" w:history="1">
             <w:r>
               <w:rPr>
                 <w:rStyle w:val="Collegamentoipertestuale"/>
@@ -253,7 +253,7 @@
               <w:rPr>
                 <w:noProof/>
               </w:rPr>
-              <w:instrText xml:space="preserve"> PAGEREF _Toc244270405 \h </w:instrText>
+              <w:instrText xml:space="preserve"> PAGEREF _Toc244271044 \h </w:instrText>
             </w:r>
             <w:r>
               <w:rPr>
@@ -295,7 +295,7 @@
               <w14:ligatures w14:val="standardContextual"/>
             </w:rPr>
           </w:pPr>
-          <w:hyperlink w:anchor="_Toc244270406" w:history="1">
+          <w:hyperlink w:anchor="_Toc244271045" w:history="1">
             <w:r>
               <w:rPr>
                 <w:rStyle w:val="Collegamentoipertestuale"/>
@@ -319,7 +319,7 @@
               <w:rPr>
                 <w:noProof/>
               </w:rPr>
-              <w:instrText xml:space="preserve"> PAGEREF _Toc244270406 \h </w:instrText>
+              <w:instrText xml:space="preserve"> PAGEREF _Toc244271045 \h </w:instrText>
             </w:r>
             <w:r>
               <w:rPr>
@@ -361,7 +361,7 @@
               <w14:ligatures w14:val="standardContextual"/>
             </w:rPr>
           </w:pPr>
-          <w:hyperlink w:anchor="_Toc244270407" w:history="1">
+          <w:hyperlink w:anchor="_Toc244271046" w:history="1">
             <w:r>
               <w:rPr>
                 <w:rStyle w:val="Collegamentoipertestuale"/>
@@ -385,7 +385,7 @@
               <w:rPr>
                 <w:noProof/>
               </w:rPr>
-              <w:instrText xml:space="preserve"> PAGEREF _Toc244270407 \h </w:instrText>
+              <w:instrText xml:space="preserve"> PAGEREF _Toc244271046 \h </w:instrText>
             </w:r>
             <w:r>
               <w:rPr>
@@ -427,7 +427,7 @@
               <w14:ligatures w14:val="standardContextual"/>
             </w:rPr>
           </w:pPr>
-          <w:hyperlink w:anchor="_Toc244270408" w:history="1">
+          <w:hyperlink w:anchor="_Toc244271047" w:history="1">
             <w:r>
               <w:rPr>
                 <w:rStyle w:val="Collegamentoipertestuale"/>
@@ -451,7 +451,7 @@
               <w:rPr>
                 <w:noProof/>
               </w:rPr>
-              <w:instrText xml:space="preserve"> PAGEREF _Toc244270408 \h </w:instrText>
+              <w:instrText xml:space="preserve"> PAGEREF _Toc244271047 \h </w:instrText>
             </w:r>
             <w:r>
               <w:rPr>
@@ -493,7 +493,7 @@
               <w14:ligatures w14:val="standardContextual"/>
             </w:rPr>
           </w:pPr>
-          <w:hyperlink w:anchor="_Toc244270409" w:history="1">
+          <w:hyperlink w:anchor="_Toc244271048" w:history="1">
             <w:r>
               <w:rPr>
                 <w:rStyle w:val="Collegamentoipertestuale"/>
@@ -517,7 +517,7 @@
               <w:rPr>
                 <w:noProof/>
               </w:rPr>
-              <w:instrText xml:space="preserve"> PAGEREF _Toc244270409 \h </w:instrText>
+              <w:instrText xml:space="preserve"> PAGEREF _Toc244271048 \h </w:instrText>
             </w:r>
             <w:r>
               <w:rPr>
@@ -559,7 +559,7 @@
               <w14:ligatures w14:val="standardContextual"/>
             </w:rPr>
           </w:pPr>
-          <w:hyperlink w:anchor="_Toc244270410" w:history="1">
+          <w:hyperlink w:anchor="_Toc244271049" w:history="1">
             <w:r>
               <w:rPr>
                 <w:rStyle w:val="Collegamentoipertestuale"/>
@@ -583,7 +583,7 @@
               <w:rPr>
                 <w:noProof/>
               </w:rPr>
-              <w:instrText xml:space="preserve"> PAGEREF _Toc244270410 \h </w:instrText>
+              <w:instrText xml:space="preserve"> PAGEREF _Toc244271049 \h </w:instrText>
             </w:r>
             <w:r>
               <w:rPr>
@@ -625,7 +625,7 @@
               <w14:ligatures w14:val="standardContextual"/>
             </w:rPr>
           </w:pPr>
-          <w:hyperlink w:anchor="_Toc244270411" w:history="1">
+          <w:hyperlink w:anchor="_Toc244271050" w:history="1">
             <w:r>
               <w:rPr>
                 <w:rStyle w:val="Collegamentoipertestuale"/>
@@ -649,7 +649,7 @@
               <w:rPr>
                 <w:noProof/>
               </w:rPr>
-              <w:instrText xml:space="preserve"> PAGEREF _Toc244270411 \h </w:instrText>
+              <w:instrText xml:space="preserve"> PAGEREF _Toc244271050 \h </w:instrText>
             </w:r>
             <w:r>
               <w:rPr>
@@ -691,7 +691,7 @@
               <w14:ligatures w14:val="standardContextual"/>
             </w:rPr>
           </w:pPr>
-          <w:hyperlink w:anchor="_Toc244270412" w:history="1">
+          <w:hyperlink w:anchor="_Toc244271051" w:history="1">
             <w:r>
               <w:rPr>
                 <w:rStyle w:val="Collegamentoipertestuale"/>
@@ -715,7 +715,7 @@
               <w:rPr>
                 <w:noProof/>
               </w:rPr>
-              <w:instrText xml:space="preserve"> PAGEREF _Toc244270412 \h </w:instrText>
+              <w:instrText xml:space="preserve"> PAGEREF _Toc244271051 \h </w:instrText>
             </w:r>
             <w:r>
               <w:rPr>
@@ -757,7 +757,7 @@
               <w14:ligatures w14:val="standardContextual"/>
             </w:rPr>
           </w:pPr>
-          <w:hyperlink w:anchor="_Toc244270413" w:history="1">
+          <w:hyperlink w:anchor="_Toc244271052" w:history="1">
             <w:r>
               <w:rPr>
                 <w:rStyle w:val="Collegamentoipertestuale"/>
@@ -781,7 +781,7 @@
               <w:rPr>
                 <w:noProof/>
               </w:rPr>
-              <w:instrText xml:space="preserve"> PAGEREF _Toc244270413 \h </w:instrText>
+              <w:instrText xml:space="preserve"> PAGEREF _Toc244271052 \h </w:instrText>
             </w:r>
             <w:r>
               <w:rPr>
@@ -823,7 +823,7 @@
               <w14:ligatures w14:val="standardContextual"/>
             </w:rPr>
           </w:pPr>
-          <w:hyperlink w:anchor="_Toc244270414" w:history="1">
+          <w:hyperlink w:anchor="_Toc244271053" w:history="1">
             <w:r>
               <w:rPr>
                 <w:rStyle w:val="Collegamentoipertestuale"/>
@@ -847,7 +847,7 @@
               <w:rPr>
                 <w:noProof/>
               </w:rPr>
-              <w:instrText xml:space="preserve"> PAGEREF _Toc244270414 \h </w:instrText>
+              <w:instrText xml:space="preserve"> PAGEREF _Toc244271053 \h </w:instrText>
             </w:r>
             <w:r>
               <w:rPr>
@@ -889,7 +889,7 @@
               <w14:ligatures w14:val="standardContextual"/>
             </w:rPr>
           </w:pPr>
-          <w:hyperlink w:anchor="_Toc244270415" w:history="1">
+          <w:hyperlink w:anchor="_Toc244271054" w:history="1">
             <w:r>
               <w:rPr>
                 <w:rStyle w:val="Collegamentoipertestuale"/>
@@ -913,7 +913,7 @@
               <w:rPr>
                 <w:noProof/>
               </w:rPr>
-              <w:instrText xml:space="preserve"> PAGEREF _Toc244270415 \h </w:instrText>
+              <w:instrText xml:space="preserve"> PAGEREF _Toc244271054 \h </w:instrText>
             </w:r>
             <w:r>
               <w:rPr>
@@ -955,7 +955,7 @@
               <w14:ligatures w14:val="standardContextual"/>
             </w:rPr>
           </w:pPr>
-          <w:hyperlink w:anchor="_Toc244270416" w:history="1">
+          <w:hyperlink w:anchor="_Toc244271055" w:history="1">
             <w:r>
               <w:rPr>
                 <w:rStyle w:val="Collegamentoipertestuale"/>
@@ -979,7 +979,7 @@
               <w:rPr>
                 <w:noProof/>
               </w:rPr>
-              <w:instrText xml:space="preserve"> PAGEREF _Toc244270416 \h </w:instrText>
+              <w:instrText xml:space="preserve"> PAGEREF _Toc244271055 \h </w:instrText>
             </w:r>
             <w:r>
               <w:rPr>
@@ -1021,7 +1021,7 @@
               <w14:ligatures w14:val="standardContextual"/>
             </w:rPr>
           </w:pPr>
-          <w:hyperlink w:anchor="_Toc244270417" w:history="1">
+          <w:hyperlink w:anchor="_Toc244271056" w:history="1">
             <w:r>
               <w:rPr>
                 <w:rStyle w:val="Collegamentoipertestuale"/>
@@ -1045,7 +1045,7 @@
               <w:rPr>
                 <w:noProof/>
               </w:rPr>
-              <w:instrText xml:space="preserve"> PAGEREF _Toc244270417 \h </w:instrText>
+              <w:instrText xml:space="preserve"> PAGEREF _Toc244271056 \h </w:instrText>
             </w:r>
             <w:r>
               <w:rPr>
@@ -1087,7 +1087,7 @@
               <w14:ligatures w14:val="standardContextual"/>
             </w:rPr>
           </w:pPr>
-          <w:hyperlink w:anchor="_Toc244270418" w:history="1">
+          <w:hyperlink w:anchor="_Toc244271057" w:history="1">
             <w:r>
               <w:rPr>
                 <w:rStyle w:val="Collegamentoipertestuale"/>
@@ -1111,7 +1111,7 @@
               <w:rPr>
                 <w:noProof/>
               </w:rPr>
-              <w:instrText xml:space="preserve"> PAGEREF _Toc244270418 \h </w:instrText>
+              <w:instrText xml:space="preserve"> PAGEREF _Toc244271057 \h </w:instrText>
             </w:r>
             <w:r>
               <w:rPr>
@@ -1153,7 +1153,7 @@
               <w14:ligatures w14:val="standardContextual"/>
             </w:rPr>
           </w:pPr>
-          <w:hyperlink w:anchor="_Toc244270419" w:history="1">
+          <w:hyperlink w:anchor="_Toc244271058" w:history="1">
             <w:r>
               <w:rPr>
                 <w:rStyle w:val="Collegamentoipertestuale"/>
@@ -1177,7 +1177,7 @@
               <w:rPr>
                 <w:noProof/>
               </w:rPr>
-              <w:instrText xml:space="preserve"> PAGEREF _Toc244270419 \h </w:instrText>
+              <w:instrText xml:space="preserve"> PAGEREF _Toc244271058 \h </w:instrText>
             </w:r>
             <w:r>
               <w:rPr>
@@ -1219,7 +1219,7 @@
               <w14:ligatures w14:val="standardContextual"/>
             </w:rPr>
           </w:pPr>
-          <w:hyperlink w:anchor="_Toc244270420" w:history="1">
+          <w:hyperlink w:anchor="_Toc244271059" w:history="1">
             <w:r>
               <w:rPr>
                 <w:rStyle w:val="Collegamentoipertestuale"/>
@@ -1243,7 +1243,7 @@
               <w:rPr>
                 <w:noProof/>
               </w:rPr>
-              <w:instrText xml:space="preserve"> PAGEREF _Toc244270420 \h </w:instrText>
+              <w:instrText xml:space="preserve"> PAGEREF _Toc244271059 \h </w:instrText>
             </w:r>
             <w:r>
               <w:rPr>
@@ -1285,7 +1285,7 @@
               <w14:ligatures w14:val="standardContextual"/>
             </w:rPr>
           </w:pPr>
-          <w:hyperlink w:anchor="_Toc244270421" w:history="1">
+          <w:hyperlink w:anchor="_Toc244271060" w:history="1">
             <w:r>
               <w:rPr>
                 <w:rStyle w:val="Collegamentoipertestuale"/>
@@ -1309,7 +1309,7 @@
               <w:rPr>
                 <w:noProof/>
               </w:rPr>
-              <w:instrText xml:space="preserve"> PAGEREF _Toc244270421 \h </w:instrText>
+              <w:instrText xml:space="preserve"> PAGEREF _Toc244271060 \h </w:instrText>
             </w:r>
             <w:r>
               <w:rPr>
@@ -1351,7 +1351,7 @@
               <w14:ligatures w14:val="standardContextual"/>
             </w:rPr>
           </w:pPr>
-          <w:hyperlink w:anchor="_Toc244270422" w:history="1">
+          <w:hyperlink w:anchor="_Toc244271061" w:history="1">
             <w:r>
               <w:rPr>
                 <w:rStyle w:val="Collegamentoipertestuale"/>
@@ -1375,7 +1375,7 @@
               <w:rPr>
                 <w:noProof/>
               </w:rPr>
-              <w:instrText xml:space="preserve"> PAGEREF _Toc244270422 \h </w:instrText>
+              <w:instrText xml:space="preserve"> PAGEREF _Toc244271061 \h </w:instrText>
             </w:r>
             <w:r>
               <w:rPr>
@@ -1417,7 +1417,7 @@
               <w14:ligatures w14:val="standardContextual"/>
             </w:rPr>
           </w:pPr>
-          <w:hyperlink w:anchor="_Toc244270423" w:history="1">
+          <w:hyperlink w:anchor="_Toc244271062" w:history="1">
             <w:r>
               <w:rPr>
                 <w:rStyle w:val="Collegamentoipertestuale"/>
@@ -1441,7 +1441,7 @@
               <w:rPr>
                 <w:noProof/>
               </w:rPr>
-              <w:instrText xml:space="preserve"> PAGEREF _Toc244270423 \h </w:instrText>
+              <w:instrText xml:space="preserve"> PAGEREF _Toc244271062 \h </w:instrText>
             </w:r>
             <w:r>
               <w:rPr>
@@ -1483,7 +1483,7 @@
               <w14:ligatures w14:val="standardContextual"/>
             </w:rPr>
           </w:pPr>
-          <w:hyperlink w:anchor="_Toc244270424" w:history="1">
+          <w:hyperlink w:anchor="_Toc244271063" w:history="1">
             <w:r>
               <w:rPr>
                 <w:rStyle w:val="Collegamentoipertestuale"/>
@@ -1507,7 +1507,7 @@
               <w:rPr>
                 <w:noProof/>
               </w:rPr>
-              <w:instrText xml:space="preserve"> PAGEREF _Toc244270424 \h </w:instrText>
+              <w:instrText xml:space="preserve"> PAGEREF _Toc244271063 \h </w:instrText>
             </w:r>
             <w:r>
               <w:rPr>
@@ -1549,7 +1549,7 @@
               <w14:ligatures w14:val="standardContextual"/>
             </w:rPr>
           </w:pPr>
-          <w:hyperlink w:anchor="_Toc244270425" w:history="1">
+          <w:hyperlink w:anchor="_Toc244271064" w:history="1">
             <w:r>
               <w:rPr>
                 <w:rStyle w:val="Collegamentoipertestuale"/>
@@ -1573,7 +1573,7 @@
               <w:rPr>
                 <w:noProof/>
               </w:rPr>
-              <w:instrText xml:space="preserve"> PAGEREF _Toc244270425 \h </w:instrText>
+              <w:instrText xml:space="preserve"> PAGEREF _Toc244271064 \h </w:instrText>
             </w:r>
             <w:r>
               <w:rPr>
@@ -1615,7 +1615,7 @@
               <w14:ligatures w14:val="standardContextual"/>
             </w:rPr>
           </w:pPr>
-          <w:hyperlink w:anchor="_Toc244270426" w:history="1">
+          <w:hyperlink w:anchor="_Toc244271065" w:history="1">
             <w:r>
               <w:rPr>
                 <w:rStyle w:val="Collegamentoipertestuale"/>
@@ -1639,7 +1639,7 @@
               <w:rPr>
                 <w:noProof/>
               </w:rPr>
-              <w:instrText xml:space="preserve"> PAGEREF _Toc244270426 \h </w:instrText>
+              <w:instrText xml:space="preserve"> PAGEREF _Toc244271065 \h </w:instrText>
             </w:r>
             <w:r>
               <w:rPr>
@@ -1681,7 +1681,7 @@
               <w14:ligatures w14:val="standardContextual"/>
             </w:rPr>
           </w:pPr>
-          <w:hyperlink w:anchor="_Toc244270427" w:history="1">
+          <w:hyperlink w:anchor="_Toc244271066" w:history="1">
             <w:r>
               <w:rPr>
                 <w:rStyle w:val="Collegamentoipertestuale"/>
@@ -1705,7 +1705,7 @@
               <w:rPr>
                 <w:noProof/>
               </w:rPr>
-              <w:instrText xml:space="preserve"> PAGEREF _Toc244270427 \h </w:instrText>
+              <w:instrText xml:space="preserve"> PAGEREF _Toc244271066 \h </w:instrText>
             </w:r>
             <w:r>
               <w:rPr>
@@ -1747,7 +1747,7 @@
               <w14:ligatures w14:val="standardContextual"/>
             </w:rPr>
           </w:pPr>
-          <w:hyperlink w:anchor="_Toc244270428" w:history="1">
+          <w:hyperlink w:anchor="_Toc244271067" w:history="1">
             <w:r>
               <w:rPr>
                 <w:rStyle w:val="Collegamentoipertestuale"/>
@@ -1771,7 +1771,7 @@
               <w:rPr>
                 <w:noProof/>
               </w:rPr>
-              <w:instrText xml:space="preserve"> PAGEREF _Toc244270428 \h </w:instrText>
+              <w:instrText xml:space="preserve"> PAGEREF _Toc244271067 \h </w:instrText>
             </w:r>
             <w:r>
               <w:rPr>
@@ -1813,7 +1813,7 @@
               <w14:ligatures w14:val="standardContextual"/>
             </w:rPr>
           </w:pPr>
-          <w:hyperlink w:anchor="_Toc244270429" w:history="1">
+          <w:hyperlink w:anchor="_Toc244271068" w:history="1">
             <w:r>
               <w:rPr>
                 <w:rStyle w:val="Collegamentoipertestuale"/>
@@ -1837,7 +1837,7 @@
               <w:rPr>
                 <w:noProof/>
               </w:rPr>
-              <w:instrText xml:space="preserve"> PAGEREF _Toc244270429 \h </w:instrText>
+              <w:instrText xml:space="preserve"> PAGEREF _Toc244271068 \h </w:instrText>
             </w:r>
             <w:r>
               <w:rPr>
@@ -1879,7 +1879,7 @@
               <w14:ligatures w14:val="standardContextual"/>
             </w:rPr>
           </w:pPr>
-          <w:hyperlink w:anchor="_Toc244270430" w:history="1">
+          <w:hyperlink w:anchor="_Toc244271069" w:history="1">
             <w:r>
               <w:rPr>
                 <w:rStyle w:val="Collegamentoipertestuale"/>
@@ -1903,7 +1903,7 @@
               <w:rPr>
                 <w:noProof/>
               </w:rPr>
-              <w:instrText xml:space="preserve"> PAGEREF _Toc244270430 \h </w:instrText>
+              <w:instrText xml:space="preserve"> PAGEREF _Toc244271069 \h </w:instrText>
             </w:r>
             <w:r>
               <w:rPr>
@@ -1945,7 +1945,7 @@
               <w14:ligatures w14:val="standardContextual"/>
             </w:rPr>
           </w:pPr>
-          <w:hyperlink w:anchor="_Toc244270431" w:history="1">
+          <w:hyperlink w:anchor="_Toc244271070" w:history="1">
             <w:r>
               <w:rPr>
                 <w:rStyle w:val="Collegamentoipertestuale"/>
@@ -1969,7 +1969,7 @@
               <w:rPr>
                 <w:noProof/>
               </w:rPr>
-              <w:instrText xml:space="preserve"> PAGEREF _Toc244270431 \h </w:instrText>
+              <w:instrText xml:space="preserve"> PAGEREF _Toc244271070 \h </w:instrText>
             </w:r>
             <w:r>
               <w:rPr>
@@ -2011,7 +2011,7 @@
               <w14:ligatures w14:val="standardContextual"/>
             </w:rPr>
           </w:pPr>
-          <w:hyperlink w:anchor="_Toc244270432" w:history="1">
+          <w:hyperlink w:anchor="_Toc244271071" w:history="1">
             <w:r>
               <w:rPr>
                 <w:rStyle w:val="Collegamentoipertestuale"/>
@@ -2035,7 +2035,7 @@
               <w:rPr>
                 <w:noProof/>
               </w:rPr>
-              <w:instrText xml:space="preserve"> PAGEREF _Toc244270432 \h </w:instrText>
+              <w:instrText xml:space="preserve"> PAGEREF _Toc244271071 \h </w:instrText>
             </w:r>
             <w:r>
               <w:rPr>
@@ -2077,7 +2077,7 @@
               <w14:ligatures w14:val="standardContextual"/>
             </w:rPr>
           </w:pPr>
-          <w:hyperlink w:anchor="_Toc244270433" w:history="1">
+          <w:hyperlink w:anchor="_Toc244271072" w:history="1">
             <w:r>
               <w:rPr>
                 <w:rStyle w:val="Collegamentoipertestuale"/>
@@ -2101,7 +2101,7 @@
               <w:rPr>
                 <w:noProof/>
               </w:rPr>
-              <w:instrText xml:space="preserve"> PAGEREF _Toc244270433 \h </w:instrText>
+              <w:instrText xml:space="preserve"> PAGEREF _Toc244271072 \h </w:instrText>
             </w:r>
             <w:r>
               <w:rPr>
@@ -2143,7 +2143,7 @@
               <w14:ligatures w14:val="standardContextual"/>
             </w:rPr>
           </w:pPr>
-          <w:hyperlink w:anchor="_Toc244270434" w:history="1">
+          <w:hyperlink w:anchor="_Toc244271073" w:history="1">
             <w:r>
               <w:rPr>
                 <w:rStyle w:val="Collegamentoipertestuale"/>
@@ -2167,7 +2167,7 @@
               <w:rPr>
                 <w:noProof/>
               </w:rPr>
-              <w:instrText xml:space="preserve"> PAGEREF _Toc244270434 \h </w:instrText>
+              <w:instrText xml:space="preserve"> PAGEREF _Toc244271073 \h </w:instrText>
             </w:r>
             <w:r>
               <w:rPr>
@@ -2209,7 +2209,7 @@
               <w14:ligatures w14:val="standardContextual"/>
             </w:rPr>
           </w:pPr>
-          <w:hyperlink w:anchor="_Toc244270435" w:history="1">
+          <w:hyperlink w:anchor="_Toc244271074" w:history="1">
             <w:r>
               <w:rPr>
                 <w:rStyle w:val="Collegamentoipertestuale"/>
@@ -2233,7 +2233,7 @@
               <w:rPr>
                 <w:noProof/>
               </w:rPr>
-              <w:instrText xml:space="preserve"> PAGEREF _Toc244270435 \h </w:instrText>
+              <w:instrText xml:space="preserve"> PAGEREF _Toc244271074 \h </w:instrText>
             </w:r>
             <w:r>
               <w:rPr>
@@ -2275,7 +2275,7 @@
               <w14:ligatures w14:val="standardContextual"/>
             </w:rPr>
           </w:pPr>
-          <w:hyperlink w:anchor="_Toc244270436" w:history="1">
+          <w:hyperlink w:anchor="_Toc244271075" w:history="1">
             <w:r>
               <w:rPr>
                 <w:rStyle w:val="Collegamentoipertestuale"/>
@@ -2299,7 +2299,7 @@
               <w:rPr>
                 <w:noProof/>
               </w:rPr>
-              <w:instrText xml:space="preserve"> PAGEREF _Toc244270436 \h </w:instrText>
+              <w:instrText xml:space="preserve"> PAGEREF _Toc244271075 \h </w:instrText>
             </w:r>
             <w:r>
               <w:rPr>
@@ -2341,7 +2341,7 @@
               <w14:ligatures w14:val="standardContextual"/>
             </w:rPr>
           </w:pPr>
-          <w:hyperlink w:anchor="_Toc244270437" w:history="1">
+          <w:hyperlink w:anchor="_Toc244271076" w:history="1">
             <w:r>
               <w:rPr>
                 <w:rStyle w:val="Collegamentoipertestuale"/>
@@ -2365,7 +2365,7 @@
               <w:rPr>
                 <w:noProof/>
               </w:rPr>
-              <w:instrText xml:space="preserve"> PAGEREF _Toc244270437 \h </w:instrText>
+              <w:instrText xml:space="preserve"> PAGEREF _Toc244271076 \h </w:instrText>
             </w:r>
             <w:r>
               <w:rPr>
@@ -2407,7 +2407,7 @@
               <w14:ligatures w14:val="standardContextual"/>
             </w:rPr>
           </w:pPr>
-          <w:hyperlink w:anchor="_Toc244270438" w:history="1">
+          <w:hyperlink w:anchor="_Toc244271077" w:history="1">
             <w:r>
               <w:rPr>
                 <w:rStyle w:val="Collegamentoipertestuale"/>
@@ -2431,7 +2431,7 @@
               <w:rPr>
                 <w:noProof/>
               </w:rPr>
-              <w:instrText xml:space="preserve"> PAGEREF _Toc244270438 \h </w:instrText>
+              <w:instrText xml:space="preserve"> PAGEREF _Toc244271077 \h </w:instrText>
             </w:r>
             <w:r>
               <w:rPr>
@@ -2473,7 +2473,7 @@
               <w14:ligatures w14:val="standardContextual"/>
             </w:rPr>
           </w:pPr>
-          <w:hyperlink w:anchor="_Toc244270439" w:history="1">
+          <w:hyperlink w:anchor="_Toc244271078" w:history="1">
             <w:r>
               <w:rPr>
                 <w:rStyle w:val="Collegamentoipertestuale"/>
@@ -2497,7 +2497,7 @@
               <w:rPr>
                 <w:noProof/>
               </w:rPr>
-              <w:instrText xml:space="preserve"> PAGEREF _Toc244270439 \h </w:instrText>
+              <w:instrText xml:space="preserve"> PAGEREF _Toc244271078 \h </w:instrText>
             </w:r>
             <w:r>
               <w:rPr>
@@ -2539,7 +2539,7 @@
               <w14:ligatures w14:val="standardContextual"/>
             </w:rPr>
           </w:pPr>
-          <w:hyperlink w:anchor="_Toc244270440" w:history="1">
+          <w:hyperlink w:anchor="_Toc244271079" w:history="1">
             <w:r>
               <w:rPr>
                 <w:rStyle w:val="Collegamentoipertestuale"/>
@@ -2563,7 +2563,7 @@
               <w:rPr>
                 <w:noProof/>
               </w:rPr>
-              <w:instrText xml:space="preserve"> PAGEREF _Toc244270440 \h </w:instrText>
+              <w:instrText xml:space="preserve"> PAGEREF _Toc244271079 \h </w:instrText>
             </w:r>
             <w:r>
               <w:rPr>
@@ -2605,7 +2605,7 @@
               <w14:ligatures w14:val="standardContextual"/>
             </w:rPr>
           </w:pPr>
-          <w:hyperlink w:anchor="_Toc244270441" w:history="1">
+          <w:hyperlink w:anchor="_Toc244271080" w:history="1">
             <w:r>
               <w:rPr>
                 <w:rStyle w:val="Collegamentoipertestuale"/>
@@ -2629,7 +2629,7 @@
               <w:rPr>
                 <w:noProof/>
               </w:rPr>
-              <w:instrText xml:space="preserve"> PAGEREF _Toc244270441 \h </w:instrText>
+              <w:instrText xml:space="preserve"> PAGEREF _Toc244271080 \h </w:instrText>
             </w:r>
             <w:r>
               <w:rPr>
@@ -2671,7 +2671,7 @@
               <w14:ligatures w14:val="standardContextual"/>
             </w:rPr>
           </w:pPr>
-          <w:hyperlink w:anchor="_Toc244270442" w:history="1">
+          <w:hyperlink w:anchor="_Toc244271081" w:history="1">
             <w:r>
               <w:rPr>
                 <w:rStyle w:val="Collegamentoipertestuale"/>
@@ -2695,7 +2695,7 @@
               <w:rPr>
                 <w:noProof/>
               </w:rPr>
-              <w:instrText xml:space="preserve"> PAGEREF _Toc244270442 \h </w:instrText>
+              <w:instrText xml:space="preserve"> PAGEREF _Toc244271081 \h </w:instrText>
             </w:r>
             <w:r>
               <w:rPr>
@@ -2737,7 +2737,7 @@
               <w14:ligatures w14:val="standardContextual"/>
             </w:rPr>
           </w:pPr>
-          <w:hyperlink w:anchor="_Toc244270443" w:history="1">
+          <w:hyperlink w:anchor="_Toc244271082" w:history="1">
             <w:r>
               <w:rPr>
                 <w:rStyle w:val="Collegamentoipertestuale"/>
@@ -2761,7 +2761,7 @@
               <w:rPr>
                 <w:noProof/>
               </w:rPr>
-              <w:instrText xml:space="preserve"> PAGEREF _Toc244270443 \h </w:instrText>
+              <w:instrText xml:space="preserve"> PAGEREF _Toc244271082 \h </w:instrText>
             </w:r>
             <w:r>
               <w:rPr>
@@ -2803,7 +2803,7 @@
               <w14:ligatures w14:val="standardContextual"/>
             </w:rPr>
           </w:pPr>
-          <w:hyperlink w:anchor="_Toc244270444" w:history="1">
+          <w:hyperlink w:anchor="_Toc244271083" w:history="1">
             <w:r>
               <w:rPr>
                 <w:rStyle w:val="Collegamentoipertestuale"/>
@@ -2827,7 +2827,7 @@
               <w:rPr>
                 <w:noProof/>
               </w:rPr>
-              <w:instrText xml:space="preserve"> PAGEREF _Toc244270444 \h </w:instrText>
+              <w:instrText xml:space="preserve"> PAGEREF _Toc244271083 \h </w:instrText>
             </w:r>
             <w:r>
               <w:rPr>
@@ -2869,7 +2869,7 @@
               <w14:ligatures w14:val="standardContextual"/>
             </w:rPr>
           </w:pPr>
-          <w:hyperlink w:anchor="_Toc244270445" w:history="1">
+          <w:hyperlink w:anchor="_Toc244271084" w:history="1">
             <w:r>
               <w:rPr>
                 <w:rStyle w:val="Collegamentoipertestuale"/>
@@ -2893,7 +2893,7 @@
               <w:rPr>
                 <w:noProof/>
               </w:rPr>
-              <w:instrText xml:space="preserve"> PAGEREF _Toc244270445 \h </w:instrText>
+              <w:instrText xml:space="preserve"> PAGEREF _Toc244271084 \h </w:instrText>
             </w:r>
             <w:r>
               <w:rPr>
@@ -2935,7 +2935,7 @@
               <w14:ligatures w14:val="standardContextual"/>
             </w:rPr>
           </w:pPr>
-          <w:hyperlink w:anchor="_Toc244270446" w:history="1">
+          <w:hyperlink w:anchor="_Toc244271085" w:history="1">
             <w:r>
               <w:rPr>
                 <w:rStyle w:val="Collegamentoipertestuale"/>
@@ -2959,7 +2959,7 @@
               <w:rPr>
                 <w:noProof/>
               </w:rPr>
-              <w:instrText xml:space="preserve"> PAGEREF _Toc244270446 \h </w:instrText>
+              <w:instrText xml:space="preserve"> PAGEREF _Toc244271085 \h </w:instrText>
             </w:r>
             <w:r>
               <w:rPr>
@@ -3001,7 +3001,7 @@
               <w14:ligatures w14:val="standardContextual"/>
             </w:rPr>
           </w:pPr>
-          <w:hyperlink w:anchor="_Toc244270447" w:history="1">
+          <w:hyperlink w:anchor="_Toc244271086" w:history="1">
             <w:r>
               <w:rPr>
                 <w:rStyle w:val="Collegamentoipertestuale"/>
@@ -3025,7 +3025,7 @@
               <w:rPr>
                 <w:noProof/>
               </w:rPr>
-              <w:instrText xml:space="preserve"> PAGEREF _Toc244270447 \h </w:instrText>
+              <w:instrText xml:space="preserve"> PAGEREF _Toc244271086 \h </w:instrText>
             </w:r>
             <w:r>
               <w:rPr>
@@ -3067,7 +3067,7 @@
               <w14:ligatures w14:val="standardContextual"/>
             </w:rPr>
           </w:pPr>
-          <w:hyperlink w:anchor="_Toc244270448" w:history="1">
+          <w:hyperlink w:anchor="_Toc244271087" w:history="1">
             <w:r>
               <w:rPr>
                 <w:rStyle w:val="Collegamentoipertestuale"/>
@@ -3091,7 +3091,7 @@
               <w:rPr>
                 <w:noProof/>
               </w:rPr>
-              <w:instrText xml:space="preserve"> PAGEREF _Toc244270448 \h </w:instrText>
+              <w:instrText xml:space="preserve"> PAGEREF _Toc244271087 \h </w:instrText>
             </w:r>
             <w:r>
               <w:rPr>
@@ -3133,7 +3133,7 @@
               <w14:ligatures w14:val="standardContextual"/>
             </w:rPr>
           </w:pPr>
-          <w:hyperlink w:anchor="_Toc244270449" w:history="1">
+          <w:hyperlink w:anchor="_Toc244271088" w:history="1">
             <w:r>
               <w:rPr>
                 <w:rStyle w:val="Collegamentoipertestuale"/>
@@ -3157,7 +3157,7 @@
               <w:rPr>
                 <w:noProof/>
               </w:rPr>
-              <w:instrText xml:space="preserve"> PAGEREF _Toc244270449 \h </w:instrText>
+              <w:instrText xml:space="preserve"> PAGEREF _Toc244271088 \h </w:instrText>
             </w:r>
             <w:r>
               <w:rPr>
@@ -3199,7 +3199,7 @@
               <w14:ligatures w14:val="standardContextual"/>
             </w:rPr>
           </w:pPr>
-          <w:hyperlink w:anchor="_Toc244270450" w:history="1">
+          <w:hyperlink w:anchor="_Toc244271089" w:history="1">
             <w:r>
               <w:rPr>
                 <w:rStyle w:val="Collegamentoipertestuale"/>
@@ -3223,7 +3223,7 @@
               <w:rPr>
                 <w:noProof/>
               </w:rPr>
-              <w:instrText xml:space="preserve"> PAGEREF _Toc244270450 \h </w:instrText>
+              <w:instrText xml:space="preserve"> PAGEREF _Toc244271089 \h </w:instrText>
             </w:r>
             <w:r>
               <w:rPr>
@@ -3265,7 +3265,7 @@
               <w14:ligatures w14:val="standardContextual"/>
             </w:rPr>
           </w:pPr>
-          <w:hyperlink w:anchor="_Toc244270451" w:history="1">
+          <w:hyperlink w:anchor="_Toc244271090" w:history="1">
             <w:r>
               <w:rPr>
                 <w:rStyle w:val="Collegamentoipertestuale"/>
@@ -3289,7 +3289,7 @@
               <w:rPr>
                 <w:noProof/>
               </w:rPr>
-              <w:instrText xml:space="preserve"> PAGEREF _Toc244270451 \h </w:instrText>
+              <w:instrText xml:space="preserve"> PAGEREF _Toc244271090 \h </w:instrText>
             </w:r>
             <w:r>
               <w:rPr>
@@ -3331,7 +3331,7 @@
               <w14:ligatures w14:val="standardContextual"/>
             </w:rPr>
           </w:pPr>
-          <w:hyperlink w:anchor="_Toc244270452" w:history="1">
+          <w:hyperlink w:anchor="_Toc244271091" w:history="1">
             <w:r>
               <w:rPr>
                 <w:rStyle w:val="Collegamentoipertestuale"/>
@@ -3355,7 +3355,7 @@
               <w:rPr>
                 <w:noProof/>
               </w:rPr>
-              <w:instrText xml:space="preserve"> PAGEREF _Toc244270452 \h </w:instrText>
+              <w:instrText xml:space="preserve"> PAGEREF _Toc244271091 \h </w:instrText>
             </w:r>
             <w:r>
               <w:rPr>
@@ -3397,7 +3397,7 @@
               <w14:ligatures w14:val="standardContextual"/>
             </w:rPr>
           </w:pPr>
-          <w:hyperlink w:anchor="_Toc244270453" w:history="1">
+          <w:hyperlink w:anchor="_Toc244271092" w:history="1">
             <w:r>
               <w:rPr>
                 <w:rStyle w:val="Collegamentoipertestuale"/>
@@ -3421,7 +3421,7 @@
               <w:rPr>
                 <w:noProof/>
               </w:rPr>
-              <w:instrText xml:space="preserve"> PAGEREF _Toc244270453 \h </w:instrText>
+              <w:instrText xml:space="preserve"> PAGEREF _Toc244271092 \h </w:instrText>
             </w:r>
             <w:r>
               <w:rPr>
@@ -3463,7 +3463,7 @@
               <w14:ligatures w14:val="standardContextual"/>
             </w:rPr>
           </w:pPr>
-          <w:hyperlink w:anchor="_Toc244270454" w:history="1">
+          <w:hyperlink w:anchor="_Toc244271093" w:history="1">
             <w:r>
               <w:rPr>
                 <w:rStyle w:val="Collegamentoipertestuale"/>
@@ -3487,7 +3487,7 @@
               <w:rPr>
                 <w:noProof/>
               </w:rPr>
-              <w:instrText xml:space="preserve"> PAGEREF _Toc244270454 \h </w:instrText>
+              <w:instrText xml:space="preserve"> PAGEREF _Toc244271093 \h </w:instrText>
             </w:r>
             <w:r>
               <w:rPr>
@@ -3529,7 +3529,7 @@
               <w14:ligatures w14:val="standardContextual"/>
             </w:rPr>
           </w:pPr>
-          <w:hyperlink w:anchor="_Toc244270455" w:history="1">
+          <w:hyperlink w:anchor="_Toc244271094" w:history="1">
             <w:r>
               <w:rPr>
                 <w:rStyle w:val="Collegamentoipertestuale"/>
@@ -3553,7 +3553,7 @@
               <w:rPr>
                 <w:noProof/>
               </w:rPr>
-              <w:instrText xml:space="preserve"> PAGEREF _Toc244270455 \h </w:instrText>
+              <w:instrText xml:space="preserve"> PAGEREF _Toc244271094 \h </w:instrText>
             </w:r>
             <w:r>
               <w:rPr>
@@ -3595,7 +3595,7 @@
               <w14:ligatures w14:val="standardContextual"/>
             </w:rPr>
           </w:pPr>
-          <w:hyperlink w:anchor="_Toc244270456" w:history="1">
+          <w:hyperlink w:anchor="_Toc244271095" w:history="1">
             <w:r>
               <w:rPr>
                 <w:rStyle w:val="Collegamentoipertestuale"/>
@@ -3619,7 +3619,7 @@
               <w:rPr>
                 <w:noProof/>
               </w:rPr>
-              <w:instrText xml:space="preserve"> PAGEREF _Toc244270456 \h </w:instrText>
+              <w:instrText xml:space="preserve"> PAGEREF _Toc244271095 \h </w:instrText>
             </w:r>
             <w:r>
               <w:rPr>
@@ -3661,7 +3661,7 @@
               <w14:ligatures w14:val="standardContextual"/>
             </w:rPr>
           </w:pPr>
-          <w:hyperlink w:anchor="_Toc244270457" w:history="1">
+          <w:hyperlink w:anchor="_Toc244271096" w:history="1">
             <w:r>
               <w:rPr>
                 <w:rStyle w:val="Collegamentoipertestuale"/>
@@ -3685,7 +3685,7 @@
               <w:rPr>
                 <w:noProof/>
               </w:rPr>
-              <w:instrText xml:space="preserve"> PAGEREF _Toc244270457 \h </w:instrText>
+              <w:instrText xml:space="preserve"> PAGEREF _Toc244271096 \h </w:instrText>
             </w:r>
             <w:r>
               <w:rPr>
@@ -3727,7 +3727,7 @@
               <w14:ligatures w14:val="standardContextual"/>
             </w:rPr>
           </w:pPr>
-          <w:hyperlink w:anchor="_Toc244270458" w:history="1">
+          <w:hyperlink w:anchor="_Toc244271097" w:history="1">
             <w:r>
               <w:rPr>
                 <w:rStyle w:val="Collegamentoipertestuale"/>
@@ -3751,7 +3751,7 @@
               <w:rPr>
                 <w:noProof/>
               </w:rPr>
-              <w:instrText xml:space="preserve"> PAGEREF _Toc244270458 \h </w:instrText>
+              <w:instrText xml:space="preserve"> PAGEREF _Toc244271097 \h </w:instrText>
             </w:r>
             <w:r>
               <w:rPr>
@@ -3793,7 +3793,7 @@
               <w14:ligatures w14:val="standardContextual"/>
             </w:rPr>
           </w:pPr>
-          <w:hyperlink w:anchor="_Toc244270459" w:history="1">
+          <w:hyperlink w:anchor="_Toc244271098" w:history="1">
             <w:r>
               <w:rPr>
                 <w:rStyle w:val="Collegamentoipertestuale"/>
@@ -3817,7 +3817,7 @@
               <w:rPr>
                 <w:noProof/>
               </w:rPr>
-              <w:instrText xml:space="preserve"> PAGEREF _Toc244270459 \h </w:instrText>
+              <w:instrText xml:space="preserve"> PAGEREF _Toc244271098 \h </w:instrText>
             </w:r>
             <w:r>
               <w:rPr>
@@ -3859,7 +3859,7 @@
               <w14:ligatures w14:val="standardContextual"/>
             </w:rPr>
           </w:pPr>
-          <w:hyperlink w:anchor="_Toc244270460" w:history="1">
+          <w:hyperlink w:anchor="_Toc244271099" w:history="1">
             <w:r>
               <w:rPr>
                 <w:rStyle w:val="Collegamentoipertestuale"/>
@@ -3883,7 +3883,7 @@
               <w:rPr>
                 <w:noProof/>
               </w:rPr>
-              <w:instrText xml:space="preserve"> PAGEREF _Toc244270460 \h </w:instrText>
+              <w:instrText xml:space="preserve"> PAGEREF _Toc244271099 \h </w:instrText>
             </w:r>
             <w:r>
               <w:rPr>
@@ -3925,7 +3925,7 @@
               <w14:ligatures w14:val="standardContextual"/>
             </w:rPr>
           </w:pPr>
-          <w:hyperlink w:anchor="_Toc244270461" w:history="1">
+          <w:hyperlink w:anchor="_Toc244271100" w:history="1">
             <w:r>
               <w:rPr>
                 <w:rStyle w:val="Collegamentoipertestuale"/>
@@ -3949,7 +3949,7 @@
               <w:rPr>
                 <w:noProof/>
               </w:rPr>
-              <w:instrText xml:space="preserve"> PAGEREF _Toc244270461 \h </w:instrText>
+              <w:instrText xml:space="preserve"> PAGEREF _Toc244271100 \h </w:instrText>
             </w:r>
             <w:r>
               <w:rPr>
@@ -3991,7 +3991,7 @@
               <w14:ligatures w14:val="standardContextual"/>
             </w:rPr>
           </w:pPr>
-          <w:hyperlink w:anchor="_Toc244270462" w:history="1">
+          <w:hyperlink w:anchor="_Toc244271101" w:history="1">
             <w:r>
               <w:rPr>
                 <w:rStyle w:val="Collegamentoipertestuale"/>
@@ -4015,7 +4015,7 @@
               <w:rPr>
                 <w:noProof/>
               </w:rPr>
-              <w:instrText xml:space="preserve"> PAGEREF _Toc244270462 \h </w:instrText>
+              <w:instrText xml:space="preserve"> PAGEREF _Toc244271101 \h </w:instrText>
             </w:r>
             <w:r>
               <w:rPr>
@@ -4057,7 +4057,7 @@
               <w14:ligatures w14:val="standardContextual"/>
             </w:rPr>
           </w:pPr>
-          <w:hyperlink w:anchor="_Toc244270463" w:history="1">
+          <w:hyperlink w:anchor="_Toc244271102" w:history="1">
             <w:r>
               <w:rPr>
                 <w:rStyle w:val="Collegamentoipertestuale"/>
@@ -4081,7 +4081,7 @@
               <w:rPr>
                 <w:noProof/>
               </w:rPr>
-              <w:instrText xml:space="preserve"> PAGEREF _Toc244270463 \h </w:instrText>
+              <w:instrText xml:space="preserve"> PAGEREF _Toc244271102 \h </w:instrText>
             </w:r>
             <w:r>
               <w:rPr>
@@ -4123,7 +4123,7 @@
               <w14:ligatures w14:val="standardContextual"/>
             </w:rPr>
           </w:pPr>
-          <w:hyperlink w:anchor="_Toc244270464" w:history="1">
+          <w:hyperlink w:anchor="_Toc244271103" w:history="1">
             <w:r>
               <w:rPr>
                 <w:rStyle w:val="Collegamentoipertestuale"/>
@@ -4147,7 +4147,7 @@
               <w:rPr>
                 <w:noProof/>
               </w:rPr>
-              <w:instrText xml:space="preserve"> PAGEREF _Toc244270464 \h </w:instrText>
+              <w:instrText xml:space="preserve"> PAGEREF _Toc244271103 \h </w:instrText>
             </w:r>
             <w:r>
               <w:rPr>
@@ -4189,7 +4189,7 @@
               <w14:ligatures w14:val="standardContextual"/>
             </w:rPr>
           </w:pPr>
-          <w:hyperlink w:anchor="_Toc244270465" w:history="1">
+          <w:hyperlink w:anchor="_Toc244271104" w:history="1">
             <w:r>
               <w:rPr>
                 <w:rStyle w:val="Collegamentoipertestuale"/>
@@ -4213,7 +4213,7 @@
               <w:rPr>
                 <w:noProof/>
               </w:rPr>
-              <w:instrText xml:space="preserve"> PAGEREF _Toc244270465 \h </w:instrText>
+              <w:instrText xml:space="preserve"> PAGEREF _Toc244271104 \h </w:instrText>
             </w:r>
             <w:r>
               <w:rPr>
@@ -4255,7 +4255,7 @@
               <w14:ligatures w14:val="standardContextual"/>
             </w:rPr>
           </w:pPr>
-          <w:hyperlink w:anchor="_Toc244270466" w:history="1">
+          <w:hyperlink w:anchor="_Toc244271105" w:history="1">
             <w:r>
               <w:rPr>
                 <w:rStyle w:val="Collegamentoipertestuale"/>
@@ -4279,7 +4279,7 @@
               <w:rPr>
                 <w:noProof/>
               </w:rPr>
-              <w:instrText xml:space="preserve"> PAGEREF _Toc244270466 \h </w:instrText>
+              <w:instrText xml:space="preserve"> PAGEREF _Toc244271105 \h </w:instrText>
             </w:r>
             <w:r>
               <w:rPr>
@@ -4321,7 +4321,7 @@
               <w14:ligatures w14:val="standardContextual"/>
             </w:rPr>
           </w:pPr>
-          <w:hyperlink w:anchor="_Toc244270467" w:history="1">
+          <w:hyperlink w:anchor="_Toc244271106" w:history="1">
             <w:r>
               <w:rPr>
                 <w:rStyle w:val="Collegamentoipertestuale"/>
@@ -4345,7 +4345,7 @@
               <w:rPr>
                 <w:noProof/>
               </w:rPr>
-              <w:instrText xml:space="preserve"> PAGEREF _Toc244270467 \h </w:instrText>
+              <w:instrText xml:space="preserve"> PAGEREF _Toc244271106 \h </w:instrText>
             </w:r>
             <w:r>
               <w:rPr>
@@ -4387,13 +4387,13 @@
               <w14:ligatures w14:val="standardContextual"/>
             </w:rPr>
           </w:pPr>
-          <w:hyperlink w:anchor="_Toc244270468" w:history="1">
+          <w:hyperlink w:anchor="_Toc244271107" w:history="1">
             <w:r>
               <w:rPr>
                 <w:rStyle w:val="Collegamentoipertestuale"/>
                 <w:noProof/>
               </w:rPr>
-              <w:t>6.18 Ruoli</w:t>
+              <w:t>6.18 Versione 1.7.2</w:t>
             </w:r>
             <w:r>
               <w:rPr>
@@ -4411,7 +4411,73 @@
               <w:rPr>
                 <w:noProof/>
               </w:rPr>
-              <w:instrText xml:space="preserve"> PAGEREF _Toc244270468 \h </w:instrText>
+              <w:instrText xml:space="preserve"> PAGEREF _Toc244271107 \h </w:instrText>
+            </w:r>
+            <w:r>
+              <w:rPr>
+                <w:noProof/>
+              </w:rPr>
+            </w:r>
+            <w:r>
+              <w:rPr>
+                <w:noProof/>
+              </w:rPr>
+              <w:fldChar w:fldCharType="separate"/>
+            </w:r>
+            <w:r>
+              <w:rPr>
+                <w:noProof/>
+              </w:rPr>
+              <w:t>38</w:t>
+            </w:r>
+            <w:r>
+              <w:rPr>
+                <w:noProof/>
+              </w:rPr>
+              <w:fldChar w:fldCharType="end"/>
+            </w:r>
+          </w:hyperlink>
+        </w:p>
+        <w:p>
+          <w:pPr>
+            <w:pStyle w:val="Sommario2"/>
+            <w:tabs>
+              <w:tab w:val="right" w:leader="dot" w:pos="9628"/>
+            </w:tabs>
+            <w:rPr>
+              <w:rFonts w:asciiTheme="minorHAnsi" w:eastAsiaTheme="minorEastAsia" w:hAnsiTheme="minorHAnsi" w:cstheme="minorBidi"/>
+              <w:noProof/>
+              <w:kern w:val="2"/>
+              <w:sz w:val="24"/>
+              <w:szCs w:val="24"/>
+              <w14:ligatures w14:val="standardContextual"/>
+            </w:rPr>
+          </w:pPr>
+          <w:hyperlink w:anchor="_Toc244271108" w:history="1">
+            <w:r>
+              <w:rPr>
+                <w:rStyle w:val="Collegamentoipertestuale"/>
+                <w:noProof/>
+              </w:rPr>
+              <w:t>6.19 Ruoli</w:t>
+            </w:r>
+            <w:r>
+              <w:rPr>
+                <w:noProof/>
+              </w:rPr>
+              <w:tab/>
+            </w:r>
+            <w:r>
+              <w:rPr>
+                <w:noProof/>
+              </w:rPr>
+              <w:fldChar w:fldCharType="begin"/>
+            </w:r>
+            <w:r>
+              <w:rPr>
+                <w:noProof/>
+              </w:rPr>
+              <w:instrText xml:space="preserve"> PAGEREF _Toc244271108 \h </w:instrText>
             </w:r>
             <w:r>
               <w:rPr>
@@ -4453,7 +4519,7 @@
               <w14:ligatures w14:val="standardContextual"/>
             </w:rPr>
           </w:pPr>
-          <w:hyperlink w:anchor="_Toc244270469" w:history="1">
+          <w:hyperlink w:anchor="_Toc244271109" w:history="1">
             <w:r>
               <w:rPr>
                 <w:rStyle w:val="Collegamentoipertestuale"/>
@@ -4477,7 +4543,7 @@
               <w:rPr>
                 <w:noProof/>
               </w:rPr>
-              <w:instrText xml:space="preserve"> PAGEREF _Toc244270469 \h </w:instrText>
+              <w:instrText xml:space="preserve"> PAGEREF _Toc244271109 \h </w:instrText>
             </w:r>
             <w:r>
               <w:rPr>
@@ -4519,7 +4585,7 @@
               <w14:ligatures w14:val="standardContextual"/>
             </w:rPr>
           </w:pPr>
-          <w:hyperlink w:anchor="_Toc244270470" w:history="1">
+          <w:hyperlink w:anchor="_Toc244271110" w:history="1">
             <w:r>
               <w:rPr>
                 <w:rStyle w:val="Collegamentoipertestuale"/>
@@ -4543,7 +4609,7 @@
               <w:rPr>
                 <w:noProof/>
               </w:rPr>
-              <w:instrText xml:space="preserve"> PAGEREF _Toc244270470 \h </w:instrText>
+              <w:instrText xml:space="preserve"> PAGEREF _Toc244271110 \h </w:instrText>
             </w:r>
             <w:r>
               <w:rPr>
@@ -4585,7 +4651,7 @@
               <w14:ligatures w14:val="standardContextual"/>
             </w:rPr>
           </w:pPr>
-          <w:hyperlink w:anchor="_Toc244270471" w:history="1">
+          <w:hyperlink w:anchor="_Toc244271111" w:history="1">
             <w:r>
               <w:rPr>
                 <w:rStyle w:val="Collegamentoipertestuale"/>
@@ -4609,7 +4675,7 @@
               <w:rPr>
                 <w:noProof/>
               </w:rPr>
-              <w:instrText xml:space="preserve"> PAGEREF _Toc244270471 \h </w:instrText>
+              <w:instrText xml:space="preserve"> PAGEREF _Toc244271111 \h </w:instrText>
             </w:r>
             <w:r>
               <w:rPr>
@@ -4651,7 +4717,7 @@
               <w14:ligatures w14:val="standardContextual"/>
             </w:rPr>
           </w:pPr>
-          <w:hyperlink w:anchor="_Toc244270472" w:history="1">
+          <w:hyperlink w:anchor="_Toc244271112" w:history="1">
             <w:r>
               <w:rPr>
                 <w:rStyle w:val="Collegamentoipertestuale"/>
@@ -4675,7 +4741,7 @@
               <w:rPr>
                 <w:noProof/>
               </w:rPr>
-              <w:instrText xml:space="preserve"> PAGEREF _Toc244270472 \h </w:instrText>
+              <w:instrText xml:space="preserve"> PAGEREF _Toc244271112 \h </w:instrText>
             </w:r>
             <w:r>
               <w:rPr>
@@ -4692,7 +4758,7 @@
               <w:rPr>
                 <w:noProof/>
               </w:rPr>
-              <w:t>39</w:t>
+              <w:t>40</w:t>
             </w:r>
             <w:r>
               <w:rPr>
@@ -4717,7 +4783,7 @@
               <w14:ligatures w14:val="standardContextual"/>
             </w:rPr>
           </w:pPr>
-          <w:hyperlink w:anchor="_Toc244270473" w:history="1">
+          <w:hyperlink w:anchor="_Toc244271113" w:history="1">
             <w:r>
               <w:rPr>
                 <w:rStyle w:val="Collegamentoipertestuale"/>
@@ -4741,7 +4807,7 @@
               <w:rPr>
                 <w:noProof/>
               </w:rPr>
-              <w:instrText xml:space="preserve"> PAGEREF _Toc244270473 \h </w:instrText>
+              <w:instrText xml:space="preserve"> PAGEREF _Toc244271113 \h </w:instrText>
             </w:r>
             <w:r>
               <w:rPr>
@@ -4783,7 +4849,7 @@
               <w14:ligatures w14:val="standardContextual"/>
             </w:rPr>
           </w:pPr>
-          <w:hyperlink w:anchor="_Toc244270474" w:history="1">
+          <w:hyperlink w:anchor="_Toc244271114" w:history="1">
             <w:r>
               <w:rPr>
                 <w:rStyle w:val="Collegamentoipertestuale"/>
@@ -4807,7 +4873,7 @@
               <w:rPr>
                 <w:noProof/>
               </w:rPr>
-              <w:instrText xml:space="preserve"> PAGEREF _Toc244270474 \h </w:instrText>
+              <w:instrText xml:space="preserve"> PAGEREF _Toc244271114 \h </w:instrText>
             </w:r>
             <w:r>
               <w:rPr>
@@ -4849,7 +4915,7 @@
               <w14:ligatures w14:val="standardContextual"/>
             </w:rPr>
           </w:pPr>
-          <w:hyperlink w:anchor="_Toc244270475" w:history="1">
+          <w:hyperlink w:anchor="_Toc244271115" w:history="1">
             <w:r>
               <w:rPr>
                 <w:rStyle w:val="Collegamentoipertestuale"/>
@@ -4873,7 +4939,7 @@
               <w:rPr>
                 <w:noProof/>
               </w:rPr>
-              <w:instrText xml:space="preserve"> PAGEREF _Toc244270475 \h </w:instrText>
+              <w:instrText xml:space="preserve"> PAGEREF _Toc244271115 \h </w:instrText>
             </w:r>
             <w:r>
               <w:rPr>
@@ -4916,7 +4982,7 @@
       <w:pPr>
         <w:pStyle w:val="Titolo1"/>
       </w:pPr>
-      <w:bookmarkStart w:id="0" w:name="_Toc244270404"/>
+      <w:bookmarkStart w:id="0" w:name="_Toc244271043"/>
       <w:r>
         <w:t>1. In breve</w:t>
       </w:r>
@@ -5161,40 +5227,20 @@
           <w:b/>
           <w:bCs/>
         </w:rPr>
-        <w:t>versione 1.7.1</w:t>
-      </w:r>
-      <w:r>
-        <w:t xml:space="preserve"> (30 ottobre): </w:t>
+        <w:t>versione 1.7.2</w:t>
+      </w:r>
+      <w:r>
+        <w:t xml:space="preserve"> (30 ottobre): la × di avvisi, notifiche e novità è un </w:t>
       </w:r>
       <w:r>
         <w:rPr>
           <w:b/>
           <w:bCs/>
         </w:rPr>
-        <w:t>correzioni per Android</w:t>
-      </w:r>
-      <w:r>
-        <w:t xml:space="preserve"> (barre del sistema e tema), </w:t>
-      </w:r>
-      <w:r>
-        <w:rPr>
-          <w:b/>
-          <w:bCs/>
-        </w:rPr>
-        <w:t>20 errori</w:t>
-      </w:r>
-      <w:r>
-        <w:t xml:space="preserve"> trovati usando l'app come un utente, </w:t>
-      </w:r>
-      <w:r>
-        <w:rPr>
-          <w:b/>
-          <w:bCs/>
-        </w:rPr>
-        <w:t>più veloce e leggera</w:t>
-      </w:r>
-      <w:r>
-        <w:t xml:space="preserve"> (vedi 4.23);</w:t>
+        <w:t>pulsante rotondo grande</w:t>
+      </w:r>
+      <w:r>
+        <w:t>, comodo da toccare sul telefono e sul tablet;</w:t>
       </w:r>
     </w:p>
     <w:p>
@@ -5211,7 +5257,7 @@
           <w:b/>
           <w:bCs/>
         </w:rPr>
-        <w:t>versione 1.7.0</w:t>
+        <w:t>versione 1.7.1</w:t>
       </w:r>
       <w:r>
         <w:t xml:space="preserve"> (30 ottobre): </w:t>
@@ -5221,20 +5267,30 @@
           <w:b/>
           <w:bCs/>
         </w:rPr>
-        <w:t>vista semplice con i pulsanti in alto</w:t>
-      </w:r>
-      <w:r>
-        <w:t xml:space="preserve"> e il menu </w:t>
+        <w:t>correzioni per Android</w:t>
+      </w:r>
+      <w:r>
+        <w:t xml:space="preserve"> (barre del sistema e tema), </w:t>
       </w:r>
       <w:r>
         <w:rPr>
           <w:b/>
           <w:bCs/>
         </w:rPr>
-        <w:t>«Tutti gli strumenti»</w:t>
-      </w:r>
-      <w:r>
-        <w:t xml:space="preserve"> con la ricerca, come nelle foto dell'autore e con i colori di PDFz; schermata iniziale più ordinata (vedi 4.22);</w:t>
+        <w:t>20 errori</w:t>
+      </w:r>
+      <w:r>
+        <w:t xml:space="preserve"> trovati usando l'app come un utente, </w:t>
+      </w:r>
+      <w:r>
+        <w:rPr>
+          <w:b/>
+          <w:bCs/>
+        </w:rPr>
+        <w:t>più veloce e leggera</w:t>
+      </w:r>
+      <w:r>
+        <w:t xml:space="preserve"> (vedi 4.23);</w:t>
       </w:r>
     </w:p>
     <w:p>
@@ -5251,20 +5307,30 @@
           <w:b/>
           <w:bCs/>
         </w:rPr>
-        <w:t>versione 1.6.2</w:t>
-      </w:r>
-      <w:r>
-        <w:t xml:space="preserve"> (30 ottobre; la 1.6.1 non è uscita): il sito degli aggiornamenti è sul dominio dell'autore </w:t>
+        <w:t>versione 1.7.0</w:t>
+      </w:r>
+      <w:r>
+        <w:t xml:space="preserve"> (30 ottobre): </w:t>
       </w:r>
       <w:r>
         <w:rPr>
           <w:b/>
           <w:bCs/>
         </w:rPr>
-        <w:t>https://pdfz.agjin.com/</w:t>
-      </w:r>
-      <w:r>
-        <w:t xml:space="preserve"> (vedi 4.10);</w:t>
+        <w:t>vista semplice con i pulsanti in alto</w:t>
+      </w:r>
+      <w:r>
+        <w:t xml:space="preserve"> e il menu </w:t>
+      </w:r>
+      <w:r>
+        <w:rPr>
+          <w:b/>
+          <w:bCs/>
+        </w:rPr>
+        <w:t>«Tutti gli strumenti»</w:t>
+      </w:r>
+      <w:r>
+        <w:t xml:space="preserve"> con la ricerca, come nelle foto dell'autore e con i colori di PDFz; schermata iniziale più ordinata (vedi 4.22);</w:t>
       </w:r>
     </w:p>
     <w:p>
@@ -5281,30 +5347,20 @@
           <w:b/>
           <w:bCs/>
         </w:rPr>
-        <w:t>versione 1.6.0</w:t>
-      </w:r>
-      <w:r>
-        <w:t xml:space="preserve"> (30 ottobre): </w:t>
+        <w:t>versione 1.6.2</w:t>
+      </w:r>
+      <w:r>
+        <w:t xml:space="preserve"> (30 ottobre; la 1.6.1 non è uscita): il sito degli aggiornamenti è sul dominio dell'autore </w:t>
       </w:r>
       <w:r>
         <w:rPr>
           <w:b/>
           <w:bCs/>
         </w:rPr>
-        <w:t>più semplice</w:t>
-      </w:r>
-      <w:r>
-        <w:t xml:space="preserve"> — schermata «Cosa vuoi fare?», modalità Semplice a sei pulsanti, guide 1-2-3 al primo uso, </w:t>
-      </w:r>
-      <w:r>
-        <w:rPr>
-          <w:b/>
-          <w:bCs/>
-        </w:rPr>
-        <w:t>niente più «Applica»</w:t>
-      </w:r>
-      <w:r>
-        <w:t xml:space="preserve"> e parole semplici (vedi 4.16-4.20);</w:t>
+        <w:t>https://pdfz.agjin.com/</w:t>
+      </w:r>
+      <w:r>
+        <w:t xml:space="preserve"> (vedi 4.10);</w:t>
       </w:r>
     </w:p>
     <w:p>
@@ -5321,50 +5377,30 @@
           <w:b/>
           <w:bCs/>
         </w:rPr>
-        <w:t>versione 1.5.0</w:t>
-      </w:r>
-      <w:r>
-        <w:t xml:space="preserve"> (30 ottobre): firme, timbri e testi già applicati </w:t>
+        <w:t>versione 1.6.0</w:t>
+      </w:r>
+      <w:r>
+        <w:t xml:space="preserve"> (30 ottobre): </w:t>
       </w:r>
       <w:r>
         <w:rPr>
           <w:b/>
           <w:bCs/>
         </w:rPr>
-        <w:t>si spostano</w:t>
-      </w:r>
-      <w:r>
-        <w:t xml:space="preserve">; </w:t>
+        <w:t>più semplice</w:t>
+      </w:r>
+      <w:r>
+        <w:t xml:space="preserve"> — schermata «Cosa vuoi fare?», modalità Semplice a sei pulsanti, guide 1-2-3 al primo uso, </w:t>
       </w:r>
       <w:r>
         <w:rPr>
           <w:b/>
           <w:bCs/>
         </w:rPr>
-        <w:t>due pagine affiancate</w:t>
-      </w:r>
-      <w:r>
-        <w:t xml:space="preserve">, </w:t>
-      </w:r>
-      <w:r>
-        <w:rPr>
-          <w:b/>
-          <w:bCs/>
-        </w:rPr>
-        <w:t>lettura a libro</w:t>
-      </w:r>
-      <w:r>
-        <w:t xml:space="preserve"> e </w:t>
-      </w:r>
-      <w:r>
-        <w:rPr>
-          <w:b/>
-          <w:bCs/>
-        </w:rPr>
-        <w:t>presentazione a schermo intero con Ctrl+L</w:t>
-      </w:r>
-      <w:r>
-        <w:t>; immagini diritte sulle pagine ruotate (vedi 4.13-4.15). In fondo, al capitolo 10, un'analisi della facilità d'uso con 5 proposte;</w:t>
+        <w:t>niente più «Applica»</w:t>
+      </w:r>
+      <w:r>
+        <w:t xml:space="preserve"> e parole semplici (vedi 4.16-4.20);</w:t>
       </w:r>
     </w:p>
     <w:p>
@@ -5381,40 +5417,50 @@
           <w:b/>
           <w:bCs/>
         </w:rPr>
-        <w:t>versione 1.4.0</w:t>
-      </w:r>
-      <w:r>
-        <w:t xml:space="preserve"> (24 ottobre): </w:t>
+        <w:t>versione 1.5.0</w:t>
+      </w:r>
+      <w:r>
+        <w:t xml:space="preserve"> (30 ottobre): firme, timbri e testi già applicati </w:t>
       </w:r>
       <w:r>
         <w:rPr>
           <w:b/>
           <w:bCs/>
         </w:rPr>
-        <w:t>firme, timbri, testi aggiunti, filigrane e numeri di pagina si eliminano anche dopo averli applicati</w:t>
-      </w:r>
-      <w:r>
-        <w:t xml:space="preserve">, le firme digitali una per volta; sul telefono </w:t>
+        <w:t>si spostano</w:t>
+      </w:r>
+      <w:r>
+        <w:t xml:space="preserve">; </w:t>
       </w:r>
       <w:r>
         <w:rPr>
           <w:b/>
           <w:bCs/>
         </w:rPr>
-        <w:t>pannello degli strumenti ingrandibile</w:t>
-      </w:r>
-      <w:r>
-        <w:t xml:space="preserve"> e </w:t>
+        <w:t>due pagine affiancate</w:t>
+      </w:r>
+      <w:r>
+        <w:t xml:space="preserve">, </w:t>
       </w:r>
       <w:r>
         <w:rPr>
           <w:b/>
           <w:bCs/>
         </w:rPr>
-        <w:t>caselle di testo più grandi</w:t>
-      </w:r>
-      <w:r>
-        <w:t xml:space="preserve"> (vedi 4.11 e 4.12);</w:t>
+        <w:t>lettura a libro</w:t>
+      </w:r>
+      <w:r>
+        <w:t xml:space="preserve"> e </w:t>
+      </w:r>
+      <w:r>
+        <w:rPr>
+          <w:b/>
+          <w:bCs/>
+        </w:rPr>
+        <w:t>presentazione a schermo intero con Ctrl+L</w:t>
+      </w:r>
+      <w:r>
+        <w:t>; immagini diritte sulle pagine ruotate (vedi 4.13-4.15). In fondo, al capitolo 10, un'analisi della facilità d'uso con 5 proposte;</w:t>
       </w:r>
     </w:p>
     <w:p>
@@ -5431,6 +5477,56 @@
           <w:b/>
           <w:bCs/>
         </w:rPr>
+        <w:t>versione 1.4.0</w:t>
+      </w:r>
+      <w:r>
+        <w:t xml:space="preserve"> (24 ottobre): </w:t>
+      </w:r>
+      <w:r>
+        <w:rPr>
+          <w:b/>
+          <w:bCs/>
+        </w:rPr>
+        <w:t>firme, timbri, testi aggiunti, filigrane e numeri di pagina si eliminano anche dopo averli applicati</w:t>
+      </w:r>
+      <w:r>
+        <w:t xml:space="preserve">, le firme digitali una per volta; sul telefono </w:t>
+      </w:r>
+      <w:r>
+        <w:rPr>
+          <w:b/>
+          <w:bCs/>
+        </w:rPr>
+        <w:t>pannello degli strumenti ingrandibile</w:t>
+      </w:r>
+      <w:r>
+        <w:t xml:space="preserve"> e </w:t>
+      </w:r>
+      <w:r>
+        <w:rPr>
+          <w:b/>
+          <w:bCs/>
+        </w:rPr>
+        <w:t>caselle di testo più grandi</w:t>
+      </w:r>
+      <w:r>
+        <w:t xml:space="preserve"> (vedi 4.11 e 4.12);</w:t>
+      </w:r>
+    </w:p>
+    <w:p>
+      <w:pPr>
+        <w:pStyle w:val="Paragrafoelenco"/>
+        <w:numPr>
+          <w:ilvl w:val="0"/>
+          <w:numId w:val="2"/>
+        </w:numPr>
+        <w:spacing w:after="60"/>
+      </w:pPr>
+      <w:r>
+        <w:rPr>
+          <w:b/>
+          <w:bCs/>
+        </w:rPr>
         <w:t>versione 1.2.0</w:t>
       </w:r>
       <w:r>
@@ -5477,7 +5573,7 @@
       <w:pPr>
         <w:pStyle w:val="Titolo1"/>
       </w:pPr>
-      <w:bookmarkStart w:id="1" w:name="_Toc244270405"/>
+      <w:bookmarkStart w:id="1" w:name="_Toc244271044"/>
       <w:r>
         <w:t>2. Nuovo marchio</w:t>
       </w:r>
@@ -5487,7 +5583,7 @@
       <w:pPr>
         <w:pStyle w:val="Titolo2"/>
       </w:pPr>
-      <w:bookmarkStart w:id="2" w:name="_Toc244270406"/>
+      <w:bookmarkStart w:id="2" w:name="_Toc244271045"/>
       <w:r>
         <w:t>2.1 Nomi e identificativi</w:t>
       </w:r>
@@ -6033,7 +6129,7 @@
       <w:pPr>
         <w:pStyle w:val="Titolo2"/>
       </w:pPr>
-      <w:bookmarkStart w:id="3" w:name="_Toc244270407"/>
+      <w:bookmarkStart w:id="3" w:name="_Toc244271046"/>
       <w:r>
         <w:t>2.2 Colori</w:t>
       </w:r>
@@ -6428,7 +6524,7 @@
       <w:pPr>
         <w:pStyle w:val="Titolo2"/>
       </w:pPr>
-      <w:bookmarkStart w:id="4" w:name="_Toc244270408"/>
+      <w:bookmarkStart w:id="4" w:name="_Toc244271047"/>
       <w:r>
         <w:t>2.3 Icona in uso: 24 «Foglio senza fondo» (serie 6, 22 ottobre)</w:t>
       </w:r>
@@ -6462,7 +6558,7 @@
           <w:noProof/>
         </w:rPr>
         <w:drawing>
-          <wp:inline distT="0" distB="0" distL="0" distR="0" wp14:anchorId="5123D465" wp14:editId="6698040D">
+          <wp:inline distT="0" distB="0" distL="0" distR="0" wp14:anchorId="502A55D8" wp14:editId="032C1737">
             <wp:extent cx="3429000" cy="4000500"/>
             <wp:effectExtent l="0" t="0" r="0" b="0"/>
             <wp:docPr id="2" name="Immagine 2"/>
@@ -6521,7 +6617,7 @@
       <w:pPr>
         <w:pStyle w:val="Titolo2"/>
       </w:pPr>
-      <w:bookmarkStart w:id="5" w:name="_Toc244270409"/>
+      <w:bookmarkStart w:id="5" w:name="_Toc244271048"/>
       <w:r>
         <w:t>2.4 Serie 4: la 17 «Foglio oro», in uso fino al 21 ottobre</w:t>
       </w:r>
@@ -6555,7 +6651,7 @@
           <w:noProof/>
         </w:rPr>
         <w:drawing>
-          <wp:inline distT="0" distB="0" distL="0" distR="0" wp14:anchorId="70E04CFF" wp14:editId="67F6D084">
+          <wp:inline distT="0" distB="0" distL="0" distR="0" wp14:anchorId="4D8340FE" wp14:editId="3F6129F7">
             <wp:extent cx="5334000" cy="5895975"/>
             <wp:effectExtent l="0" t="0" r="0" b="0"/>
             <wp:docPr id="3" name="Immagine 3"/>
@@ -6968,7 +7064,7 @@
       <w:pPr>
         <w:pStyle w:val="Titolo2"/>
       </w:pPr>
-      <w:bookmarkStart w:id="6" w:name="_Toc244270410"/>
+      <w:bookmarkStart w:id="6" w:name="_Toc244271049"/>
       <w:r>
         <w:t>2.5 Serie 5: la 17 con più bianco, la 19 in uso il 21 ottobre</w:t>
       </w:r>
@@ -7002,7 +7098,7 @@
           <w:noProof/>
         </w:rPr>
         <w:drawing>
-          <wp:inline distT="0" distB="0" distL="0" distR="0" wp14:anchorId="02AA37CA" wp14:editId="572B0012">
+          <wp:inline distT="0" distB="0" distL="0" distR="0" wp14:anchorId="0D93C379" wp14:editId="78BEAB28">
             <wp:extent cx="5715000" cy="3295650"/>
             <wp:effectExtent l="0" t="0" r="0" b="0"/>
             <wp:docPr id="4" name="Immagine 4"/>
@@ -7549,7 +7645,7 @@
       <w:pPr>
         <w:pStyle w:val="Titolo2"/>
       </w:pPr>
-      <w:bookmarkStart w:id="7" w:name="_Toc244270411"/>
+      <w:bookmarkStart w:id="7" w:name="_Toc244271050"/>
       <w:r>
         <w:t>2.6 Serie 3, non scelta (la 11 è diventata la serie 4)</w:t>
       </w:r>
@@ -7573,7 +7669,7 @@
           <w:noProof/>
         </w:rPr>
         <w:drawing>
-          <wp:inline distT="0" distB="0" distL="0" distR="0" wp14:anchorId="27AE9B85" wp14:editId="7090F3C9">
+          <wp:inline distT="0" distB="0" distL="0" distR="0" wp14:anchorId="45B91232" wp14:editId="67FBDAF5">
             <wp:extent cx="5905500" cy="4133850"/>
             <wp:effectExtent l="0" t="0" r="0" b="0"/>
             <wp:docPr id="5" name="Immagine 5"/>
@@ -8259,7 +8355,7 @@
       <w:pPr>
         <w:pStyle w:val="Titolo2"/>
       </w:pPr>
-      <w:bookmarkStart w:id="8" w:name="_Toc244270412"/>
+      <w:bookmarkStart w:id="8" w:name="_Toc244271051"/>
       <w:r>
         <w:t>2.7 Serie 2, non scelta</w:t>
       </w:r>
@@ -8283,7 +8379,7 @@
           <w:noProof/>
         </w:rPr>
         <w:drawing>
-          <wp:inline distT="0" distB="0" distL="0" distR="0" wp14:anchorId="03E56840" wp14:editId="12DD070A">
+          <wp:inline distT="0" distB="0" distL="0" distR="0" wp14:anchorId="440BDE31" wp14:editId="1657DAF1">
             <wp:extent cx="5905500" cy="4133850"/>
             <wp:effectExtent l="0" t="0" r="0" b="0"/>
             <wp:docPr id="6" name="Immagine 6"/>
@@ -9003,7 +9099,7 @@
       <w:pPr>
         <w:pStyle w:val="Titolo2"/>
       </w:pPr>
-      <w:bookmarkStart w:id="9" w:name="_Toc244270413"/>
+      <w:bookmarkStart w:id="9" w:name="_Toc244271052"/>
       <w:r>
         <w:t>2.8 Serie 1, scartata</w:t>
       </w:r>
@@ -9027,7 +9123,7 @@
           <w:noProof/>
         </w:rPr>
         <w:drawing>
-          <wp:inline distT="0" distB="0" distL="0" distR="0" wp14:anchorId="4463CF6B" wp14:editId="44190BF8">
+          <wp:inline distT="0" distB="0" distL="0" distR="0" wp14:anchorId="4376FA8F" wp14:editId="467723D4">
             <wp:extent cx="4000500" cy="2800350"/>
             <wp:effectExtent l="0" t="0" r="0" b="0"/>
             <wp:docPr id="7" name="Immagine 7"/>
@@ -9086,7 +9182,7 @@
       <w:pPr>
         <w:pStyle w:val="Titolo2"/>
       </w:pPr>
-      <w:bookmarkStart w:id="10" w:name="_Toc244270414"/>
+      <w:bookmarkStart w:id="10" w:name="_Toc244271053"/>
       <w:r>
         <w:t>2.9 Verifica dei marchi registrati</w:t>
       </w:r>
@@ -9338,7 +9434,7 @@
       <w:pPr>
         <w:pStyle w:val="Titolo1"/>
       </w:pPr>
-      <w:bookmarkStart w:id="11" w:name="_Toc244270415"/>
+      <w:bookmarkStart w:id="11" w:name="_Toc244271054"/>
       <w:r>
         <w:t>3. Temi colore</w:t>
       </w:r>
@@ -9372,7 +9468,7 @@
           <w:noProof/>
         </w:rPr>
         <w:drawing>
-          <wp:inline distT="0" distB="0" distL="0" distR="0" wp14:anchorId="0FED099B" wp14:editId="139630FD">
+          <wp:inline distT="0" distB="0" distL="0" distR="0" wp14:anchorId="63A65AB9" wp14:editId="7FF35BD2">
             <wp:extent cx="4572000" cy="3429000"/>
             <wp:effectExtent l="0" t="0" r="0" b="0"/>
             <wp:docPr id="8" name="Immagine 8"/>
@@ -10082,7 +10178,7 @@
       <w:pPr>
         <w:pStyle w:val="Titolo1"/>
       </w:pPr>
-      <w:bookmarkStart w:id="12" w:name="_Toc244270416"/>
+      <w:bookmarkStart w:id="12" w:name="_Toc244271055"/>
       <w:r>
         <w:t>4. Correzione: avvisi «come JavaScript»</w:t>
       </w:r>
@@ -10092,7 +10188,7 @@
       <w:pPr>
         <w:pStyle w:val="Titolo2"/>
       </w:pPr>
-      <w:bookmarkStart w:id="13" w:name="_Toc244270417"/>
+      <w:bookmarkStart w:id="13" w:name="_Toc244271056"/>
       <w:r>
         <w:t>4.1 Il problema</w:t>
       </w:r>
@@ -10495,7 +10591,7 @@
       <w:pPr>
         <w:pStyle w:val="Titolo2"/>
       </w:pPr>
-      <w:bookmarkStart w:id="14" w:name="_Toc244270418"/>
+      <w:bookmarkStart w:id="14" w:name="_Toc244271057"/>
       <w:r>
         <w:t>4.2 La soluzione</w:t>
       </w:r>
@@ -10628,7 +10724,7 @@
           <w:noProof/>
         </w:rPr>
         <w:drawing>
-          <wp:inline distT="0" distB="0" distL="0" distR="0" wp14:anchorId="03E21DCD" wp14:editId="149DE451">
+          <wp:inline distT="0" distB="0" distL="0" distR="0" wp14:anchorId="361687B8" wp14:editId="19615E36">
             <wp:extent cx="4572000" cy="3429000"/>
             <wp:effectExtent l="0" t="0" r="0" b="0"/>
             <wp:docPr id="9" name="Immagine 9"/>
@@ -10687,7 +10783,7 @@
       <w:pPr>
         <w:pStyle w:val="Titolo2"/>
       </w:pPr>
-      <w:bookmarkStart w:id="15" w:name="_Toc244270419"/>
+      <w:bookmarkStart w:id="15" w:name="_Toc244271058"/>
       <w:r>
         <w:t>4.3 Verifiche</w:t>
       </w:r>
@@ -10734,7 +10830,7 @@
       <w:pPr>
         <w:pStyle w:val="Titolo2"/>
       </w:pPr>
-      <w:bookmarkStart w:id="16" w:name="_Toc244270420"/>
+      <w:bookmarkStart w:id="16" w:name="_Toc244271059"/>
       <w:r>
         <w:t>4.4 Android: menu Tema e notifiche (versione 1.0.1)</w:t>
       </w:r>
@@ -11069,7 +11165,7 @@
       <w:pPr>
         <w:pStyle w:val="Titolo2"/>
       </w:pPr>
-      <w:bookmarkStart w:id="17" w:name="_Toc244270421"/>
+      <w:bookmarkStart w:id="17" w:name="_Toc244271060"/>
       <w:r>
         <w:t>4.5 App più leggera: traduzione tolta</w:t>
       </w:r>
@@ -11502,7 +11598,7 @@
       <w:pPr>
         <w:pStyle w:val="Titolo2"/>
       </w:pPr>
-      <w:bookmarkStart w:id="18" w:name="_Toc244270422"/>
+      <w:bookmarkStart w:id="18" w:name="_Toc244271061"/>
       <w:r>
         <w:t>4.6 Schede in una nuova finestra</w:t>
       </w:r>
@@ -11620,7 +11716,7 @@
           <w:noProof/>
         </w:rPr>
         <w:drawing>
-          <wp:inline distT="0" distB="0" distL="0" distR="0" wp14:anchorId="084CBCAA" wp14:editId="02EE72F2">
+          <wp:inline distT="0" distB="0" distL="0" distR="0" wp14:anchorId="4767F237" wp14:editId="79C41573">
             <wp:extent cx="5715000" cy="857250"/>
             <wp:effectExtent l="0" t="0" r="0" b="0"/>
             <wp:docPr id="10" name="Immagine 10"/>
@@ -11909,7 +12005,7 @@
       <w:pPr>
         <w:pStyle w:val="Titolo2"/>
       </w:pPr>
-      <w:bookmarkStart w:id="19" w:name="_Toc244270423"/>
+      <w:bookmarkStart w:id="19" w:name="_Toc244271062"/>
       <w:r>
         <w:t>4.7 Riunire le finestre</w:t>
       </w:r>
@@ -12011,7 +12107,7 @@
       <w:pPr>
         <w:pStyle w:val="Titolo2"/>
       </w:pPr>
-      <w:bookmarkStart w:id="20" w:name="_Toc244270424"/>
+      <w:bookmarkStart w:id="20" w:name="_Toc244271063"/>
       <w:r>
         <w:t>4.8 Correzioni di «Modifica testo»</w:t>
       </w:r>
@@ -12276,7 +12372,7 @@
           <w:noProof/>
         </w:rPr>
         <w:drawing>
-          <wp:inline distT="0" distB="0" distL="0" distR="0" wp14:anchorId="10BC4F56" wp14:editId="233C4A2C">
+          <wp:inline distT="0" distB="0" distL="0" distR="0" wp14:anchorId="7277C513" wp14:editId="77D0641B">
             <wp:extent cx="3286125" cy="2286000"/>
             <wp:effectExtent l="0" t="0" r="0" b="0"/>
             <wp:docPr id="11" name="Immagine 11"/>
@@ -12341,7 +12437,7 @@
           <w:noProof/>
         </w:rPr>
         <w:drawing>
-          <wp:inline distT="0" distB="0" distL="0" distR="0" wp14:anchorId="5AF63FBE" wp14:editId="33F839FC">
+          <wp:inline distT="0" distB="0" distL="0" distR="0" wp14:anchorId="109D69E8" wp14:editId="01F493C5">
             <wp:extent cx="3286125" cy="2286000"/>
             <wp:effectExtent l="0" t="0" r="0" b="0"/>
             <wp:docPr id="12" name="Immagine 12"/>
@@ -12408,7 +12504,7 @@
       <w:pPr>
         <w:pStyle w:val="Titolo2"/>
       </w:pPr>
-      <w:bookmarkStart w:id="21" w:name="_Toc244270425"/>
+      <w:bookmarkStart w:id="21" w:name="_Toc244271064"/>
       <w:r>
         <w:t>4.9 Web app per iPhone</w:t>
       </w:r>
@@ -12847,7 +12943,7 @@
       <w:pPr>
         <w:pStyle w:val="Titolo2"/>
       </w:pPr>
-      <w:bookmarkStart w:id="22" w:name="_Toc244270426"/>
+      <w:bookmarkStart w:id="22" w:name="_Toc244271065"/>
       <w:r>
         <w:t>4.10 Aggiornamenti su Cloudflare (repository privato)</w:t>
       </w:r>
@@ -13361,7 +13457,7 @@
       <w:pPr>
         <w:pStyle w:val="Titolo2"/>
       </w:pPr>
-      <w:bookmarkStart w:id="23" w:name="_Toc244270427"/>
+      <w:bookmarkStart w:id="23" w:name="_Toc244271066"/>
       <w:r>
         <w:t>4.11 Eliminare firme, timbri e testi già applicati (versione 1.4.0)</w:t>
       </w:r>
@@ -13692,7 +13788,7 @@
           <w:noProof/>
         </w:rPr>
         <w:drawing>
-          <wp:inline distT="0" distB="0" distL="0" distR="0" wp14:anchorId="54D549D8" wp14:editId="157EC062">
+          <wp:inline distT="0" distB="0" distL="0" distR="0" wp14:anchorId="1ED59FAB" wp14:editId="045B3852">
             <wp:extent cx="2095500" cy="4533900"/>
             <wp:effectExtent l="0" t="0" r="0" b="0"/>
             <wp:docPr id="13" name="Immagine 13"/>
@@ -13789,7 +13885,7 @@
       <w:pPr>
         <w:pStyle w:val="Titolo2"/>
       </w:pPr>
-      <w:bookmarkStart w:id="24" w:name="_Toc244270428"/>
+      <w:bookmarkStart w:id="24" w:name="_Toc244271067"/>
       <w:r>
         <w:t>4.12 Telefono: pannello più grande e caselle di testo comode (versione 1.4.0)</w:t>
       </w:r>
@@ -13857,7 +13953,7 @@
           <w:noProof/>
         </w:rPr>
         <w:drawing>
-          <wp:inline distT="0" distB="0" distL="0" distR="0" wp14:anchorId="3AA72C12" wp14:editId="3A52786B">
+          <wp:inline distT="0" distB="0" distL="0" distR="0" wp14:anchorId="3A8C5A10" wp14:editId="3567DB19">
             <wp:extent cx="2095500" cy="4533900"/>
             <wp:effectExtent l="0" t="0" r="0" b="0"/>
             <wp:docPr id="14" name="Immagine 14"/>
@@ -13922,7 +14018,7 @@
           <w:noProof/>
         </w:rPr>
         <w:drawing>
-          <wp:inline distT="0" distB="0" distL="0" distR="0" wp14:anchorId="08E27E76" wp14:editId="741A2352">
+          <wp:inline distT="0" distB="0" distL="0" distR="0" wp14:anchorId="6C4D2C44" wp14:editId="67A812E7">
             <wp:extent cx="2095500" cy="4533900"/>
             <wp:effectExtent l="0" t="0" r="0" b="0"/>
             <wp:docPr id="15" name="Immagine 15"/>
@@ -13981,7 +14077,7 @@
       <w:pPr>
         <w:pStyle w:val="Titolo2"/>
       </w:pPr>
-      <w:bookmarkStart w:id="25" w:name="_Toc244270429"/>
+      <w:bookmarkStart w:id="25" w:name="_Toc244271068"/>
       <w:r>
         <w:t>4.13 Spostare firme, timbri e testi già applicati (versione 1.5.0)</w:t>
       </w:r>
@@ -14033,7 +14129,7 @@
           <w:noProof/>
         </w:rPr>
         <w:drawing>
-          <wp:inline distT="0" distB="0" distL="0" distR="0" wp14:anchorId="29C9F24F" wp14:editId="43617B5E">
+          <wp:inline distT="0" distB="0" distL="0" distR="0" wp14:anchorId="35EA1ED5" wp14:editId="71AD8EF8">
             <wp:extent cx="4953000" cy="3095625"/>
             <wp:effectExtent l="0" t="0" r="0" b="0"/>
             <wp:docPr id="16" name="Immagine 16"/>
@@ -14092,7 +14188,7 @@
       <w:pPr>
         <w:pStyle w:val="Titolo2"/>
       </w:pPr>
-      <w:bookmarkStart w:id="26" w:name="_Toc244270430"/>
+      <w:bookmarkStart w:id="26" w:name="_Toc244271069"/>
       <w:r>
         <w:t>4.14 Modi di lettura e presentazione (versione 1.5.0)</w:t>
       </w:r>
@@ -14229,7 +14325,7 @@
           <w:noProof/>
         </w:rPr>
         <w:drawing>
-          <wp:inline distT="0" distB="0" distL="0" distR="0" wp14:anchorId="0DC6A79C" wp14:editId="1918B2B6">
+          <wp:inline distT="0" distB="0" distL="0" distR="0" wp14:anchorId="2A52A5C6" wp14:editId="3FAE6323">
             <wp:extent cx="4953000" cy="3095625"/>
             <wp:effectExtent l="0" t="0" r="0" b="0"/>
             <wp:docPr id="17" name="Immagine 17"/>
@@ -14294,7 +14390,7 @@
           <w:noProof/>
         </w:rPr>
         <w:drawing>
-          <wp:inline distT="0" distB="0" distL="0" distR="0" wp14:anchorId="638CBBF1" wp14:editId="291305DD">
+          <wp:inline distT="0" distB="0" distL="0" distR="0" wp14:anchorId="201E1720" wp14:editId="3D69DF32">
             <wp:extent cx="1905000" cy="4124325"/>
             <wp:effectExtent l="0" t="0" r="0" b="0"/>
             <wp:docPr id="18" name="Immagine 18"/>
@@ -14353,7 +14449,7 @@
       <w:pPr>
         <w:pStyle w:val="Titolo2"/>
       </w:pPr>
-      <w:bookmarkStart w:id="27" w:name="_Toc244270431"/>
+      <w:bookmarkStart w:id="27" w:name="_Toc244271070"/>
       <w:r>
         <w:t>4.15 Correzione: immagini sulle pagine ruotate (versione 1.5.0)</w:t>
       </w:r>
@@ -14381,7 +14477,7 @@
       <w:pPr>
         <w:pStyle w:val="Titolo2"/>
       </w:pPr>
-      <w:bookmarkStart w:id="28" w:name="_Toc244270432"/>
+      <w:bookmarkStart w:id="28" w:name="_Toc244271071"/>
       <w:r>
         <w:t>4.16 Niente più «Applica» (versione 1.6.0)</w:t>
       </w:r>
@@ -14425,7 +14521,7 @@
           <w:noProof/>
         </w:rPr>
         <w:drawing>
-          <wp:inline distT="0" distB="0" distL="0" distR="0" wp14:anchorId="59D4A5AF" wp14:editId="4DE4FF78">
+          <wp:inline distT="0" distB="0" distL="0" distR="0" wp14:anchorId="21A46053" wp14:editId="3A101DDB">
             <wp:extent cx="4953000" cy="3095625"/>
             <wp:effectExtent l="0" t="0" r="0" b="0"/>
             <wp:docPr id="19" name="Immagine 19"/>
@@ -14484,7 +14580,7 @@
       <w:pPr>
         <w:pStyle w:val="Titolo2"/>
       </w:pPr>
-      <w:bookmarkStart w:id="29" w:name="_Toc244270433"/>
+      <w:bookmarkStart w:id="29" w:name="_Toc244271072"/>
       <w:r>
         <w:t>4.17 Schermata «Cosa vuoi fare?» (versione 1.6.0)</w:t>
       </w:r>
@@ -14518,7 +14614,7 @@
           <w:noProof/>
         </w:rPr>
         <w:drawing>
-          <wp:inline distT="0" distB="0" distL="0" distR="0" wp14:anchorId="652970B7" wp14:editId="01D5F952">
+          <wp:inline distT="0" distB="0" distL="0" distR="0" wp14:anchorId="17561BE6" wp14:editId="5D790904">
             <wp:extent cx="4953000" cy="3095625"/>
             <wp:effectExtent l="0" t="0" r="0" b="0"/>
             <wp:docPr id="20" name="Immagine 20"/>
@@ -14577,7 +14673,7 @@
       <w:pPr>
         <w:pStyle w:val="Titolo2"/>
       </w:pPr>
-      <w:bookmarkStart w:id="30" w:name="_Toc244270434"/>
+      <w:bookmarkStart w:id="30" w:name="_Toc244271073"/>
       <w:r>
         <w:t>4.18 Modalità Semplice e Completa (versione 1.6.0)</w:t>
       </w:r>
@@ -14621,7 +14717,7 @@
           <w:noProof/>
         </w:rPr>
         <w:drawing>
-          <wp:inline distT="0" distB="0" distL="0" distR="0" wp14:anchorId="08CA744B" wp14:editId="59DC08E2">
+          <wp:inline distT="0" distB="0" distL="0" distR="0" wp14:anchorId="075BBCB7" wp14:editId="65637F49">
             <wp:extent cx="1905000" cy="4124325"/>
             <wp:effectExtent l="0" t="0" r="0" b="0"/>
             <wp:docPr id="21" name="Immagine 21"/>
@@ -14680,7 +14776,7 @@
       <w:pPr>
         <w:pStyle w:val="Titolo2"/>
       </w:pPr>
-      <w:bookmarkStart w:id="31" w:name="_Toc244270435"/>
+      <w:bookmarkStart w:id="31" w:name="_Toc244271074"/>
       <w:r>
         <w:t>4.19 Guide 1-2-3 (versione 1.6.0)</w:t>
       </w:r>
@@ -14704,7 +14800,7 @@
           <w:noProof/>
         </w:rPr>
         <w:drawing>
-          <wp:inline distT="0" distB="0" distL="0" distR="0" wp14:anchorId="694DBA4E" wp14:editId="65F128B0">
+          <wp:inline distT="0" distB="0" distL="0" distR="0" wp14:anchorId="35170650" wp14:editId="4F59E907">
             <wp:extent cx="4953000" cy="3095625"/>
             <wp:effectExtent l="0" t="0" r="0" b="0"/>
             <wp:docPr id="22" name="Immagine 22"/>
@@ -14769,7 +14865,7 @@
           <w:noProof/>
         </w:rPr>
         <w:drawing>
-          <wp:inline distT="0" distB="0" distL="0" distR="0" wp14:anchorId="6FB2C66B" wp14:editId="3872F8F3">
+          <wp:inline distT="0" distB="0" distL="0" distR="0" wp14:anchorId="474D93B3" wp14:editId="062811EC">
             <wp:extent cx="1905000" cy="4124325"/>
             <wp:effectExtent l="0" t="0" r="0" b="0"/>
             <wp:docPr id="23" name="Immagine 23"/>
@@ -14828,7 +14924,7 @@
       <w:pPr>
         <w:pStyle w:val="Titolo2"/>
       </w:pPr>
-      <w:bookmarkStart w:id="32" w:name="_Toc244270436"/>
+      <w:bookmarkStart w:id="32" w:name="_Toc244271075"/>
       <w:r>
         <w:t>4.20 Parole semplici e piccoli difetti (versione 1.6.0)</w:t>
       </w:r>
@@ -14846,7 +14942,7 @@
       <w:pPr>
         <w:pStyle w:val="Titolo2"/>
       </w:pPr>
-      <w:bookmarkStart w:id="33" w:name="_Toc244270437"/>
+      <w:bookmarkStart w:id="33" w:name="_Toc244271076"/>
       <w:r>
         <w:t>4.21 Dominio dell'autore: pdfz.agjin.com (versione 1.6.2)</w:t>
       </w:r>
@@ -14895,7 +14991,7 @@
       <w:pPr>
         <w:pStyle w:val="Titolo2"/>
       </w:pPr>
-      <w:bookmarkStart w:id="34" w:name="_Toc244270438"/>
+      <w:bookmarkStart w:id="34" w:name="_Toc244271077"/>
       <w:r>
         <w:t>4.22 Vista semplice con i pulsanti in alto (versione 1.7.0)</w:t>
       </w:r>
@@ -14964,7 +15060,7 @@
           <w:noProof/>
         </w:rPr>
         <w:drawing>
-          <wp:inline distT="0" distB="0" distL="0" distR="0" wp14:anchorId="2DC54258" wp14:editId="038EE910">
+          <wp:inline distT="0" distB="0" distL="0" distR="0" wp14:anchorId="4A4440AF" wp14:editId="37724B06">
             <wp:extent cx="4953000" cy="3714750"/>
             <wp:effectExtent l="0" t="0" r="0" b="0"/>
             <wp:docPr id="24" name="Immagine 24"/>
@@ -15029,7 +15125,7 @@
           <w:noProof/>
         </w:rPr>
         <w:drawing>
-          <wp:inline distT="0" distB="0" distL="0" distR="0" wp14:anchorId="1C8FBC0B" wp14:editId="512DB26F">
+          <wp:inline distT="0" distB="0" distL="0" distR="0" wp14:anchorId="36B4E9AA" wp14:editId="5574F958">
             <wp:extent cx="4953000" cy="3714750"/>
             <wp:effectExtent l="0" t="0" r="0" b="0"/>
             <wp:docPr id="25" name="Immagine 25"/>
@@ -15139,7 +15235,7 @@
           <w:noProof/>
         </w:rPr>
         <w:drawing>
-          <wp:inline distT="0" distB="0" distL="0" distR="0" wp14:anchorId="61232E41" wp14:editId="1DB25CF7">
+          <wp:inline distT="0" distB="0" distL="0" distR="0" wp14:anchorId="038E95F7" wp14:editId="101BD4EA">
             <wp:extent cx="4953000" cy="3714750"/>
             <wp:effectExtent l="0" t="0" r="0" b="0"/>
             <wp:docPr id="26" name="Immagine 26"/>
@@ -15204,7 +15300,7 @@
           <w:noProof/>
         </w:rPr>
         <w:drawing>
-          <wp:inline distT="0" distB="0" distL="0" distR="0" wp14:anchorId="5EA5320A" wp14:editId="027DA053">
+          <wp:inline distT="0" distB="0" distL="0" distR="0" wp14:anchorId="16C3C09E" wp14:editId="6EC13C4C">
             <wp:extent cx="1905000" cy="4124325"/>
             <wp:effectExtent l="0" t="0" r="0" b="0"/>
             <wp:docPr id="27" name="Immagine 27"/>
@@ -15263,7 +15359,7 @@
       <w:pPr>
         <w:pStyle w:val="Titolo2"/>
       </w:pPr>
-      <w:bookmarkStart w:id="35" w:name="_Toc244270439"/>
+      <w:bookmarkStart w:id="35" w:name="_Toc244271078"/>
       <w:r>
         <w:t>4.23 Android, giro da utente e ottimizzazioni (versione 1.7.1)</w:t>
       </w:r>
@@ -15297,7 +15393,7 @@
           <w:noProof/>
         </w:rPr>
         <w:drawing>
-          <wp:inline distT="0" distB="0" distL="0" distR="0" wp14:anchorId="287C38D7" wp14:editId="409D5BC9">
+          <wp:inline distT="0" distB="0" distL="0" distR="0" wp14:anchorId="063313B8" wp14:editId="708820BB">
             <wp:extent cx="1905000" cy="4124325"/>
             <wp:effectExtent l="0" t="0" r="0" b="0"/>
             <wp:docPr id="28" name="Immagine 28"/>
@@ -15380,7 +15476,7 @@
           <w:noProof/>
         </w:rPr>
         <w:drawing>
-          <wp:inline distT="0" distB="0" distL="0" distR="0" wp14:anchorId="6FD70A07" wp14:editId="27A8B0D8">
+          <wp:inline distT="0" distB="0" distL="0" distR="0" wp14:anchorId="315C8A30" wp14:editId="462E2EC6">
             <wp:extent cx="1905000" cy="4124325"/>
             <wp:effectExtent l="0" t="0" r="0" b="0"/>
             <wp:docPr id="29" name="Immagine 29"/>
@@ -15473,7 +15569,7 @@
       <w:pPr>
         <w:pStyle w:val="Titolo1"/>
       </w:pPr>
-      <w:bookmarkStart w:id="36" w:name="_Toc244270440"/>
+      <w:bookmarkStart w:id="36" w:name="_Toc244271079"/>
       <w:r>
         <w:t>5. Decisioni</w:t>
       </w:r>
@@ -15491,7 +15587,7 @@
       <w:pPr>
         <w:pStyle w:val="Titolo2"/>
       </w:pPr>
-      <w:bookmarkStart w:id="37" w:name="_Toc244270441"/>
+      <w:bookmarkStart w:id="37" w:name="_Toc244271080"/>
       <w:r>
         <w:t>5.1 Canale degli aggiornamenti</w:t>
       </w:r>
@@ -15998,7 +16094,7 @@
       <w:pPr>
         <w:pStyle w:val="Titolo2"/>
       </w:pPr>
-      <w:bookmarkStart w:id="38" w:name="_Toc244270442"/>
+      <w:bookmarkStart w:id="38" w:name="_Toc244271081"/>
       <w:r>
         <w:t>5.2 Storia del repository</w:t>
       </w:r>
@@ -16505,7 +16601,7 @@
       <w:pPr>
         <w:pStyle w:val="Titolo2"/>
       </w:pPr>
-      <w:bookmarkStart w:id="39" w:name="_Toc244270443"/>
+      <w:bookmarkStart w:id="39" w:name="_Toc244271082"/>
       <w:r>
         <w:t>5.3 Identificativi del prodotto</w:t>
       </w:r>
@@ -17005,7 +17101,7 @@
       <w:pPr>
         <w:pStyle w:val="Titolo2"/>
       </w:pPr>
-      <w:bookmarkStart w:id="40" w:name="_Toc244270444"/>
+      <w:bookmarkStart w:id="40" w:name="_Toc244271083"/>
       <w:r>
         <w:t>5.4 Avvisi e domande</w:t>
       </w:r>
@@ -17512,7 +17608,7 @@
       <w:pPr>
         <w:pStyle w:val="Titolo2"/>
       </w:pPr>
-      <w:bookmarkStart w:id="41" w:name="_Toc244270445"/>
+      <w:bookmarkStart w:id="41" w:name="_Toc244271084"/>
       <w:r>
         <w:t>5.5 Traduzione offline</w:t>
       </w:r>
@@ -18019,7 +18115,7 @@
       <w:pPr>
         <w:pStyle w:val="Titolo2"/>
       </w:pPr>
-      <w:bookmarkStart w:id="42" w:name="_Toc244270446"/>
+      <w:bookmarkStart w:id="42" w:name="_Toc244271085"/>
       <w:r>
         <w:t>5.6 Passaggio della scheda alla nuova finestra</w:t>
       </w:r>
@@ -18541,7 +18637,7 @@
       <w:pPr>
         <w:pStyle w:val="Titolo2"/>
       </w:pPr>
-      <w:bookmarkStart w:id="43" w:name="_Toc244270447"/>
+      <w:bookmarkStart w:id="43" w:name="_Toc244271086"/>
       <w:r>
         <w:t>5.7 Come si cancella la riga in «Modifica testo»</w:t>
       </w:r>
@@ -19048,7 +19144,7 @@
       <w:pPr>
         <w:pStyle w:val="Titolo2"/>
       </w:pPr>
-      <w:bookmarkStart w:id="44" w:name="_Toc244270448"/>
+      <w:bookmarkStart w:id="44" w:name="_Toc244271087"/>
       <w:r>
         <w:t>5.9 Lettura a libro e presentazione</w:t>
       </w:r>
@@ -19555,7 +19651,7 @@
       <w:pPr>
         <w:pStyle w:val="Titolo2"/>
       </w:pPr>
-      <w:bookmarkStart w:id="45" w:name="_Toc244270449"/>
+      <w:bookmarkStart w:id="45" w:name="_Toc244271088"/>
       <w:r>
         <w:t>5.8 Come si ritrovano firme e timbri applicati</w:t>
       </w:r>
@@ -20092,7 +20188,7 @@
       <w:pPr>
         <w:pStyle w:val="Titolo1"/>
       </w:pPr>
-      <w:bookmarkStart w:id="46" w:name="_Toc244270450"/>
+      <w:bookmarkStart w:id="46" w:name="_Toc244271089"/>
       <w:r>
         <w:t>6. Come si lavora</w:t>
       </w:r>
@@ -20102,7 +20198,7 @@
       <w:pPr>
         <w:pStyle w:val="Titolo2"/>
       </w:pPr>
-      <w:bookmarkStart w:id="47" w:name="_Toc244270451"/>
+      <w:bookmarkStart w:id="47" w:name="_Toc244271090"/>
       <w:r>
         <w:t>6.1 Comandi</w:t>
       </w:r>
@@ -20172,7 +20268,7 @@
       <w:pPr>
         <w:pStyle w:val="Titolo2"/>
       </w:pPr>
-      <w:bookmarkStart w:id="48" w:name="_Toc244270452"/>
+      <w:bookmarkStart w:id="48" w:name="_Toc244271091"/>
       <w:r>
         <w:t>6.2 Pubblicare una versione</w:t>
       </w:r>
@@ -20300,7 +20396,7 @@
       <w:pPr>
         <w:pStyle w:val="Titolo2"/>
       </w:pPr>
-      <w:bookmarkStart w:id="49" w:name="_Toc244270453"/>
+      <w:bookmarkStart w:id="49" w:name="_Toc244271092"/>
       <w:r>
         <w:t>6.3 Release 1.0.0 (pubblicata il 16 ottobre 2026)</w:t>
       </w:r>
@@ -21027,7 +21123,7 @@
       <w:pPr>
         <w:pStyle w:val="Titolo2"/>
       </w:pPr>
-      <w:bookmarkStart w:id="50" w:name="_Toc244270454"/>
+      <w:bookmarkStart w:id="50" w:name="_Toc244271093"/>
       <w:r>
         <w:t>6.4 Release 1.0.1</w:t>
       </w:r>
@@ -21324,7 +21420,7 @@
       <w:pPr>
         <w:pStyle w:val="Titolo2"/>
       </w:pPr>
-      <w:bookmarkStart w:id="51" w:name="_Toc244270455"/>
+      <w:bookmarkStart w:id="51" w:name="_Toc244271094"/>
       <w:r>
         <w:t>6.5 Release 1.0.2 e repository pubblico</w:t>
       </w:r>
@@ -21746,7 +21842,7 @@
       <w:pPr>
         <w:pStyle w:val="Titolo2"/>
       </w:pPr>
-      <w:bookmarkStart w:id="52" w:name="_Toc244270456"/>
+      <w:bookmarkStart w:id="52" w:name="_Toc244271095"/>
       <w:r>
         <w:t>6.6 Nuova versione: link diretto per ogni sistema</w:t>
       </w:r>
@@ -22163,7 +22259,7 @@
           <w:noProof/>
         </w:rPr>
         <w:drawing>
-          <wp:inline distT="0" distB="0" distL="0" distR="0" wp14:anchorId="0D952384" wp14:editId="2D8038A6">
+          <wp:inline distT="0" distB="0" distL="0" distR="0" wp14:anchorId="74C54BE0" wp14:editId="4FFCCA6F">
             <wp:extent cx="4572000" cy="4429125"/>
             <wp:effectExtent l="0" t="0" r="0" b="0"/>
             <wp:docPr id="30" name="Immagine 30"/>
@@ -22238,7 +22334,7 @@
       <w:pPr>
         <w:pStyle w:val="Titolo2"/>
       </w:pPr>
-      <w:bookmarkStart w:id="53" w:name="_Toc244270457"/>
+      <w:bookmarkStart w:id="53" w:name="_Toc244271096"/>
       <w:r>
         <w:t>6.7 Release 1.1.0</w:t>
       </w:r>
@@ -22802,7 +22898,7 @@
       <w:pPr>
         <w:pStyle w:val="Titolo2"/>
       </w:pPr>
-      <w:bookmarkStart w:id="54" w:name="_Toc244270458"/>
+      <w:bookmarkStart w:id="54" w:name="_Toc244271097"/>
       <w:r>
         <w:t>6.8 Versione 1.2.0</w:t>
       </w:r>
@@ -23351,7 +23447,7 @@
       <w:pPr>
         <w:pStyle w:val="Titolo2"/>
       </w:pPr>
-      <w:bookmarkStart w:id="55" w:name="_Toc244270459"/>
+      <w:bookmarkStart w:id="55" w:name="_Toc244271098"/>
       <w:r>
         <w:t>6.9 Versione 1.2.1</w:t>
       </w:r>
@@ -23369,7 +23465,7 @@
       <w:pPr>
         <w:pStyle w:val="Titolo2"/>
       </w:pPr>
-      <w:bookmarkStart w:id="56" w:name="_Toc244270460"/>
+      <w:bookmarkStart w:id="56" w:name="_Toc244271099"/>
       <w:r>
         <w:t>6.10 Versione 1.3.0</w:t>
       </w:r>
@@ -23401,7 +23497,7 @@
       <w:pPr>
         <w:pStyle w:val="Titolo2"/>
       </w:pPr>
-      <w:bookmarkStart w:id="57" w:name="_Toc244270461"/>
+      <w:bookmarkStart w:id="57" w:name="_Toc244271100"/>
       <w:r>
         <w:t>6.11 Versione 1.3.1 (ponte verso Cloudflare)</w:t>
       </w:r>
@@ -23419,7 +23515,7 @@
       <w:pPr>
         <w:pStyle w:val="Titolo2"/>
       </w:pPr>
-      <w:bookmarkStart w:id="58" w:name="_Toc244270462"/>
+      <w:bookmarkStart w:id="58" w:name="_Toc244271101"/>
       <w:r>
         <w:t>6.12 Versione 1.4.0</w:t>
       </w:r>
@@ -23437,7 +23533,7 @@
       <w:pPr>
         <w:pStyle w:val="Titolo2"/>
       </w:pPr>
-      <w:bookmarkStart w:id="59" w:name="_Toc244270463"/>
+      <w:bookmarkStart w:id="59" w:name="_Toc244271102"/>
       <w:r>
         <w:t>6.13 Versione 1.5.0</w:t>
       </w:r>
@@ -23455,7 +23551,7 @@
       <w:pPr>
         <w:pStyle w:val="Titolo2"/>
       </w:pPr>
-      <w:bookmarkStart w:id="60" w:name="_Toc244270464"/>
+      <w:bookmarkStart w:id="60" w:name="_Toc244271103"/>
       <w:r>
         <w:t>6.14 Versione 1.6.0</w:t>
       </w:r>
@@ -23479,7 +23575,7 @@
       <w:pPr>
         <w:pStyle w:val="Titolo2"/>
       </w:pPr>
-      <w:bookmarkStart w:id="61" w:name="_Toc244270465"/>
+      <w:bookmarkStart w:id="61" w:name="_Toc244271104"/>
       <w:r>
         <w:t>6.15 Versione 1.6.2</w:t>
       </w:r>
@@ -23497,7 +23593,7 @@
       <w:pPr>
         <w:pStyle w:val="Titolo2"/>
       </w:pPr>
-      <w:bookmarkStart w:id="62" w:name="_Toc244270466"/>
+      <w:bookmarkStart w:id="62" w:name="_Toc244271105"/>
       <w:r>
         <w:t>6.16 Versione 1.7.0</w:t>
       </w:r>
@@ -23515,7 +23611,7 @@
       <w:pPr>
         <w:pStyle w:val="Titolo2"/>
       </w:pPr>
-      <w:bookmarkStart w:id="63" w:name="_Toc244270467"/>
+      <w:bookmarkStart w:id="63" w:name="_Toc244271106"/>
       <w:r>
         <w:t>6.17 Versione 1.7.1</w:t>
       </w:r>
@@ -23526,18 +23622,36 @@
         <w:spacing w:after="120"/>
       </w:pPr>
       <w:r>
-        <w:t>Preparata il 30 ottobre 2026 (installer Windows 101.7.1, Android 1001007001): correzioni Android (barre del sistema, tema, tasto indietro), 20 errori del giro da utente, ottimizzazioni di velocità e spazio. Provata con i 89 test del motore, nel browser a varie larghezze, in vista telefono con le barre di Android simulate e nella web app con il motore Pyodide.</w:t>
+        <w:t>Pubblicata il 30 ottobre 2026 senza il Mac (il passo che crea il DMG si è fermato: «Resource busy», corretto nella 1.7.2; MSI 102,5 MB, 29 MB in meno con la compressione LZX; installer Windows 101.7.1, Android 1001007001): correzioni Android (barre del sistema, tema, tasto indietro), 20 errori del giro da utente, ottimizzazioni di velocità e spazio. Provata con i 89 test del motore, nel browser a varie larghezze, in vista telefono con le barre di Android simulate e nella web app con il motore Pyodide.</w:t>
       </w:r>
     </w:p>
     <w:p>
       <w:pPr>
         <w:pStyle w:val="Titolo2"/>
       </w:pPr>
-      <w:bookmarkStart w:id="64" w:name="_Toc244270468"/>
-      <w:r>
-        <w:t>6.18 Ruoli</w:t>
+      <w:bookmarkStart w:id="64" w:name="_Toc244271107"/>
+      <w:r>
+        <w:t>6.18 Versione 1.7.2</w:t>
       </w:r>
       <w:bookmarkEnd w:id="64"/>
+    </w:p>
+    <w:p>
+      <w:pPr>
+        <w:spacing w:after="120"/>
+      </w:pPr>
+      <w:r>
+        <w:t>Preparata il 30 ottobre 2026 (installer Windows 101.7.2, Android 1001007002): DMG per Mac di nuovo presente (creato in due passi, con tentativi e il formato di prima come riserva); pulsante «chiudi» grande e ben visibile negli avvisi, nella campanella delle notifiche e nella finestra delle novità (36 px con il mouse, 46 px sugli schermi touch).</w:t>
+      </w:r>
+    </w:p>
+    <w:p>
+      <w:pPr>
+        <w:pStyle w:val="Titolo2"/>
+      </w:pPr>
+      <w:bookmarkStart w:id="65" w:name="_Toc244271108"/>
+      <w:r>
+        <w:t>6.19 Ruoli</w:t>
+      </w:r>
+      <w:bookmarkEnd w:id="65"/>
     </w:p>
     <w:tbl>
       <w:tblPr>
@@ -23806,11 +23920,11 @@
       <w:pPr>
         <w:pStyle w:val="Titolo1"/>
       </w:pPr>
-      <w:bookmarkStart w:id="65" w:name="_Toc244270469"/>
+      <w:bookmarkStart w:id="66" w:name="_Toc244271109"/>
       <w:r>
         <w:t>7. Sicurezza</w:t>
       </w:r>
-      <w:bookmarkEnd w:id="65"/>
+      <w:bookmarkEnd w:id="66"/>
     </w:p>
     <w:p>
       <w:pPr>
@@ -24105,11 +24219,11 @@
       <w:pPr>
         <w:pStyle w:val="Titolo1"/>
       </w:pPr>
-      <w:bookmarkStart w:id="66" w:name="_Toc244270470"/>
+      <w:bookmarkStart w:id="67" w:name="_Toc244271110"/>
       <w:r>
         <w:t>8. Punti aperti</w:t>
       </w:r>
-      <w:bookmarkEnd w:id="66"/>
+      <w:bookmarkEnd w:id="67"/>
     </w:p>
     <w:p>
       <w:pPr>
@@ -24394,11 +24508,11 @@
       <w:pPr>
         <w:pStyle w:val="Titolo1"/>
       </w:pPr>
-      <w:bookmarkStart w:id="67" w:name="_Toc244270471"/>
+      <w:bookmarkStart w:id="68" w:name="_Toc244271111"/>
       <w:r>
         <w:t>9. Pensato per i prossimi 10 anni</w:t>
       </w:r>
-      <w:bookmarkEnd w:id="67"/>
+      <w:bookmarkEnd w:id="68"/>
     </w:p>
     <w:p>
       <w:pPr>
@@ -24588,11 +24702,11 @@
       <w:pPr>
         <w:pStyle w:val="Titolo1"/>
       </w:pPr>
-      <w:bookmarkStart w:id="68" w:name="_Toc244270472"/>
+      <w:bookmarkStart w:id="69" w:name="_Toc244271112"/>
       <w:r>
         <w:t>10. Facilità d'uso: analisi e proposte (30 ottobre 2026)</w:t>
       </w:r>
-      <w:bookmarkEnd w:id="68"/>
+      <w:bookmarkEnd w:id="69"/>
     </w:p>
     <w:p>
       <w:pPr>
@@ -24676,11 +24790,11 @@
       <w:pPr>
         <w:pStyle w:val="Titolo2"/>
       </w:pPr>
-      <w:bookmarkStart w:id="69" w:name="_Toc244270473"/>
+      <w:bookmarkStart w:id="70" w:name="_Toc244271113"/>
       <w:r>
         <w:t>10.1 Opinione</w:t>
       </w:r>
-      <w:bookmarkEnd w:id="69"/>
+      <w:bookmarkEnd w:id="70"/>
     </w:p>
     <w:p>
       <w:pPr>
@@ -25204,11 +25318,11 @@
       <w:pPr>
         <w:pStyle w:val="Titolo2"/>
       </w:pPr>
-      <w:bookmarkStart w:id="70" w:name="_Toc244270474"/>
+      <w:bookmarkStart w:id="71" w:name="_Toc244271114"/>
       <w:r>
         <w:t>10.2 Punti da migliorare</w:t>
       </w:r>
-      <w:bookmarkEnd w:id="70"/>
+      <w:bookmarkEnd w:id="71"/>
     </w:p>
     <w:p>
       <w:pPr>
@@ -25353,7 +25467,7 @@
           <w:noProof/>
         </w:rPr>
         <w:drawing>
-          <wp:inline distT="0" distB="0" distL="0" distR="0" wp14:anchorId="2B0A0CE6" wp14:editId="3B9DB02B">
+          <wp:inline distT="0" distB="0" distL="0" distR="0" wp14:anchorId="2FEEDA1E" wp14:editId="793289E9">
             <wp:extent cx="1905000" cy="4124325"/>
             <wp:effectExtent l="0" t="0" r="0" b="0"/>
             <wp:docPr id="31" name="Immagine 31"/>
@@ -25418,7 +25532,7 @@
           <w:noProof/>
         </w:rPr>
         <w:drawing>
-          <wp:inline distT="0" distB="0" distL="0" distR="0" wp14:anchorId="2B7C2894" wp14:editId="552D9021">
+          <wp:inline distT="0" distB="0" distL="0" distR="0" wp14:anchorId="22E1A7C2" wp14:editId="45ED778C">
             <wp:extent cx="1905000" cy="4124325"/>
             <wp:effectExtent l="0" t="0" r="0" b="0"/>
             <wp:docPr id="32" name="Immagine 32"/>
@@ -25483,7 +25597,7 @@
           <w:noProof/>
         </w:rPr>
         <w:drawing>
-          <wp:inline distT="0" distB="0" distL="0" distR="0" wp14:anchorId="4FFF1E13" wp14:editId="0931A1D0">
+          <wp:inline distT="0" distB="0" distL="0" distR="0" wp14:anchorId="421006EF" wp14:editId="7BE6C6D4">
             <wp:extent cx="4953000" cy="3095625"/>
             <wp:effectExtent l="0" t="0" r="0" b="0"/>
             <wp:docPr id="33" name="Immagine 33"/>
@@ -25542,11 +25656,11 @@
       <w:pPr>
         <w:pStyle w:val="Titolo2"/>
       </w:pPr>
-      <w:bookmarkStart w:id="71" w:name="_Toc244270475"/>
+      <w:bookmarkStart w:id="72" w:name="_Toc244271115"/>
       <w:r>
         <w:t>10.3 Cinque proposte</w:t>
       </w:r>
-      <w:bookmarkEnd w:id="71"/>
+      <w:bookmarkEnd w:id="72"/>
     </w:p>
     <w:tbl>
       <w:tblPr>
@@ -26422,10 +26536,10 @@
 <file path=word/numbering.xml><?xml version="1.0" encoding="utf-8"?>
 <w:numbering xmlns:wpc="http://schemas.microsoft.com/office/word/2010/wordprocessingCanvas" xmlns:cx="http://schemas.microsoft.com/office/drawing/2014/chartex" xmlns:cx1="http://schemas.microsoft.com/office/drawing/2015/9/8/chartex" xmlns:cx2="http://schemas.microsoft.com/office/drawing/2015/10/21/chartex" xmlns:cx3="http://schemas.microsoft.com/office/drawing/2016/5/9/chartex" xmlns:cx4="http://schemas.microsoft.com/office/drawing/2016/5/10/chartex" xmlns:cx5="http://schemas.microsoft.com/office/drawing/2016/5/11/chartex" xmlns:cx6="http://schemas.microsoft.com/office/drawing/2016/5/12/chartex" xmlns:cx7="http://schemas.microsoft.com/office/drawing/2016/5/13/chartex" xmlns:cx8="http://schemas.microsoft.com/office/drawing/2016/5/14/chartex" xmlns:mc="http://schemas.openxmlformats.org/markup-compatibility/2006" xmlns:aink="http://schemas.microsoft.com/office/drawing/2016/ink" xmlns:am3d="http://schemas.microsoft.com/office/drawing/2017/model3d" xmlns:o="urn:schemas-microsoft-com:office:office" xmlns:oel="http://schemas.microsoft.com/office/2019/extlst" xmlns:r="http://schemas.openxmlformats.org/officeDocument/2006/relationships" xmlns:m="http://schemas.openxmlformats.org/officeDocument/2006/math" xmlns:v="urn:schemas-microsoft-com:vml" xmlns:wp14="http://schemas.microsoft.com/office/word/2010/wordprocessingDrawing" xmlns:wp="http://schemas.openxmlformats.org/drawingml/2006/wordprocessingDrawing" xmlns:w10="urn:schemas-microsoft-com:office:word" xmlns:w="http://schemas.openxmlformats.org/wordprocessingml/2006/main" xmlns:w14="http://schemas.microsoft.com/office/word/2010/wordml" xmlns:w15="http://schemas.microsoft.com/office/word/2012/wordml" xmlns:w16cex="http://schemas.microsoft.com/office/word/2018/wordml/cex" xmlns:w16cid="http://schemas.microsoft.com/office/word/2016/wordml/cid" xmlns:w16="http://schemas.microsoft.com/office/word/2018/wordml" xmlns:w16du="http://schemas.microsoft.com/office/word/2023/wordml/word16du" xmlns:w16sdtdh="http://schemas.microsoft.com/office/word/2020/wordml/sdtdatahash" xmlns:w16sdtfl="http://schemas.microsoft.com/office/word/2024/wordml/sdtformatlock" xmlns:w16se="http://schemas.microsoft.com/office/word/2015/wordml/symex" xmlns:wpg="http://schemas.microsoft.com/office/word/2010/wordprocessingGroup" xmlns:wpi="http://schemas.microsoft.com/office/word/2010/wordprocessingInk" xmlns:wne="http://schemas.microsoft.com/office/word/2006/wordml" xmlns:wps="http://schemas.microsoft.com/office/word/2010/wordprocessingShape" mc:Ignorable="w14 w15 w16se w16cid w16 w16cex w16sdtdh w16sdtfl w16du wp14">
   <w:abstractNum w:abstractNumId="0" w15:restartNumberingAfterBreak="0">
-    <w:nsid w:val="100F42F6"/>
+    <w:nsid w:val="215D2AC8"/>
     <w:multiLevelType w:val="hybridMultilevel"/>
-    <w:tmpl w:val="158CFEC8"/>
-    <w:lvl w:ilvl="0" w:tplc="066CAA6A">
+    <w:tmpl w:val="DC288B0C"/>
+    <w:lvl w:ilvl="0" w:tplc="F350F850">
       <w:start w:val="1"/>
       <w:numFmt w:val="decimal"/>
       <w:lvlText w:val="%1."/>
@@ -26434,52 +26548,52 @@
         <w:ind w:left="540" w:hanging="300"/>
       </w:pPr>
     </w:lvl>
-    <w:lvl w:ilvl="1" w:tplc="507C1DF8">
+    <w:lvl w:ilvl="1" w:tplc="B25E315A">
       <w:numFmt w:val="decimal"/>
       <w:lvlText w:val=""/>
       <w:lvlJc w:val="left"/>
     </w:lvl>
-    <w:lvl w:ilvl="2" w:tplc="101C45A8">
+    <w:lvl w:ilvl="2" w:tplc="C3B80DAC">
       <w:numFmt w:val="decimal"/>
       <w:lvlText w:val=""/>
       <w:lvlJc w:val="left"/>
     </w:lvl>
-    <w:lvl w:ilvl="3" w:tplc="CABE906E">
+    <w:lvl w:ilvl="3" w:tplc="D958AAA0">
       <w:numFmt w:val="decimal"/>
       <w:lvlText w:val=""/>
       <w:lvlJc w:val="left"/>
     </w:lvl>
-    <w:lvl w:ilvl="4" w:tplc="5798E2BC">
+    <w:lvl w:ilvl="4" w:tplc="4670CB44">
       <w:numFmt w:val="decimal"/>
       <w:lvlText w:val=""/>
       <w:lvlJc w:val="left"/>
     </w:lvl>
-    <w:lvl w:ilvl="5" w:tplc="DBAE4A8A">
+    <w:lvl w:ilvl="5" w:tplc="97A6284C">
       <w:numFmt w:val="decimal"/>
       <w:lvlText w:val=""/>
       <w:lvlJc w:val="left"/>
     </w:lvl>
-    <w:lvl w:ilvl="6" w:tplc="172430E8">
+    <w:lvl w:ilvl="6" w:tplc="42425A16">
       <w:numFmt w:val="decimal"/>
       <w:lvlText w:val=""/>
       <w:lvlJc w:val="left"/>
     </w:lvl>
-    <w:lvl w:ilvl="7" w:tplc="C164AD4E">
+    <w:lvl w:ilvl="7" w:tplc="5DA27888">
       <w:numFmt w:val="decimal"/>
       <w:lvlText w:val=""/>
       <w:lvlJc w:val="left"/>
     </w:lvl>
-    <w:lvl w:ilvl="8" w:tplc="13260BE4">
+    <w:lvl w:ilvl="8" w:tplc="8480A3F2">
       <w:numFmt w:val="decimal"/>
       <w:lvlText w:val=""/>
       <w:lvlJc w:val="left"/>
     </w:lvl>
   </w:abstractNum>
   <w:abstractNum w:abstractNumId="1" w15:restartNumberingAfterBreak="0">
-    <w:nsid w:val="32E00A3E"/>
+    <w:nsid w:val="3E02057E"/>
     <w:multiLevelType w:val="hybridMultilevel"/>
-    <w:tmpl w:val="43E61F60"/>
-    <w:lvl w:ilvl="0" w:tplc="261C8624">
+    <w:tmpl w:val="DB76CCF0"/>
+    <w:lvl w:ilvl="0" w:tplc="872C1940">
       <w:start w:val="1"/>
       <w:numFmt w:val="decimal"/>
       <w:lvlText w:val="%1."/>
@@ -26488,52 +26602,52 @@
         <w:ind w:left="540" w:hanging="300"/>
       </w:pPr>
     </w:lvl>
-    <w:lvl w:ilvl="1" w:tplc="BA12C54A">
+    <w:lvl w:ilvl="1" w:tplc="FA2AE17A">
       <w:numFmt w:val="decimal"/>
       <w:lvlText w:val=""/>
       <w:lvlJc w:val="left"/>
     </w:lvl>
-    <w:lvl w:ilvl="2" w:tplc="5E92A38C">
+    <w:lvl w:ilvl="2" w:tplc="8E6EAB0C">
       <w:numFmt w:val="decimal"/>
       <w:lvlText w:val=""/>
       <w:lvlJc w:val="left"/>
     </w:lvl>
-    <w:lvl w:ilvl="3" w:tplc="C9F096F2">
+    <w:lvl w:ilvl="3" w:tplc="561A851E">
       <w:numFmt w:val="decimal"/>
       <w:lvlText w:val=""/>
       <w:lvlJc w:val="left"/>
     </w:lvl>
-    <w:lvl w:ilvl="4" w:tplc="6C546A40">
+    <w:lvl w:ilvl="4" w:tplc="52CE3F88">
       <w:numFmt w:val="decimal"/>
       <w:lvlText w:val=""/>
       <w:lvlJc w:val="left"/>
     </w:lvl>
-    <w:lvl w:ilvl="5" w:tplc="6FD2440C">
+    <w:lvl w:ilvl="5" w:tplc="CB6EEAC0">
       <w:numFmt w:val="decimal"/>
       <w:lvlText w:val=""/>
       <w:lvlJc w:val="left"/>
     </w:lvl>
-    <w:lvl w:ilvl="6" w:tplc="167E5038">
+    <w:lvl w:ilvl="6" w:tplc="7BBA323C">
       <w:numFmt w:val="decimal"/>
       <w:lvlText w:val=""/>
       <w:lvlJc w:val="left"/>
     </w:lvl>
-    <w:lvl w:ilvl="7" w:tplc="D01A0DF2">
+    <w:lvl w:ilvl="7" w:tplc="73E23BDC">
       <w:numFmt w:val="decimal"/>
       <w:lvlText w:val=""/>
       <w:lvlJc w:val="left"/>
     </w:lvl>
-    <w:lvl w:ilvl="8" w:tplc="7DF47DB0">
+    <w:lvl w:ilvl="8" w:tplc="CC047500">
       <w:numFmt w:val="decimal"/>
       <w:lvlText w:val=""/>
       <w:lvlJc w:val="left"/>
     </w:lvl>
   </w:abstractNum>
   <w:abstractNum w:abstractNumId="2" w15:restartNumberingAfterBreak="0">
-    <w:nsid w:val="51432D58"/>
+    <w:nsid w:val="71B91A4F"/>
     <w:multiLevelType w:val="hybridMultilevel"/>
-    <w:tmpl w:val="AC663D52"/>
-    <w:lvl w:ilvl="0" w:tplc="F4BA0C56">
+    <w:tmpl w:val="EC4A5F34"/>
+    <w:lvl w:ilvl="0" w:tplc="CDBC4E1A">
       <w:start w:val="1"/>
       <w:numFmt w:val="bullet"/>
       <w:lvlText w:val="•"/>
@@ -26542,52 +26656,52 @@
         <w:ind w:left="540" w:hanging="270"/>
       </w:pPr>
     </w:lvl>
-    <w:lvl w:ilvl="1" w:tplc="89CE1518">
+    <w:lvl w:ilvl="1" w:tplc="B3BA77A4">
       <w:numFmt w:val="decimal"/>
       <w:lvlText w:val=""/>
       <w:lvlJc w:val="left"/>
     </w:lvl>
-    <w:lvl w:ilvl="2" w:tplc="8E886BAE">
+    <w:lvl w:ilvl="2" w:tplc="4A80676A">
       <w:numFmt w:val="decimal"/>
       <w:lvlText w:val=""/>
       <w:lvlJc w:val="left"/>
     </w:lvl>
-    <w:lvl w:ilvl="3" w:tplc="548C035E">
+    <w:lvl w:ilvl="3" w:tplc="B5D2B694">
       <w:numFmt w:val="decimal"/>
       <w:lvlText w:val=""/>
       <w:lvlJc w:val="left"/>
     </w:lvl>
-    <w:lvl w:ilvl="4" w:tplc="7778A1EE">
+    <w:lvl w:ilvl="4" w:tplc="BE6E2018">
       <w:numFmt w:val="decimal"/>
       <w:lvlText w:val=""/>
       <w:lvlJc w:val="left"/>
     </w:lvl>
-    <w:lvl w:ilvl="5" w:tplc="C07A8508">
+    <w:lvl w:ilvl="5" w:tplc="B08EB326">
       <w:numFmt w:val="decimal"/>
       <w:lvlText w:val=""/>
       <w:lvlJc w:val="left"/>
     </w:lvl>
-    <w:lvl w:ilvl="6" w:tplc="1F7A10CA">
+    <w:lvl w:ilvl="6" w:tplc="2A6A7386">
       <w:numFmt w:val="decimal"/>
       <w:lvlText w:val=""/>
       <w:lvlJc w:val="left"/>
     </w:lvl>
-    <w:lvl w:ilvl="7" w:tplc="6FF0EC2C">
+    <w:lvl w:ilvl="7" w:tplc="69B2592A">
       <w:numFmt w:val="decimal"/>
       <w:lvlText w:val=""/>
       <w:lvlJc w:val="left"/>
     </w:lvl>
-    <w:lvl w:ilvl="8" w:tplc="EF182D8A">
+    <w:lvl w:ilvl="8" w:tplc="1BE69200">
       <w:numFmt w:val="decimal"/>
       <w:lvlText w:val=""/>
       <w:lvlJc w:val="left"/>
     </w:lvl>
   </w:abstractNum>
   <w:abstractNum w:abstractNumId="3" w15:restartNumberingAfterBreak="0">
-    <w:nsid w:val="743979AB"/>
+    <w:nsid w:val="7AE20CE2"/>
     <w:multiLevelType w:val="hybridMultilevel"/>
-    <w:tmpl w:val="E0500FF0"/>
-    <w:lvl w:ilvl="0" w:tplc="A9DCE1C6" w:tentative="1">
+    <w:tmpl w:val="1616B882"/>
+    <w:lvl w:ilvl="0" w:tplc="DADA5F60" w:tentative="1">
       <w:start w:val="1"/>
       <w:numFmt w:val="bullet"/>
       <w:lvlText w:val="●"/>
@@ -26596,7 +26710,7 @@
         <w:ind w:left="720" w:hanging="360"/>
       </w:pPr>
     </w:lvl>
-    <w:lvl w:ilvl="1" w:tplc="11E0242A" w:tentative="1">
+    <w:lvl w:ilvl="1" w:tplc="6046C9EC" w:tentative="1">
       <w:start w:val="1"/>
       <w:numFmt w:val="bullet"/>
       <w:lvlText w:val="○"/>
@@ -26605,7 +26719,7 @@
         <w:ind w:left="1440" w:hanging="360"/>
       </w:pPr>
     </w:lvl>
-    <w:lvl w:ilvl="2" w:tplc="A192E97E" w:tentative="1">
+    <w:lvl w:ilvl="2" w:tplc="F7D2C71C" w:tentative="1">
       <w:start w:val="1"/>
       <w:numFmt w:val="bullet"/>
       <w:lvlText w:val="■"/>
@@ -26614,7 +26728,7 @@
         <w:ind w:left="2160" w:hanging="360"/>
       </w:pPr>
     </w:lvl>
-    <w:lvl w:ilvl="3" w:tplc="49CEE254" w:tentative="1">
+    <w:lvl w:ilvl="3" w:tplc="07EE9544" w:tentative="1">
       <w:start w:val="1"/>
       <w:numFmt w:val="bullet"/>
       <w:lvlText w:val="●"/>
@@ -26623,7 +26737,7 @@
         <w:ind w:left="2880" w:hanging="360"/>
       </w:pPr>
     </w:lvl>
-    <w:lvl w:ilvl="4" w:tplc="50844088" w:tentative="1">
+    <w:lvl w:ilvl="4" w:tplc="C45CA78E" w:tentative="1">
       <w:start w:val="1"/>
       <w:numFmt w:val="bullet"/>
       <w:lvlText w:val="○"/>
@@ -26632,7 +26746,7 @@
         <w:ind w:left="3600" w:hanging="360"/>
       </w:pPr>
     </w:lvl>
-    <w:lvl w:ilvl="5" w:tplc="10003AC0" w:tentative="1">
+    <w:lvl w:ilvl="5" w:tplc="A0960E98" w:tentative="1">
       <w:start w:val="1"/>
       <w:numFmt w:val="bullet"/>
       <w:lvlText w:val="■"/>
@@ -26641,7 +26755,7 @@
         <w:ind w:left="4320" w:hanging="360"/>
       </w:pPr>
     </w:lvl>
-    <w:lvl w:ilvl="6" w:tplc="2B1C1852" w:tentative="1">
+    <w:lvl w:ilvl="6" w:tplc="55E8143C" w:tentative="1">
       <w:start w:val="1"/>
       <w:numFmt w:val="bullet"/>
       <w:lvlText w:val="●"/>
@@ -26650,7 +26764,7 @@
         <w:ind w:left="5040" w:hanging="360"/>
       </w:pPr>
     </w:lvl>
-    <w:lvl w:ilvl="7" w:tplc="71925958" w:tentative="1">
+    <w:lvl w:ilvl="7" w:tplc="BEECD8E8" w:tentative="1">
       <w:start w:val="1"/>
       <w:numFmt w:val="bullet"/>
       <w:lvlText w:val="●"/>
@@ -26659,7 +26773,7 @@
         <w:ind w:left="5760" w:hanging="360"/>
       </w:pPr>
     </w:lvl>
-    <w:lvl w:ilvl="8" w:tplc="E2C64444" w:tentative="1">
+    <w:lvl w:ilvl="8" w:tplc="CC2E974A" w:tentative="1">
       <w:start w:val="1"/>
       <w:numFmt w:val="bullet"/>
       <w:lvlText w:val="●"/>
@@ -26669,26 +26783,26 @@
       </w:pPr>
     </w:lvl>
   </w:abstractNum>
-  <w:num w:numId="1" w16cid:durableId="384837676">
+  <w:num w:numId="1" w16cid:durableId="842819152">
     <w:abstractNumId w:val="3"/>
     <w:lvlOverride w:ilvl="0">
       <w:startOverride w:val="1"/>
     </w:lvlOverride>
   </w:num>
-  <w:num w:numId="2" w16cid:durableId="267347942">
+  <w:num w:numId="2" w16cid:durableId="834612255">
     <w:abstractNumId w:val="2"/>
     <w:lvlOverride w:ilvl="0">
       <w:startOverride w:val="1"/>
     </w:lvlOverride>
   </w:num>
-  <w:num w:numId="3" w16cid:durableId="573322077">
-    <w:abstractNumId w:val="1"/>
+  <w:num w:numId="3" w16cid:durableId="1323002308">
+    <w:abstractNumId w:val="0"/>
     <w:lvlOverride w:ilvl="0">
       <w:startOverride w:val="1"/>
     </w:lvlOverride>
   </w:num>
-  <w:num w:numId="4" w16cid:durableId="63797726">
-    <w:abstractNumId w:val="0"/>
+  <w:num w:numId="4" w16cid:durableId="1754934544">
+    <w:abstractNumId w:val="1"/>
     <w:lvlOverride w:ilvl="0">
       <w:startOverride w:val="1"/>
     </w:lvlOverride>
@@ -27329,7 +27443,7 @@
     <w:autoRedefine/>
     <w:uiPriority w:val="39"/>
     <w:unhideWhenUsed/>
-    <w:rsid w:val="00126F9B"/>
+    <w:rsid w:val="008D5010"/>
     <w:pPr>
       <w:spacing w:after="100"/>
     </w:pPr>
@@ -27341,7 +27455,7 @@
     <w:autoRedefine/>
     <w:uiPriority w:val="39"/>
     <w:unhideWhenUsed/>
-    <w:rsid w:val="00126F9B"/>
+    <w:rsid w:val="008D5010"/>
     <w:pPr>
       <w:spacing w:after="100"/>
       <w:ind w:left="210"/>

</xml_diff>

<commit_message>
docs: release 1.7.2 pubblicata (link verificati su pdfz.agjin.com e GitHub)
Co-Authored-By: Claude Opus 5.5 <noreply@anthropic.com>
</commit_message>
<xml_diff>
--- a/docs/PDFz_20261030.docx
+++ b/docs/PDFz_20261030.docx
@@ -16,7 +16,7 @@
           <w:noProof/>
         </w:rPr>
         <w:drawing>
-          <wp:inline distT="0" distB="0" distL="0" distR="0" wp14:anchorId="3263CAE0" wp14:editId="396AC592">
+          <wp:inline distT="0" distB="0" distL="0" distR="0" wp14:anchorId="34A84EDD" wp14:editId="37E63BEB">
             <wp:extent cx="3619500" cy="1285875"/>
             <wp:effectExtent l="0" t="0" r="0" b="0"/>
             <wp:docPr id="1" name="Immagine 1"/>
@@ -135,7 +135,7 @@
     <w:sdt>
       <w:sdtPr>
         <w:alias w:val="Indice"/>
-        <w:id w:val="271907022"/>
+        <w:id w:val="1738586108"/>
       </w:sdtPr>
       <w:sdtEndPr/>
       <w:sdtContent>
@@ -163,7 +163,7 @@
           <w:r>
             <w:fldChar w:fldCharType="separate"/>
           </w:r>
-          <w:hyperlink w:anchor="_Toc244271043" w:history="1">
+          <w:hyperlink w:anchor="_Toc244271695" w:history="1">
             <w:r>
               <w:rPr>
                 <w:rStyle w:val="Collegamentoipertestuale"/>
@@ -187,7 +187,7 @@
               <w:rPr>
                 <w:noProof/>
               </w:rPr>
-              <w:instrText xml:space="preserve"> PAGEREF _Toc244271043 \h </w:instrText>
+              <w:instrText xml:space="preserve"> PAGEREF _Toc244271695 \h </w:instrText>
             </w:r>
             <w:r>
               <w:rPr>
@@ -229,7 +229,7 @@
               <w14:ligatures w14:val="standardContextual"/>
             </w:rPr>
           </w:pPr>
-          <w:hyperlink w:anchor="_Toc244271044" w:history="1">
+          <w:hyperlink w:anchor="_Toc244271696" w:history="1">
             <w:r>
               <w:rPr>
                 <w:rStyle w:val="Collegamentoipertestuale"/>
@@ -253,7 +253,7 @@
               <w:rPr>
                 <w:noProof/>
               </w:rPr>
-              <w:instrText xml:space="preserve"> PAGEREF _Toc244271044 \h </w:instrText>
+              <w:instrText xml:space="preserve"> PAGEREF _Toc244271696 \h </w:instrText>
             </w:r>
             <w:r>
               <w:rPr>
@@ -295,7 +295,7 @@
               <w14:ligatures w14:val="standardContextual"/>
             </w:rPr>
           </w:pPr>
-          <w:hyperlink w:anchor="_Toc244271045" w:history="1">
+          <w:hyperlink w:anchor="_Toc244271697" w:history="1">
             <w:r>
               <w:rPr>
                 <w:rStyle w:val="Collegamentoipertestuale"/>
@@ -319,7 +319,7 @@
               <w:rPr>
                 <w:noProof/>
               </w:rPr>
-              <w:instrText xml:space="preserve"> PAGEREF _Toc244271045 \h </w:instrText>
+              <w:instrText xml:space="preserve"> PAGEREF _Toc244271697 \h </w:instrText>
             </w:r>
             <w:r>
               <w:rPr>
@@ -361,7 +361,7 @@
               <w14:ligatures w14:val="standardContextual"/>
             </w:rPr>
           </w:pPr>
-          <w:hyperlink w:anchor="_Toc244271046" w:history="1">
+          <w:hyperlink w:anchor="_Toc244271698" w:history="1">
             <w:r>
               <w:rPr>
                 <w:rStyle w:val="Collegamentoipertestuale"/>
@@ -385,7 +385,7 @@
               <w:rPr>
                 <w:noProof/>
               </w:rPr>
-              <w:instrText xml:space="preserve"> PAGEREF _Toc244271046 \h </w:instrText>
+              <w:instrText xml:space="preserve"> PAGEREF _Toc244271698 \h </w:instrText>
             </w:r>
             <w:r>
               <w:rPr>
@@ -427,7 +427,7 @@
               <w14:ligatures w14:val="standardContextual"/>
             </w:rPr>
           </w:pPr>
-          <w:hyperlink w:anchor="_Toc244271047" w:history="1">
+          <w:hyperlink w:anchor="_Toc244271699" w:history="1">
             <w:r>
               <w:rPr>
                 <w:rStyle w:val="Collegamentoipertestuale"/>
@@ -451,7 +451,7 @@
               <w:rPr>
                 <w:noProof/>
               </w:rPr>
-              <w:instrText xml:space="preserve"> PAGEREF _Toc244271047 \h </w:instrText>
+              <w:instrText xml:space="preserve"> PAGEREF _Toc244271699 \h </w:instrText>
             </w:r>
             <w:r>
               <w:rPr>
@@ -493,7 +493,7 @@
               <w14:ligatures w14:val="standardContextual"/>
             </w:rPr>
           </w:pPr>
-          <w:hyperlink w:anchor="_Toc244271048" w:history="1">
+          <w:hyperlink w:anchor="_Toc244271700" w:history="1">
             <w:r>
               <w:rPr>
                 <w:rStyle w:val="Collegamentoipertestuale"/>
@@ -517,7 +517,7 @@
               <w:rPr>
                 <w:noProof/>
               </w:rPr>
-              <w:instrText xml:space="preserve"> PAGEREF _Toc244271048 \h </w:instrText>
+              <w:instrText xml:space="preserve"> PAGEREF _Toc244271700 \h </w:instrText>
             </w:r>
             <w:r>
               <w:rPr>
@@ -559,7 +559,7 @@
               <w14:ligatures w14:val="standardContextual"/>
             </w:rPr>
           </w:pPr>
-          <w:hyperlink w:anchor="_Toc244271049" w:history="1">
+          <w:hyperlink w:anchor="_Toc244271701" w:history="1">
             <w:r>
               <w:rPr>
                 <w:rStyle w:val="Collegamentoipertestuale"/>
@@ -583,7 +583,7 @@
               <w:rPr>
                 <w:noProof/>
               </w:rPr>
-              <w:instrText xml:space="preserve"> PAGEREF _Toc244271049 \h </w:instrText>
+              <w:instrText xml:space="preserve"> PAGEREF _Toc244271701 \h </w:instrText>
             </w:r>
             <w:r>
               <w:rPr>
@@ -625,7 +625,7 @@
               <w14:ligatures w14:val="standardContextual"/>
             </w:rPr>
           </w:pPr>
-          <w:hyperlink w:anchor="_Toc244271050" w:history="1">
+          <w:hyperlink w:anchor="_Toc244271702" w:history="1">
             <w:r>
               <w:rPr>
                 <w:rStyle w:val="Collegamentoipertestuale"/>
@@ -649,7 +649,7 @@
               <w:rPr>
                 <w:noProof/>
               </w:rPr>
-              <w:instrText xml:space="preserve"> PAGEREF _Toc244271050 \h </w:instrText>
+              <w:instrText xml:space="preserve"> PAGEREF _Toc244271702 \h </w:instrText>
             </w:r>
             <w:r>
               <w:rPr>
@@ -691,7 +691,7 @@
               <w14:ligatures w14:val="standardContextual"/>
             </w:rPr>
           </w:pPr>
-          <w:hyperlink w:anchor="_Toc244271051" w:history="1">
+          <w:hyperlink w:anchor="_Toc244271703" w:history="1">
             <w:r>
               <w:rPr>
                 <w:rStyle w:val="Collegamentoipertestuale"/>
@@ -715,7 +715,7 @@
               <w:rPr>
                 <w:noProof/>
               </w:rPr>
-              <w:instrText xml:space="preserve"> PAGEREF _Toc244271051 \h </w:instrText>
+              <w:instrText xml:space="preserve"> PAGEREF _Toc244271703 \h </w:instrText>
             </w:r>
             <w:r>
               <w:rPr>
@@ -757,7 +757,7 @@
               <w14:ligatures w14:val="standardContextual"/>
             </w:rPr>
           </w:pPr>
-          <w:hyperlink w:anchor="_Toc244271052" w:history="1">
+          <w:hyperlink w:anchor="_Toc244271704" w:history="1">
             <w:r>
               <w:rPr>
                 <w:rStyle w:val="Collegamentoipertestuale"/>
@@ -781,7 +781,7 @@
               <w:rPr>
                 <w:noProof/>
               </w:rPr>
-              <w:instrText xml:space="preserve"> PAGEREF _Toc244271052 \h </w:instrText>
+              <w:instrText xml:space="preserve"> PAGEREF _Toc244271704 \h </w:instrText>
             </w:r>
             <w:r>
               <w:rPr>
@@ -823,7 +823,7 @@
               <w14:ligatures w14:val="standardContextual"/>
             </w:rPr>
           </w:pPr>
-          <w:hyperlink w:anchor="_Toc244271053" w:history="1">
+          <w:hyperlink w:anchor="_Toc244271705" w:history="1">
             <w:r>
               <w:rPr>
                 <w:rStyle w:val="Collegamentoipertestuale"/>
@@ -847,7 +847,7 @@
               <w:rPr>
                 <w:noProof/>
               </w:rPr>
-              <w:instrText xml:space="preserve"> PAGEREF _Toc244271053 \h </w:instrText>
+              <w:instrText xml:space="preserve"> PAGEREF _Toc244271705 \h </w:instrText>
             </w:r>
             <w:r>
               <w:rPr>
@@ -889,7 +889,7 @@
               <w14:ligatures w14:val="standardContextual"/>
             </w:rPr>
           </w:pPr>
-          <w:hyperlink w:anchor="_Toc244271054" w:history="1">
+          <w:hyperlink w:anchor="_Toc244271706" w:history="1">
             <w:r>
               <w:rPr>
                 <w:rStyle w:val="Collegamentoipertestuale"/>
@@ -913,7 +913,7 @@
               <w:rPr>
                 <w:noProof/>
               </w:rPr>
-              <w:instrText xml:space="preserve"> PAGEREF _Toc244271054 \h </w:instrText>
+              <w:instrText xml:space="preserve"> PAGEREF _Toc244271706 \h </w:instrText>
             </w:r>
             <w:r>
               <w:rPr>
@@ -955,7 +955,7 @@
               <w14:ligatures w14:val="standardContextual"/>
             </w:rPr>
           </w:pPr>
-          <w:hyperlink w:anchor="_Toc244271055" w:history="1">
+          <w:hyperlink w:anchor="_Toc244271707" w:history="1">
             <w:r>
               <w:rPr>
                 <w:rStyle w:val="Collegamentoipertestuale"/>
@@ -979,7 +979,7 @@
               <w:rPr>
                 <w:noProof/>
               </w:rPr>
-              <w:instrText xml:space="preserve"> PAGEREF _Toc244271055 \h </w:instrText>
+              <w:instrText xml:space="preserve"> PAGEREF _Toc244271707 \h </w:instrText>
             </w:r>
             <w:r>
               <w:rPr>
@@ -1021,7 +1021,7 @@
               <w14:ligatures w14:val="standardContextual"/>
             </w:rPr>
           </w:pPr>
-          <w:hyperlink w:anchor="_Toc244271056" w:history="1">
+          <w:hyperlink w:anchor="_Toc244271708" w:history="1">
             <w:r>
               <w:rPr>
                 <w:rStyle w:val="Collegamentoipertestuale"/>
@@ -1045,7 +1045,7 @@
               <w:rPr>
                 <w:noProof/>
               </w:rPr>
-              <w:instrText xml:space="preserve"> PAGEREF _Toc244271056 \h </w:instrText>
+              <w:instrText xml:space="preserve"> PAGEREF _Toc244271708 \h </w:instrText>
             </w:r>
             <w:r>
               <w:rPr>
@@ -1087,7 +1087,7 @@
               <w14:ligatures w14:val="standardContextual"/>
             </w:rPr>
           </w:pPr>
-          <w:hyperlink w:anchor="_Toc244271057" w:history="1">
+          <w:hyperlink w:anchor="_Toc244271709" w:history="1">
             <w:r>
               <w:rPr>
                 <w:rStyle w:val="Collegamentoipertestuale"/>
@@ -1111,7 +1111,7 @@
               <w:rPr>
                 <w:noProof/>
               </w:rPr>
-              <w:instrText xml:space="preserve"> PAGEREF _Toc244271057 \h </w:instrText>
+              <w:instrText xml:space="preserve"> PAGEREF _Toc244271709 \h </w:instrText>
             </w:r>
             <w:r>
               <w:rPr>
@@ -1153,7 +1153,7 @@
               <w14:ligatures w14:val="standardContextual"/>
             </w:rPr>
           </w:pPr>
-          <w:hyperlink w:anchor="_Toc244271058" w:history="1">
+          <w:hyperlink w:anchor="_Toc244271710" w:history="1">
             <w:r>
               <w:rPr>
                 <w:rStyle w:val="Collegamentoipertestuale"/>
@@ -1177,7 +1177,7 @@
               <w:rPr>
                 <w:noProof/>
               </w:rPr>
-              <w:instrText xml:space="preserve"> PAGEREF _Toc244271058 \h </w:instrText>
+              <w:instrText xml:space="preserve"> PAGEREF _Toc244271710 \h </w:instrText>
             </w:r>
             <w:r>
               <w:rPr>
@@ -1219,7 +1219,7 @@
               <w14:ligatures w14:val="standardContextual"/>
             </w:rPr>
           </w:pPr>
-          <w:hyperlink w:anchor="_Toc244271059" w:history="1">
+          <w:hyperlink w:anchor="_Toc244271711" w:history="1">
             <w:r>
               <w:rPr>
                 <w:rStyle w:val="Collegamentoipertestuale"/>
@@ -1243,7 +1243,7 @@
               <w:rPr>
                 <w:noProof/>
               </w:rPr>
-              <w:instrText xml:space="preserve"> PAGEREF _Toc244271059 \h </w:instrText>
+              <w:instrText xml:space="preserve"> PAGEREF _Toc244271711 \h </w:instrText>
             </w:r>
             <w:r>
               <w:rPr>
@@ -1285,7 +1285,7 @@
               <w14:ligatures w14:val="standardContextual"/>
             </w:rPr>
           </w:pPr>
-          <w:hyperlink w:anchor="_Toc244271060" w:history="1">
+          <w:hyperlink w:anchor="_Toc244271712" w:history="1">
             <w:r>
               <w:rPr>
                 <w:rStyle w:val="Collegamentoipertestuale"/>
@@ -1309,7 +1309,7 @@
               <w:rPr>
                 <w:noProof/>
               </w:rPr>
-              <w:instrText xml:space="preserve"> PAGEREF _Toc244271060 \h </w:instrText>
+              <w:instrText xml:space="preserve"> PAGEREF _Toc244271712 \h </w:instrText>
             </w:r>
             <w:r>
               <w:rPr>
@@ -1351,7 +1351,7 @@
               <w14:ligatures w14:val="standardContextual"/>
             </w:rPr>
           </w:pPr>
-          <w:hyperlink w:anchor="_Toc244271061" w:history="1">
+          <w:hyperlink w:anchor="_Toc244271713" w:history="1">
             <w:r>
               <w:rPr>
                 <w:rStyle w:val="Collegamentoipertestuale"/>
@@ -1375,7 +1375,7 @@
               <w:rPr>
                 <w:noProof/>
               </w:rPr>
-              <w:instrText xml:space="preserve"> PAGEREF _Toc244271061 \h </w:instrText>
+              <w:instrText xml:space="preserve"> PAGEREF _Toc244271713 \h </w:instrText>
             </w:r>
             <w:r>
               <w:rPr>
@@ -1417,7 +1417,7 @@
               <w14:ligatures w14:val="standardContextual"/>
             </w:rPr>
           </w:pPr>
-          <w:hyperlink w:anchor="_Toc244271062" w:history="1">
+          <w:hyperlink w:anchor="_Toc244271714" w:history="1">
             <w:r>
               <w:rPr>
                 <w:rStyle w:val="Collegamentoipertestuale"/>
@@ -1441,7 +1441,7 @@
               <w:rPr>
                 <w:noProof/>
               </w:rPr>
-              <w:instrText xml:space="preserve"> PAGEREF _Toc244271062 \h </w:instrText>
+              <w:instrText xml:space="preserve"> PAGEREF _Toc244271714 \h </w:instrText>
             </w:r>
             <w:r>
               <w:rPr>
@@ -1483,7 +1483,7 @@
               <w14:ligatures w14:val="standardContextual"/>
             </w:rPr>
           </w:pPr>
-          <w:hyperlink w:anchor="_Toc244271063" w:history="1">
+          <w:hyperlink w:anchor="_Toc244271715" w:history="1">
             <w:r>
               <w:rPr>
                 <w:rStyle w:val="Collegamentoipertestuale"/>
@@ -1507,7 +1507,7 @@
               <w:rPr>
                 <w:noProof/>
               </w:rPr>
-              <w:instrText xml:space="preserve"> PAGEREF _Toc244271063 \h </w:instrText>
+              <w:instrText xml:space="preserve"> PAGEREF _Toc244271715 \h </w:instrText>
             </w:r>
             <w:r>
               <w:rPr>
@@ -1549,7 +1549,7 @@
               <w14:ligatures w14:val="standardContextual"/>
             </w:rPr>
           </w:pPr>
-          <w:hyperlink w:anchor="_Toc244271064" w:history="1">
+          <w:hyperlink w:anchor="_Toc244271716" w:history="1">
             <w:r>
               <w:rPr>
                 <w:rStyle w:val="Collegamentoipertestuale"/>
@@ -1573,7 +1573,7 @@
               <w:rPr>
                 <w:noProof/>
               </w:rPr>
-              <w:instrText xml:space="preserve"> PAGEREF _Toc244271064 \h </w:instrText>
+              <w:instrText xml:space="preserve"> PAGEREF _Toc244271716 \h </w:instrText>
             </w:r>
             <w:r>
               <w:rPr>
@@ -1615,7 +1615,7 @@
               <w14:ligatures w14:val="standardContextual"/>
             </w:rPr>
           </w:pPr>
-          <w:hyperlink w:anchor="_Toc244271065" w:history="1">
+          <w:hyperlink w:anchor="_Toc244271717" w:history="1">
             <w:r>
               <w:rPr>
                 <w:rStyle w:val="Collegamentoipertestuale"/>
@@ -1639,7 +1639,7 @@
               <w:rPr>
                 <w:noProof/>
               </w:rPr>
-              <w:instrText xml:space="preserve"> PAGEREF _Toc244271065 \h </w:instrText>
+              <w:instrText xml:space="preserve"> PAGEREF _Toc244271717 \h </w:instrText>
             </w:r>
             <w:r>
               <w:rPr>
@@ -1681,7 +1681,7 @@
               <w14:ligatures w14:val="standardContextual"/>
             </w:rPr>
           </w:pPr>
-          <w:hyperlink w:anchor="_Toc244271066" w:history="1">
+          <w:hyperlink w:anchor="_Toc244271718" w:history="1">
             <w:r>
               <w:rPr>
                 <w:rStyle w:val="Collegamentoipertestuale"/>
@@ -1705,7 +1705,7 @@
               <w:rPr>
                 <w:noProof/>
               </w:rPr>
-              <w:instrText xml:space="preserve"> PAGEREF _Toc244271066 \h </w:instrText>
+              <w:instrText xml:space="preserve"> PAGEREF _Toc244271718 \h </w:instrText>
             </w:r>
             <w:r>
               <w:rPr>
@@ -1747,7 +1747,7 @@
               <w14:ligatures w14:val="standardContextual"/>
             </w:rPr>
           </w:pPr>
-          <w:hyperlink w:anchor="_Toc244271067" w:history="1">
+          <w:hyperlink w:anchor="_Toc244271719" w:history="1">
             <w:r>
               <w:rPr>
                 <w:rStyle w:val="Collegamentoipertestuale"/>
@@ -1771,7 +1771,7 @@
               <w:rPr>
                 <w:noProof/>
               </w:rPr>
-              <w:instrText xml:space="preserve"> PAGEREF _Toc244271067 \h </w:instrText>
+              <w:instrText xml:space="preserve"> PAGEREF _Toc244271719 \h </w:instrText>
             </w:r>
             <w:r>
               <w:rPr>
@@ -1813,7 +1813,7 @@
               <w14:ligatures w14:val="standardContextual"/>
             </w:rPr>
           </w:pPr>
-          <w:hyperlink w:anchor="_Toc244271068" w:history="1">
+          <w:hyperlink w:anchor="_Toc244271720" w:history="1">
             <w:r>
               <w:rPr>
                 <w:rStyle w:val="Collegamentoipertestuale"/>
@@ -1837,7 +1837,7 @@
               <w:rPr>
                 <w:noProof/>
               </w:rPr>
-              <w:instrText xml:space="preserve"> PAGEREF _Toc244271068 \h </w:instrText>
+              <w:instrText xml:space="preserve"> PAGEREF _Toc244271720 \h </w:instrText>
             </w:r>
             <w:r>
               <w:rPr>
@@ -1879,7 +1879,7 @@
               <w14:ligatures w14:val="standardContextual"/>
             </w:rPr>
           </w:pPr>
-          <w:hyperlink w:anchor="_Toc244271069" w:history="1">
+          <w:hyperlink w:anchor="_Toc244271721" w:history="1">
             <w:r>
               <w:rPr>
                 <w:rStyle w:val="Collegamentoipertestuale"/>
@@ -1903,7 +1903,7 @@
               <w:rPr>
                 <w:noProof/>
               </w:rPr>
-              <w:instrText xml:space="preserve"> PAGEREF _Toc244271069 \h </w:instrText>
+              <w:instrText xml:space="preserve"> PAGEREF _Toc244271721 \h </w:instrText>
             </w:r>
             <w:r>
               <w:rPr>
@@ -1945,7 +1945,7 @@
               <w14:ligatures w14:val="standardContextual"/>
             </w:rPr>
           </w:pPr>
-          <w:hyperlink w:anchor="_Toc244271070" w:history="1">
+          <w:hyperlink w:anchor="_Toc244271722" w:history="1">
             <w:r>
               <w:rPr>
                 <w:rStyle w:val="Collegamentoipertestuale"/>
@@ -1969,7 +1969,7 @@
               <w:rPr>
                 <w:noProof/>
               </w:rPr>
-              <w:instrText xml:space="preserve"> PAGEREF _Toc244271070 \h </w:instrText>
+              <w:instrText xml:space="preserve"> PAGEREF _Toc244271722 \h </w:instrText>
             </w:r>
             <w:r>
               <w:rPr>
@@ -2011,7 +2011,7 @@
               <w14:ligatures w14:val="standardContextual"/>
             </w:rPr>
           </w:pPr>
-          <w:hyperlink w:anchor="_Toc244271071" w:history="1">
+          <w:hyperlink w:anchor="_Toc244271723" w:history="1">
             <w:r>
               <w:rPr>
                 <w:rStyle w:val="Collegamentoipertestuale"/>
@@ -2035,7 +2035,7 @@
               <w:rPr>
                 <w:noProof/>
               </w:rPr>
-              <w:instrText xml:space="preserve"> PAGEREF _Toc244271071 \h </w:instrText>
+              <w:instrText xml:space="preserve"> PAGEREF _Toc244271723 \h </w:instrText>
             </w:r>
             <w:r>
               <w:rPr>
@@ -2077,7 +2077,7 @@
               <w14:ligatures w14:val="standardContextual"/>
             </w:rPr>
           </w:pPr>
-          <w:hyperlink w:anchor="_Toc244271072" w:history="1">
+          <w:hyperlink w:anchor="_Toc244271724" w:history="1">
             <w:r>
               <w:rPr>
                 <w:rStyle w:val="Collegamentoipertestuale"/>
@@ -2101,7 +2101,7 @@
               <w:rPr>
                 <w:noProof/>
               </w:rPr>
-              <w:instrText xml:space="preserve"> PAGEREF _Toc244271072 \h </w:instrText>
+              <w:instrText xml:space="preserve"> PAGEREF _Toc244271724 \h </w:instrText>
             </w:r>
             <w:r>
               <w:rPr>
@@ -2143,7 +2143,7 @@
               <w14:ligatures w14:val="standardContextual"/>
             </w:rPr>
           </w:pPr>
-          <w:hyperlink w:anchor="_Toc244271073" w:history="1">
+          <w:hyperlink w:anchor="_Toc244271725" w:history="1">
             <w:r>
               <w:rPr>
                 <w:rStyle w:val="Collegamentoipertestuale"/>
@@ -2167,7 +2167,7 @@
               <w:rPr>
                 <w:noProof/>
               </w:rPr>
-              <w:instrText xml:space="preserve"> PAGEREF _Toc244271073 \h </w:instrText>
+              <w:instrText xml:space="preserve"> PAGEREF _Toc244271725 \h </w:instrText>
             </w:r>
             <w:r>
               <w:rPr>
@@ -2209,7 +2209,7 @@
               <w14:ligatures w14:val="standardContextual"/>
             </w:rPr>
           </w:pPr>
-          <w:hyperlink w:anchor="_Toc244271074" w:history="1">
+          <w:hyperlink w:anchor="_Toc244271726" w:history="1">
             <w:r>
               <w:rPr>
                 <w:rStyle w:val="Collegamentoipertestuale"/>
@@ -2233,7 +2233,7 @@
               <w:rPr>
                 <w:noProof/>
               </w:rPr>
-              <w:instrText xml:space="preserve"> PAGEREF _Toc244271074 \h </w:instrText>
+              <w:instrText xml:space="preserve"> PAGEREF _Toc244271726 \h </w:instrText>
             </w:r>
             <w:r>
               <w:rPr>
@@ -2275,7 +2275,7 @@
               <w14:ligatures w14:val="standardContextual"/>
             </w:rPr>
           </w:pPr>
-          <w:hyperlink w:anchor="_Toc244271075" w:history="1">
+          <w:hyperlink w:anchor="_Toc244271727" w:history="1">
             <w:r>
               <w:rPr>
                 <w:rStyle w:val="Collegamentoipertestuale"/>
@@ -2299,7 +2299,7 @@
               <w:rPr>
                 <w:noProof/>
               </w:rPr>
-              <w:instrText xml:space="preserve"> PAGEREF _Toc244271075 \h </w:instrText>
+              <w:instrText xml:space="preserve"> PAGEREF _Toc244271727 \h </w:instrText>
             </w:r>
             <w:r>
               <w:rPr>
@@ -2341,7 +2341,7 @@
               <w14:ligatures w14:val="standardContextual"/>
             </w:rPr>
           </w:pPr>
-          <w:hyperlink w:anchor="_Toc244271076" w:history="1">
+          <w:hyperlink w:anchor="_Toc244271728" w:history="1">
             <w:r>
               <w:rPr>
                 <w:rStyle w:val="Collegamentoipertestuale"/>
@@ -2365,7 +2365,7 @@
               <w:rPr>
                 <w:noProof/>
               </w:rPr>
-              <w:instrText xml:space="preserve"> PAGEREF _Toc244271076 \h </w:instrText>
+              <w:instrText xml:space="preserve"> PAGEREF _Toc244271728 \h </w:instrText>
             </w:r>
             <w:r>
               <w:rPr>
@@ -2407,7 +2407,7 @@
               <w14:ligatures w14:val="standardContextual"/>
             </w:rPr>
           </w:pPr>
-          <w:hyperlink w:anchor="_Toc244271077" w:history="1">
+          <w:hyperlink w:anchor="_Toc244271729" w:history="1">
             <w:r>
               <w:rPr>
                 <w:rStyle w:val="Collegamentoipertestuale"/>
@@ -2431,7 +2431,7 @@
               <w:rPr>
                 <w:noProof/>
               </w:rPr>
-              <w:instrText xml:space="preserve"> PAGEREF _Toc244271077 \h </w:instrText>
+              <w:instrText xml:space="preserve"> PAGEREF _Toc244271729 \h </w:instrText>
             </w:r>
             <w:r>
               <w:rPr>
@@ -2473,7 +2473,7 @@
               <w14:ligatures w14:val="standardContextual"/>
             </w:rPr>
           </w:pPr>
-          <w:hyperlink w:anchor="_Toc244271078" w:history="1">
+          <w:hyperlink w:anchor="_Toc244271730" w:history="1">
             <w:r>
               <w:rPr>
                 <w:rStyle w:val="Collegamentoipertestuale"/>
@@ -2497,7 +2497,7 @@
               <w:rPr>
                 <w:noProof/>
               </w:rPr>
-              <w:instrText xml:space="preserve"> PAGEREF _Toc244271078 \h </w:instrText>
+              <w:instrText xml:space="preserve"> PAGEREF _Toc244271730 \h </w:instrText>
             </w:r>
             <w:r>
               <w:rPr>
@@ -2539,7 +2539,7 @@
               <w14:ligatures w14:val="standardContextual"/>
             </w:rPr>
           </w:pPr>
-          <w:hyperlink w:anchor="_Toc244271079" w:history="1">
+          <w:hyperlink w:anchor="_Toc244271731" w:history="1">
             <w:r>
               <w:rPr>
                 <w:rStyle w:val="Collegamentoipertestuale"/>
@@ -2563,7 +2563,7 @@
               <w:rPr>
                 <w:noProof/>
               </w:rPr>
-              <w:instrText xml:space="preserve"> PAGEREF _Toc244271079 \h </w:instrText>
+              <w:instrText xml:space="preserve"> PAGEREF _Toc244271731 \h </w:instrText>
             </w:r>
             <w:r>
               <w:rPr>
@@ -2605,7 +2605,7 @@
               <w14:ligatures w14:val="standardContextual"/>
             </w:rPr>
           </w:pPr>
-          <w:hyperlink w:anchor="_Toc244271080" w:history="1">
+          <w:hyperlink w:anchor="_Toc244271732" w:history="1">
             <w:r>
               <w:rPr>
                 <w:rStyle w:val="Collegamentoipertestuale"/>
@@ -2629,7 +2629,7 @@
               <w:rPr>
                 <w:noProof/>
               </w:rPr>
-              <w:instrText xml:space="preserve"> PAGEREF _Toc244271080 \h </w:instrText>
+              <w:instrText xml:space="preserve"> PAGEREF _Toc244271732 \h </w:instrText>
             </w:r>
             <w:r>
               <w:rPr>
@@ -2671,7 +2671,7 @@
               <w14:ligatures w14:val="standardContextual"/>
             </w:rPr>
           </w:pPr>
-          <w:hyperlink w:anchor="_Toc244271081" w:history="1">
+          <w:hyperlink w:anchor="_Toc244271733" w:history="1">
             <w:r>
               <w:rPr>
                 <w:rStyle w:val="Collegamentoipertestuale"/>
@@ -2695,7 +2695,7 @@
               <w:rPr>
                 <w:noProof/>
               </w:rPr>
-              <w:instrText xml:space="preserve"> PAGEREF _Toc244271081 \h </w:instrText>
+              <w:instrText xml:space="preserve"> PAGEREF _Toc244271733 \h </w:instrText>
             </w:r>
             <w:r>
               <w:rPr>
@@ -2737,7 +2737,7 @@
               <w14:ligatures w14:val="standardContextual"/>
             </w:rPr>
           </w:pPr>
-          <w:hyperlink w:anchor="_Toc244271082" w:history="1">
+          <w:hyperlink w:anchor="_Toc244271734" w:history="1">
             <w:r>
               <w:rPr>
                 <w:rStyle w:val="Collegamentoipertestuale"/>
@@ -2761,7 +2761,7 @@
               <w:rPr>
                 <w:noProof/>
               </w:rPr>
-              <w:instrText xml:space="preserve"> PAGEREF _Toc244271082 \h </w:instrText>
+              <w:instrText xml:space="preserve"> PAGEREF _Toc244271734 \h </w:instrText>
             </w:r>
             <w:r>
               <w:rPr>
@@ -2803,7 +2803,7 @@
               <w14:ligatures w14:val="standardContextual"/>
             </w:rPr>
           </w:pPr>
-          <w:hyperlink w:anchor="_Toc244271083" w:history="1">
+          <w:hyperlink w:anchor="_Toc244271735" w:history="1">
             <w:r>
               <w:rPr>
                 <w:rStyle w:val="Collegamentoipertestuale"/>
@@ -2827,7 +2827,7 @@
               <w:rPr>
                 <w:noProof/>
               </w:rPr>
-              <w:instrText xml:space="preserve"> PAGEREF _Toc244271083 \h </w:instrText>
+              <w:instrText xml:space="preserve"> PAGEREF _Toc244271735 \h </w:instrText>
             </w:r>
             <w:r>
               <w:rPr>
@@ -2869,7 +2869,7 @@
               <w14:ligatures w14:val="standardContextual"/>
             </w:rPr>
           </w:pPr>
-          <w:hyperlink w:anchor="_Toc244271084" w:history="1">
+          <w:hyperlink w:anchor="_Toc244271736" w:history="1">
             <w:r>
               <w:rPr>
                 <w:rStyle w:val="Collegamentoipertestuale"/>
@@ -2893,7 +2893,7 @@
               <w:rPr>
                 <w:noProof/>
               </w:rPr>
-              <w:instrText xml:space="preserve"> PAGEREF _Toc244271084 \h </w:instrText>
+              <w:instrText xml:space="preserve"> PAGEREF _Toc244271736 \h </w:instrText>
             </w:r>
             <w:r>
               <w:rPr>
@@ -2935,7 +2935,7 @@
               <w14:ligatures w14:val="standardContextual"/>
             </w:rPr>
           </w:pPr>
-          <w:hyperlink w:anchor="_Toc244271085" w:history="1">
+          <w:hyperlink w:anchor="_Toc244271737" w:history="1">
             <w:r>
               <w:rPr>
                 <w:rStyle w:val="Collegamentoipertestuale"/>
@@ -2959,7 +2959,7 @@
               <w:rPr>
                 <w:noProof/>
               </w:rPr>
-              <w:instrText xml:space="preserve"> PAGEREF _Toc244271085 \h </w:instrText>
+              <w:instrText xml:space="preserve"> PAGEREF _Toc244271737 \h </w:instrText>
             </w:r>
             <w:r>
               <w:rPr>
@@ -3001,7 +3001,7 @@
               <w14:ligatures w14:val="standardContextual"/>
             </w:rPr>
           </w:pPr>
-          <w:hyperlink w:anchor="_Toc244271086" w:history="1">
+          <w:hyperlink w:anchor="_Toc244271738" w:history="1">
             <w:r>
               <w:rPr>
                 <w:rStyle w:val="Collegamentoipertestuale"/>
@@ -3025,7 +3025,7 @@
               <w:rPr>
                 <w:noProof/>
               </w:rPr>
-              <w:instrText xml:space="preserve"> PAGEREF _Toc244271086 \h </w:instrText>
+              <w:instrText xml:space="preserve"> PAGEREF _Toc244271738 \h </w:instrText>
             </w:r>
             <w:r>
               <w:rPr>
@@ -3067,7 +3067,7 @@
               <w14:ligatures w14:val="standardContextual"/>
             </w:rPr>
           </w:pPr>
-          <w:hyperlink w:anchor="_Toc244271087" w:history="1">
+          <w:hyperlink w:anchor="_Toc244271739" w:history="1">
             <w:r>
               <w:rPr>
                 <w:rStyle w:val="Collegamentoipertestuale"/>
@@ -3091,7 +3091,7 @@
               <w:rPr>
                 <w:noProof/>
               </w:rPr>
-              <w:instrText xml:space="preserve"> PAGEREF _Toc244271087 \h </w:instrText>
+              <w:instrText xml:space="preserve"> PAGEREF _Toc244271739 \h </w:instrText>
             </w:r>
             <w:r>
               <w:rPr>
@@ -3133,7 +3133,7 @@
               <w14:ligatures w14:val="standardContextual"/>
             </w:rPr>
           </w:pPr>
-          <w:hyperlink w:anchor="_Toc244271088" w:history="1">
+          <w:hyperlink w:anchor="_Toc244271740" w:history="1">
             <w:r>
               <w:rPr>
                 <w:rStyle w:val="Collegamentoipertestuale"/>
@@ -3157,7 +3157,7 @@
               <w:rPr>
                 <w:noProof/>
               </w:rPr>
-              <w:instrText xml:space="preserve"> PAGEREF _Toc244271088 \h </w:instrText>
+              <w:instrText xml:space="preserve"> PAGEREF _Toc244271740 \h </w:instrText>
             </w:r>
             <w:r>
               <w:rPr>
@@ -3199,7 +3199,7 @@
               <w14:ligatures w14:val="standardContextual"/>
             </w:rPr>
           </w:pPr>
-          <w:hyperlink w:anchor="_Toc244271089" w:history="1">
+          <w:hyperlink w:anchor="_Toc244271741" w:history="1">
             <w:r>
               <w:rPr>
                 <w:rStyle w:val="Collegamentoipertestuale"/>
@@ -3223,7 +3223,7 @@
               <w:rPr>
                 <w:noProof/>
               </w:rPr>
-              <w:instrText xml:space="preserve"> PAGEREF _Toc244271089 \h </w:instrText>
+              <w:instrText xml:space="preserve"> PAGEREF _Toc244271741 \h </w:instrText>
             </w:r>
             <w:r>
               <w:rPr>
@@ -3265,7 +3265,7 @@
               <w14:ligatures w14:val="standardContextual"/>
             </w:rPr>
           </w:pPr>
-          <w:hyperlink w:anchor="_Toc244271090" w:history="1">
+          <w:hyperlink w:anchor="_Toc244271742" w:history="1">
             <w:r>
               <w:rPr>
                 <w:rStyle w:val="Collegamentoipertestuale"/>
@@ -3289,7 +3289,7 @@
               <w:rPr>
                 <w:noProof/>
               </w:rPr>
-              <w:instrText xml:space="preserve"> PAGEREF _Toc244271090 \h </w:instrText>
+              <w:instrText xml:space="preserve"> PAGEREF _Toc244271742 \h </w:instrText>
             </w:r>
             <w:r>
               <w:rPr>
@@ -3331,7 +3331,7 @@
               <w14:ligatures w14:val="standardContextual"/>
             </w:rPr>
           </w:pPr>
-          <w:hyperlink w:anchor="_Toc244271091" w:history="1">
+          <w:hyperlink w:anchor="_Toc244271743" w:history="1">
             <w:r>
               <w:rPr>
                 <w:rStyle w:val="Collegamentoipertestuale"/>
@@ -3355,7 +3355,7 @@
               <w:rPr>
                 <w:noProof/>
               </w:rPr>
-              <w:instrText xml:space="preserve"> PAGEREF _Toc244271091 \h </w:instrText>
+              <w:instrText xml:space="preserve"> PAGEREF _Toc244271743 \h </w:instrText>
             </w:r>
             <w:r>
               <w:rPr>
@@ -3397,7 +3397,7 @@
               <w14:ligatures w14:val="standardContextual"/>
             </w:rPr>
           </w:pPr>
-          <w:hyperlink w:anchor="_Toc244271092" w:history="1">
+          <w:hyperlink w:anchor="_Toc244271744" w:history="1">
             <w:r>
               <w:rPr>
                 <w:rStyle w:val="Collegamentoipertestuale"/>
@@ -3421,7 +3421,7 @@
               <w:rPr>
                 <w:noProof/>
               </w:rPr>
-              <w:instrText xml:space="preserve"> PAGEREF _Toc244271092 \h </w:instrText>
+              <w:instrText xml:space="preserve"> PAGEREF _Toc244271744 \h </w:instrText>
             </w:r>
             <w:r>
               <w:rPr>
@@ -3463,7 +3463,7 @@
               <w14:ligatures w14:val="standardContextual"/>
             </w:rPr>
           </w:pPr>
-          <w:hyperlink w:anchor="_Toc244271093" w:history="1">
+          <w:hyperlink w:anchor="_Toc244271745" w:history="1">
             <w:r>
               <w:rPr>
                 <w:rStyle w:val="Collegamentoipertestuale"/>
@@ -3487,7 +3487,7 @@
               <w:rPr>
                 <w:noProof/>
               </w:rPr>
-              <w:instrText xml:space="preserve"> PAGEREF _Toc244271093 \h </w:instrText>
+              <w:instrText xml:space="preserve"> PAGEREF _Toc244271745 \h </w:instrText>
             </w:r>
             <w:r>
               <w:rPr>
@@ -3529,7 +3529,7 @@
               <w14:ligatures w14:val="standardContextual"/>
             </w:rPr>
           </w:pPr>
-          <w:hyperlink w:anchor="_Toc244271094" w:history="1">
+          <w:hyperlink w:anchor="_Toc244271746" w:history="1">
             <w:r>
               <w:rPr>
                 <w:rStyle w:val="Collegamentoipertestuale"/>
@@ -3553,7 +3553,7 @@
               <w:rPr>
                 <w:noProof/>
               </w:rPr>
-              <w:instrText xml:space="preserve"> PAGEREF _Toc244271094 \h </w:instrText>
+              <w:instrText xml:space="preserve"> PAGEREF _Toc244271746 \h </w:instrText>
             </w:r>
             <w:r>
               <w:rPr>
@@ -3595,7 +3595,7 @@
               <w14:ligatures w14:val="standardContextual"/>
             </w:rPr>
           </w:pPr>
-          <w:hyperlink w:anchor="_Toc244271095" w:history="1">
+          <w:hyperlink w:anchor="_Toc244271747" w:history="1">
             <w:r>
               <w:rPr>
                 <w:rStyle w:val="Collegamentoipertestuale"/>
@@ -3619,7 +3619,7 @@
               <w:rPr>
                 <w:noProof/>
               </w:rPr>
-              <w:instrText xml:space="preserve"> PAGEREF _Toc244271095 \h </w:instrText>
+              <w:instrText xml:space="preserve"> PAGEREF _Toc244271747 \h </w:instrText>
             </w:r>
             <w:r>
               <w:rPr>
@@ -3661,7 +3661,7 @@
               <w14:ligatures w14:val="standardContextual"/>
             </w:rPr>
           </w:pPr>
-          <w:hyperlink w:anchor="_Toc244271096" w:history="1">
+          <w:hyperlink w:anchor="_Toc244271748" w:history="1">
             <w:r>
               <w:rPr>
                 <w:rStyle w:val="Collegamentoipertestuale"/>
@@ -3685,7 +3685,7 @@
               <w:rPr>
                 <w:noProof/>
               </w:rPr>
-              <w:instrText xml:space="preserve"> PAGEREF _Toc244271096 \h </w:instrText>
+              <w:instrText xml:space="preserve"> PAGEREF _Toc244271748 \h </w:instrText>
             </w:r>
             <w:r>
               <w:rPr>
@@ -3727,7 +3727,7 @@
               <w14:ligatures w14:val="standardContextual"/>
             </w:rPr>
           </w:pPr>
-          <w:hyperlink w:anchor="_Toc244271097" w:history="1">
+          <w:hyperlink w:anchor="_Toc244271749" w:history="1">
             <w:r>
               <w:rPr>
                 <w:rStyle w:val="Collegamentoipertestuale"/>
@@ -3751,7 +3751,7 @@
               <w:rPr>
                 <w:noProof/>
               </w:rPr>
-              <w:instrText xml:space="preserve"> PAGEREF _Toc244271097 \h </w:instrText>
+              <w:instrText xml:space="preserve"> PAGEREF _Toc244271749 \h </w:instrText>
             </w:r>
             <w:r>
               <w:rPr>
@@ -3793,7 +3793,7 @@
               <w14:ligatures w14:val="standardContextual"/>
             </w:rPr>
           </w:pPr>
-          <w:hyperlink w:anchor="_Toc244271098" w:history="1">
+          <w:hyperlink w:anchor="_Toc244271750" w:history="1">
             <w:r>
               <w:rPr>
                 <w:rStyle w:val="Collegamentoipertestuale"/>
@@ -3817,7 +3817,7 @@
               <w:rPr>
                 <w:noProof/>
               </w:rPr>
-              <w:instrText xml:space="preserve"> PAGEREF _Toc244271098 \h </w:instrText>
+              <w:instrText xml:space="preserve"> PAGEREF _Toc244271750 \h </w:instrText>
             </w:r>
             <w:r>
               <w:rPr>
@@ -3859,7 +3859,7 @@
               <w14:ligatures w14:val="standardContextual"/>
             </w:rPr>
           </w:pPr>
-          <w:hyperlink w:anchor="_Toc244271099" w:history="1">
+          <w:hyperlink w:anchor="_Toc244271751" w:history="1">
             <w:r>
               <w:rPr>
                 <w:rStyle w:val="Collegamentoipertestuale"/>
@@ -3883,7 +3883,7 @@
               <w:rPr>
                 <w:noProof/>
               </w:rPr>
-              <w:instrText xml:space="preserve"> PAGEREF _Toc244271099 \h </w:instrText>
+              <w:instrText xml:space="preserve"> PAGEREF _Toc244271751 \h </w:instrText>
             </w:r>
             <w:r>
               <w:rPr>
@@ -3925,7 +3925,7 @@
               <w14:ligatures w14:val="standardContextual"/>
             </w:rPr>
           </w:pPr>
-          <w:hyperlink w:anchor="_Toc244271100" w:history="1">
+          <w:hyperlink w:anchor="_Toc244271752" w:history="1">
             <w:r>
               <w:rPr>
                 <w:rStyle w:val="Collegamentoipertestuale"/>
@@ -3949,7 +3949,7 @@
               <w:rPr>
                 <w:noProof/>
               </w:rPr>
-              <w:instrText xml:space="preserve"> PAGEREF _Toc244271100 \h </w:instrText>
+              <w:instrText xml:space="preserve"> PAGEREF _Toc244271752 \h </w:instrText>
             </w:r>
             <w:r>
               <w:rPr>
@@ -3991,7 +3991,7 @@
               <w14:ligatures w14:val="standardContextual"/>
             </w:rPr>
           </w:pPr>
-          <w:hyperlink w:anchor="_Toc244271101" w:history="1">
+          <w:hyperlink w:anchor="_Toc244271753" w:history="1">
             <w:r>
               <w:rPr>
                 <w:rStyle w:val="Collegamentoipertestuale"/>
@@ -4015,7 +4015,7 @@
               <w:rPr>
                 <w:noProof/>
               </w:rPr>
-              <w:instrText xml:space="preserve"> PAGEREF _Toc244271101 \h </w:instrText>
+              <w:instrText xml:space="preserve"> PAGEREF _Toc244271753 \h </w:instrText>
             </w:r>
             <w:r>
               <w:rPr>
@@ -4057,7 +4057,7 @@
               <w14:ligatures w14:val="standardContextual"/>
             </w:rPr>
           </w:pPr>
-          <w:hyperlink w:anchor="_Toc244271102" w:history="1">
+          <w:hyperlink w:anchor="_Toc244271754" w:history="1">
             <w:r>
               <w:rPr>
                 <w:rStyle w:val="Collegamentoipertestuale"/>
@@ -4081,7 +4081,7 @@
               <w:rPr>
                 <w:noProof/>
               </w:rPr>
-              <w:instrText xml:space="preserve"> PAGEREF _Toc244271102 \h </w:instrText>
+              <w:instrText xml:space="preserve"> PAGEREF _Toc244271754 \h </w:instrText>
             </w:r>
             <w:r>
               <w:rPr>
@@ -4123,7 +4123,7 @@
               <w14:ligatures w14:val="standardContextual"/>
             </w:rPr>
           </w:pPr>
-          <w:hyperlink w:anchor="_Toc244271103" w:history="1">
+          <w:hyperlink w:anchor="_Toc244271755" w:history="1">
             <w:r>
               <w:rPr>
                 <w:rStyle w:val="Collegamentoipertestuale"/>
@@ -4147,7 +4147,7 @@
               <w:rPr>
                 <w:noProof/>
               </w:rPr>
-              <w:instrText xml:space="preserve"> PAGEREF _Toc244271103 \h </w:instrText>
+              <w:instrText xml:space="preserve"> PAGEREF _Toc244271755 \h </w:instrText>
             </w:r>
             <w:r>
               <w:rPr>
@@ -4189,7 +4189,7 @@
               <w14:ligatures w14:val="standardContextual"/>
             </w:rPr>
           </w:pPr>
-          <w:hyperlink w:anchor="_Toc244271104" w:history="1">
+          <w:hyperlink w:anchor="_Toc244271756" w:history="1">
             <w:r>
               <w:rPr>
                 <w:rStyle w:val="Collegamentoipertestuale"/>
@@ -4213,7 +4213,7 @@
               <w:rPr>
                 <w:noProof/>
               </w:rPr>
-              <w:instrText xml:space="preserve"> PAGEREF _Toc244271104 \h </w:instrText>
+              <w:instrText xml:space="preserve"> PAGEREF _Toc244271756 \h </w:instrText>
             </w:r>
             <w:r>
               <w:rPr>
@@ -4255,7 +4255,7 @@
               <w14:ligatures w14:val="standardContextual"/>
             </w:rPr>
           </w:pPr>
-          <w:hyperlink w:anchor="_Toc244271105" w:history="1">
+          <w:hyperlink w:anchor="_Toc244271757" w:history="1">
             <w:r>
               <w:rPr>
                 <w:rStyle w:val="Collegamentoipertestuale"/>
@@ -4279,7 +4279,7 @@
               <w:rPr>
                 <w:noProof/>
               </w:rPr>
-              <w:instrText xml:space="preserve"> PAGEREF _Toc244271105 \h </w:instrText>
+              <w:instrText xml:space="preserve"> PAGEREF _Toc244271757 \h </w:instrText>
             </w:r>
             <w:r>
               <w:rPr>
@@ -4321,7 +4321,7 @@
               <w14:ligatures w14:val="standardContextual"/>
             </w:rPr>
           </w:pPr>
-          <w:hyperlink w:anchor="_Toc244271106" w:history="1">
+          <w:hyperlink w:anchor="_Toc244271758" w:history="1">
             <w:r>
               <w:rPr>
                 <w:rStyle w:val="Collegamentoipertestuale"/>
@@ -4345,7 +4345,7 @@
               <w:rPr>
                 <w:noProof/>
               </w:rPr>
-              <w:instrText xml:space="preserve"> PAGEREF _Toc244271106 \h </w:instrText>
+              <w:instrText xml:space="preserve"> PAGEREF _Toc244271758 \h </w:instrText>
             </w:r>
             <w:r>
               <w:rPr>
@@ -4387,7 +4387,7 @@
               <w14:ligatures w14:val="standardContextual"/>
             </w:rPr>
           </w:pPr>
-          <w:hyperlink w:anchor="_Toc244271107" w:history="1">
+          <w:hyperlink w:anchor="_Toc244271759" w:history="1">
             <w:r>
               <w:rPr>
                 <w:rStyle w:val="Collegamentoipertestuale"/>
@@ -4411,7 +4411,7 @@
               <w:rPr>
                 <w:noProof/>
               </w:rPr>
-              <w:instrText xml:space="preserve"> PAGEREF _Toc244271107 \h </w:instrText>
+              <w:instrText xml:space="preserve"> PAGEREF _Toc244271759 \h </w:instrText>
             </w:r>
             <w:r>
               <w:rPr>
@@ -4453,7 +4453,7 @@
               <w14:ligatures w14:val="standardContextual"/>
             </w:rPr>
           </w:pPr>
-          <w:hyperlink w:anchor="_Toc244271108" w:history="1">
+          <w:hyperlink w:anchor="_Toc244271760" w:history="1">
             <w:r>
               <w:rPr>
                 <w:rStyle w:val="Collegamentoipertestuale"/>
@@ -4477,7 +4477,7 @@
               <w:rPr>
                 <w:noProof/>
               </w:rPr>
-              <w:instrText xml:space="preserve"> PAGEREF _Toc244271108 \h </w:instrText>
+              <w:instrText xml:space="preserve"> PAGEREF _Toc244271760 \h </w:instrText>
             </w:r>
             <w:r>
               <w:rPr>
@@ -4519,7 +4519,7 @@
               <w14:ligatures w14:val="standardContextual"/>
             </w:rPr>
           </w:pPr>
-          <w:hyperlink w:anchor="_Toc244271109" w:history="1">
+          <w:hyperlink w:anchor="_Toc244271761" w:history="1">
             <w:r>
               <w:rPr>
                 <w:rStyle w:val="Collegamentoipertestuale"/>
@@ -4543,7 +4543,7 @@
               <w:rPr>
                 <w:noProof/>
               </w:rPr>
-              <w:instrText xml:space="preserve"> PAGEREF _Toc244271109 \h </w:instrText>
+              <w:instrText xml:space="preserve"> PAGEREF _Toc244271761 \h </w:instrText>
             </w:r>
             <w:r>
               <w:rPr>
@@ -4585,7 +4585,7 @@
               <w14:ligatures w14:val="standardContextual"/>
             </w:rPr>
           </w:pPr>
-          <w:hyperlink w:anchor="_Toc244271110" w:history="1">
+          <w:hyperlink w:anchor="_Toc244271762" w:history="1">
             <w:r>
               <w:rPr>
                 <w:rStyle w:val="Collegamentoipertestuale"/>
@@ -4609,7 +4609,7 @@
               <w:rPr>
                 <w:noProof/>
               </w:rPr>
-              <w:instrText xml:space="preserve"> PAGEREF _Toc244271110 \h </w:instrText>
+              <w:instrText xml:space="preserve"> PAGEREF _Toc244271762 \h </w:instrText>
             </w:r>
             <w:r>
               <w:rPr>
@@ -4651,7 +4651,7 @@
               <w14:ligatures w14:val="standardContextual"/>
             </w:rPr>
           </w:pPr>
-          <w:hyperlink w:anchor="_Toc244271111" w:history="1">
+          <w:hyperlink w:anchor="_Toc244271763" w:history="1">
             <w:r>
               <w:rPr>
                 <w:rStyle w:val="Collegamentoipertestuale"/>
@@ -4675,7 +4675,7 @@
               <w:rPr>
                 <w:noProof/>
               </w:rPr>
-              <w:instrText xml:space="preserve"> PAGEREF _Toc244271111 \h </w:instrText>
+              <w:instrText xml:space="preserve"> PAGEREF _Toc244271763 \h </w:instrText>
             </w:r>
             <w:r>
               <w:rPr>
@@ -4717,7 +4717,7 @@
               <w14:ligatures w14:val="standardContextual"/>
             </w:rPr>
           </w:pPr>
-          <w:hyperlink w:anchor="_Toc244271112" w:history="1">
+          <w:hyperlink w:anchor="_Toc244271764" w:history="1">
             <w:r>
               <w:rPr>
                 <w:rStyle w:val="Collegamentoipertestuale"/>
@@ -4741,7 +4741,7 @@
               <w:rPr>
                 <w:noProof/>
               </w:rPr>
-              <w:instrText xml:space="preserve"> PAGEREF _Toc244271112 \h </w:instrText>
+              <w:instrText xml:space="preserve"> PAGEREF _Toc244271764 \h </w:instrText>
             </w:r>
             <w:r>
               <w:rPr>
@@ -4783,7 +4783,7 @@
               <w14:ligatures w14:val="standardContextual"/>
             </w:rPr>
           </w:pPr>
-          <w:hyperlink w:anchor="_Toc244271113" w:history="1">
+          <w:hyperlink w:anchor="_Toc244271765" w:history="1">
             <w:r>
               <w:rPr>
                 <w:rStyle w:val="Collegamentoipertestuale"/>
@@ -4807,7 +4807,7 @@
               <w:rPr>
                 <w:noProof/>
               </w:rPr>
-              <w:instrText xml:space="preserve"> PAGEREF _Toc244271113 \h </w:instrText>
+              <w:instrText xml:space="preserve"> PAGEREF _Toc244271765 \h </w:instrText>
             </w:r>
             <w:r>
               <w:rPr>
@@ -4849,7 +4849,7 @@
               <w14:ligatures w14:val="standardContextual"/>
             </w:rPr>
           </w:pPr>
-          <w:hyperlink w:anchor="_Toc244271114" w:history="1">
+          <w:hyperlink w:anchor="_Toc244271766" w:history="1">
             <w:r>
               <w:rPr>
                 <w:rStyle w:val="Collegamentoipertestuale"/>
@@ -4873,7 +4873,7 @@
               <w:rPr>
                 <w:noProof/>
               </w:rPr>
-              <w:instrText xml:space="preserve"> PAGEREF _Toc244271114 \h </w:instrText>
+              <w:instrText xml:space="preserve"> PAGEREF _Toc244271766 \h </w:instrText>
             </w:r>
             <w:r>
               <w:rPr>
@@ -4915,7 +4915,7 @@
               <w14:ligatures w14:val="standardContextual"/>
             </w:rPr>
           </w:pPr>
-          <w:hyperlink w:anchor="_Toc244271115" w:history="1">
+          <w:hyperlink w:anchor="_Toc244271767" w:history="1">
             <w:r>
               <w:rPr>
                 <w:rStyle w:val="Collegamentoipertestuale"/>
@@ -4939,7 +4939,7 @@
               <w:rPr>
                 <w:noProof/>
               </w:rPr>
-              <w:instrText xml:space="preserve"> PAGEREF _Toc244271115 \h </w:instrText>
+              <w:instrText xml:space="preserve"> PAGEREF _Toc244271767 \h </w:instrText>
             </w:r>
             <w:r>
               <w:rPr>
@@ -4982,7 +4982,7 @@
       <w:pPr>
         <w:pStyle w:val="Titolo1"/>
       </w:pPr>
-      <w:bookmarkStart w:id="0" w:name="_Toc244271043"/>
+      <w:bookmarkStart w:id="0" w:name="_Toc244271695"/>
       <w:r>
         <w:t>1. In breve</w:t>
       </w:r>
@@ -5573,7 +5573,7 @@
       <w:pPr>
         <w:pStyle w:val="Titolo1"/>
       </w:pPr>
-      <w:bookmarkStart w:id="1" w:name="_Toc244271044"/>
+      <w:bookmarkStart w:id="1" w:name="_Toc244271696"/>
       <w:r>
         <w:t>2. Nuovo marchio</w:t>
       </w:r>
@@ -5583,7 +5583,7 @@
       <w:pPr>
         <w:pStyle w:val="Titolo2"/>
       </w:pPr>
-      <w:bookmarkStart w:id="2" w:name="_Toc244271045"/>
+      <w:bookmarkStart w:id="2" w:name="_Toc244271697"/>
       <w:r>
         <w:t>2.1 Nomi e identificativi</w:t>
       </w:r>
@@ -6129,7 +6129,7 @@
       <w:pPr>
         <w:pStyle w:val="Titolo2"/>
       </w:pPr>
-      <w:bookmarkStart w:id="3" w:name="_Toc244271046"/>
+      <w:bookmarkStart w:id="3" w:name="_Toc244271698"/>
       <w:r>
         <w:t>2.2 Colori</w:t>
       </w:r>
@@ -6524,7 +6524,7 @@
       <w:pPr>
         <w:pStyle w:val="Titolo2"/>
       </w:pPr>
-      <w:bookmarkStart w:id="4" w:name="_Toc244271047"/>
+      <w:bookmarkStart w:id="4" w:name="_Toc244271699"/>
       <w:r>
         <w:t>2.3 Icona in uso: 24 «Foglio senza fondo» (serie 6, 22 ottobre)</w:t>
       </w:r>
@@ -6558,7 +6558,7 @@
           <w:noProof/>
         </w:rPr>
         <w:drawing>
-          <wp:inline distT="0" distB="0" distL="0" distR="0" wp14:anchorId="502A55D8" wp14:editId="032C1737">
+          <wp:inline distT="0" distB="0" distL="0" distR="0" wp14:anchorId="169572BA" wp14:editId="7E5F0090">
             <wp:extent cx="3429000" cy="4000500"/>
             <wp:effectExtent l="0" t="0" r="0" b="0"/>
             <wp:docPr id="2" name="Immagine 2"/>
@@ -6617,7 +6617,7 @@
       <w:pPr>
         <w:pStyle w:val="Titolo2"/>
       </w:pPr>
-      <w:bookmarkStart w:id="5" w:name="_Toc244271048"/>
+      <w:bookmarkStart w:id="5" w:name="_Toc244271700"/>
       <w:r>
         <w:t>2.4 Serie 4: la 17 «Foglio oro», in uso fino al 21 ottobre</w:t>
       </w:r>
@@ -6651,7 +6651,7 @@
           <w:noProof/>
         </w:rPr>
         <w:drawing>
-          <wp:inline distT="0" distB="0" distL="0" distR="0" wp14:anchorId="4D8340FE" wp14:editId="3F6129F7">
+          <wp:inline distT="0" distB="0" distL="0" distR="0" wp14:anchorId="1DA5A0F5" wp14:editId="761C883B">
             <wp:extent cx="5334000" cy="5895975"/>
             <wp:effectExtent l="0" t="0" r="0" b="0"/>
             <wp:docPr id="3" name="Immagine 3"/>
@@ -7064,7 +7064,7 @@
       <w:pPr>
         <w:pStyle w:val="Titolo2"/>
       </w:pPr>
-      <w:bookmarkStart w:id="6" w:name="_Toc244271049"/>
+      <w:bookmarkStart w:id="6" w:name="_Toc244271701"/>
       <w:r>
         <w:t>2.5 Serie 5: la 17 con più bianco, la 19 in uso il 21 ottobre</w:t>
       </w:r>
@@ -7098,7 +7098,7 @@
           <w:noProof/>
         </w:rPr>
         <w:drawing>
-          <wp:inline distT="0" distB="0" distL="0" distR="0" wp14:anchorId="0D93C379" wp14:editId="78BEAB28">
+          <wp:inline distT="0" distB="0" distL="0" distR="0" wp14:anchorId="3FA3263C" wp14:editId="70FEADBA">
             <wp:extent cx="5715000" cy="3295650"/>
             <wp:effectExtent l="0" t="0" r="0" b="0"/>
             <wp:docPr id="4" name="Immagine 4"/>
@@ -7645,7 +7645,7 @@
       <w:pPr>
         <w:pStyle w:val="Titolo2"/>
       </w:pPr>
-      <w:bookmarkStart w:id="7" w:name="_Toc244271050"/>
+      <w:bookmarkStart w:id="7" w:name="_Toc244271702"/>
       <w:r>
         <w:t>2.6 Serie 3, non scelta (la 11 è diventata la serie 4)</w:t>
       </w:r>
@@ -7669,7 +7669,7 @@
           <w:noProof/>
         </w:rPr>
         <w:drawing>
-          <wp:inline distT="0" distB="0" distL="0" distR="0" wp14:anchorId="45B91232" wp14:editId="67FBDAF5">
+          <wp:inline distT="0" distB="0" distL="0" distR="0" wp14:anchorId="755BA1EB" wp14:editId="575F9D32">
             <wp:extent cx="5905500" cy="4133850"/>
             <wp:effectExtent l="0" t="0" r="0" b="0"/>
             <wp:docPr id="5" name="Immagine 5"/>
@@ -8355,7 +8355,7 @@
       <w:pPr>
         <w:pStyle w:val="Titolo2"/>
       </w:pPr>
-      <w:bookmarkStart w:id="8" w:name="_Toc244271051"/>
+      <w:bookmarkStart w:id="8" w:name="_Toc244271703"/>
       <w:r>
         <w:t>2.7 Serie 2, non scelta</w:t>
       </w:r>
@@ -8379,7 +8379,7 @@
           <w:noProof/>
         </w:rPr>
         <w:drawing>
-          <wp:inline distT="0" distB="0" distL="0" distR="0" wp14:anchorId="440BDE31" wp14:editId="1657DAF1">
+          <wp:inline distT="0" distB="0" distL="0" distR="0" wp14:anchorId="0A1E6581" wp14:editId="4B28AD46">
             <wp:extent cx="5905500" cy="4133850"/>
             <wp:effectExtent l="0" t="0" r="0" b="0"/>
             <wp:docPr id="6" name="Immagine 6"/>
@@ -9099,7 +9099,7 @@
       <w:pPr>
         <w:pStyle w:val="Titolo2"/>
       </w:pPr>
-      <w:bookmarkStart w:id="9" w:name="_Toc244271052"/>
+      <w:bookmarkStart w:id="9" w:name="_Toc244271704"/>
       <w:r>
         <w:t>2.8 Serie 1, scartata</w:t>
       </w:r>
@@ -9123,7 +9123,7 @@
           <w:noProof/>
         </w:rPr>
         <w:drawing>
-          <wp:inline distT="0" distB="0" distL="0" distR="0" wp14:anchorId="4376FA8F" wp14:editId="467723D4">
+          <wp:inline distT="0" distB="0" distL="0" distR="0" wp14:anchorId="728C4519" wp14:editId="0A43B4CA">
             <wp:extent cx="4000500" cy="2800350"/>
             <wp:effectExtent l="0" t="0" r="0" b="0"/>
             <wp:docPr id="7" name="Immagine 7"/>
@@ -9182,7 +9182,7 @@
       <w:pPr>
         <w:pStyle w:val="Titolo2"/>
       </w:pPr>
-      <w:bookmarkStart w:id="10" w:name="_Toc244271053"/>
+      <w:bookmarkStart w:id="10" w:name="_Toc244271705"/>
       <w:r>
         <w:t>2.9 Verifica dei marchi registrati</w:t>
       </w:r>
@@ -9434,7 +9434,7 @@
       <w:pPr>
         <w:pStyle w:val="Titolo1"/>
       </w:pPr>
-      <w:bookmarkStart w:id="11" w:name="_Toc244271054"/>
+      <w:bookmarkStart w:id="11" w:name="_Toc244271706"/>
       <w:r>
         <w:t>3. Temi colore</w:t>
       </w:r>
@@ -9468,7 +9468,7 @@
           <w:noProof/>
         </w:rPr>
         <w:drawing>
-          <wp:inline distT="0" distB="0" distL="0" distR="0" wp14:anchorId="63A65AB9" wp14:editId="7FF35BD2">
+          <wp:inline distT="0" distB="0" distL="0" distR="0" wp14:anchorId="627B61A7" wp14:editId="325E2D51">
             <wp:extent cx="4572000" cy="3429000"/>
             <wp:effectExtent l="0" t="0" r="0" b="0"/>
             <wp:docPr id="8" name="Immagine 8"/>
@@ -10178,7 +10178,7 @@
       <w:pPr>
         <w:pStyle w:val="Titolo1"/>
       </w:pPr>
-      <w:bookmarkStart w:id="12" w:name="_Toc244271055"/>
+      <w:bookmarkStart w:id="12" w:name="_Toc244271707"/>
       <w:r>
         <w:t>4. Correzione: avvisi «come JavaScript»</w:t>
       </w:r>
@@ -10188,7 +10188,7 @@
       <w:pPr>
         <w:pStyle w:val="Titolo2"/>
       </w:pPr>
-      <w:bookmarkStart w:id="13" w:name="_Toc244271056"/>
+      <w:bookmarkStart w:id="13" w:name="_Toc244271708"/>
       <w:r>
         <w:t>4.1 Il problema</w:t>
       </w:r>
@@ -10591,7 +10591,7 @@
       <w:pPr>
         <w:pStyle w:val="Titolo2"/>
       </w:pPr>
-      <w:bookmarkStart w:id="14" w:name="_Toc244271057"/>
+      <w:bookmarkStart w:id="14" w:name="_Toc244271709"/>
       <w:r>
         <w:t>4.2 La soluzione</w:t>
       </w:r>
@@ -10724,7 +10724,7 @@
           <w:noProof/>
         </w:rPr>
         <w:drawing>
-          <wp:inline distT="0" distB="0" distL="0" distR="0" wp14:anchorId="361687B8" wp14:editId="19615E36">
+          <wp:inline distT="0" distB="0" distL="0" distR="0" wp14:anchorId="61FD5A9C" wp14:editId="4F89F8E0">
             <wp:extent cx="4572000" cy="3429000"/>
             <wp:effectExtent l="0" t="0" r="0" b="0"/>
             <wp:docPr id="9" name="Immagine 9"/>
@@ -10783,7 +10783,7 @@
       <w:pPr>
         <w:pStyle w:val="Titolo2"/>
       </w:pPr>
-      <w:bookmarkStart w:id="15" w:name="_Toc244271058"/>
+      <w:bookmarkStart w:id="15" w:name="_Toc244271710"/>
       <w:r>
         <w:t>4.3 Verifiche</w:t>
       </w:r>
@@ -10830,7 +10830,7 @@
       <w:pPr>
         <w:pStyle w:val="Titolo2"/>
       </w:pPr>
-      <w:bookmarkStart w:id="16" w:name="_Toc244271059"/>
+      <w:bookmarkStart w:id="16" w:name="_Toc244271711"/>
       <w:r>
         <w:t>4.4 Android: menu Tema e notifiche (versione 1.0.1)</w:t>
       </w:r>
@@ -11165,7 +11165,7 @@
       <w:pPr>
         <w:pStyle w:val="Titolo2"/>
       </w:pPr>
-      <w:bookmarkStart w:id="17" w:name="_Toc244271060"/>
+      <w:bookmarkStart w:id="17" w:name="_Toc244271712"/>
       <w:r>
         <w:t>4.5 App più leggera: traduzione tolta</w:t>
       </w:r>
@@ -11598,7 +11598,7 @@
       <w:pPr>
         <w:pStyle w:val="Titolo2"/>
       </w:pPr>
-      <w:bookmarkStart w:id="18" w:name="_Toc244271061"/>
+      <w:bookmarkStart w:id="18" w:name="_Toc244271713"/>
       <w:r>
         <w:t>4.6 Schede in una nuova finestra</w:t>
       </w:r>
@@ -11716,7 +11716,7 @@
           <w:noProof/>
         </w:rPr>
         <w:drawing>
-          <wp:inline distT="0" distB="0" distL="0" distR="0" wp14:anchorId="4767F237" wp14:editId="79C41573">
+          <wp:inline distT="0" distB="0" distL="0" distR="0" wp14:anchorId="7B1D79EB" wp14:editId="34DB36B1">
             <wp:extent cx="5715000" cy="857250"/>
             <wp:effectExtent l="0" t="0" r="0" b="0"/>
             <wp:docPr id="10" name="Immagine 10"/>
@@ -12005,7 +12005,7 @@
       <w:pPr>
         <w:pStyle w:val="Titolo2"/>
       </w:pPr>
-      <w:bookmarkStart w:id="19" w:name="_Toc244271062"/>
+      <w:bookmarkStart w:id="19" w:name="_Toc244271714"/>
       <w:r>
         <w:t>4.7 Riunire le finestre</w:t>
       </w:r>
@@ -12107,7 +12107,7 @@
       <w:pPr>
         <w:pStyle w:val="Titolo2"/>
       </w:pPr>
-      <w:bookmarkStart w:id="20" w:name="_Toc244271063"/>
+      <w:bookmarkStart w:id="20" w:name="_Toc244271715"/>
       <w:r>
         <w:t>4.8 Correzioni di «Modifica testo»</w:t>
       </w:r>
@@ -12372,7 +12372,7 @@
           <w:noProof/>
         </w:rPr>
         <w:drawing>
-          <wp:inline distT="0" distB="0" distL="0" distR="0" wp14:anchorId="7277C513" wp14:editId="77D0641B">
+          <wp:inline distT="0" distB="0" distL="0" distR="0" wp14:anchorId="58CDE3C4" wp14:editId="6DA7AA45">
             <wp:extent cx="3286125" cy="2286000"/>
             <wp:effectExtent l="0" t="0" r="0" b="0"/>
             <wp:docPr id="11" name="Immagine 11"/>
@@ -12437,7 +12437,7 @@
           <w:noProof/>
         </w:rPr>
         <w:drawing>
-          <wp:inline distT="0" distB="0" distL="0" distR="0" wp14:anchorId="109D69E8" wp14:editId="01F493C5">
+          <wp:inline distT="0" distB="0" distL="0" distR="0" wp14:anchorId="543C11A0" wp14:editId="1F7D0B02">
             <wp:extent cx="3286125" cy="2286000"/>
             <wp:effectExtent l="0" t="0" r="0" b="0"/>
             <wp:docPr id="12" name="Immagine 12"/>
@@ -12504,7 +12504,7 @@
       <w:pPr>
         <w:pStyle w:val="Titolo2"/>
       </w:pPr>
-      <w:bookmarkStart w:id="21" w:name="_Toc244271064"/>
+      <w:bookmarkStart w:id="21" w:name="_Toc244271716"/>
       <w:r>
         <w:t>4.9 Web app per iPhone</w:t>
       </w:r>
@@ -12943,7 +12943,7 @@
       <w:pPr>
         <w:pStyle w:val="Titolo2"/>
       </w:pPr>
-      <w:bookmarkStart w:id="22" w:name="_Toc244271065"/>
+      <w:bookmarkStart w:id="22" w:name="_Toc244271717"/>
       <w:r>
         <w:t>4.10 Aggiornamenti su Cloudflare (repository privato)</w:t>
       </w:r>
@@ -13457,7 +13457,7 @@
       <w:pPr>
         <w:pStyle w:val="Titolo2"/>
       </w:pPr>
-      <w:bookmarkStart w:id="23" w:name="_Toc244271066"/>
+      <w:bookmarkStart w:id="23" w:name="_Toc244271718"/>
       <w:r>
         <w:t>4.11 Eliminare firme, timbri e testi già applicati (versione 1.4.0)</w:t>
       </w:r>
@@ -13788,7 +13788,7 @@
           <w:noProof/>
         </w:rPr>
         <w:drawing>
-          <wp:inline distT="0" distB="0" distL="0" distR="0" wp14:anchorId="1ED59FAB" wp14:editId="045B3852">
+          <wp:inline distT="0" distB="0" distL="0" distR="0" wp14:anchorId="1B1C0413" wp14:editId="1CD51729">
             <wp:extent cx="2095500" cy="4533900"/>
             <wp:effectExtent l="0" t="0" r="0" b="0"/>
             <wp:docPr id="13" name="Immagine 13"/>
@@ -13885,7 +13885,7 @@
       <w:pPr>
         <w:pStyle w:val="Titolo2"/>
       </w:pPr>
-      <w:bookmarkStart w:id="24" w:name="_Toc244271067"/>
+      <w:bookmarkStart w:id="24" w:name="_Toc244271719"/>
       <w:r>
         <w:t>4.12 Telefono: pannello più grande e caselle di testo comode (versione 1.4.0)</w:t>
       </w:r>
@@ -13953,7 +13953,7 @@
           <w:noProof/>
         </w:rPr>
         <w:drawing>
-          <wp:inline distT="0" distB="0" distL="0" distR="0" wp14:anchorId="3A8C5A10" wp14:editId="3567DB19">
+          <wp:inline distT="0" distB="0" distL="0" distR="0" wp14:anchorId="35E63399" wp14:editId="5B5634CB">
             <wp:extent cx="2095500" cy="4533900"/>
             <wp:effectExtent l="0" t="0" r="0" b="0"/>
             <wp:docPr id="14" name="Immagine 14"/>
@@ -14018,7 +14018,7 @@
           <w:noProof/>
         </w:rPr>
         <w:drawing>
-          <wp:inline distT="0" distB="0" distL="0" distR="0" wp14:anchorId="6C4D2C44" wp14:editId="67A812E7">
+          <wp:inline distT="0" distB="0" distL="0" distR="0" wp14:anchorId="15344323" wp14:editId="11006511">
             <wp:extent cx="2095500" cy="4533900"/>
             <wp:effectExtent l="0" t="0" r="0" b="0"/>
             <wp:docPr id="15" name="Immagine 15"/>
@@ -14077,7 +14077,7 @@
       <w:pPr>
         <w:pStyle w:val="Titolo2"/>
       </w:pPr>
-      <w:bookmarkStart w:id="25" w:name="_Toc244271068"/>
+      <w:bookmarkStart w:id="25" w:name="_Toc244271720"/>
       <w:r>
         <w:t>4.13 Spostare firme, timbri e testi già applicati (versione 1.5.0)</w:t>
       </w:r>
@@ -14129,7 +14129,7 @@
           <w:noProof/>
         </w:rPr>
         <w:drawing>
-          <wp:inline distT="0" distB="0" distL="0" distR="0" wp14:anchorId="35EA1ED5" wp14:editId="71AD8EF8">
+          <wp:inline distT="0" distB="0" distL="0" distR="0" wp14:anchorId="5731FE5D" wp14:editId="33F810AD">
             <wp:extent cx="4953000" cy="3095625"/>
             <wp:effectExtent l="0" t="0" r="0" b="0"/>
             <wp:docPr id="16" name="Immagine 16"/>
@@ -14188,7 +14188,7 @@
       <w:pPr>
         <w:pStyle w:val="Titolo2"/>
       </w:pPr>
-      <w:bookmarkStart w:id="26" w:name="_Toc244271069"/>
+      <w:bookmarkStart w:id="26" w:name="_Toc244271721"/>
       <w:r>
         <w:t>4.14 Modi di lettura e presentazione (versione 1.5.0)</w:t>
       </w:r>
@@ -14325,7 +14325,7 @@
           <w:noProof/>
         </w:rPr>
         <w:drawing>
-          <wp:inline distT="0" distB="0" distL="0" distR="0" wp14:anchorId="2A52A5C6" wp14:editId="3FAE6323">
+          <wp:inline distT="0" distB="0" distL="0" distR="0" wp14:anchorId="4EA47CFC" wp14:editId="175BBBF9">
             <wp:extent cx="4953000" cy="3095625"/>
             <wp:effectExtent l="0" t="0" r="0" b="0"/>
             <wp:docPr id="17" name="Immagine 17"/>
@@ -14390,7 +14390,7 @@
           <w:noProof/>
         </w:rPr>
         <w:drawing>
-          <wp:inline distT="0" distB="0" distL="0" distR="0" wp14:anchorId="201E1720" wp14:editId="3D69DF32">
+          <wp:inline distT="0" distB="0" distL="0" distR="0" wp14:anchorId="3546EC91" wp14:editId="7CEE377C">
             <wp:extent cx="1905000" cy="4124325"/>
             <wp:effectExtent l="0" t="0" r="0" b="0"/>
             <wp:docPr id="18" name="Immagine 18"/>
@@ -14449,7 +14449,7 @@
       <w:pPr>
         <w:pStyle w:val="Titolo2"/>
       </w:pPr>
-      <w:bookmarkStart w:id="27" w:name="_Toc244271070"/>
+      <w:bookmarkStart w:id="27" w:name="_Toc244271722"/>
       <w:r>
         <w:t>4.15 Correzione: immagini sulle pagine ruotate (versione 1.5.0)</w:t>
       </w:r>
@@ -14477,7 +14477,7 @@
       <w:pPr>
         <w:pStyle w:val="Titolo2"/>
       </w:pPr>
-      <w:bookmarkStart w:id="28" w:name="_Toc244271071"/>
+      <w:bookmarkStart w:id="28" w:name="_Toc244271723"/>
       <w:r>
         <w:t>4.16 Niente più «Applica» (versione 1.6.0)</w:t>
       </w:r>
@@ -14521,7 +14521,7 @@
           <w:noProof/>
         </w:rPr>
         <w:drawing>
-          <wp:inline distT="0" distB="0" distL="0" distR="0" wp14:anchorId="21A46053" wp14:editId="3A101DDB">
+          <wp:inline distT="0" distB="0" distL="0" distR="0" wp14:anchorId="59D394D2" wp14:editId="25011109">
             <wp:extent cx="4953000" cy="3095625"/>
             <wp:effectExtent l="0" t="0" r="0" b="0"/>
             <wp:docPr id="19" name="Immagine 19"/>
@@ -14580,7 +14580,7 @@
       <w:pPr>
         <w:pStyle w:val="Titolo2"/>
       </w:pPr>
-      <w:bookmarkStart w:id="29" w:name="_Toc244271072"/>
+      <w:bookmarkStart w:id="29" w:name="_Toc244271724"/>
       <w:r>
         <w:t>4.17 Schermata «Cosa vuoi fare?» (versione 1.6.0)</w:t>
       </w:r>
@@ -14614,7 +14614,7 @@
           <w:noProof/>
         </w:rPr>
         <w:drawing>
-          <wp:inline distT="0" distB="0" distL="0" distR="0" wp14:anchorId="17561BE6" wp14:editId="5D790904">
+          <wp:inline distT="0" distB="0" distL="0" distR="0" wp14:anchorId="34F74A75" wp14:editId="0DF02939">
             <wp:extent cx="4953000" cy="3095625"/>
             <wp:effectExtent l="0" t="0" r="0" b="0"/>
             <wp:docPr id="20" name="Immagine 20"/>
@@ -14673,7 +14673,7 @@
       <w:pPr>
         <w:pStyle w:val="Titolo2"/>
       </w:pPr>
-      <w:bookmarkStart w:id="30" w:name="_Toc244271073"/>
+      <w:bookmarkStart w:id="30" w:name="_Toc244271725"/>
       <w:r>
         <w:t>4.18 Modalità Semplice e Completa (versione 1.6.0)</w:t>
       </w:r>
@@ -14717,7 +14717,7 @@
           <w:noProof/>
         </w:rPr>
         <w:drawing>
-          <wp:inline distT="0" distB="0" distL="0" distR="0" wp14:anchorId="075BBCB7" wp14:editId="65637F49">
+          <wp:inline distT="0" distB="0" distL="0" distR="0" wp14:anchorId="516A2475" wp14:editId="7005718B">
             <wp:extent cx="1905000" cy="4124325"/>
             <wp:effectExtent l="0" t="0" r="0" b="0"/>
             <wp:docPr id="21" name="Immagine 21"/>
@@ -14776,7 +14776,7 @@
       <w:pPr>
         <w:pStyle w:val="Titolo2"/>
       </w:pPr>
-      <w:bookmarkStart w:id="31" w:name="_Toc244271074"/>
+      <w:bookmarkStart w:id="31" w:name="_Toc244271726"/>
       <w:r>
         <w:t>4.19 Guide 1-2-3 (versione 1.6.0)</w:t>
       </w:r>
@@ -14800,7 +14800,7 @@
           <w:noProof/>
         </w:rPr>
         <w:drawing>
-          <wp:inline distT="0" distB="0" distL="0" distR="0" wp14:anchorId="35170650" wp14:editId="4F59E907">
+          <wp:inline distT="0" distB="0" distL="0" distR="0" wp14:anchorId="1BE1E7EC" wp14:editId="448AF71D">
             <wp:extent cx="4953000" cy="3095625"/>
             <wp:effectExtent l="0" t="0" r="0" b="0"/>
             <wp:docPr id="22" name="Immagine 22"/>
@@ -14865,7 +14865,7 @@
           <w:noProof/>
         </w:rPr>
         <w:drawing>
-          <wp:inline distT="0" distB="0" distL="0" distR="0" wp14:anchorId="474D93B3" wp14:editId="062811EC">
+          <wp:inline distT="0" distB="0" distL="0" distR="0" wp14:anchorId="2236FE16" wp14:editId="32BE50B5">
             <wp:extent cx="1905000" cy="4124325"/>
             <wp:effectExtent l="0" t="0" r="0" b="0"/>
             <wp:docPr id="23" name="Immagine 23"/>
@@ -14924,7 +14924,7 @@
       <w:pPr>
         <w:pStyle w:val="Titolo2"/>
       </w:pPr>
-      <w:bookmarkStart w:id="32" w:name="_Toc244271075"/>
+      <w:bookmarkStart w:id="32" w:name="_Toc244271727"/>
       <w:r>
         <w:t>4.20 Parole semplici e piccoli difetti (versione 1.6.0)</w:t>
       </w:r>
@@ -14942,7 +14942,7 @@
       <w:pPr>
         <w:pStyle w:val="Titolo2"/>
       </w:pPr>
-      <w:bookmarkStart w:id="33" w:name="_Toc244271076"/>
+      <w:bookmarkStart w:id="33" w:name="_Toc244271728"/>
       <w:r>
         <w:t>4.21 Dominio dell'autore: pdfz.agjin.com (versione 1.6.2)</w:t>
       </w:r>
@@ -14991,7 +14991,7 @@
       <w:pPr>
         <w:pStyle w:val="Titolo2"/>
       </w:pPr>
-      <w:bookmarkStart w:id="34" w:name="_Toc244271077"/>
+      <w:bookmarkStart w:id="34" w:name="_Toc244271729"/>
       <w:r>
         <w:t>4.22 Vista semplice con i pulsanti in alto (versione 1.7.0)</w:t>
       </w:r>
@@ -15060,7 +15060,7 @@
           <w:noProof/>
         </w:rPr>
         <w:drawing>
-          <wp:inline distT="0" distB="0" distL="0" distR="0" wp14:anchorId="4A4440AF" wp14:editId="37724B06">
+          <wp:inline distT="0" distB="0" distL="0" distR="0" wp14:anchorId="4A2B0ADE" wp14:editId="704CBBB0">
             <wp:extent cx="4953000" cy="3714750"/>
             <wp:effectExtent l="0" t="0" r="0" b="0"/>
             <wp:docPr id="24" name="Immagine 24"/>
@@ -15125,7 +15125,7 @@
           <w:noProof/>
         </w:rPr>
         <w:drawing>
-          <wp:inline distT="0" distB="0" distL="0" distR="0" wp14:anchorId="36B4E9AA" wp14:editId="5574F958">
+          <wp:inline distT="0" distB="0" distL="0" distR="0" wp14:anchorId="4AC9555C" wp14:editId="28DC7F2B">
             <wp:extent cx="4953000" cy="3714750"/>
             <wp:effectExtent l="0" t="0" r="0" b="0"/>
             <wp:docPr id="25" name="Immagine 25"/>
@@ -15235,7 +15235,7 @@
           <w:noProof/>
         </w:rPr>
         <w:drawing>
-          <wp:inline distT="0" distB="0" distL="0" distR="0" wp14:anchorId="038E95F7" wp14:editId="101BD4EA">
+          <wp:inline distT="0" distB="0" distL="0" distR="0" wp14:anchorId="2E0758CF" wp14:editId="6AE6BBE9">
             <wp:extent cx="4953000" cy="3714750"/>
             <wp:effectExtent l="0" t="0" r="0" b="0"/>
             <wp:docPr id="26" name="Immagine 26"/>
@@ -15300,7 +15300,7 @@
           <w:noProof/>
         </w:rPr>
         <w:drawing>
-          <wp:inline distT="0" distB="0" distL="0" distR="0" wp14:anchorId="16C3C09E" wp14:editId="6EC13C4C">
+          <wp:inline distT="0" distB="0" distL="0" distR="0" wp14:anchorId="30C3DB1F" wp14:editId="64BA094E">
             <wp:extent cx="1905000" cy="4124325"/>
             <wp:effectExtent l="0" t="0" r="0" b="0"/>
             <wp:docPr id="27" name="Immagine 27"/>
@@ -15359,7 +15359,7 @@
       <w:pPr>
         <w:pStyle w:val="Titolo2"/>
       </w:pPr>
-      <w:bookmarkStart w:id="35" w:name="_Toc244271078"/>
+      <w:bookmarkStart w:id="35" w:name="_Toc244271730"/>
       <w:r>
         <w:t>4.23 Android, giro da utente e ottimizzazioni (versione 1.7.1)</w:t>
       </w:r>
@@ -15393,7 +15393,7 @@
           <w:noProof/>
         </w:rPr>
         <w:drawing>
-          <wp:inline distT="0" distB="0" distL="0" distR="0" wp14:anchorId="063313B8" wp14:editId="708820BB">
+          <wp:inline distT="0" distB="0" distL="0" distR="0" wp14:anchorId="5003D565" wp14:editId="3E1E5849">
             <wp:extent cx="1905000" cy="4124325"/>
             <wp:effectExtent l="0" t="0" r="0" b="0"/>
             <wp:docPr id="28" name="Immagine 28"/>
@@ -15476,7 +15476,7 @@
           <w:noProof/>
         </w:rPr>
         <w:drawing>
-          <wp:inline distT="0" distB="0" distL="0" distR="0" wp14:anchorId="315C8A30" wp14:editId="462E2EC6">
+          <wp:inline distT="0" distB="0" distL="0" distR="0" wp14:anchorId="2D2DC522" wp14:editId="4FF0704F">
             <wp:extent cx="1905000" cy="4124325"/>
             <wp:effectExtent l="0" t="0" r="0" b="0"/>
             <wp:docPr id="29" name="Immagine 29"/>
@@ -15569,7 +15569,7 @@
       <w:pPr>
         <w:pStyle w:val="Titolo1"/>
       </w:pPr>
-      <w:bookmarkStart w:id="36" w:name="_Toc244271079"/>
+      <w:bookmarkStart w:id="36" w:name="_Toc244271731"/>
       <w:r>
         <w:t>5. Decisioni</w:t>
       </w:r>
@@ -15587,7 +15587,7 @@
       <w:pPr>
         <w:pStyle w:val="Titolo2"/>
       </w:pPr>
-      <w:bookmarkStart w:id="37" w:name="_Toc244271080"/>
+      <w:bookmarkStart w:id="37" w:name="_Toc244271732"/>
       <w:r>
         <w:t>5.1 Canale degli aggiornamenti</w:t>
       </w:r>
@@ -16094,7 +16094,7 @@
       <w:pPr>
         <w:pStyle w:val="Titolo2"/>
       </w:pPr>
-      <w:bookmarkStart w:id="38" w:name="_Toc244271081"/>
+      <w:bookmarkStart w:id="38" w:name="_Toc244271733"/>
       <w:r>
         <w:t>5.2 Storia del repository</w:t>
       </w:r>
@@ -16601,7 +16601,7 @@
       <w:pPr>
         <w:pStyle w:val="Titolo2"/>
       </w:pPr>
-      <w:bookmarkStart w:id="39" w:name="_Toc244271082"/>
+      <w:bookmarkStart w:id="39" w:name="_Toc244271734"/>
       <w:r>
         <w:t>5.3 Identificativi del prodotto</w:t>
       </w:r>
@@ -17101,7 +17101,7 @@
       <w:pPr>
         <w:pStyle w:val="Titolo2"/>
       </w:pPr>
-      <w:bookmarkStart w:id="40" w:name="_Toc244271083"/>
+      <w:bookmarkStart w:id="40" w:name="_Toc244271735"/>
       <w:r>
         <w:t>5.4 Avvisi e domande</w:t>
       </w:r>
@@ -17608,7 +17608,7 @@
       <w:pPr>
         <w:pStyle w:val="Titolo2"/>
       </w:pPr>
-      <w:bookmarkStart w:id="41" w:name="_Toc244271084"/>
+      <w:bookmarkStart w:id="41" w:name="_Toc244271736"/>
       <w:r>
         <w:t>5.5 Traduzione offline</w:t>
       </w:r>
@@ -18115,7 +18115,7 @@
       <w:pPr>
         <w:pStyle w:val="Titolo2"/>
       </w:pPr>
-      <w:bookmarkStart w:id="42" w:name="_Toc244271085"/>
+      <w:bookmarkStart w:id="42" w:name="_Toc244271737"/>
       <w:r>
         <w:t>5.6 Passaggio della scheda alla nuova finestra</w:t>
       </w:r>
@@ -18637,7 +18637,7 @@
       <w:pPr>
         <w:pStyle w:val="Titolo2"/>
       </w:pPr>
-      <w:bookmarkStart w:id="43" w:name="_Toc244271086"/>
+      <w:bookmarkStart w:id="43" w:name="_Toc244271738"/>
       <w:r>
         <w:t>5.7 Come si cancella la riga in «Modifica testo»</w:t>
       </w:r>
@@ -19144,7 +19144,7 @@
       <w:pPr>
         <w:pStyle w:val="Titolo2"/>
       </w:pPr>
-      <w:bookmarkStart w:id="44" w:name="_Toc244271087"/>
+      <w:bookmarkStart w:id="44" w:name="_Toc244271739"/>
       <w:r>
         <w:t>5.9 Lettura a libro e presentazione</w:t>
       </w:r>
@@ -19651,7 +19651,7 @@
       <w:pPr>
         <w:pStyle w:val="Titolo2"/>
       </w:pPr>
-      <w:bookmarkStart w:id="45" w:name="_Toc244271088"/>
+      <w:bookmarkStart w:id="45" w:name="_Toc244271740"/>
       <w:r>
         <w:t>5.8 Come si ritrovano firme e timbri applicati</w:t>
       </w:r>
@@ -20188,7 +20188,7 @@
       <w:pPr>
         <w:pStyle w:val="Titolo1"/>
       </w:pPr>
-      <w:bookmarkStart w:id="46" w:name="_Toc244271089"/>
+      <w:bookmarkStart w:id="46" w:name="_Toc244271741"/>
       <w:r>
         <w:t>6. Come si lavora</w:t>
       </w:r>
@@ -20198,7 +20198,7 @@
       <w:pPr>
         <w:pStyle w:val="Titolo2"/>
       </w:pPr>
-      <w:bookmarkStart w:id="47" w:name="_Toc244271090"/>
+      <w:bookmarkStart w:id="47" w:name="_Toc244271742"/>
       <w:r>
         <w:t>6.1 Comandi</w:t>
       </w:r>
@@ -20268,7 +20268,7 @@
       <w:pPr>
         <w:pStyle w:val="Titolo2"/>
       </w:pPr>
-      <w:bookmarkStart w:id="48" w:name="_Toc244271091"/>
+      <w:bookmarkStart w:id="48" w:name="_Toc244271743"/>
       <w:r>
         <w:t>6.2 Pubblicare una versione</w:t>
       </w:r>
@@ -20396,7 +20396,7 @@
       <w:pPr>
         <w:pStyle w:val="Titolo2"/>
       </w:pPr>
-      <w:bookmarkStart w:id="49" w:name="_Toc244271092"/>
+      <w:bookmarkStart w:id="49" w:name="_Toc244271744"/>
       <w:r>
         <w:t>6.3 Release 1.0.0 (pubblicata il 16 ottobre 2026)</w:t>
       </w:r>
@@ -21123,7 +21123,7 @@
       <w:pPr>
         <w:pStyle w:val="Titolo2"/>
       </w:pPr>
-      <w:bookmarkStart w:id="50" w:name="_Toc244271093"/>
+      <w:bookmarkStart w:id="50" w:name="_Toc244271745"/>
       <w:r>
         <w:t>6.4 Release 1.0.1</w:t>
       </w:r>
@@ -21420,7 +21420,7 @@
       <w:pPr>
         <w:pStyle w:val="Titolo2"/>
       </w:pPr>
-      <w:bookmarkStart w:id="51" w:name="_Toc244271094"/>
+      <w:bookmarkStart w:id="51" w:name="_Toc244271746"/>
       <w:r>
         <w:t>6.5 Release 1.0.2 e repository pubblico</w:t>
       </w:r>
@@ -21842,7 +21842,7 @@
       <w:pPr>
         <w:pStyle w:val="Titolo2"/>
       </w:pPr>
-      <w:bookmarkStart w:id="52" w:name="_Toc244271095"/>
+      <w:bookmarkStart w:id="52" w:name="_Toc244271747"/>
       <w:r>
         <w:t>6.6 Nuova versione: link diretto per ogni sistema</w:t>
       </w:r>
@@ -22259,7 +22259,7 @@
           <w:noProof/>
         </w:rPr>
         <w:drawing>
-          <wp:inline distT="0" distB="0" distL="0" distR="0" wp14:anchorId="74C54BE0" wp14:editId="4FFCCA6F">
+          <wp:inline distT="0" distB="0" distL="0" distR="0" wp14:anchorId="56116110" wp14:editId="73C57EE6">
             <wp:extent cx="4572000" cy="4429125"/>
             <wp:effectExtent l="0" t="0" r="0" b="0"/>
             <wp:docPr id="30" name="Immagine 30"/>
@@ -22334,7 +22334,7 @@
       <w:pPr>
         <w:pStyle w:val="Titolo2"/>
       </w:pPr>
-      <w:bookmarkStart w:id="53" w:name="_Toc244271096"/>
+      <w:bookmarkStart w:id="53" w:name="_Toc244271748"/>
       <w:r>
         <w:t>6.7 Release 1.1.0</w:t>
       </w:r>
@@ -22898,7 +22898,7 @@
       <w:pPr>
         <w:pStyle w:val="Titolo2"/>
       </w:pPr>
-      <w:bookmarkStart w:id="54" w:name="_Toc244271097"/>
+      <w:bookmarkStart w:id="54" w:name="_Toc244271749"/>
       <w:r>
         <w:t>6.8 Versione 1.2.0</w:t>
       </w:r>
@@ -23447,7 +23447,7 @@
       <w:pPr>
         <w:pStyle w:val="Titolo2"/>
       </w:pPr>
-      <w:bookmarkStart w:id="55" w:name="_Toc244271098"/>
+      <w:bookmarkStart w:id="55" w:name="_Toc244271750"/>
       <w:r>
         <w:t>6.9 Versione 1.2.1</w:t>
       </w:r>
@@ -23465,7 +23465,7 @@
       <w:pPr>
         <w:pStyle w:val="Titolo2"/>
       </w:pPr>
-      <w:bookmarkStart w:id="56" w:name="_Toc244271099"/>
+      <w:bookmarkStart w:id="56" w:name="_Toc244271751"/>
       <w:r>
         <w:t>6.10 Versione 1.3.0</w:t>
       </w:r>
@@ -23497,7 +23497,7 @@
       <w:pPr>
         <w:pStyle w:val="Titolo2"/>
       </w:pPr>
-      <w:bookmarkStart w:id="57" w:name="_Toc244271100"/>
+      <w:bookmarkStart w:id="57" w:name="_Toc244271752"/>
       <w:r>
         <w:t>6.11 Versione 1.3.1 (ponte verso Cloudflare)</w:t>
       </w:r>
@@ -23515,7 +23515,7 @@
       <w:pPr>
         <w:pStyle w:val="Titolo2"/>
       </w:pPr>
-      <w:bookmarkStart w:id="58" w:name="_Toc244271101"/>
+      <w:bookmarkStart w:id="58" w:name="_Toc244271753"/>
       <w:r>
         <w:t>6.12 Versione 1.4.0</w:t>
       </w:r>
@@ -23533,7 +23533,7 @@
       <w:pPr>
         <w:pStyle w:val="Titolo2"/>
       </w:pPr>
-      <w:bookmarkStart w:id="59" w:name="_Toc244271102"/>
+      <w:bookmarkStart w:id="59" w:name="_Toc244271754"/>
       <w:r>
         <w:t>6.13 Versione 1.5.0</w:t>
       </w:r>
@@ -23551,7 +23551,7 @@
       <w:pPr>
         <w:pStyle w:val="Titolo2"/>
       </w:pPr>
-      <w:bookmarkStart w:id="60" w:name="_Toc244271103"/>
+      <w:bookmarkStart w:id="60" w:name="_Toc244271755"/>
       <w:r>
         <w:t>6.14 Versione 1.6.0</w:t>
       </w:r>
@@ -23575,7 +23575,7 @@
       <w:pPr>
         <w:pStyle w:val="Titolo2"/>
       </w:pPr>
-      <w:bookmarkStart w:id="61" w:name="_Toc244271104"/>
+      <w:bookmarkStart w:id="61" w:name="_Toc244271756"/>
       <w:r>
         <w:t>6.15 Versione 1.6.2</w:t>
       </w:r>
@@ -23593,7 +23593,7 @@
       <w:pPr>
         <w:pStyle w:val="Titolo2"/>
       </w:pPr>
-      <w:bookmarkStart w:id="62" w:name="_Toc244271105"/>
+      <w:bookmarkStart w:id="62" w:name="_Toc244271757"/>
       <w:r>
         <w:t>6.16 Versione 1.7.0</w:t>
       </w:r>
@@ -23611,7 +23611,7 @@
       <w:pPr>
         <w:pStyle w:val="Titolo2"/>
       </w:pPr>
-      <w:bookmarkStart w:id="63" w:name="_Toc244271106"/>
+      <w:bookmarkStart w:id="63" w:name="_Toc244271758"/>
       <w:r>
         <w:t>6.17 Versione 1.7.1</w:t>
       </w:r>
@@ -23629,7 +23629,7 @@
       <w:pPr>
         <w:pStyle w:val="Titolo2"/>
       </w:pPr>
-      <w:bookmarkStart w:id="64" w:name="_Toc244271107"/>
+      <w:bookmarkStart w:id="64" w:name="_Toc244271759"/>
       <w:r>
         <w:t>6.18 Versione 1.7.2</w:t>
       </w:r>
@@ -23640,14 +23640,14 @@
         <w:spacing w:after="120"/>
       </w:pPr>
       <w:r>
-        <w:t>Preparata il 30 ottobre 2026 (installer Windows 101.7.2, Android 1001007002): DMG per Mac di nuovo presente (creato in due passi, con tentativi e il formato di prima come riserva); pulsante «chiudi» grande e ben visibile negli avvisi, nella campanella delle notifiche e nella finestra delle novità (36 px con il mouse, 46 px sugli schermi touch).</w:t>
+        <w:t>Pubblicata il 30 ottobre 2026 (release in 7 minuti, sito aggiornato dopo 9; MSI 102,5 MB invece di 131,8, DMG 112,5 MB invece di 159,8; installer Windows 101.7.2, Android 1001007002): DMG per Mac di nuovo presente (creato in due passi, con tentativi e il formato di prima come riserva); pulsante «chiudi» grande e ben visibile negli avvisi, nella campanella delle notifiche e nella finestra delle novità (36 px con il mouse, 46 px sugli schermi touch).</w:t>
       </w:r>
     </w:p>
     <w:p>
       <w:pPr>
         <w:pStyle w:val="Titolo2"/>
       </w:pPr>
-      <w:bookmarkStart w:id="65" w:name="_Toc244271108"/>
+      <w:bookmarkStart w:id="65" w:name="_Toc244271760"/>
       <w:r>
         <w:t>6.19 Ruoli</w:t>
       </w:r>
@@ -23920,7 +23920,7 @@
       <w:pPr>
         <w:pStyle w:val="Titolo1"/>
       </w:pPr>
-      <w:bookmarkStart w:id="66" w:name="_Toc244271109"/>
+      <w:bookmarkStart w:id="66" w:name="_Toc244271761"/>
       <w:r>
         <w:t>7. Sicurezza</w:t>
       </w:r>
@@ -24219,7 +24219,7 @@
       <w:pPr>
         <w:pStyle w:val="Titolo1"/>
       </w:pPr>
-      <w:bookmarkStart w:id="67" w:name="_Toc244271110"/>
+      <w:bookmarkStart w:id="67" w:name="_Toc244271762"/>
       <w:r>
         <w:t>8. Punti aperti</w:t>
       </w:r>
@@ -24508,7 +24508,7 @@
       <w:pPr>
         <w:pStyle w:val="Titolo1"/>
       </w:pPr>
-      <w:bookmarkStart w:id="68" w:name="_Toc244271111"/>
+      <w:bookmarkStart w:id="68" w:name="_Toc244271763"/>
       <w:r>
         <w:t>9. Pensato per i prossimi 10 anni</w:t>
       </w:r>
@@ -24702,7 +24702,7 @@
       <w:pPr>
         <w:pStyle w:val="Titolo1"/>
       </w:pPr>
-      <w:bookmarkStart w:id="69" w:name="_Toc244271112"/>
+      <w:bookmarkStart w:id="69" w:name="_Toc244271764"/>
       <w:r>
         <w:t>10. Facilità d'uso: analisi e proposte (30 ottobre 2026)</w:t>
       </w:r>
@@ -24790,7 +24790,7 @@
       <w:pPr>
         <w:pStyle w:val="Titolo2"/>
       </w:pPr>
-      <w:bookmarkStart w:id="70" w:name="_Toc244271113"/>
+      <w:bookmarkStart w:id="70" w:name="_Toc244271765"/>
       <w:r>
         <w:t>10.1 Opinione</w:t>
       </w:r>
@@ -25318,7 +25318,7 @@
       <w:pPr>
         <w:pStyle w:val="Titolo2"/>
       </w:pPr>
-      <w:bookmarkStart w:id="71" w:name="_Toc244271114"/>
+      <w:bookmarkStart w:id="71" w:name="_Toc244271766"/>
       <w:r>
         <w:t>10.2 Punti da migliorare</w:t>
       </w:r>
@@ -25467,7 +25467,7 @@
           <w:noProof/>
         </w:rPr>
         <w:drawing>
-          <wp:inline distT="0" distB="0" distL="0" distR="0" wp14:anchorId="2FEEDA1E" wp14:editId="793289E9">
+          <wp:inline distT="0" distB="0" distL="0" distR="0" wp14:anchorId="7AA22075" wp14:editId="38C41FB7">
             <wp:extent cx="1905000" cy="4124325"/>
             <wp:effectExtent l="0" t="0" r="0" b="0"/>
             <wp:docPr id="31" name="Immagine 31"/>
@@ -25532,7 +25532,7 @@
           <w:noProof/>
         </w:rPr>
         <w:drawing>
-          <wp:inline distT="0" distB="0" distL="0" distR="0" wp14:anchorId="22E1A7C2" wp14:editId="45ED778C">
+          <wp:inline distT="0" distB="0" distL="0" distR="0" wp14:anchorId="57018905" wp14:editId="70F260FA">
             <wp:extent cx="1905000" cy="4124325"/>
             <wp:effectExtent l="0" t="0" r="0" b="0"/>
             <wp:docPr id="32" name="Immagine 32"/>
@@ -25597,7 +25597,7 @@
           <w:noProof/>
         </w:rPr>
         <w:drawing>
-          <wp:inline distT="0" distB="0" distL="0" distR="0" wp14:anchorId="421006EF" wp14:editId="7BE6C6D4">
+          <wp:inline distT="0" distB="0" distL="0" distR="0" wp14:anchorId="1D7F40B2" wp14:editId="35E1B977">
             <wp:extent cx="4953000" cy="3095625"/>
             <wp:effectExtent l="0" t="0" r="0" b="0"/>
             <wp:docPr id="33" name="Immagine 33"/>
@@ -25656,7 +25656,7 @@
       <w:pPr>
         <w:pStyle w:val="Titolo2"/>
       </w:pPr>
-      <w:bookmarkStart w:id="72" w:name="_Toc244271115"/>
+      <w:bookmarkStart w:id="72" w:name="_Toc244271767"/>
       <w:r>
         <w:t>10.3 Cinque proposte</w:t>
       </w:r>
@@ -26536,273 +26536,273 @@
 <file path=word/numbering.xml><?xml version="1.0" encoding="utf-8"?>
 <w:numbering xmlns:wpc="http://schemas.microsoft.com/office/word/2010/wordprocessingCanvas" xmlns:cx="http://schemas.microsoft.com/office/drawing/2014/chartex" xmlns:cx1="http://schemas.microsoft.com/office/drawing/2015/9/8/chartex" xmlns:cx2="http://schemas.microsoft.com/office/drawing/2015/10/21/chartex" xmlns:cx3="http://schemas.microsoft.com/office/drawing/2016/5/9/chartex" xmlns:cx4="http://schemas.microsoft.com/office/drawing/2016/5/10/chartex" xmlns:cx5="http://schemas.microsoft.com/office/drawing/2016/5/11/chartex" xmlns:cx6="http://schemas.microsoft.com/office/drawing/2016/5/12/chartex" xmlns:cx7="http://schemas.microsoft.com/office/drawing/2016/5/13/chartex" xmlns:cx8="http://schemas.microsoft.com/office/drawing/2016/5/14/chartex" xmlns:mc="http://schemas.openxmlformats.org/markup-compatibility/2006" xmlns:aink="http://schemas.microsoft.com/office/drawing/2016/ink" xmlns:am3d="http://schemas.microsoft.com/office/drawing/2017/model3d" xmlns:o="urn:schemas-microsoft-com:office:office" xmlns:oel="http://schemas.microsoft.com/office/2019/extlst" xmlns:r="http://schemas.openxmlformats.org/officeDocument/2006/relationships" xmlns:m="http://schemas.openxmlformats.org/officeDocument/2006/math" xmlns:v="urn:schemas-microsoft-com:vml" xmlns:wp14="http://schemas.microsoft.com/office/word/2010/wordprocessingDrawing" xmlns:wp="http://schemas.openxmlformats.org/drawingml/2006/wordprocessingDrawing" xmlns:w10="urn:schemas-microsoft-com:office:word" xmlns:w="http://schemas.openxmlformats.org/wordprocessingml/2006/main" xmlns:w14="http://schemas.microsoft.com/office/word/2010/wordml" xmlns:w15="http://schemas.microsoft.com/office/word/2012/wordml" xmlns:w16cex="http://schemas.microsoft.com/office/word/2018/wordml/cex" xmlns:w16cid="http://schemas.microsoft.com/office/word/2016/wordml/cid" xmlns:w16="http://schemas.microsoft.com/office/word/2018/wordml" xmlns:w16du="http://schemas.microsoft.com/office/word/2023/wordml/word16du" xmlns:w16sdtdh="http://schemas.microsoft.com/office/word/2020/wordml/sdtdatahash" xmlns:w16sdtfl="http://schemas.microsoft.com/office/word/2024/wordml/sdtformatlock" xmlns:w16se="http://schemas.microsoft.com/office/word/2015/wordml/symex" xmlns:wpg="http://schemas.microsoft.com/office/word/2010/wordprocessingGroup" xmlns:wpi="http://schemas.microsoft.com/office/word/2010/wordprocessingInk" xmlns:wne="http://schemas.microsoft.com/office/word/2006/wordml" xmlns:wps="http://schemas.microsoft.com/office/word/2010/wordprocessingShape" mc:Ignorable="w14 w15 w16se w16cid w16 w16cex w16sdtdh w16sdtfl w16du wp14">
   <w:abstractNum w:abstractNumId="0" w15:restartNumberingAfterBreak="0">
-    <w:nsid w:val="215D2AC8"/>
+    <w:nsid w:val="239A127A"/>
     <w:multiLevelType w:val="hybridMultilevel"/>
-    <w:tmpl w:val="DC288B0C"/>
-    <w:lvl w:ilvl="0" w:tplc="F350F850">
+    <w:tmpl w:val="64E2CEBC"/>
+    <w:lvl w:ilvl="0" w:tplc="9EB88CCE" w:tentative="1">
       <w:start w:val="1"/>
-      <w:numFmt w:val="decimal"/>
-      <w:lvlText w:val="%1."/>
+      <w:numFmt w:val="bullet"/>
+      <w:lvlText w:val="●"/>
       <w:lvlJc w:val="left"/>
       <w:pPr>
-        <w:ind w:left="540" w:hanging="300"/>
+        <w:ind w:left="720" w:hanging="360"/>
       </w:pPr>
     </w:lvl>
-    <w:lvl w:ilvl="1" w:tplc="B25E315A">
+    <w:lvl w:ilvl="1" w:tplc="4872CC9E" w:tentative="1">
+      <w:start w:val="1"/>
+      <w:numFmt w:val="bullet"/>
+      <w:lvlText w:val="○"/>
+      <w:lvlJc w:val="left"/>
+      <w:pPr>
+        <w:ind w:left="1440" w:hanging="360"/>
+      </w:pPr>
+    </w:lvl>
+    <w:lvl w:ilvl="2" w:tplc="716A4808" w:tentative="1">
+      <w:start w:val="1"/>
+      <w:numFmt w:val="bullet"/>
+      <w:lvlText w:val="■"/>
+      <w:lvlJc w:val="left"/>
+      <w:pPr>
+        <w:ind w:left="2160" w:hanging="360"/>
+      </w:pPr>
+    </w:lvl>
+    <w:lvl w:ilvl="3" w:tplc="BF187BE8" w:tentative="1">
+      <w:start w:val="1"/>
+      <w:numFmt w:val="bullet"/>
+      <w:lvlText w:val="●"/>
+      <w:lvlJc w:val="left"/>
+      <w:pPr>
+        <w:ind w:left="2880" w:hanging="360"/>
+      </w:pPr>
+    </w:lvl>
+    <w:lvl w:ilvl="4" w:tplc="D390B866" w:tentative="1">
+      <w:start w:val="1"/>
+      <w:numFmt w:val="bullet"/>
+      <w:lvlText w:val="○"/>
+      <w:lvlJc w:val="left"/>
+      <w:pPr>
+        <w:ind w:left="3600" w:hanging="360"/>
+      </w:pPr>
+    </w:lvl>
+    <w:lvl w:ilvl="5" w:tplc="C00AE7A6" w:tentative="1">
+      <w:start w:val="1"/>
+      <w:numFmt w:val="bullet"/>
+      <w:lvlText w:val="■"/>
+      <w:lvlJc w:val="left"/>
+      <w:pPr>
+        <w:ind w:left="4320" w:hanging="360"/>
+      </w:pPr>
+    </w:lvl>
+    <w:lvl w:ilvl="6" w:tplc="6624F4AA" w:tentative="1">
+      <w:start w:val="1"/>
+      <w:numFmt w:val="bullet"/>
+      <w:lvlText w:val="●"/>
+      <w:lvlJc w:val="left"/>
+      <w:pPr>
+        <w:ind w:left="5040" w:hanging="360"/>
+      </w:pPr>
+    </w:lvl>
+    <w:lvl w:ilvl="7" w:tplc="C1AA45C2" w:tentative="1">
+      <w:start w:val="1"/>
+      <w:numFmt w:val="bullet"/>
+      <w:lvlText w:val="●"/>
+      <w:lvlJc w:val="left"/>
+      <w:pPr>
+        <w:ind w:left="5760" w:hanging="360"/>
+      </w:pPr>
+    </w:lvl>
+    <w:lvl w:ilvl="8" w:tplc="8BCA56FC" w:tentative="1">
+      <w:start w:val="1"/>
+      <w:numFmt w:val="bullet"/>
+      <w:lvlText w:val="●"/>
+      <w:lvlJc w:val="left"/>
+      <w:pPr>
+        <w:ind w:left="6480" w:hanging="360"/>
+      </w:pPr>
+    </w:lvl>
+  </w:abstractNum>
+  <w:abstractNum w:abstractNumId="1" w15:restartNumberingAfterBreak="0">
+    <w:nsid w:val="264157F5"/>
+    <w:multiLevelType w:val="hybridMultilevel"/>
+    <w:tmpl w:val="177A0B18"/>
+    <w:lvl w:ilvl="0" w:tplc="DB6AEEDA">
+      <w:start w:val="1"/>
+      <w:numFmt w:val="bullet"/>
+      <w:lvlText w:val="•"/>
+      <w:lvlJc w:val="left"/>
+      <w:pPr>
+        <w:ind w:left="540" w:hanging="270"/>
+      </w:pPr>
+    </w:lvl>
+    <w:lvl w:ilvl="1" w:tplc="E94EE996">
       <w:numFmt w:val="decimal"/>
       <w:lvlText w:val=""/>
       <w:lvlJc w:val="left"/>
     </w:lvl>
-    <w:lvl w:ilvl="2" w:tplc="C3B80DAC">
+    <w:lvl w:ilvl="2" w:tplc="AB6A817C">
       <w:numFmt w:val="decimal"/>
       <w:lvlText w:val=""/>
       <w:lvlJc w:val="left"/>
     </w:lvl>
-    <w:lvl w:ilvl="3" w:tplc="D958AAA0">
+    <w:lvl w:ilvl="3" w:tplc="D972A628">
       <w:numFmt w:val="decimal"/>
       <w:lvlText w:val=""/>
       <w:lvlJc w:val="left"/>
     </w:lvl>
-    <w:lvl w:ilvl="4" w:tplc="4670CB44">
+    <w:lvl w:ilvl="4" w:tplc="F1F2659E">
       <w:numFmt w:val="decimal"/>
       <w:lvlText w:val=""/>
       <w:lvlJc w:val="left"/>
     </w:lvl>
-    <w:lvl w:ilvl="5" w:tplc="97A6284C">
+    <w:lvl w:ilvl="5" w:tplc="E17A82BA">
       <w:numFmt w:val="decimal"/>
       <w:lvlText w:val=""/>
       <w:lvlJc w:val="left"/>
     </w:lvl>
-    <w:lvl w:ilvl="6" w:tplc="42425A16">
+    <w:lvl w:ilvl="6" w:tplc="8B466B2C">
       <w:numFmt w:val="decimal"/>
       <w:lvlText w:val=""/>
       <w:lvlJc w:val="left"/>
     </w:lvl>
-    <w:lvl w:ilvl="7" w:tplc="5DA27888">
+    <w:lvl w:ilvl="7" w:tplc="0AB62AEE">
       <w:numFmt w:val="decimal"/>
       <w:lvlText w:val=""/>
       <w:lvlJc w:val="left"/>
     </w:lvl>
-    <w:lvl w:ilvl="8" w:tplc="8480A3F2">
-      <w:numFmt w:val="decimal"/>
-      <w:lvlText w:val=""/>
-      <w:lvlJc w:val="left"/>
-    </w:lvl>
-  </w:abstractNum>
-  <w:abstractNum w:abstractNumId="1" w15:restartNumberingAfterBreak="0">
-    <w:nsid w:val="3E02057E"/>
-    <w:multiLevelType w:val="hybridMultilevel"/>
-    <w:tmpl w:val="DB76CCF0"/>
-    <w:lvl w:ilvl="0" w:tplc="872C1940">
-      <w:start w:val="1"/>
-      <w:numFmt w:val="decimal"/>
-      <w:lvlText w:val="%1."/>
-      <w:lvlJc w:val="left"/>
-      <w:pPr>
-        <w:ind w:left="540" w:hanging="300"/>
-      </w:pPr>
-    </w:lvl>
-    <w:lvl w:ilvl="1" w:tplc="FA2AE17A">
-      <w:numFmt w:val="decimal"/>
-      <w:lvlText w:val=""/>
-      <w:lvlJc w:val="left"/>
-    </w:lvl>
-    <w:lvl w:ilvl="2" w:tplc="8E6EAB0C">
-      <w:numFmt w:val="decimal"/>
-      <w:lvlText w:val=""/>
-      <w:lvlJc w:val="left"/>
-    </w:lvl>
-    <w:lvl w:ilvl="3" w:tplc="561A851E">
-      <w:numFmt w:val="decimal"/>
-      <w:lvlText w:val=""/>
-      <w:lvlJc w:val="left"/>
-    </w:lvl>
-    <w:lvl w:ilvl="4" w:tplc="52CE3F88">
-      <w:numFmt w:val="decimal"/>
-      <w:lvlText w:val=""/>
-      <w:lvlJc w:val="left"/>
-    </w:lvl>
-    <w:lvl w:ilvl="5" w:tplc="CB6EEAC0">
-      <w:numFmt w:val="decimal"/>
-      <w:lvlText w:val=""/>
-      <w:lvlJc w:val="left"/>
-    </w:lvl>
-    <w:lvl w:ilvl="6" w:tplc="7BBA323C">
-      <w:numFmt w:val="decimal"/>
-      <w:lvlText w:val=""/>
-      <w:lvlJc w:val="left"/>
-    </w:lvl>
-    <w:lvl w:ilvl="7" w:tplc="73E23BDC">
-      <w:numFmt w:val="decimal"/>
-      <w:lvlText w:val=""/>
-      <w:lvlJc w:val="left"/>
-    </w:lvl>
-    <w:lvl w:ilvl="8" w:tplc="CC047500">
+    <w:lvl w:ilvl="8" w:tplc="35AA331E">
       <w:numFmt w:val="decimal"/>
       <w:lvlText w:val=""/>
       <w:lvlJc w:val="left"/>
     </w:lvl>
   </w:abstractNum>
   <w:abstractNum w:abstractNumId="2" w15:restartNumberingAfterBreak="0">
-    <w:nsid w:val="71B91A4F"/>
+    <w:nsid w:val="79394D1C"/>
     <w:multiLevelType w:val="hybridMultilevel"/>
-    <w:tmpl w:val="EC4A5F34"/>
-    <w:lvl w:ilvl="0" w:tplc="CDBC4E1A">
+    <w:tmpl w:val="C7E2C498"/>
+    <w:lvl w:ilvl="0" w:tplc="7AF0AE6E">
       <w:start w:val="1"/>
-      <w:numFmt w:val="bullet"/>
-      <w:lvlText w:val="•"/>
+      <w:numFmt w:val="decimal"/>
+      <w:lvlText w:val="%1."/>
       <w:lvlJc w:val="left"/>
       <w:pPr>
-        <w:ind w:left="540" w:hanging="270"/>
+        <w:ind w:left="540" w:hanging="300"/>
       </w:pPr>
     </w:lvl>
-    <w:lvl w:ilvl="1" w:tplc="B3BA77A4">
+    <w:lvl w:ilvl="1" w:tplc="47D66D2E">
       <w:numFmt w:val="decimal"/>
       <w:lvlText w:val=""/>
       <w:lvlJc w:val="left"/>
     </w:lvl>
-    <w:lvl w:ilvl="2" w:tplc="4A80676A">
+    <w:lvl w:ilvl="2" w:tplc="0884F172">
       <w:numFmt w:val="decimal"/>
       <w:lvlText w:val=""/>
       <w:lvlJc w:val="left"/>
     </w:lvl>
-    <w:lvl w:ilvl="3" w:tplc="B5D2B694">
+    <w:lvl w:ilvl="3" w:tplc="4142E770">
       <w:numFmt w:val="decimal"/>
       <w:lvlText w:val=""/>
       <w:lvlJc w:val="left"/>
     </w:lvl>
-    <w:lvl w:ilvl="4" w:tplc="BE6E2018">
+    <w:lvl w:ilvl="4" w:tplc="3EA46628">
       <w:numFmt w:val="decimal"/>
       <w:lvlText w:val=""/>
       <w:lvlJc w:val="left"/>
     </w:lvl>
-    <w:lvl w:ilvl="5" w:tplc="B08EB326">
+    <w:lvl w:ilvl="5" w:tplc="9E82591C">
       <w:numFmt w:val="decimal"/>
       <w:lvlText w:val=""/>
       <w:lvlJc w:val="left"/>
     </w:lvl>
-    <w:lvl w:ilvl="6" w:tplc="2A6A7386">
+    <w:lvl w:ilvl="6" w:tplc="0E10E4EA">
       <w:numFmt w:val="decimal"/>
       <w:lvlText w:val=""/>
       <w:lvlJc w:val="left"/>
     </w:lvl>
-    <w:lvl w:ilvl="7" w:tplc="69B2592A">
+    <w:lvl w:ilvl="7" w:tplc="809AF2E0">
       <w:numFmt w:val="decimal"/>
       <w:lvlText w:val=""/>
       <w:lvlJc w:val="left"/>
     </w:lvl>
-    <w:lvl w:ilvl="8" w:tplc="1BE69200">
+    <w:lvl w:ilvl="8" w:tplc="1E04BEBC">
       <w:numFmt w:val="decimal"/>
       <w:lvlText w:val=""/>
       <w:lvlJc w:val="left"/>
     </w:lvl>
   </w:abstractNum>
   <w:abstractNum w:abstractNumId="3" w15:restartNumberingAfterBreak="0">
-    <w:nsid w:val="7AE20CE2"/>
+    <w:nsid w:val="7D853D19"/>
     <w:multiLevelType w:val="hybridMultilevel"/>
-    <w:tmpl w:val="1616B882"/>
-    <w:lvl w:ilvl="0" w:tplc="DADA5F60" w:tentative="1">
+    <w:tmpl w:val="764E1702"/>
+    <w:lvl w:ilvl="0" w:tplc="17DEF37C">
       <w:start w:val="1"/>
-      <w:numFmt w:val="bullet"/>
-      <w:lvlText w:val="●"/>
+      <w:numFmt w:val="decimal"/>
+      <w:lvlText w:val="%1."/>
       <w:lvlJc w:val="left"/>
       <w:pPr>
-        <w:ind w:left="720" w:hanging="360"/>
+        <w:ind w:left="540" w:hanging="300"/>
       </w:pPr>
     </w:lvl>
-    <w:lvl w:ilvl="1" w:tplc="6046C9EC" w:tentative="1">
-      <w:start w:val="1"/>
-      <w:numFmt w:val="bullet"/>
-      <w:lvlText w:val="○"/>
+    <w:lvl w:ilvl="1" w:tplc="9A4AA1B8">
+      <w:numFmt w:val="decimal"/>
+      <w:lvlText w:val=""/>
       <w:lvlJc w:val="left"/>
-      <w:pPr>
-        <w:ind w:left="1440" w:hanging="360"/>
-      </w:pPr>
     </w:lvl>
-    <w:lvl w:ilvl="2" w:tplc="F7D2C71C" w:tentative="1">
-      <w:start w:val="1"/>
-      <w:numFmt w:val="bullet"/>
-      <w:lvlText w:val="■"/>
+    <w:lvl w:ilvl="2" w:tplc="A1D271C2">
+      <w:numFmt w:val="decimal"/>
+      <w:lvlText w:val=""/>
       <w:lvlJc w:val="left"/>
-      <w:pPr>
-        <w:ind w:left="2160" w:hanging="360"/>
-      </w:pPr>
     </w:lvl>
-    <w:lvl w:ilvl="3" w:tplc="07EE9544" w:tentative="1">
-      <w:start w:val="1"/>
-      <w:numFmt w:val="bullet"/>
-      <w:lvlText w:val="●"/>
+    <w:lvl w:ilvl="3" w:tplc="7818B71A">
+      <w:numFmt w:val="decimal"/>
+      <w:lvlText w:val=""/>
       <w:lvlJc w:val="left"/>
-      <w:pPr>
-        <w:ind w:left="2880" w:hanging="360"/>
-      </w:pPr>
     </w:lvl>
-    <w:lvl w:ilvl="4" w:tplc="C45CA78E" w:tentative="1">
-      <w:start w:val="1"/>
-      <w:numFmt w:val="bullet"/>
-      <w:lvlText w:val="○"/>
+    <w:lvl w:ilvl="4" w:tplc="F54026EC">
+      <w:numFmt w:val="decimal"/>
+      <w:lvlText w:val=""/>
       <w:lvlJc w:val="left"/>
-      <w:pPr>
-        <w:ind w:left="3600" w:hanging="360"/>
-      </w:pPr>
     </w:lvl>
-    <w:lvl w:ilvl="5" w:tplc="A0960E98" w:tentative="1">
-      <w:start w:val="1"/>
-      <w:numFmt w:val="bullet"/>
-      <w:lvlText w:val="■"/>
+    <w:lvl w:ilvl="5" w:tplc="99D89C34">
+      <w:numFmt w:val="decimal"/>
+      <w:lvlText w:val=""/>
       <w:lvlJc w:val="left"/>
-      <w:pPr>
-        <w:ind w:left="4320" w:hanging="360"/>
-      </w:pPr>
     </w:lvl>
-    <w:lvl w:ilvl="6" w:tplc="55E8143C" w:tentative="1">
-      <w:start w:val="1"/>
-      <w:numFmt w:val="bullet"/>
-      <w:lvlText w:val="●"/>
+    <w:lvl w:ilvl="6" w:tplc="DCD67786">
+      <w:numFmt w:val="decimal"/>
+      <w:lvlText w:val=""/>
       <w:lvlJc w:val="left"/>
-      <w:pPr>
-        <w:ind w:left="5040" w:hanging="360"/>
-      </w:pPr>
     </w:lvl>
-    <w:lvl w:ilvl="7" w:tplc="BEECD8E8" w:tentative="1">
-      <w:start w:val="1"/>
-      <w:numFmt w:val="bullet"/>
-      <w:lvlText w:val="●"/>
+    <w:lvl w:ilvl="7" w:tplc="D9C8546A">
+      <w:numFmt w:val="decimal"/>
+      <w:lvlText w:val=""/>
       <w:lvlJc w:val="left"/>
-      <w:pPr>
-        <w:ind w:left="5760" w:hanging="360"/>
-      </w:pPr>
     </w:lvl>
-    <w:lvl w:ilvl="8" w:tplc="CC2E974A" w:tentative="1">
-      <w:start w:val="1"/>
-      <w:numFmt w:val="bullet"/>
-      <w:lvlText w:val="●"/>
+    <w:lvl w:ilvl="8" w:tplc="BB0C34D2">
+      <w:numFmt w:val="decimal"/>
+      <w:lvlText w:val=""/>
       <w:lvlJc w:val="left"/>
-      <w:pPr>
-        <w:ind w:left="6480" w:hanging="360"/>
-      </w:pPr>
     </w:lvl>
   </w:abstractNum>
-  <w:num w:numId="1" w16cid:durableId="842819152">
+  <w:num w:numId="1" w16cid:durableId="450244444">
+    <w:abstractNumId w:val="0"/>
+    <w:lvlOverride w:ilvl="0">
+      <w:startOverride w:val="1"/>
+    </w:lvlOverride>
+  </w:num>
+  <w:num w:numId="2" w16cid:durableId="1774394864">
+    <w:abstractNumId w:val="1"/>
+    <w:lvlOverride w:ilvl="0">
+      <w:startOverride w:val="1"/>
+    </w:lvlOverride>
+  </w:num>
+  <w:num w:numId="3" w16cid:durableId="413169382">
     <w:abstractNumId w:val="3"/>
     <w:lvlOverride w:ilvl="0">
       <w:startOverride w:val="1"/>
     </w:lvlOverride>
   </w:num>
-  <w:num w:numId="2" w16cid:durableId="834612255">
+  <w:num w:numId="4" w16cid:durableId="812986983">
     <w:abstractNumId w:val="2"/>
-    <w:lvlOverride w:ilvl="0">
-      <w:startOverride w:val="1"/>
-    </w:lvlOverride>
-  </w:num>
-  <w:num w:numId="3" w16cid:durableId="1323002308">
-    <w:abstractNumId w:val="0"/>
-    <w:lvlOverride w:ilvl="0">
-      <w:startOverride w:val="1"/>
-    </w:lvlOverride>
-  </w:num>
-  <w:num w:numId="4" w16cid:durableId="1754934544">
-    <w:abstractNumId w:val="1"/>
     <w:lvlOverride w:ilvl="0">
       <w:startOverride w:val="1"/>
     </w:lvlOverride>
@@ -27443,7 +27443,7 @@
     <w:autoRedefine/>
     <w:uiPriority w:val="39"/>
     <w:unhideWhenUsed/>
-    <w:rsid w:val="008D5010"/>
+    <w:rsid w:val="00822C8D"/>
     <w:pPr>
       <w:spacing w:after="100"/>
     </w:pPr>
@@ -27455,7 +27455,7 @@
     <w:autoRedefine/>
     <w:uiPriority w:val="39"/>
     <w:unhideWhenUsed/>
-    <w:rsid w:val="008D5010"/>
+    <w:rsid w:val="00822C8D"/>
     <w:pPr>
       <w:spacing w:after="100"/>
       <w:ind w:left="210"/>

</xml_diff>